<commit_message>
Correction de l'écran blanc
</commit_message>
<xml_diff>
--- a/Application de Réservation de Techniciens à Domicile.docx
+++ b/Application de Réservation de Techniciens à Domicile.docx
@@ -7651,8 +7651,6 @@
           <w:szCs w:val="24"/>
         </w:rPr>
       </w:pPr>
-      <w:bookmarkStart w:id="0" w:name="_GoBack"/>
-      <w:bookmarkEnd w:id="0"/>
     </w:p>
     <w:p>
       <w:pPr>
@@ -8742,6 +8740,2343 @@
           <w:szCs w:val="24"/>
         </w:rPr>
       </w:pPr>
+    </w:p>
+    <w:p>
+      <w:pPr>
+        <w:rPr>
+          <w:rFonts w:asciiTheme="majorBidi" w:hAnsiTheme="majorBidi" w:cstheme="majorBidi"/>
+          <w:sz w:val="24"/>
+          <w:szCs w:val="24"/>
+        </w:rPr>
+      </w:pPr>
+    </w:p>
+    <w:p>
+      <w:pPr>
+        <w:rPr>
+          <w:rFonts w:asciiTheme="majorBidi" w:hAnsiTheme="majorBidi" w:cstheme="majorBidi"/>
+          <w:sz w:val="24"/>
+          <w:szCs w:val="24"/>
+        </w:rPr>
+      </w:pPr>
+    </w:p>
+    <w:p>
+      <w:pPr>
+        <w:rPr>
+          <w:rFonts w:asciiTheme="majorBidi" w:hAnsiTheme="majorBidi" w:cstheme="majorBidi"/>
+          <w:sz w:val="24"/>
+          <w:szCs w:val="24"/>
+        </w:rPr>
+      </w:pPr>
+    </w:p>
+    <w:p>
+      <w:pPr>
+        <w:rPr>
+          <w:rFonts w:asciiTheme="majorBidi" w:hAnsiTheme="majorBidi" w:cstheme="majorBidi"/>
+          <w:sz w:val="24"/>
+          <w:szCs w:val="24"/>
+        </w:rPr>
+      </w:pPr>
+    </w:p>
+    <w:p>
+      <w:pPr>
+        <w:rPr>
+          <w:rFonts w:asciiTheme="majorBidi" w:hAnsiTheme="majorBidi" w:cstheme="majorBidi"/>
+          <w:sz w:val="24"/>
+          <w:szCs w:val="24"/>
+        </w:rPr>
+      </w:pPr>
+    </w:p>
+    <w:p>
+      <w:pPr>
+        <w:rPr>
+          <w:rFonts w:asciiTheme="majorBidi" w:hAnsiTheme="majorBidi" w:cstheme="majorBidi"/>
+          <w:sz w:val="24"/>
+          <w:szCs w:val="24"/>
+        </w:rPr>
+      </w:pPr>
+    </w:p>
+    <w:p>
+      <w:pPr>
+        <w:rPr>
+          <w:rFonts w:asciiTheme="majorBidi" w:hAnsiTheme="majorBidi" w:cstheme="majorBidi"/>
+          <w:sz w:val="24"/>
+          <w:szCs w:val="24"/>
+        </w:rPr>
+      </w:pPr>
+    </w:p>
+    <w:p>
+      <w:pPr>
+        <w:rPr>
+          <w:rFonts w:asciiTheme="majorBidi" w:hAnsiTheme="majorBidi" w:cstheme="majorBidi"/>
+          <w:sz w:val="24"/>
+          <w:szCs w:val="24"/>
+        </w:rPr>
+      </w:pPr>
+    </w:p>
+    <w:p>
+      <w:pPr>
+        <w:rPr>
+          <w:rFonts w:asciiTheme="majorBidi" w:hAnsiTheme="majorBidi" w:cstheme="majorBidi"/>
+          <w:sz w:val="24"/>
+          <w:szCs w:val="24"/>
+        </w:rPr>
+      </w:pPr>
+    </w:p>
+    <w:p>
+      <w:pPr>
+        <w:rPr>
+          <w:rFonts w:asciiTheme="majorBidi" w:hAnsiTheme="majorBidi" w:cstheme="majorBidi"/>
+          <w:sz w:val="24"/>
+          <w:szCs w:val="24"/>
+        </w:rPr>
+      </w:pPr>
+    </w:p>
+    <w:p>
+      <w:pPr>
+        <w:shd w:val="clear" w:color="auto" w:fill="F9F9F9"/>
+        <w:spacing w:after="0" w:line="240" w:lineRule="auto"/>
+        <w:rPr>
+          <w:rFonts w:ascii="Segoe UI" w:eastAsia="Times New Roman" w:hAnsi="Segoe UI" w:cs="Segoe UI"/>
+          <w:color w:val="101010"/>
+          <w:sz w:val="21"/>
+          <w:szCs w:val="21"/>
+          <w:lang w:eastAsia="fr-FR"/>
+        </w:rPr>
+      </w:pPr>
+      <w:r>
+        <w:rPr>
+          <w:rFonts w:ascii="Segoe UI" w:eastAsia="Times New Roman" w:hAnsi="Segoe UI" w:cs="Segoe UI"/>
+          <w:color w:val="101010"/>
+          <w:sz w:val="21"/>
+          <w:szCs w:val="21"/>
+          <w:lang w:eastAsia="fr-FR"/>
+        </w:rPr>
+        <w:lastRenderedPageBreak/>
+        <w:t>Pour terminer la création sur cette page GitHub :</w:t>
+      </w:r>
+    </w:p>
+    <w:p>
+      <w:pPr>
+        <w:numPr>
+          <w:ilvl w:val="0"/>
+          <w:numId w:val="24"/>
+        </w:numPr>
+        <w:shd w:val="clear" w:color="auto" w:fill="F9F9F9"/>
+        <w:spacing w:after="0" w:line="240" w:lineRule="auto"/>
+        <w:ind w:left="0"/>
+        <w:rPr>
+          <w:rFonts w:ascii="Segoe UI" w:eastAsia="Times New Roman" w:hAnsi="Segoe UI" w:cs="Segoe UI"/>
+          <w:color w:val="101010"/>
+          <w:sz w:val="21"/>
+          <w:szCs w:val="21"/>
+          <w:lang w:eastAsia="fr-FR"/>
+        </w:rPr>
+      </w:pPr>
+      <w:r>
+        <w:rPr>
+          <w:rFonts w:ascii="Segoe UI" w:eastAsia="Times New Roman" w:hAnsi="Segoe UI" w:cs="Segoe UI"/>
+          <w:color w:val="101010"/>
+          <w:sz w:val="21"/>
+          <w:szCs w:val="21"/>
+          <w:lang w:eastAsia="fr-FR"/>
+        </w:rPr>
+        <w:t>Descendez tout en bas de la page verte et cliquez sur le bouton vert </w:t>
+      </w:r>
+      <w:r>
+        <w:rPr>
+          <w:rFonts w:ascii="Segoe UI" w:eastAsia="Times New Roman" w:hAnsi="Segoe UI" w:cs="Segoe UI"/>
+          <w:b/>
+          <w:bCs/>
+          <w:color w:val="101010"/>
+          <w:sz w:val="21"/>
+          <w:szCs w:val="21"/>
+          <w:lang w:eastAsia="fr-FR"/>
+        </w:rPr>
+        <w:t>"</w:t>
+      </w:r>
+      <w:proofErr w:type="spellStart"/>
+      <w:r>
+        <w:rPr>
+          <w:rFonts w:ascii="Segoe UI" w:eastAsia="Times New Roman" w:hAnsi="Segoe UI" w:cs="Segoe UI"/>
+          <w:b/>
+          <w:bCs/>
+          <w:color w:val="101010"/>
+          <w:sz w:val="21"/>
+          <w:szCs w:val="21"/>
+          <w:lang w:eastAsia="fr-FR"/>
+        </w:rPr>
+        <w:t>Create</w:t>
+      </w:r>
+      <w:proofErr w:type="spellEnd"/>
+      <w:r>
+        <w:rPr>
+          <w:rFonts w:ascii="Segoe UI" w:eastAsia="Times New Roman" w:hAnsi="Segoe UI" w:cs="Segoe UI"/>
+          <w:b/>
+          <w:bCs/>
+          <w:color w:val="101010"/>
+          <w:sz w:val="21"/>
+          <w:szCs w:val="21"/>
+          <w:lang w:eastAsia="fr-FR"/>
+        </w:rPr>
+        <w:t xml:space="preserve"> </w:t>
+      </w:r>
+      <w:proofErr w:type="spellStart"/>
+      <w:r>
+        <w:rPr>
+          <w:rFonts w:ascii="Segoe UI" w:eastAsia="Times New Roman" w:hAnsi="Segoe UI" w:cs="Segoe UI"/>
+          <w:b/>
+          <w:bCs/>
+          <w:color w:val="101010"/>
+          <w:sz w:val="21"/>
+          <w:szCs w:val="21"/>
+          <w:lang w:eastAsia="fr-FR"/>
+        </w:rPr>
+        <w:t>repository</w:t>
+      </w:r>
+      <w:proofErr w:type="spellEnd"/>
+      <w:r>
+        <w:rPr>
+          <w:rFonts w:ascii="Segoe UI" w:eastAsia="Times New Roman" w:hAnsi="Segoe UI" w:cs="Segoe UI"/>
+          <w:b/>
+          <w:bCs/>
+          <w:color w:val="101010"/>
+          <w:sz w:val="21"/>
+          <w:szCs w:val="21"/>
+          <w:lang w:eastAsia="fr-FR"/>
+        </w:rPr>
+        <w:t>"</w:t>
+      </w:r>
+      <w:r>
+        <w:rPr>
+          <w:rFonts w:ascii="Segoe UI" w:eastAsia="Times New Roman" w:hAnsi="Segoe UI" w:cs="Segoe UI"/>
+          <w:color w:val="101010"/>
+          <w:sz w:val="21"/>
+          <w:szCs w:val="21"/>
+          <w:lang w:eastAsia="fr-FR"/>
+        </w:rPr>
+        <w:t> (Créer le dépôt).</w:t>
+      </w:r>
+    </w:p>
+    <w:p>
+      <w:pPr>
+        <w:numPr>
+          <w:ilvl w:val="0"/>
+          <w:numId w:val="24"/>
+        </w:numPr>
+        <w:shd w:val="clear" w:color="auto" w:fill="F9F9F9"/>
+        <w:spacing w:after="0" w:line="240" w:lineRule="auto"/>
+        <w:ind w:left="0"/>
+        <w:rPr>
+          <w:rFonts w:ascii="Segoe UI" w:eastAsia="Times New Roman" w:hAnsi="Segoe UI" w:cs="Segoe UI"/>
+          <w:color w:val="101010"/>
+          <w:sz w:val="21"/>
+          <w:szCs w:val="21"/>
+          <w:lang w:eastAsia="fr-FR"/>
+        </w:rPr>
+      </w:pPr>
+      <w:r>
+        <w:rPr>
+          <w:rFonts w:ascii="Segoe UI" w:eastAsia="Times New Roman" w:hAnsi="Segoe UI" w:cs="Segoe UI"/>
+          <w:color w:val="101010"/>
+          <w:sz w:val="21"/>
+          <w:szCs w:val="21"/>
+          <w:lang w:eastAsia="fr-FR"/>
+        </w:rPr>
+        <w:t>Une nouvelle page va s'afficher avec du code. Gardez-la ouverte.</w:t>
+      </w:r>
+    </w:p>
+    <w:p>
+      <w:pPr>
+        <w:shd w:val="clear" w:color="auto" w:fill="F9F9F9"/>
+        <w:spacing w:after="0" w:line="240" w:lineRule="auto"/>
+        <w:rPr>
+          <w:rFonts w:ascii="Segoe UI" w:eastAsia="Times New Roman" w:hAnsi="Segoe UI" w:cs="Segoe UI"/>
+          <w:color w:val="101010"/>
+          <w:sz w:val="21"/>
+          <w:szCs w:val="21"/>
+          <w:lang w:eastAsia="fr-FR"/>
+        </w:rPr>
+      </w:pPr>
+      <w:r>
+        <w:rPr>
+          <w:rFonts w:ascii="Segoe UI" w:eastAsia="Times New Roman" w:hAnsi="Segoe UI" w:cs="Segoe UI"/>
+          <w:color w:val="101010"/>
+          <w:sz w:val="21"/>
+          <w:szCs w:val="21"/>
+          <w:lang w:eastAsia="fr-FR"/>
+        </w:rPr>
+        <w:t>Maintenant, </w:t>
+      </w:r>
+      <w:r>
+        <w:rPr>
+          <w:rFonts w:ascii="Segoe UI" w:eastAsia="Times New Roman" w:hAnsi="Segoe UI" w:cs="Segoe UI"/>
+          <w:b/>
+          <w:bCs/>
+          <w:color w:val="101010"/>
+          <w:sz w:val="21"/>
+          <w:szCs w:val="21"/>
+          <w:lang w:eastAsia="fr-FR"/>
+        </w:rPr>
+        <w:t>retournez dans votre éditeur de code (VS Code)</w:t>
+      </w:r>
+      <w:r>
+        <w:rPr>
+          <w:rFonts w:ascii="Segoe UI" w:eastAsia="Times New Roman" w:hAnsi="Segoe UI" w:cs="Segoe UI"/>
+          <w:color w:val="101010"/>
+          <w:sz w:val="21"/>
+          <w:szCs w:val="21"/>
+          <w:lang w:eastAsia="fr-FR"/>
+        </w:rPr>
+        <w:t>, ouvrez un nouveau terminal (assurez-vous d'être dans le dossier principal </w:t>
+      </w:r>
+      <w:proofErr w:type="spellStart"/>
+      <w:r>
+        <w:rPr>
+          <w:rFonts w:ascii="Consolas" w:eastAsia="Times New Roman" w:hAnsi="Consolas" w:cs="Courier New"/>
+          <w:color w:val="A31515"/>
+          <w:sz w:val="19"/>
+          <w:szCs w:val="19"/>
+          <w:lang w:eastAsia="fr-FR"/>
+        </w:rPr>
+        <w:t>ThermoService</w:t>
+      </w:r>
+      <w:proofErr w:type="spellEnd"/>
+      <w:r>
+        <w:rPr>
+          <w:rFonts w:ascii="Segoe UI" w:eastAsia="Times New Roman" w:hAnsi="Segoe UI" w:cs="Segoe UI"/>
+          <w:color w:val="101010"/>
+          <w:sz w:val="21"/>
+          <w:szCs w:val="21"/>
+          <w:lang w:eastAsia="fr-FR"/>
+        </w:rPr>
+        <w:t>, et non dans </w:t>
+      </w:r>
+      <w:proofErr w:type="spellStart"/>
+      <w:r>
+        <w:rPr>
+          <w:rFonts w:ascii="Segoe UI" w:eastAsia="Times New Roman" w:hAnsi="Segoe UI" w:cs="Segoe UI"/>
+          <w:i/>
+          <w:iCs/>
+          <w:color w:val="101010"/>
+          <w:sz w:val="21"/>
+          <w:szCs w:val="21"/>
+          <w:lang w:eastAsia="fr-FR"/>
+        </w:rPr>
+        <w:t>frontend</w:t>
+      </w:r>
+      <w:proofErr w:type="spellEnd"/>
+      <w:r>
+        <w:rPr>
+          <w:rFonts w:ascii="Segoe UI" w:eastAsia="Times New Roman" w:hAnsi="Segoe UI" w:cs="Segoe UI"/>
+          <w:color w:val="101010"/>
+          <w:sz w:val="21"/>
+          <w:szCs w:val="21"/>
+          <w:lang w:eastAsia="fr-FR"/>
+        </w:rPr>
+        <w:t> ou </w:t>
+      </w:r>
+      <w:proofErr w:type="spellStart"/>
+      <w:r>
+        <w:rPr>
+          <w:rFonts w:ascii="Segoe UI" w:eastAsia="Times New Roman" w:hAnsi="Segoe UI" w:cs="Segoe UI"/>
+          <w:i/>
+          <w:iCs/>
+          <w:color w:val="101010"/>
+          <w:sz w:val="21"/>
+          <w:szCs w:val="21"/>
+          <w:lang w:eastAsia="fr-FR"/>
+        </w:rPr>
+        <w:t>backend</w:t>
+      </w:r>
+      <w:proofErr w:type="spellEnd"/>
+      <w:r>
+        <w:rPr>
+          <w:rFonts w:ascii="Segoe UI" w:eastAsia="Times New Roman" w:hAnsi="Segoe UI" w:cs="Segoe UI"/>
+          <w:color w:val="101010"/>
+          <w:sz w:val="21"/>
+          <w:szCs w:val="21"/>
+          <w:lang w:eastAsia="fr-FR"/>
+        </w:rPr>
+        <w:t>).</w:t>
+      </w:r>
+    </w:p>
+    <w:p>
+      <w:pPr>
+        <w:shd w:val="clear" w:color="auto" w:fill="F9F9F9"/>
+        <w:spacing w:after="0" w:line="240" w:lineRule="auto"/>
+        <w:rPr>
+          <w:rFonts w:ascii="Segoe UI" w:eastAsia="Times New Roman" w:hAnsi="Segoe UI" w:cs="Segoe UI"/>
+          <w:color w:val="101010"/>
+          <w:sz w:val="21"/>
+          <w:szCs w:val="21"/>
+          <w:lang w:eastAsia="fr-FR"/>
+        </w:rPr>
+      </w:pPr>
+      <w:r>
+        <w:rPr>
+          <w:rFonts w:ascii="Segoe UI" w:eastAsia="Times New Roman" w:hAnsi="Segoe UI" w:cs="Segoe UI"/>
+          <w:color w:val="101010"/>
+          <w:sz w:val="21"/>
+          <w:szCs w:val="21"/>
+          <w:lang w:eastAsia="fr-FR"/>
+        </w:rPr>
+        <w:t>J'ai déjà préparé les fichiers de configuration nécessaires. Il vous suffit de </w:t>
+      </w:r>
+      <w:r>
+        <w:rPr>
+          <w:rFonts w:ascii="Segoe UI" w:eastAsia="Times New Roman" w:hAnsi="Segoe UI" w:cs="Segoe UI"/>
+          <w:b/>
+          <w:bCs/>
+          <w:color w:val="101010"/>
+          <w:sz w:val="21"/>
+          <w:szCs w:val="21"/>
+          <w:lang w:eastAsia="fr-FR"/>
+        </w:rPr>
+        <w:t>copier-coller ces commandes ligne par ligne</w:t>
+      </w:r>
+      <w:r>
+        <w:rPr>
+          <w:rFonts w:ascii="Segoe UI" w:eastAsia="Times New Roman" w:hAnsi="Segoe UI" w:cs="Segoe UI"/>
+          <w:color w:val="101010"/>
+          <w:sz w:val="21"/>
+          <w:szCs w:val="21"/>
+          <w:lang w:eastAsia="fr-FR"/>
+        </w:rPr>
+        <w:t> dans votre terminal VS Code pour envoyer tout notre travail sur votre compte GitHub :</w:t>
+      </w:r>
+    </w:p>
+    <w:p>
+      <w:pPr>
+        <w:shd w:val="clear" w:color="auto" w:fill="F9F9F9"/>
+        <w:tabs>
+          <w:tab w:val="left" w:pos="916"/>
+          <w:tab w:val="left" w:pos="1832"/>
+          <w:tab w:val="left" w:pos="2748"/>
+          <w:tab w:val="left" w:pos="3664"/>
+          <w:tab w:val="left" w:pos="4580"/>
+          <w:tab w:val="left" w:pos="5496"/>
+          <w:tab w:val="left" w:pos="6412"/>
+          <w:tab w:val="left" w:pos="7328"/>
+          <w:tab w:val="left" w:pos="8244"/>
+          <w:tab w:val="left" w:pos="9160"/>
+          <w:tab w:val="left" w:pos="10076"/>
+          <w:tab w:val="left" w:pos="10992"/>
+          <w:tab w:val="left" w:pos="11908"/>
+          <w:tab w:val="left" w:pos="12824"/>
+          <w:tab w:val="left" w:pos="13740"/>
+          <w:tab w:val="left" w:pos="14656"/>
+        </w:tabs>
+        <w:spacing w:after="0" w:line="240" w:lineRule="auto"/>
+        <w:rPr>
+          <w:rFonts w:ascii="Segoe UI" w:eastAsia="Times New Roman" w:hAnsi="Segoe UI" w:cs="Segoe UI"/>
+          <w:color w:val="101010"/>
+          <w:sz w:val="21"/>
+          <w:szCs w:val="21"/>
+          <w:lang w:val="en-US" w:eastAsia="fr-FR"/>
+        </w:rPr>
+      </w:pPr>
+      <w:r>
+        <w:rPr>
+          <w:rFonts w:ascii="Segoe UI" w:eastAsia="Times New Roman" w:hAnsi="Segoe UI" w:cs="Segoe UI"/>
+          <w:color w:val="101010"/>
+          <w:sz w:val="21"/>
+          <w:szCs w:val="21"/>
+          <w:lang w:val="en-US" w:eastAsia="fr-FR"/>
+        </w:rPr>
+        <w:t>bash</w:t>
+      </w:r>
+    </w:p>
+    <w:p>
+      <w:pPr>
+        <w:shd w:val="clear" w:color="auto" w:fill="F9F9F9"/>
+        <w:tabs>
+          <w:tab w:val="left" w:pos="916"/>
+          <w:tab w:val="left" w:pos="1832"/>
+          <w:tab w:val="left" w:pos="2748"/>
+          <w:tab w:val="left" w:pos="3664"/>
+          <w:tab w:val="left" w:pos="4580"/>
+          <w:tab w:val="left" w:pos="5496"/>
+          <w:tab w:val="left" w:pos="6412"/>
+          <w:tab w:val="left" w:pos="7328"/>
+          <w:tab w:val="left" w:pos="8244"/>
+          <w:tab w:val="left" w:pos="9160"/>
+          <w:tab w:val="left" w:pos="10076"/>
+          <w:tab w:val="left" w:pos="10992"/>
+          <w:tab w:val="left" w:pos="11908"/>
+          <w:tab w:val="left" w:pos="12824"/>
+          <w:tab w:val="left" w:pos="13740"/>
+          <w:tab w:val="left" w:pos="14656"/>
+        </w:tabs>
+        <w:spacing w:after="0" w:line="240" w:lineRule="auto"/>
+        <w:rPr>
+          <w:rFonts w:ascii="Consolas" w:eastAsia="Times New Roman" w:hAnsi="Consolas" w:cs="Courier New"/>
+          <w:color w:val="101010"/>
+          <w:sz w:val="18"/>
+          <w:szCs w:val="18"/>
+          <w:lang w:val="en-US" w:eastAsia="fr-FR"/>
+        </w:rPr>
+      </w:pPr>
+      <w:proofErr w:type="spellStart"/>
+      <w:r>
+        <w:rPr>
+          <w:rFonts w:ascii="Consolas" w:eastAsia="Times New Roman" w:hAnsi="Consolas" w:cs="Courier New"/>
+          <w:color w:val="DD4A68"/>
+          <w:sz w:val="18"/>
+          <w:szCs w:val="18"/>
+          <w:lang w:val="en-US" w:eastAsia="fr-FR"/>
+        </w:rPr>
+        <w:t>git</w:t>
+      </w:r>
+      <w:proofErr w:type="spellEnd"/>
+      <w:r>
+        <w:rPr>
+          <w:rFonts w:ascii="Consolas" w:eastAsia="Times New Roman" w:hAnsi="Consolas" w:cs="Courier New"/>
+          <w:color w:val="101010"/>
+          <w:sz w:val="18"/>
+          <w:szCs w:val="18"/>
+          <w:lang w:val="en-US" w:eastAsia="fr-FR"/>
+        </w:rPr>
+        <w:t xml:space="preserve"> </w:t>
+      </w:r>
+      <w:proofErr w:type="spellStart"/>
+      <w:r>
+        <w:rPr>
+          <w:rFonts w:ascii="Consolas" w:eastAsia="Times New Roman" w:hAnsi="Consolas" w:cs="Courier New"/>
+          <w:color w:val="101010"/>
+          <w:sz w:val="18"/>
+          <w:szCs w:val="18"/>
+          <w:lang w:val="en-US" w:eastAsia="fr-FR"/>
+        </w:rPr>
+        <w:t>init</w:t>
+      </w:r>
+      <w:proofErr w:type="spellEnd"/>
+    </w:p>
+    <w:p>
+      <w:pPr>
+        <w:shd w:val="clear" w:color="auto" w:fill="F9F9F9"/>
+        <w:tabs>
+          <w:tab w:val="left" w:pos="916"/>
+          <w:tab w:val="left" w:pos="1832"/>
+          <w:tab w:val="left" w:pos="2748"/>
+          <w:tab w:val="left" w:pos="3664"/>
+          <w:tab w:val="left" w:pos="4580"/>
+          <w:tab w:val="left" w:pos="5496"/>
+          <w:tab w:val="left" w:pos="6412"/>
+          <w:tab w:val="left" w:pos="7328"/>
+          <w:tab w:val="left" w:pos="8244"/>
+          <w:tab w:val="left" w:pos="9160"/>
+          <w:tab w:val="left" w:pos="10076"/>
+          <w:tab w:val="left" w:pos="10992"/>
+          <w:tab w:val="left" w:pos="11908"/>
+          <w:tab w:val="left" w:pos="12824"/>
+          <w:tab w:val="left" w:pos="13740"/>
+          <w:tab w:val="left" w:pos="14656"/>
+        </w:tabs>
+        <w:spacing w:after="0" w:line="240" w:lineRule="auto"/>
+        <w:rPr>
+          <w:rFonts w:ascii="Consolas" w:eastAsia="Times New Roman" w:hAnsi="Consolas" w:cs="Courier New"/>
+          <w:color w:val="101010"/>
+          <w:sz w:val="18"/>
+          <w:szCs w:val="18"/>
+          <w:lang w:val="en-US" w:eastAsia="fr-FR"/>
+        </w:rPr>
+      </w:pPr>
+      <w:proofErr w:type="spellStart"/>
+      <w:r>
+        <w:rPr>
+          <w:rFonts w:ascii="Consolas" w:eastAsia="Times New Roman" w:hAnsi="Consolas" w:cs="Courier New"/>
+          <w:color w:val="DD4A68"/>
+          <w:sz w:val="18"/>
+          <w:szCs w:val="18"/>
+          <w:lang w:val="en-US" w:eastAsia="fr-FR"/>
+        </w:rPr>
+        <w:t>git</w:t>
+      </w:r>
+      <w:proofErr w:type="spellEnd"/>
+      <w:r>
+        <w:rPr>
+          <w:rFonts w:ascii="Consolas" w:eastAsia="Times New Roman" w:hAnsi="Consolas" w:cs="Courier New"/>
+          <w:color w:val="101010"/>
+          <w:sz w:val="18"/>
+          <w:szCs w:val="18"/>
+          <w:lang w:val="en-US" w:eastAsia="fr-FR"/>
+        </w:rPr>
+        <w:t xml:space="preserve"> </w:t>
+      </w:r>
+      <w:proofErr w:type="gramStart"/>
+      <w:r>
+        <w:rPr>
+          <w:rFonts w:ascii="Consolas" w:eastAsia="Times New Roman" w:hAnsi="Consolas" w:cs="Courier New"/>
+          <w:color w:val="DD4A68"/>
+          <w:sz w:val="18"/>
+          <w:szCs w:val="18"/>
+          <w:lang w:val="en-US" w:eastAsia="fr-FR"/>
+        </w:rPr>
+        <w:t>add</w:t>
+      </w:r>
+      <w:r>
+        <w:rPr>
+          <w:rFonts w:ascii="Consolas" w:eastAsia="Times New Roman" w:hAnsi="Consolas" w:cs="Courier New"/>
+          <w:color w:val="101010"/>
+          <w:sz w:val="18"/>
+          <w:szCs w:val="18"/>
+          <w:lang w:val="en-US" w:eastAsia="fr-FR"/>
+        </w:rPr>
+        <w:t xml:space="preserve"> </w:t>
+      </w:r>
+      <w:r>
+        <w:rPr>
+          <w:rFonts w:ascii="Consolas" w:eastAsia="Times New Roman" w:hAnsi="Consolas" w:cs="Courier New"/>
+          <w:color w:val="DD4A68"/>
+          <w:sz w:val="18"/>
+          <w:szCs w:val="18"/>
+          <w:lang w:val="en-US" w:eastAsia="fr-FR"/>
+        </w:rPr>
+        <w:t>.</w:t>
+      </w:r>
+      <w:proofErr w:type="gramEnd"/>
+    </w:p>
+    <w:p>
+      <w:pPr>
+        <w:shd w:val="clear" w:color="auto" w:fill="F9F9F9"/>
+        <w:tabs>
+          <w:tab w:val="left" w:pos="916"/>
+          <w:tab w:val="left" w:pos="1832"/>
+          <w:tab w:val="left" w:pos="2748"/>
+          <w:tab w:val="left" w:pos="3664"/>
+          <w:tab w:val="left" w:pos="4580"/>
+          <w:tab w:val="left" w:pos="5496"/>
+          <w:tab w:val="left" w:pos="6412"/>
+          <w:tab w:val="left" w:pos="7328"/>
+          <w:tab w:val="left" w:pos="8244"/>
+          <w:tab w:val="left" w:pos="9160"/>
+          <w:tab w:val="left" w:pos="10076"/>
+          <w:tab w:val="left" w:pos="10992"/>
+          <w:tab w:val="left" w:pos="11908"/>
+          <w:tab w:val="left" w:pos="12824"/>
+          <w:tab w:val="left" w:pos="13740"/>
+          <w:tab w:val="left" w:pos="14656"/>
+        </w:tabs>
+        <w:spacing w:after="0" w:line="240" w:lineRule="auto"/>
+        <w:rPr>
+          <w:rFonts w:ascii="Consolas" w:eastAsia="Times New Roman" w:hAnsi="Consolas" w:cs="Courier New"/>
+          <w:color w:val="101010"/>
+          <w:sz w:val="18"/>
+          <w:szCs w:val="18"/>
+          <w:lang w:val="en-US" w:eastAsia="fr-FR"/>
+        </w:rPr>
+      </w:pPr>
+      <w:proofErr w:type="spellStart"/>
+      <w:r>
+        <w:rPr>
+          <w:rFonts w:ascii="Consolas" w:eastAsia="Times New Roman" w:hAnsi="Consolas" w:cs="Courier New"/>
+          <w:color w:val="DD4A68"/>
+          <w:sz w:val="18"/>
+          <w:szCs w:val="18"/>
+          <w:lang w:val="en-US" w:eastAsia="fr-FR"/>
+        </w:rPr>
+        <w:t>git</w:t>
+      </w:r>
+      <w:proofErr w:type="spellEnd"/>
+      <w:r>
+        <w:rPr>
+          <w:rFonts w:ascii="Consolas" w:eastAsia="Times New Roman" w:hAnsi="Consolas" w:cs="Courier New"/>
+          <w:color w:val="101010"/>
+          <w:sz w:val="18"/>
+          <w:szCs w:val="18"/>
+          <w:lang w:val="en-US" w:eastAsia="fr-FR"/>
+        </w:rPr>
+        <w:t xml:space="preserve"> commit </w:t>
+      </w:r>
+      <w:r>
+        <w:rPr>
+          <w:rFonts w:ascii="Consolas" w:eastAsia="Times New Roman" w:hAnsi="Consolas" w:cs="Courier New"/>
+          <w:color w:val="EE9900"/>
+          <w:sz w:val="18"/>
+          <w:szCs w:val="18"/>
+          <w:lang w:val="en-US" w:eastAsia="fr-FR"/>
+        </w:rPr>
+        <w:t>-m</w:t>
+      </w:r>
+      <w:r>
+        <w:rPr>
+          <w:rFonts w:ascii="Consolas" w:eastAsia="Times New Roman" w:hAnsi="Consolas" w:cs="Courier New"/>
+          <w:color w:val="101010"/>
+          <w:sz w:val="18"/>
+          <w:szCs w:val="18"/>
+          <w:lang w:val="en-US" w:eastAsia="fr-FR"/>
+        </w:rPr>
+        <w:t xml:space="preserve"> </w:t>
+      </w:r>
+      <w:r>
+        <w:rPr>
+          <w:rFonts w:ascii="Consolas" w:eastAsia="Times New Roman" w:hAnsi="Consolas" w:cs="Courier New"/>
+          <w:color w:val="669900"/>
+          <w:sz w:val="18"/>
+          <w:szCs w:val="18"/>
+          <w:lang w:val="en-US" w:eastAsia="fr-FR"/>
+        </w:rPr>
+        <w:t>"Version finale SERVICE-GO"</w:t>
+      </w:r>
+    </w:p>
+    <w:p>
+      <w:pPr>
+        <w:shd w:val="clear" w:color="auto" w:fill="F9F9F9"/>
+        <w:tabs>
+          <w:tab w:val="left" w:pos="916"/>
+          <w:tab w:val="left" w:pos="1832"/>
+          <w:tab w:val="left" w:pos="2748"/>
+          <w:tab w:val="left" w:pos="3664"/>
+          <w:tab w:val="left" w:pos="4580"/>
+          <w:tab w:val="left" w:pos="5496"/>
+          <w:tab w:val="left" w:pos="6412"/>
+          <w:tab w:val="left" w:pos="7328"/>
+          <w:tab w:val="left" w:pos="8244"/>
+          <w:tab w:val="left" w:pos="9160"/>
+          <w:tab w:val="left" w:pos="10076"/>
+          <w:tab w:val="left" w:pos="10992"/>
+          <w:tab w:val="left" w:pos="11908"/>
+          <w:tab w:val="left" w:pos="12824"/>
+          <w:tab w:val="left" w:pos="13740"/>
+          <w:tab w:val="left" w:pos="14656"/>
+        </w:tabs>
+        <w:spacing w:after="0" w:line="240" w:lineRule="auto"/>
+        <w:rPr>
+          <w:rFonts w:ascii="Consolas" w:eastAsia="Times New Roman" w:hAnsi="Consolas" w:cs="Courier New"/>
+          <w:color w:val="101010"/>
+          <w:sz w:val="18"/>
+          <w:szCs w:val="18"/>
+          <w:lang w:val="en-US" w:eastAsia="fr-FR"/>
+        </w:rPr>
+      </w:pPr>
+      <w:proofErr w:type="spellStart"/>
+      <w:r>
+        <w:rPr>
+          <w:rFonts w:ascii="Consolas" w:eastAsia="Times New Roman" w:hAnsi="Consolas" w:cs="Courier New"/>
+          <w:color w:val="DD4A68"/>
+          <w:sz w:val="18"/>
+          <w:szCs w:val="18"/>
+          <w:lang w:val="en-US" w:eastAsia="fr-FR"/>
+        </w:rPr>
+        <w:t>git</w:t>
+      </w:r>
+      <w:proofErr w:type="spellEnd"/>
+      <w:r>
+        <w:rPr>
+          <w:rFonts w:ascii="Consolas" w:eastAsia="Times New Roman" w:hAnsi="Consolas" w:cs="Courier New"/>
+          <w:color w:val="101010"/>
+          <w:sz w:val="18"/>
+          <w:szCs w:val="18"/>
+          <w:lang w:val="en-US" w:eastAsia="fr-FR"/>
+        </w:rPr>
+        <w:t xml:space="preserve"> branch </w:t>
+      </w:r>
+      <w:r>
+        <w:rPr>
+          <w:rFonts w:ascii="Consolas" w:eastAsia="Times New Roman" w:hAnsi="Consolas" w:cs="Courier New"/>
+          <w:color w:val="EE9900"/>
+          <w:sz w:val="18"/>
+          <w:szCs w:val="18"/>
+          <w:lang w:val="en-US" w:eastAsia="fr-FR"/>
+        </w:rPr>
+        <w:t>-M</w:t>
+      </w:r>
+      <w:r>
+        <w:rPr>
+          <w:rFonts w:ascii="Consolas" w:eastAsia="Times New Roman" w:hAnsi="Consolas" w:cs="Courier New"/>
+          <w:color w:val="101010"/>
+          <w:sz w:val="18"/>
+          <w:szCs w:val="18"/>
+          <w:lang w:val="en-US" w:eastAsia="fr-FR"/>
+        </w:rPr>
+        <w:t xml:space="preserve"> main</w:t>
+      </w:r>
+    </w:p>
+    <w:p>
+      <w:pPr>
+        <w:shd w:val="clear" w:color="auto" w:fill="F9F9F9"/>
+        <w:tabs>
+          <w:tab w:val="left" w:pos="916"/>
+          <w:tab w:val="left" w:pos="1832"/>
+          <w:tab w:val="left" w:pos="2748"/>
+          <w:tab w:val="left" w:pos="3664"/>
+          <w:tab w:val="left" w:pos="4580"/>
+          <w:tab w:val="left" w:pos="5496"/>
+          <w:tab w:val="left" w:pos="6412"/>
+          <w:tab w:val="left" w:pos="7328"/>
+          <w:tab w:val="left" w:pos="8244"/>
+          <w:tab w:val="left" w:pos="9160"/>
+          <w:tab w:val="left" w:pos="10076"/>
+          <w:tab w:val="left" w:pos="10992"/>
+          <w:tab w:val="left" w:pos="11908"/>
+          <w:tab w:val="left" w:pos="12824"/>
+          <w:tab w:val="left" w:pos="13740"/>
+          <w:tab w:val="left" w:pos="14656"/>
+        </w:tabs>
+        <w:spacing w:after="0" w:line="240" w:lineRule="auto"/>
+        <w:rPr>
+          <w:rFonts w:ascii="Consolas" w:eastAsia="Times New Roman" w:hAnsi="Consolas" w:cs="Courier New"/>
+          <w:color w:val="101010"/>
+          <w:sz w:val="18"/>
+          <w:szCs w:val="18"/>
+          <w:lang w:val="en-US" w:eastAsia="fr-FR"/>
+        </w:rPr>
+      </w:pPr>
+      <w:proofErr w:type="spellStart"/>
+      <w:r>
+        <w:rPr>
+          <w:rFonts w:ascii="Consolas" w:eastAsia="Times New Roman" w:hAnsi="Consolas" w:cs="Courier New"/>
+          <w:color w:val="DD4A68"/>
+          <w:sz w:val="18"/>
+          <w:szCs w:val="18"/>
+          <w:lang w:val="en-US" w:eastAsia="fr-FR"/>
+        </w:rPr>
+        <w:t>git</w:t>
+      </w:r>
+      <w:proofErr w:type="spellEnd"/>
+      <w:r>
+        <w:rPr>
+          <w:rFonts w:ascii="Consolas" w:eastAsia="Times New Roman" w:hAnsi="Consolas" w:cs="Courier New"/>
+          <w:color w:val="101010"/>
+          <w:sz w:val="18"/>
+          <w:szCs w:val="18"/>
+          <w:lang w:val="en-US" w:eastAsia="fr-FR"/>
+        </w:rPr>
+        <w:t xml:space="preserve"> remote </w:t>
+      </w:r>
+      <w:r>
+        <w:rPr>
+          <w:rFonts w:ascii="Consolas" w:eastAsia="Times New Roman" w:hAnsi="Consolas" w:cs="Courier New"/>
+          <w:color w:val="DD4A68"/>
+          <w:sz w:val="18"/>
+          <w:szCs w:val="18"/>
+          <w:lang w:val="en-US" w:eastAsia="fr-FR"/>
+        </w:rPr>
+        <w:t>add</w:t>
+      </w:r>
+      <w:r>
+        <w:rPr>
+          <w:rFonts w:ascii="Consolas" w:eastAsia="Times New Roman" w:hAnsi="Consolas" w:cs="Courier New"/>
+          <w:color w:val="101010"/>
+          <w:sz w:val="18"/>
+          <w:szCs w:val="18"/>
+          <w:lang w:val="en-US" w:eastAsia="fr-FR"/>
+        </w:rPr>
+        <w:t xml:space="preserve"> origin https://github.com/berkanenabil3-del/service-go.git</w:t>
+      </w:r>
+    </w:p>
+    <w:p>
+      <w:pPr>
+        <w:shd w:val="clear" w:color="auto" w:fill="F9F9F9"/>
+        <w:tabs>
+          <w:tab w:val="left" w:pos="916"/>
+          <w:tab w:val="left" w:pos="1832"/>
+          <w:tab w:val="left" w:pos="2748"/>
+          <w:tab w:val="left" w:pos="3664"/>
+          <w:tab w:val="left" w:pos="4580"/>
+          <w:tab w:val="left" w:pos="5496"/>
+          <w:tab w:val="left" w:pos="6412"/>
+          <w:tab w:val="left" w:pos="7328"/>
+          <w:tab w:val="left" w:pos="8244"/>
+          <w:tab w:val="left" w:pos="9160"/>
+          <w:tab w:val="left" w:pos="10076"/>
+          <w:tab w:val="left" w:pos="10992"/>
+          <w:tab w:val="left" w:pos="11908"/>
+          <w:tab w:val="left" w:pos="12824"/>
+          <w:tab w:val="left" w:pos="13740"/>
+          <w:tab w:val="left" w:pos="14656"/>
+        </w:tabs>
+        <w:spacing w:after="0" w:line="240" w:lineRule="auto"/>
+        <w:rPr>
+          <w:rFonts w:ascii="Consolas" w:eastAsia="Times New Roman" w:hAnsi="Consolas" w:cs="Courier New"/>
+          <w:color w:val="101010"/>
+          <w:sz w:val="18"/>
+          <w:szCs w:val="18"/>
+          <w:lang w:eastAsia="fr-FR"/>
+        </w:rPr>
+      </w:pPr>
+      <w:proofErr w:type="gramStart"/>
+      <w:r>
+        <w:rPr>
+          <w:rFonts w:ascii="Consolas" w:eastAsia="Times New Roman" w:hAnsi="Consolas" w:cs="Courier New"/>
+          <w:color w:val="DD4A68"/>
+          <w:sz w:val="18"/>
+          <w:szCs w:val="18"/>
+          <w:lang w:eastAsia="fr-FR"/>
+        </w:rPr>
+        <w:t>git</w:t>
+      </w:r>
+      <w:proofErr w:type="gramEnd"/>
+      <w:r>
+        <w:rPr>
+          <w:rFonts w:ascii="Consolas" w:eastAsia="Times New Roman" w:hAnsi="Consolas" w:cs="Courier New"/>
+          <w:color w:val="101010"/>
+          <w:sz w:val="18"/>
+          <w:szCs w:val="18"/>
+          <w:lang w:eastAsia="fr-FR"/>
+        </w:rPr>
+        <w:t xml:space="preserve"> push </w:t>
+      </w:r>
+      <w:r>
+        <w:rPr>
+          <w:rFonts w:ascii="Consolas" w:eastAsia="Times New Roman" w:hAnsi="Consolas" w:cs="Courier New"/>
+          <w:color w:val="EE9900"/>
+          <w:sz w:val="18"/>
+          <w:szCs w:val="18"/>
+          <w:lang w:eastAsia="fr-FR"/>
+        </w:rPr>
+        <w:t>-u</w:t>
+      </w:r>
+      <w:r>
+        <w:rPr>
+          <w:rFonts w:ascii="Consolas" w:eastAsia="Times New Roman" w:hAnsi="Consolas" w:cs="Courier New"/>
+          <w:color w:val="101010"/>
+          <w:sz w:val="18"/>
+          <w:szCs w:val="18"/>
+          <w:lang w:eastAsia="fr-FR"/>
+        </w:rPr>
+        <w:t xml:space="preserve"> </w:t>
+      </w:r>
+      <w:proofErr w:type="spellStart"/>
+      <w:r>
+        <w:rPr>
+          <w:rFonts w:ascii="Consolas" w:eastAsia="Times New Roman" w:hAnsi="Consolas" w:cs="Courier New"/>
+          <w:color w:val="101010"/>
+          <w:sz w:val="18"/>
+          <w:szCs w:val="18"/>
+          <w:lang w:eastAsia="fr-FR"/>
+        </w:rPr>
+        <w:t>origin</w:t>
+      </w:r>
+      <w:proofErr w:type="spellEnd"/>
+      <w:r>
+        <w:rPr>
+          <w:rFonts w:ascii="Consolas" w:eastAsia="Times New Roman" w:hAnsi="Consolas" w:cs="Courier New"/>
+          <w:color w:val="101010"/>
+          <w:sz w:val="18"/>
+          <w:szCs w:val="18"/>
+          <w:lang w:eastAsia="fr-FR"/>
+        </w:rPr>
+        <w:t xml:space="preserve"> main</w:t>
+      </w:r>
+    </w:p>
+    <w:p>
+      <w:pPr>
+        <w:shd w:val="clear" w:color="auto" w:fill="F9F9F9"/>
+        <w:spacing w:after="0" w:line="240" w:lineRule="auto"/>
+        <w:rPr>
+          <w:rFonts w:ascii="Segoe UI" w:eastAsia="Times New Roman" w:hAnsi="Segoe UI" w:cs="Segoe UI"/>
+          <w:color w:val="101010"/>
+          <w:sz w:val="21"/>
+          <w:szCs w:val="21"/>
+          <w:lang w:eastAsia="fr-FR"/>
+        </w:rPr>
+      </w:pPr>
+      <w:r>
+        <w:rPr>
+          <w:rFonts w:ascii="Segoe UI" w:eastAsia="Times New Roman" w:hAnsi="Segoe UI" w:cs="Segoe UI"/>
+          <w:i/>
+          <w:iCs/>
+          <w:color w:val="101010"/>
+          <w:sz w:val="21"/>
+          <w:szCs w:val="21"/>
+          <w:lang w:eastAsia="fr-FR"/>
+        </w:rPr>
+        <w:t>(Il se peut qu'une petite fenêtre s'ouvre pour vous demander de vous connecter à GitHub depuis VS Code. Si c'est le cas, acceptez).</w:t>
+      </w:r>
+    </w:p>
+    <w:p>
+      <w:pPr>
+        <w:shd w:val="clear" w:color="auto" w:fill="F9F9F9"/>
+        <w:spacing w:after="0" w:line="240" w:lineRule="auto"/>
+        <w:rPr>
+          <w:rFonts w:ascii="Segoe UI" w:eastAsia="Times New Roman" w:hAnsi="Segoe UI" w:cs="Segoe UI"/>
+          <w:color w:val="101010"/>
+          <w:sz w:val="21"/>
+          <w:szCs w:val="21"/>
+          <w:lang w:eastAsia="fr-FR"/>
+        </w:rPr>
+      </w:pPr>
+      <w:r>
+        <w:rPr>
+          <w:rFonts w:ascii="Segoe UI" w:eastAsia="Times New Roman" w:hAnsi="Segoe UI" w:cs="Segoe UI"/>
+          <w:color w:val="101010"/>
+          <w:sz w:val="21"/>
+          <w:szCs w:val="21"/>
+          <w:lang w:eastAsia="fr-FR"/>
+        </w:rPr>
+        <w:t xml:space="preserve">Une fois que ces commandes sont terminées, retournez sur votre page GitHub et actualisez (F5). Vous verrez tous vos fichiers de code ! Vous pourrez ensuite passer à l'étape </w:t>
+      </w:r>
+      <w:proofErr w:type="spellStart"/>
+      <w:r>
+        <w:rPr>
+          <w:rFonts w:ascii="Segoe UI" w:eastAsia="Times New Roman" w:hAnsi="Segoe UI" w:cs="Segoe UI"/>
+          <w:color w:val="101010"/>
+          <w:sz w:val="21"/>
+          <w:szCs w:val="21"/>
+          <w:lang w:eastAsia="fr-FR"/>
+        </w:rPr>
+        <w:t>Render</w:t>
+      </w:r>
+      <w:proofErr w:type="spellEnd"/>
+      <w:r>
+        <w:rPr>
+          <w:rFonts w:ascii="Segoe UI" w:eastAsia="Times New Roman" w:hAnsi="Segoe UI" w:cs="Segoe UI"/>
+          <w:color w:val="101010"/>
+          <w:sz w:val="21"/>
+          <w:szCs w:val="21"/>
+          <w:lang w:eastAsia="fr-FR"/>
+        </w:rPr>
+        <w:t xml:space="preserve"> comme expliqué précédemment. Dites-moi si vous avez la moindre erreur dans le terminal !</w:t>
+      </w:r>
+    </w:p>
+    <w:p>
+      <w:pPr>
+        <w:rPr>
+          <w:rFonts w:asciiTheme="majorBidi" w:hAnsiTheme="majorBidi" w:cstheme="majorBidi"/>
+          <w:sz w:val="24"/>
+          <w:szCs w:val="24"/>
+        </w:rPr>
+      </w:pPr>
+    </w:p>
+    <w:p>
+      <w:pPr>
+        <w:rPr>
+          <w:rFonts w:asciiTheme="majorBidi" w:hAnsiTheme="majorBidi" w:cstheme="majorBidi"/>
+          <w:sz w:val="24"/>
+          <w:szCs w:val="24"/>
+        </w:rPr>
+      </w:pPr>
+    </w:p>
+    <w:p>
+      <w:pPr>
+        <w:rPr>
+          <w:rFonts w:asciiTheme="majorBidi" w:hAnsiTheme="majorBidi" w:cstheme="majorBidi"/>
+          <w:sz w:val="24"/>
+          <w:szCs w:val="24"/>
+        </w:rPr>
+      </w:pPr>
+    </w:p>
+    <w:p>
+      <w:pPr>
+        <w:rPr>
+          <w:rFonts w:asciiTheme="majorBidi" w:hAnsiTheme="majorBidi" w:cstheme="majorBidi"/>
+          <w:sz w:val="24"/>
+          <w:szCs w:val="24"/>
+        </w:rPr>
+      </w:pPr>
+    </w:p>
+    <w:p>
+      <w:pPr>
+        <w:shd w:val="clear" w:color="auto" w:fill="F9F9F9"/>
+        <w:spacing w:after="0" w:line="240" w:lineRule="auto"/>
+        <w:rPr>
+          <w:rFonts w:ascii="Segoe UI" w:eastAsia="Times New Roman" w:hAnsi="Segoe UI" w:cs="Segoe UI"/>
+          <w:color w:val="101010"/>
+          <w:sz w:val="21"/>
+          <w:szCs w:val="21"/>
+          <w:lang w:eastAsia="fr-FR"/>
+        </w:rPr>
+      </w:pPr>
+      <w:r>
+        <w:rPr>
+          <w:rFonts w:ascii="Segoe UI" w:eastAsia="Times New Roman" w:hAnsi="Segoe UI" w:cs="Segoe UI"/>
+          <w:color w:val="101010"/>
+          <w:sz w:val="21"/>
+          <w:szCs w:val="21"/>
+          <w:lang w:eastAsia="fr-FR"/>
+        </w:rPr>
+        <w:t xml:space="preserve">Félicitations, c'est parfait ! </w:t>
+      </w:r>
+      <w:r>
+        <w:rPr>
+          <w:rFonts w:ascii="Segoe UI Symbol" w:eastAsia="Times New Roman" w:hAnsi="Segoe UI Symbol" w:cs="Segoe UI Symbol"/>
+          <w:color w:val="101010"/>
+          <w:sz w:val="21"/>
+          <w:szCs w:val="21"/>
+          <w:lang w:eastAsia="fr-FR"/>
+        </w:rPr>
+        <w:t>🎉</w:t>
+      </w:r>
+      <w:r>
+        <w:rPr>
+          <w:rFonts w:ascii="Segoe UI" w:eastAsia="Times New Roman" w:hAnsi="Segoe UI" w:cs="Segoe UI"/>
+          <w:color w:val="101010"/>
+          <w:sz w:val="21"/>
+          <w:szCs w:val="21"/>
+          <w:lang w:eastAsia="fr-FR"/>
+        </w:rPr>
+        <w:t xml:space="preserve"> Votre code est maintenant officiellement sauvegardé sur GitHub.</w:t>
+      </w:r>
+    </w:p>
+    <w:p>
+      <w:pPr>
+        <w:shd w:val="clear" w:color="auto" w:fill="F9F9F9"/>
+        <w:spacing w:after="0" w:line="240" w:lineRule="auto"/>
+        <w:rPr>
+          <w:rFonts w:ascii="Segoe UI" w:eastAsia="Times New Roman" w:hAnsi="Segoe UI" w:cs="Segoe UI"/>
+          <w:color w:val="101010"/>
+          <w:sz w:val="21"/>
+          <w:szCs w:val="21"/>
+          <w:lang w:eastAsia="fr-FR"/>
+        </w:rPr>
+      </w:pPr>
+      <w:r>
+        <w:rPr>
+          <w:rFonts w:ascii="Segoe UI" w:eastAsia="Times New Roman" w:hAnsi="Segoe UI" w:cs="Segoe UI"/>
+          <w:color w:val="101010"/>
+          <w:sz w:val="21"/>
+          <w:szCs w:val="21"/>
+          <w:lang w:eastAsia="fr-FR"/>
+        </w:rPr>
+        <w:t>Il ne reste plus que la toute dernière étape : </w:t>
+      </w:r>
+      <w:r>
+        <w:rPr>
+          <w:rFonts w:ascii="Segoe UI" w:eastAsia="Times New Roman" w:hAnsi="Segoe UI" w:cs="Segoe UI"/>
+          <w:b/>
+          <w:bCs/>
+          <w:color w:val="101010"/>
+          <w:sz w:val="21"/>
+          <w:szCs w:val="21"/>
+          <w:lang w:eastAsia="fr-FR"/>
+        </w:rPr>
+        <w:t xml:space="preserve">le mettre en ligne sur </w:t>
+      </w:r>
+      <w:proofErr w:type="spellStart"/>
+      <w:r>
+        <w:rPr>
+          <w:rFonts w:ascii="Segoe UI" w:eastAsia="Times New Roman" w:hAnsi="Segoe UI" w:cs="Segoe UI"/>
+          <w:b/>
+          <w:bCs/>
+          <w:color w:val="101010"/>
+          <w:sz w:val="21"/>
+          <w:szCs w:val="21"/>
+          <w:lang w:eastAsia="fr-FR"/>
+        </w:rPr>
+        <w:t>Render</w:t>
+      </w:r>
+      <w:proofErr w:type="spellEnd"/>
+      <w:r>
+        <w:rPr>
+          <w:rFonts w:ascii="Segoe UI" w:eastAsia="Times New Roman" w:hAnsi="Segoe UI" w:cs="Segoe UI"/>
+          <w:b/>
+          <w:bCs/>
+          <w:color w:val="101010"/>
+          <w:sz w:val="21"/>
+          <w:szCs w:val="21"/>
+          <w:lang w:eastAsia="fr-FR"/>
+        </w:rPr>
+        <w:t xml:space="preserve"> !</w:t>
+      </w:r>
+    </w:p>
+    <w:p>
+      <w:pPr>
+        <w:shd w:val="clear" w:color="auto" w:fill="F9F9F9"/>
+        <w:spacing w:after="0" w:line="240" w:lineRule="auto"/>
+        <w:rPr>
+          <w:rFonts w:ascii="Segoe UI" w:eastAsia="Times New Roman" w:hAnsi="Segoe UI" w:cs="Segoe UI"/>
+          <w:color w:val="101010"/>
+          <w:sz w:val="21"/>
+          <w:szCs w:val="21"/>
+          <w:lang w:eastAsia="fr-FR"/>
+        </w:rPr>
+      </w:pPr>
+      <w:r>
+        <w:rPr>
+          <w:rFonts w:ascii="Segoe UI" w:eastAsia="Times New Roman" w:hAnsi="Segoe UI" w:cs="Segoe UI"/>
+          <w:color w:val="101010"/>
+          <w:sz w:val="21"/>
+          <w:szCs w:val="21"/>
+          <w:lang w:eastAsia="fr-FR"/>
+        </w:rPr>
+        <w:t>Voici exactement ce que vous devez faire maintenant :</w:t>
+      </w:r>
+    </w:p>
+    <w:p>
+      <w:pPr>
+        <w:numPr>
+          <w:ilvl w:val="0"/>
+          <w:numId w:val="25"/>
+        </w:numPr>
+        <w:shd w:val="clear" w:color="auto" w:fill="F9F9F9"/>
+        <w:spacing w:after="0" w:line="240" w:lineRule="auto"/>
+        <w:ind w:left="0"/>
+        <w:rPr>
+          <w:rFonts w:ascii="Segoe UI" w:eastAsia="Times New Roman" w:hAnsi="Segoe UI" w:cs="Segoe UI"/>
+          <w:color w:val="101010"/>
+          <w:sz w:val="21"/>
+          <w:szCs w:val="21"/>
+          <w:lang w:eastAsia="fr-FR"/>
+        </w:rPr>
+      </w:pPr>
+      <w:r>
+        <w:rPr>
+          <w:rFonts w:ascii="Segoe UI" w:eastAsia="Times New Roman" w:hAnsi="Segoe UI" w:cs="Segoe UI"/>
+          <w:color w:val="101010"/>
+          <w:sz w:val="21"/>
+          <w:szCs w:val="21"/>
+          <w:lang w:eastAsia="fr-FR"/>
+        </w:rPr>
+        <w:t>Allez sur le site </w:t>
+      </w:r>
+      <w:hyperlink r:id="rId9" w:history="1">
+        <w:r>
+          <w:rPr>
+            <w:rFonts w:ascii="Segoe UI" w:eastAsia="Times New Roman" w:hAnsi="Segoe UI" w:cs="Segoe UI"/>
+            <w:b/>
+            <w:bCs/>
+            <w:color w:val="3E8ED1"/>
+            <w:sz w:val="21"/>
+            <w:szCs w:val="21"/>
+            <w:u w:val="single"/>
+            <w:lang w:eastAsia="fr-FR"/>
+          </w:rPr>
+          <w:t>Render.com</w:t>
+        </w:r>
+      </w:hyperlink>
+    </w:p>
+    <w:p>
+      <w:pPr>
+        <w:numPr>
+          <w:ilvl w:val="0"/>
+          <w:numId w:val="25"/>
+        </w:numPr>
+        <w:shd w:val="clear" w:color="auto" w:fill="F9F9F9"/>
+        <w:spacing w:after="0" w:line="240" w:lineRule="auto"/>
+        <w:ind w:left="0"/>
+        <w:rPr>
+          <w:rFonts w:ascii="Segoe UI" w:eastAsia="Times New Roman" w:hAnsi="Segoe UI" w:cs="Segoe UI"/>
+          <w:color w:val="101010"/>
+          <w:sz w:val="21"/>
+          <w:szCs w:val="21"/>
+          <w:lang w:eastAsia="fr-FR"/>
+        </w:rPr>
+      </w:pPr>
+      <w:r>
+        <w:rPr>
+          <w:rFonts w:ascii="Segoe UI" w:eastAsia="Times New Roman" w:hAnsi="Segoe UI" w:cs="Segoe UI"/>
+          <w:color w:val="101010"/>
+          <w:sz w:val="21"/>
+          <w:szCs w:val="21"/>
+          <w:lang w:eastAsia="fr-FR"/>
+        </w:rPr>
+        <w:t>Cliquez en haut à droite sur </w:t>
+      </w:r>
+      <w:r>
+        <w:rPr>
+          <w:rFonts w:ascii="Segoe UI" w:eastAsia="Times New Roman" w:hAnsi="Segoe UI" w:cs="Segoe UI"/>
+          <w:b/>
+          <w:bCs/>
+          <w:color w:val="101010"/>
+          <w:sz w:val="21"/>
+          <w:szCs w:val="21"/>
+          <w:lang w:eastAsia="fr-FR"/>
+        </w:rPr>
+        <w:t>"</w:t>
+      </w:r>
+      <w:proofErr w:type="spellStart"/>
+      <w:r>
+        <w:rPr>
+          <w:rFonts w:ascii="Segoe UI" w:eastAsia="Times New Roman" w:hAnsi="Segoe UI" w:cs="Segoe UI"/>
+          <w:b/>
+          <w:bCs/>
+          <w:color w:val="101010"/>
+          <w:sz w:val="21"/>
+          <w:szCs w:val="21"/>
+          <w:lang w:eastAsia="fr-FR"/>
+        </w:rPr>
+        <w:t>Get</w:t>
+      </w:r>
+      <w:proofErr w:type="spellEnd"/>
+      <w:r>
+        <w:rPr>
+          <w:rFonts w:ascii="Segoe UI" w:eastAsia="Times New Roman" w:hAnsi="Segoe UI" w:cs="Segoe UI"/>
+          <w:b/>
+          <w:bCs/>
+          <w:color w:val="101010"/>
+          <w:sz w:val="21"/>
+          <w:szCs w:val="21"/>
+          <w:lang w:eastAsia="fr-FR"/>
+        </w:rPr>
+        <w:t xml:space="preserve"> </w:t>
+      </w:r>
+      <w:proofErr w:type="spellStart"/>
+      <w:r>
+        <w:rPr>
+          <w:rFonts w:ascii="Segoe UI" w:eastAsia="Times New Roman" w:hAnsi="Segoe UI" w:cs="Segoe UI"/>
+          <w:b/>
+          <w:bCs/>
+          <w:color w:val="101010"/>
+          <w:sz w:val="21"/>
+          <w:szCs w:val="21"/>
+          <w:lang w:eastAsia="fr-FR"/>
+        </w:rPr>
+        <w:t>Started</w:t>
+      </w:r>
+      <w:proofErr w:type="spellEnd"/>
+      <w:r>
+        <w:rPr>
+          <w:rFonts w:ascii="Segoe UI" w:eastAsia="Times New Roman" w:hAnsi="Segoe UI" w:cs="Segoe UI"/>
+          <w:b/>
+          <w:bCs/>
+          <w:color w:val="101010"/>
+          <w:sz w:val="21"/>
+          <w:szCs w:val="21"/>
+          <w:lang w:eastAsia="fr-FR"/>
+        </w:rPr>
+        <w:t>"</w:t>
+      </w:r>
+      <w:r>
+        <w:rPr>
+          <w:rFonts w:ascii="Segoe UI" w:eastAsia="Times New Roman" w:hAnsi="Segoe UI" w:cs="Segoe UI"/>
+          <w:color w:val="101010"/>
+          <w:sz w:val="21"/>
+          <w:szCs w:val="21"/>
+          <w:lang w:eastAsia="fr-FR"/>
+        </w:rPr>
+        <w:t> (ou </w:t>
+      </w:r>
+      <w:proofErr w:type="spellStart"/>
+      <w:r>
+        <w:rPr>
+          <w:rFonts w:ascii="Segoe UI" w:eastAsia="Times New Roman" w:hAnsi="Segoe UI" w:cs="Segoe UI"/>
+          <w:i/>
+          <w:iCs/>
+          <w:color w:val="101010"/>
+          <w:sz w:val="21"/>
+          <w:szCs w:val="21"/>
+          <w:lang w:eastAsia="fr-FR"/>
+        </w:rPr>
+        <w:t>Sign</w:t>
+      </w:r>
+      <w:proofErr w:type="spellEnd"/>
+      <w:r>
+        <w:rPr>
+          <w:rFonts w:ascii="Segoe UI" w:eastAsia="Times New Roman" w:hAnsi="Segoe UI" w:cs="Segoe UI"/>
+          <w:i/>
+          <w:iCs/>
+          <w:color w:val="101010"/>
+          <w:sz w:val="21"/>
+          <w:szCs w:val="21"/>
+          <w:lang w:eastAsia="fr-FR"/>
+        </w:rPr>
+        <w:t xml:space="preserve"> in</w:t>
+      </w:r>
+      <w:r>
+        <w:rPr>
+          <w:rFonts w:ascii="Segoe UI" w:eastAsia="Times New Roman" w:hAnsi="Segoe UI" w:cs="Segoe UI"/>
+          <w:color w:val="101010"/>
+          <w:sz w:val="21"/>
+          <w:szCs w:val="21"/>
+          <w:lang w:eastAsia="fr-FR"/>
+        </w:rPr>
+        <w:t> / </w:t>
+      </w:r>
+      <w:r>
+        <w:rPr>
+          <w:rFonts w:ascii="Segoe UI" w:eastAsia="Times New Roman" w:hAnsi="Segoe UI" w:cs="Segoe UI"/>
+          <w:i/>
+          <w:iCs/>
+          <w:color w:val="101010"/>
+          <w:sz w:val="21"/>
+          <w:szCs w:val="21"/>
+          <w:lang w:eastAsia="fr-FR"/>
+        </w:rPr>
+        <w:t>Dashboard</w:t>
+      </w:r>
+      <w:r>
+        <w:rPr>
+          <w:rFonts w:ascii="Segoe UI" w:eastAsia="Times New Roman" w:hAnsi="Segoe UI" w:cs="Segoe UI"/>
+          <w:color w:val="101010"/>
+          <w:sz w:val="21"/>
+          <w:szCs w:val="21"/>
+          <w:lang w:eastAsia="fr-FR"/>
+        </w:rPr>
+        <w:t>) et choisissez de vous connecter avec </w:t>
+      </w:r>
+      <w:r>
+        <w:rPr>
+          <w:rFonts w:ascii="Segoe UI" w:eastAsia="Times New Roman" w:hAnsi="Segoe UI" w:cs="Segoe UI"/>
+          <w:b/>
+          <w:bCs/>
+          <w:color w:val="101010"/>
+          <w:sz w:val="21"/>
+          <w:szCs w:val="21"/>
+          <w:lang w:eastAsia="fr-FR"/>
+        </w:rPr>
+        <w:t>GitHub</w:t>
+      </w:r>
+      <w:r>
+        <w:rPr>
+          <w:rFonts w:ascii="Segoe UI" w:eastAsia="Times New Roman" w:hAnsi="Segoe UI" w:cs="Segoe UI"/>
+          <w:color w:val="101010"/>
+          <w:sz w:val="21"/>
+          <w:szCs w:val="21"/>
+          <w:lang w:eastAsia="fr-FR"/>
+        </w:rPr>
+        <w:t>.</w:t>
+      </w:r>
+    </w:p>
+    <w:p>
+      <w:pPr>
+        <w:numPr>
+          <w:ilvl w:val="0"/>
+          <w:numId w:val="25"/>
+        </w:numPr>
+        <w:shd w:val="clear" w:color="auto" w:fill="F9F9F9"/>
+        <w:spacing w:after="0" w:line="240" w:lineRule="auto"/>
+        <w:ind w:left="0"/>
+        <w:rPr>
+          <w:rFonts w:ascii="Segoe UI" w:eastAsia="Times New Roman" w:hAnsi="Segoe UI" w:cs="Segoe UI"/>
+          <w:color w:val="101010"/>
+          <w:sz w:val="21"/>
+          <w:szCs w:val="21"/>
+          <w:lang w:eastAsia="fr-FR"/>
+        </w:rPr>
+      </w:pPr>
+      <w:r>
+        <w:rPr>
+          <w:rFonts w:ascii="Segoe UI" w:eastAsia="Times New Roman" w:hAnsi="Segoe UI" w:cs="Segoe UI"/>
+          <w:color w:val="101010"/>
+          <w:sz w:val="21"/>
+          <w:szCs w:val="21"/>
+          <w:lang w:eastAsia="fr-FR"/>
+        </w:rPr>
+        <w:t xml:space="preserve">Une fois sur votre tableau de bord </w:t>
+      </w:r>
+      <w:proofErr w:type="spellStart"/>
+      <w:r>
+        <w:rPr>
+          <w:rFonts w:ascii="Segoe UI" w:eastAsia="Times New Roman" w:hAnsi="Segoe UI" w:cs="Segoe UI"/>
+          <w:color w:val="101010"/>
+          <w:sz w:val="21"/>
+          <w:szCs w:val="21"/>
+          <w:lang w:eastAsia="fr-FR"/>
+        </w:rPr>
+        <w:t>Render</w:t>
+      </w:r>
+      <w:proofErr w:type="spellEnd"/>
+      <w:r>
+        <w:rPr>
+          <w:rFonts w:ascii="Segoe UI" w:eastAsia="Times New Roman" w:hAnsi="Segoe UI" w:cs="Segoe UI"/>
+          <w:color w:val="101010"/>
+          <w:sz w:val="21"/>
+          <w:szCs w:val="21"/>
+          <w:lang w:eastAsia="fr-FR"/>
+        </w:rPr>
+        <w:t>, cliquez sur le bouton </w:t>
+      </w:r>
+      <w:r>
+        <w:rPr>
+          <w:rFonts w:ascii="Segoe UI" w:eastAsia="Times New Roman" w:hAnsi="Segoe UI" w:cs="Segoe UI"/>
+          <w:b/>
+          <w:bCs/>
+          <w:color w:val="101010"/>
+          <w:sz w:val="21"/>
+          <w:szCs w:val="21"/>
+          <w:lang w:eastAsia="fr-FR"/>
+        </w:rPr>
+        <w:t>"New +"</w:t>
+      </w:r>
+      <w:r>
+        <w:rPr>
+          <w:rFonts w:ascii="Segoe UI" w:eastAsia="Times New Roman" w:hAnsi="Segoe UI" w:cs="Segoe UI"/>
+          <w:color w:val="101010"/>
+          <w:sz w:val="21"/>
+          <w:szCs w:val="21"/>
+          <w:lang w:eastAsia="fr-FR"/>
+        </w:rPr>
+        <w:t> et choisissez </w:t>
+      </w:r>
+      <w:r>
+        <w:rPr>
+          <w:rFonts w:ascii="Segoe UI" w:eastAsia="Times New Roman" w:hAnsi="Segoe UI" w:cs="Segoe UI"/>
+          <w:b/>
+          <w:bCs/>
+          <w:color w:val="101010"/>
+          <w:sz w:val="21"/>
+          <w:szCs w:val="21"/>
+          <w:lang w:eastAsia="fr-FR"/>
+        </w:rPr>
+        <w:t>"Web Service"</w:t>
+      </w:r>
+      <w:r>
+        <w:rPr>
+          <w:rFonts w:ascii="Segoe UI" w:eastAsia="Times New Roman" w:hAnsi="Segoe UI" w:cs="Segoe UI"/>
+          <w:color w:val="101010"/>
+          <w:sz w:val="21"/>
+          <w:szCs w:val="21"/>
+          <w:lang w:eastAsia="fr-FR"/>
+        </w:rPr>
+        <w:t>.</w:t>
+      </w:r>
+    </w:p>
+    <w:p>
+      <w:pPr>
+        <w:numPr>
+          <w:ilvl w:val="0"/>
+          <w:numId w:val="25"/>
+        </w:numPr>
+        <w:shd w:val="clear" w:color="auto" w:fill="F9F9F9"/>
+        <w:spacing w:after="0" w:line="240" w:lineRule="auto"/>
+        <w:ind w:left="0"/>
+        <w:rPr>
+          <w:rFonts w:ascii="Segoe UI" w:eastAsia="Times New Roman" w:hAnsi="Segoe UI" w:cs="Segoe UI"/>
+          <w:color w:val="101010"/>
+          <w:sz w:val="21"/>
+          <w:szCs w:val="21"/>
+          <w:lang w:eastAsia="fr-FR"/>
+        </w:rPr>
+      </w:pPr>
+      <w:proofErr w:type="spellStart"/>
+      <w:r>
+        <w:rPr>
+          <w:rFonts w:ascii="Segoe UI" w:eastAsia="Times New Roman" w:hAnsi="Segoe UI" w:cs="Segoe UI"/>
+          <w:color w:val="101010"/>
+          <w:sz w:val="21"/>
+          <w:szCs w:val="21"/>
+          <w:lang w:eastAsia="fr-FR"/>
+        </w:rPr>
+        <w:t>Render</w:t>
+      </w:r>
+      <w:proofErr w:type="spellEnd"/>
+      <w:r>
+        <w:rPr>
+          <w:rFonts w:ascii="Segoe UI" w:eastAsia="Times New Roman" w:hAnsi="Segoe UI" w:cs="Segoe UI"/>
+          <w:color w:val="101010"/>
+          <w:sz w:val="21"/>
+          <w:szCs w:val="21"/>
+          <w:lang w:eastAsia="fr-FR"/>
+        </w:rPr>
+        <w:t xml:space="preserve"> va vous montrer la liste de vos projets GitHub. Cliquez sur le bouton </w:t>
+      </w:r>
+      <w:r>
+        <w:rPr>
+          <w:rFonts w:ascii="Segoe UI" w:eastAsia="Times New Roman" w:hAnsi="Segoe UI" w:cs="Segoe UI"/>
+          <w:b/>
+          <w:bCs/>
+          <w:color w:val="101010"/>
+          <w:sz w:val="21"/>
+          <w:szCs w:val="21"/>
+          <w:lang w:eastAsia="fr-FR"/>
+        </w:rPr>
+        <w:t>"</w:t>
+      </w:r>
+      <w:proofErr w:type="spellStart"/>
+      <w:r>
+        <w:rPr>
+          <w:rFonts w:ascii="Segoe UI" w:eastAsia="Times New Roman" w:hAnsi="Segoe UI" w:cs="Segoe UI"/>
+          <w:b/>
+          <w:bCs/>
+          <w:color w:val="101010"/>
+          <w:sz w:val="21"/>
+          <w:szCs w:val="21"/>
+          <w:lang w:eastAsia="fr-FR"/>
+        </w:rPr>
+        <w:t>Connect</w:t>
+      </w:r>
+      <w:proofErr w:type="spellEnd"/>
+      <w:r>
+        <w:rPr>
+          <w:rFonts w:ascii="Segoe UI" w:eastAsia="Times New Roman" w:hAnsi="Segoe UI" w:cs="Segoe UI"/>
+          <w:b/>
+          <w:bCs/>
+          <w:color w:val="101010"/>
+          <w:sz w:val="21"/>
+          <w:szCs w:val="21"/>
+          <w:lang w:eastAsia="fr-FR"/>
+        </w:rPr>
+        <w:t>"</w:t>
+      </w:r>
+      <w:r>
+        <w:rPr>
+          <w:rFonts w:ascii="Segoe UI" w:eastAsia="Times New Roman" w:hAnsi="Segoe UI" w:cs="Segoe UI"/>
+          <w:color w:val="101010"/>
+          <w:sz w:val="21"/>
+          <w:szCs w:val="21"/>
+          <w:lang w:eastAsia="fr-FR"/>
+        </w:rPr>
+        <w:t> à côté de votre projet </w:t>
+      </w:r>
+      <w:r>
+        <w:rPr>
+          <w:rFonts w:ascii="Consolas" w:eastAsia="Times New Roman" w:hAnsi="Consolas" w:cs="Courier New"/>
+          <w:color w:val="A31515"/>
+          <w:sz w:val="19"/>
+          <w:szCs w:val="19"/>
+          <w:lang w:eastAsia="fr-FR"/>
+        </w:rPr>
+        <w:t>Service-go</w:t>
+      </w:r>
+      <w:r>
+        <w:rPr>
+          <w:rFonts w:ascii="Segoe UI" w:eastAsia="Times New Roman" w:hAnsi="Segoe UI" w:cs="Segoe UI"/>
+          <w:color w:val="101010"/>
+          <w:sz w:val="21"/>
+          <w:szCs w:val="21"/>
+          <w:lang w:eastAsia="fr-FR"/>
+        </w:rPr>
+        <w:t>.</w:t>
+      </w:r>
+    </w:p>
+    <w:p>
+      <w:pPr>
+        <w:shd w:val="clear" w:color="auto" w:fill="F9F9F9"/>
+        <w:spacing w:before="100" w:beforeAutospacing="1" w:after="100" w:afterAutospacing="1" w:line="240" w:lineRule="auto"/>
+        <w:outlineLvl w:val="2"/>
+        <w:rPr>
+          <w:rFonts w:ascii="Segoe UI" w:eastAsia="Times New Roman" w:hAnsi="Segoe UI" w:cs="Segoe UI"/>
+          <w:color w:val="101010"/>
+          <w:sz w:val="24"/>
+          <w:szCs w:val="24"/>
+          <w:lang w:eastAsia="fr-FR"/>
+        </w:rPr>
+      </w:pPr>
+      <w:r>
+        <w:rPr>
+          <w:rFonts w:ascii="Segoe UI Symbol" w:eastAsia="Times New Roman" w:hAnsi="Segoe UI Symbol" w:cs="Segoe UI Symbol"/>
+          <w:color w:val="101010"/>
+          <w:sz w:val="24"/>
+          <w:szCs w:val="24"/>
+          <w:lang w:eastAsia="fr-FR"/>
+        </w:rPr>
+        <w:t>⚙️</w:t>
+      </w:r>
+      <w:r>
+        <w:rPr>
+          <w:rFonts w:ascii="Segoe UI" w:eastAsia="Times New Roman" w:hAnsi="Segoe UI" w:cs="Segoe UI"/>
+          <w:color w:val="101010"/>
+          <w:sz w:val="24"/>
+          <w:szCs w:val="24"/>
+          <w:lang w:eastAsia="fr-FR"/>
+        </w:rPr>
+        <w:t xml:space="preserve"> La page de configuration (Très important)</w:t>
+      </w:r>
+    </w:p>
+    <w:p>
+      <w:pPr>
+        <w:shd w:val="clear" w:color="auto" w:fill="F9F9F9"/>
+        <w:spacing w:after="0" w:line="240" w:lineRule="auto"/>
+        <w:rPr>
+          <w:rFonts w:ascii="Segoe UI" w:eastAsia="Times New Roman" w:hAnsi="Segoe UI" w:cs="Segoe UI"/>
+          <w:color w:val="101010"/>
+          <w:sz w:val="21"/>
+          <w:szCs w:val="21"/>
+          <w:lang w:eastAsia="fr-FR"/>
+        </w:rPr>
+      </w:pPr>
+      <w:r>
+        <w:rPr>
+          <w:rFonts w:ascii="Segoe UI" w:eastAsia="Times New Roman" w:hAnsi="Segoe UI" w:cs="Segoe UI"/>
+          <w:color w:val="101010"/>
+          <w:sz w:val="21"/>
+          <w:szCs w:val="21"/>
+          <w:lang w:eastAsia="fr-FR"/>
+        </w:rPr>
+        <w:t>Sur la page qui s'affiche, remplissez les informations exactement comme ceci :</w:t>
+      </w:r>
+    </w:p>
+    <w:p>
+      <w:pPr>
+        <w:numPr>
+          <w:ilvl w:val="0"/>
+          <w:numId w:val="26"/>
+        </w:numPr>
+        <w:shd w:val="clear" w:color="auto" w:fill="F9F9F9"/>
+        <w:spacing w:after="0" w:line="240" w:lineRule="auto"/>
+        <w:ind w:left="0"/>
+        <w:rPr>
+          <w:rFonts w:ascii="Segoe UI" w:eastAsia="Times New Roman" w:hAnsi="Segoe UI" w:cs="Segoe UI"/>
+          <w:color w:val="101010"/>
+          <w:sz w:val="21"/>
+          <w:szCs w:val="21"/>
+          <w:lang w:eastAsia="fr-FR"/>
+        </w:rPr>
+      </w:pPr>
+      <w:r>
+        <w:rPr>
+          <w:rFonts w:ascii="Segoe UI" w:eastAsia="Times New Roman" w:hAnsi="Segoe UI" w:cs="Segoe UI"/>
+          <w:b/>
+          <w:bCs/>
+          <w:color w:val="101010"/>
+          <w:sz w:val="21"/>
+          <w:szCs w:val="21"/>
+          <w:lang w:eastAsia="fr-FR"/>
+        </w:rPr>
+        <w:t>Name :</w:t>
+      </w:r>
+      <w:r>
+        <w:rPr>
+          <w:rFonts w:ascii="Segoe UI" w:eastAsia="Times New Roman" w:hAnsi="Segoe UI" w:cs="Segoe UI"/>
+          <w:color w:val="101010"/>
+          <w:sz w:val="21"/>
+          <w:szCs w:val="21"/>
+          <w:lang w:eastAsia="fr-FR"/>
+        </w:rPr>
+        <w:t> </w:t>
+      </w:r>
+      <w:r>
+        <w:rPr>
+          <w:rFonts w:ascii="Consolas" w:eastAsia="Times New Roman" w:hAnsi="Consolas" w:cs="Courier New"/>
+          <w:color w:val="A31515"/>
+          <w:sz w:val="19"/>
+          <w:szCs w:val="19"/>
+          <w:lang w:eastAsia="fr-FR"/>
+        </w:rPr>
+        <w:t>service-go</w:t>
+      </w:r>
+      <w:r>
+        <w:rPr>
+          <w:rFonts w:ascii="Segoe UI" w:eastAsia="Times New Roman" w:hAnsi="Segoe UI" w:cs="Segoe UI"/>
+          <w:color w:val="101010"/>
+          <w:sz w:val="21"/>
+          <w:szCs w:val="21"/>
+          <w:lang w:eastAsia="fr-FR"/>
+        </w:rPr>
+        <w:t> </w:t>
+      </w:r>
+      <w:r>
+        <w:rPr>
+          <w:rFonts w:ascii="Segoe UI" w:eastAsia="Times New Roman" w:hAnsi="Segoe UI" w:cs="Segoe UI"/>
+          <w:i/>
+          <w:iCs/>
+          <w:color w:val="101010"/>
+          <w:sz w:val="21"/>
+          <w:szCs w:val="21"/>
+          <w:lang w:eastAsia="fr-FR"/>
+        </w:rPr>
+        <w:t>(ou n'importe quel nom, cela donnera service-go.onrender.com)</w:t>
+      </w:r>
+    </w:p>
+    <w:p>
+      <w:pPr>
+        <w:numPr>
+          <w:ilvl w:val="0"/>
+          <w:numId w:val="26"/>
+        </w:numPr>
+        <w:shd w:val="clear" w:color="auto" w:fill="F9F9F9"/>
+        <w:spacing w:after="0" w:line="240" w:lineRule="auto"/>
+        <w:ind w:left="0"/>
+        <w:rPr>
+          <w:rFonts w:ascii="Segoe UI" w:eastAsia="Times New Roman" w:hAnsi="Segoe UI" w:cs="Segoe UI"/>
+          <w:color w:val="101010"/>
+          <w:sz w:val="21"/>
+          <w:szCs w:val="21"/>
+          <w:lang w:eastAsia="fr-FR"/>
+        </w:rPr>
+      </w:pPr>
+      <w:proofErr w:type="spellStart"/>
+      <w:r>
+        <w:rPr>
+          <w:rFonts w:ascii="Segoe UI" w:eastAsia="Times New Roman" w:hAnsi="Segoe UI" w:cs="Segoe UI"/>
+          <w:b/>
+          <w:bCs/>
+          <w:color w:val="101010"/>
+          <w:sz w:val="21"/>
+          <w:szCs w:val="21"/>
+          <w:lang w:eastAsia="fr-FR"/>
+        </w:rPr>
+        <w:t>Language</w:t>
+      </w:r>
+      <w:proofErr w:type="spellEnd"/>
+      <w:r>
+        <w:rPr>
+          <w:rFonts w:ascii="Segoe UI" w:eastAsia="Times New Roman" w:hAnsi="Segoe UI" w:cs="Segoe UI"/>
+          <w:b/>
+          <w:bCs/>
+          <w:color w:val="101010"/>
+          <w:sz w:val="21"/>
+          <w:szCs w:val="21"/>
+          <w:lang w:eastAsia="fr-FR"/>
+        </w:rPr>
+        <w:t xml:space="preserve"> / </w:t>
+      </w:r>
+      <w:proofErr w:type="spellStart"/>
+      <w:r>
+        <w:rPr>
+          <w:rFonts w:ascii="Segoe UI" w:eastAsia="Times New Roman" w:hAnsi="Segoe UI" w:cs="Segoe UI"/>
+          <w:b/>
+          <w:bCs/>
+          <w:color w:val="101010"/>
+          <w:sz w:val="21"/>
+          <w:szCs w:val="21"/>
+          <w:lang w:eastAsia="fr-FR"/>
+        </w:rPr>
+        <w:t>Environment</w:t>
+      </w:r>
+      <w:proofErr w:type="spellEnd"/>
+      <w:r>
+        <w:rPr>
+          <w:rFonts w:ascii="Segoe UI" w:eastAsia="Times New Roman" w:hAnsi="Segoe UI" w:cs="Segoe UI"/>
+          <w:b/>
+          <w:bCs/>
+          <w:color w:val="101010"/>
+          <w:sz w:val="21"/>
+          <w:szCs w:val="21"/>
+          <w:lang w:eastAsia="fr-FR"/>
+        </w:rPr>
+        <w:t xml:space="preserve"> :</w:t>
+      </w:r>
+      <w:r>
+        <w:rPr>
+          <w:rFonts w:ascii="Segoe UI" w:eastAsia="Times New Roman" w:hAnsi="Segoe UI" w:cs="Segoe UI"/>
+          <w:color w:val="101010"/>
+          <w:sz w:val="21"/>
+          <w:szCs w:val="21"/>
+          <w:lang w:eastAsia="fr-FR"/>
+        </w:rPr>
+        <w:t> </w:t>
+      </w:r>
+      <w:proofErr w:type="spellStart"/>
+      <w:r>
+        <w:rPr>
+          <w:rFonts w:ascii="Consolas" w:eastAsia="Times New Roman" w:hAnsi="Consolas" w:cs="Courier New"/>
+          <w:color w:val="A31515"/>
+          <w:sz w:val="19"/>
+          <w:szCs w:val="19"/>
+          <w:lang w:eastAsia="fr-FR"/>
+        </w:rPr>
+        <w:t>Node</w:t>
+      </w:r>
+      <w:proofErr w:type="spellEnd"/>
+    </w:p>
+    <w:p>
+      <w:pPr>
+        <w:numPr>
+          <w:ilvl w:val="0"/>
+          <w:numId w:val="26"/>
+        </w:numPr>
+        <w:shd w:val="clear" w:color="auto" w:fill="F9F9F9"/>
+        <w:spacing w:after="0" w:line="240" w:lineRule="auto"/>
+        <w:ind w:left="0"/>
+        <w:rPr>
+          <w:rFonts w:ascii="Segoe UI" w:eastAsia="Times New Roman" w:hAnsi="Segoe UI" w:cs="Segoe UI"/>
+          <w:color w:val="101010"/>
+          <w:sz w:val="21"/>
+          <w:szCs w:val="21"/>
+          <w:lang w:eastAsia="fr-FR"/>
+        </w:rPr>
+      </w:pPr>
+      <w:r>
+        <w:rPr>
+          <w:rFonts w:ascii="Segoe UI" w:eastAsia="Times New Roman" w:hAnsi="Segoe UI" w:cs="Segoe UI"/>
+          <w:b/>
+          <w:bCs/>
+          <w:color w:val="101010"/>
+          <w:sz w:val="21"/>
+          <w:szCs w:val="21"/>
+          <w:lang w:eastAsia="fr-FR"/>
+        </w:rPr>
+        <w:t>Branch :</w:t>
+      </w:r>
+      <w:r>
+        <w:rPr>
+          <w:rFonts w:ascii="Segoe UI" w:eastAsia="Times New Roman" w:hAnsi="Segoe UI" w:cs="Segoe UI"/>
+          <w:color w:val="101010"/>
+          <w:sz w:val="21"/>
+          <w:szCs w:val="21"/>
+          <w:lang w:eastAsia="fr-FR"/>
+        </w:rPr>
+        <w:t> </w:t>
+      </w:r>
+      <w:r>
+        <w:rPr>
+          <w:rFonts w:ascii="Consolas" w:eastAsia="Times New Roman" w:hAnsi="Consolas" w:cs="Courier New"/>
+          <w:color w:val="A31515"/>
+          <w:sz w:val="19"/>
+          <w:szCs w:val="19"/>
+          <w:lang w:eastAsia="fr-FR"/>
+        </w:rPr>
+        <w:t>main</w:t>
+      </w:r>
+    </w:p>
+    <w:p>
+      <w:pPr>
+        <w:numPr>
+          <w:ilvl w:val="0"/>
+          <w:numId w:val="26"/>
+        </w:numPr>
+        <w:shd w:val="clear" w:color="auto" w:fill="F9F9F9"/>
+        <w:spacing w:after="0" w:line="240" w:lineRule="auto"/>
+        <w:ind w:left="0"/>
+        <w:rPr>
+          <w:rFonts w:ascii="Segoe UI" w:eastAsia="Times New Roman" w:hAnsi="Segoe UI" w:cs="Segoe UI"/>
+          <w:color w:val="101010"/>
+          <w:sz w:val="21"/>
+          <w:szCs w:val="21"/>
+          <w:lang w:val="en-US" w:eastAsia="fr-FR"/>
+        </w:rPr>
+      </w:pPr>
+      <w:r>
+        <w:rPr>
+          <w:rFonts w:ascii="Segoe UI" w:eastAsia="Times New Roman" w:hAnsi="Segoe UI" w:cs="Segoe UI"/>
+          <w:b/>
+          <w:bCs/>
+          <w:color w:val="101010"/>
+          <w:sz w:val="21"/>
+          <w:szCs w:val="21"/>
+          <w:lang w:val="en-US" w:eastAsia="fr-FR"/>
+        </w:rPr>
+        <w:t>Build Command</w:t>
+      </w:r>
+      <w:r>
+        <w:rPr>
+          <w:rFonts w:ascii="Segoe UI" w:eastAsia="Times New Roman" w:hAnsi="Segoe UI" w:cs="Segoe UI"/>
+          <w:color w:val="101010"/>
+          <w:sz w:val="21"/>
+          <w:szCs w:val="21"/>
+          <w:lang w:val="en-US" w:eastAsia="fr-FR"/>
+        </w:rPr>
+        <w:t> </w:t>
+      </w:r>
+      <w:r>
+        <w:rPr>
+          <w:rFonts w:ascii="Segoe UI" w:eastAsia="Times New Roman" w:hAnsi="Segoe UI" w:cs="Segoe UI"/>
+          <w:i/>
+          <w:iCs/>
+          <w:color w:val="101010"/>
+          <w:sz w:val="21"/>
+          <w:szCs w:val="21"/>
+          <w:lang w:val="en-US" w:eastAsia="fr-FR"/>
+        </w:rPr>
+        <w:t>(Copiez-collez exactement ceci)</w:t>
+      </w:r>
+      <w:r>
+        <w:rPr>
+          <w:rFonts w:ascii="Segoe UI" w:eastAsia="Times New Roman" w:hAnsi="Segoe UI" w:cs="Segoe UI"/>
+          <w:color w:val="101010"/>
+          <w:sz w:val="21"/>
+          <w:szCs w:val="21"/>
+          <w:lang w:val="en-US" w:eastAsia="fr-FR"/>
+        </w:rPr>
+        <w:t> : </w:t>
+      </w:r>
+      <w:r>
+        <w:rPr>
+          <w:rFonts w:ascii="Consolas" w:eastAsia="Times New Roman" w:hAnsi="Consolas" w:cs="Courier New"/>
+          <w:color w:val="A31515"/>
+          <w:sz w:val="19"/>
+          <w:szCs w:val="19"/>
+          <w:lang w:val="en-US" w:eastAsia="fr-FR"/>
+        </w:rPr>
+        <w:t>cd frontend &amp;&amp; npm install &amp;&amp; npm run build &amp;&amp; cd ../backend &amp;&amp; npm install</w:t>
+      </w:r>
+    </w:p>
+    <w:p>
+      <w:pPr>
+        <w:numPr>
+          <w:ilvl w:val="0"/>
+          <w:numId w:val="26"/>
+        </w:numPr>
+        <w:shd w:val="clear" w:color="auto" w:fill="F9F9F9"/>
+        <w:spacing w:after="0" w:line="240" w:lineRule="auto"/>
+        <w:ind w:left="0"/>
+        <w:rPr>
+          <w:rFonts w:ascii="Segoe UI" w:eastAsia="Times New Roman" w:hAnsi="Segoe UI" w:cs="Segoe UI"/>
+          <w:color w:val="101010"/>
+          <w:sz w:val="21"/>
+          <w:szCs w:val="21"/>
+          <w:lang w:eastAsia="fr-FR"/>
+        </w:rPr>
+      </w:pPr>
+      <w:r>
+        <w:rPr>
+          <w:rFonts w:ascii="Segoe UI" w:eastAsia="Times New Roman" w:hAnsi="Segoe UI" w:cs="Segoe UI"/>
+          <w:b/>
+          <w:bCs/>
+          <w:color w:val="101010"/>
+          <w:sz w:val="21"/>
+          <w:szCs w:val="21"/>
+          <w:lang w:eastAsia="fr-FR"/>
+        </w:rPr>
+        <w:t>Start Command</w:t>
+      </w:r>
+      <w:r>
+        <w:rPr>
+          <w:rFonts w:ascii="Segoe UI" w:eastAsia="Times New Roman" w:hAnsi="Segoe UI" w:cs="Segoe UI"/>
+          <w:color w:val="101010"/>
+          <w:sz w:val="21"/>
+          <w:szCs w:val="21"/>
+          <w:lang w:eastAsia="fr-FR"/>
+        </w:rPr>
+        <w:t> </w:t>
+      </w:r>
+      <w:r>
+        <w:rPr>
+          <w:rFonts w:ascii="Segoe UI" w:eastAsia="Times New Roman" w:hAnsi="Segoe UI" w:cs="Segoe UI"/>
+          <w:i/>
+          <w:iCs/>
+          <w:color w:val="101010"/>
+          <w:sz w:val="21"/>
+          <w:szCs w:val="21"/>
+          <w:lang w:eastAsia="fr-FR"/>
+        </w:rPr>
+        <w:t>(Copiez-collez exactement ceci)</w:t>
+      </w:r>
+      <w:r>
+        <w:rPr>
+          <w:rFonts w:ascii="Segoe UI" w:eastAsia="Times New Roman" w:hAnsi="Segoe UI" w:cs="Segoe UI"/>
+          <w:color w:val="101010"/>
+          <w:sz w:val="21"/>
+          <w:szCs w:val="21"/>
+          <w:lang w:eastAsia="fr-FR"/>
+        </w:rPr>
+        <w:t> : </w:t>
+      </w:r>
+      <w:r>
+        <w:rPr>
+          <w:rFonts w:ascii="Consolas" w:eastAsia="Times New Roman" w:hAnsi="Consolas" w:cs="Courier New"/>
+          <w:color w:val="A31515"/>
+          <w:sz w:val="19"/>
+          <w:szCs w:val="19"/>
+          <w:lang w:eastAsia="fr-FR"/>
+        </w:rPr>
+        <w:t xml:space="preserve">cd </w:t>
+      </w:r>
+      <w:proofErr w:type="spellStart"/>
+      <w:r>
+        <w:rPr>
+          <w:rFonts w:ascii="Consolas" w:eastAsia="Times New Roman" w:hAnsi="Consolas" w:cs="Courier New"/>
+          <w:color w:val="A31515"/>
+          <w:sz w:val="19"/>
+          <w:szCs w:val="19"/>
+          <w:lang w:eastAsia="fr-FR"/>
+        </w:rPr>
+        <w:t>backend</w:t>
+      </w:r>
+      <w:proofErr w:type="spellEnd"/>
+      <w:r>
+        <w:rPr>
+          <w:rFonts w:ascii="Consolas" w:eastAsia="Times New Roman" w:hAnsi="Consolas" w:cs="Courier New"/>
+          <w:color w:val="A31515"/>
+          <w:sz w:val="19"/>
+          <w:szCs w:val="19"/>
+          <w:lang w:eastAsia="fr-FR"/>
+        </w:rPr>
+        <w:t xml:space="preserve"> &amp;&amp; </w:t>
+      </w:r>
+      <w:proofErr w:type="spellStart"/>
+      <w:r>
+        <w:rPr>
+          <w:rFonts w:ascii="Consolas" w:eastAsia="Times New Roman" w:hAnsi="Consolas" w:cs="Courier New"/>
+          <w:color w:val="A31515"/>
+          <w:sz w:val="19"/>
+          <w:szCs w:val="19"/>
+          <w:lang w:eastAsia="fr-FR"/>
+        </w:rPr>
+        <w:t>node</w:t>
+      </w:r>
+      <w:proofErr w:type="spellEnd"/>
+      <w:r>
+        <w:rPr>
+          <w:rFonts w:ascii="Consolas" w:eastAsia="Times New Roman" w:hAnsi="Consolas" w:cs="Courier New"/>
+          <w:color w:val="A31515"/>
+          <w:sz w:val="19"/>
+          <w:szCs w:val="19"/>
+          <w:lang w:eastAsia="fr-FR"/>
+        </w:rPr>
+        <w:t xml:space="preserve"> server.js</w:t>
+      </w:r>
+    </w:p>
+    <w:p>
+      <w:pPr>
+        <w:numPr>
+          <w:ilvl w:val="0"/>
+          <w:numId w:val="26"/>
+        </w:numPr>
+        <w:shd w:val="clear" w:color="auto" w:fill="F9F9F9"/>
+        <w:spacing w:after="0" w:line="240" w:lineRule="auto"/>
+        <w:ind w:left="0"/>
+        <w:rPr>
+          <w:rFonts w:ascii="Segoe UI" w:eastAsia="Times New Roman" w:hAnsi="Segoe UI" w:cs="Segoe UI"/>
+          <w:color w:val="101010"/>
+          <w:sz w:val="21"/>
+          <w:szCs w:val="21"/>
+          <w:lang w:eastAsia="fr-FR"/>
+        </w:rPr>
+      </w:pPr>
+      <w:r>
+        <w:rPr>
+          <w:rFonts w:ascii="Segoe UI" w:eastAsia="Times New Roman" w:hAnsi="Segoe UI" w:cs="Segoe UI"/>
+          <w:b/>
+          <w:bCs/>
+          <w:color w:val="101010"/>
+          <w:sz w:val="21"/>
+          <w:szCs w:val="21"/>
+          <w:lang w:eastAsia="fr-FR"/>
+        </w:rPr>
+        <w:t>Instance Type :</w:t>
+      </w:r>
+      <w:r>
+        <w:rPr>
+          <w:rFonts w:ascii="Segoe UI" w:eastAsia="Times New Roman" w:hAnsi="Segoe UI" w:cs="Segoe UI"/>
+          <w:color w:val="101010"/>
+          <w:sz w:val="21"/>
+          <w:szCs w:val="21"/>
+          <w:lang w:eastAsia="fr-FR"/>
+        </w:rPr>
+        <w:t> Choisissez bien </w:t>
+      </w:r>
+      <w:r>
+        <w:rPr>
+          <w:rFonts w:ascii="Segoe UI" w:eastAsia="Times New Roman" w:hAnsi="Segoe UI" w:cs="Segoe UI"/>
+          <w:b/>
+          <w:bCs/>
+          <w:color w:val="101010"/>
+          <w:sz w:val="21"/>
+          <w:szCs w:val="21"/>
+          <w:lang w:eastAsia="fr-FR"/>
+        </w:rPr>
+        <w:t>Free</w:t>
+      </w:r>
+      <w:r>
+        <w:rPr>
+          <w:rFonts w:ascii="Segoe UI" w:eastAsia="Times New Roman" w:hAnsi="Segoe UI" w:cs="Segoe UI"/>
+          <w:color w:val="101010"/>
+          <w:sz w:val="21"/>
+          <w:szCs w:val="21"/>
+          <w:lang w:eastAsia="fr-FR"/>
+        </w:rPr>
+        <w:t> (Gratuit).</w:t>
+      </w:r>
+    </w:p>
+    <w:p>
+      <w:pPr>
+        <w:shd w:val="clear" w:color="auto" w:fill="F9F9F9"/>
+        <w:spacing w:after="0" w:line="240" w:lineRule="auto"/>
+        <w:rPr>
+          <w:rFonts w:ascii="Segoe UI" w:eastAsia="Times New Roman" w:hAnsi="Segoe UI" w:cs="Segoe UI"/>
+          <w:color w:val="101010"/>
+          <w:sz w:val="21"/>
+          <w:szCs w:val="21"/>
+          <w:lang w:eastAsia="fr-FR"/>
+        </w:rPr>
+      </w:pPr>
+      <w:r>
+        <w:rPr>
+          <w:rFonts w:ascii="Segoe UI" w:eastAsia="Times New Roman" w:hAnsi="Segoe UI" w:cs="Segoe UI"/>
+          <w:color w:val="101010"/>
+          <w:sz w:val="21"/>
+          <w:szCs w:val="21"/>
+          <w:lang w:eastAsia="fr-FR"/>
+        </w:rPr>
+        <w:t>Cliquez tout en bas sur le bouton </w:t>
+      </w:r>
+      <w:r>
+        <w:rPr>
+          <w:rFonts w:ascii="Segoe UI" w:eastAsia="Times New Roman" w:hAnsi="Segoe UI" w:cs="Segoe UI"/>
+          <w:b/>
+          <w:bCs/>
+          <w:color w:val="101010"/>
+          <w:sz w:val="21"/>
+          <w:szCs w:val="21"/>
+          <w:lang w:eastAsia="fr-FR"/>
+        </w:rPr>
+        <w:t>"</w:t>
+      </w:r>
+      <w:proofErr w:type="spellStart"/>
+      <w:r>
+        <w:rPr>
+          <w:rFonts w:ascii="Segoe UI" w:eastAsia="Times New Roman" w:hAnsi="Segoe UI" w:cs="Segoe UI"/>
+          <w:b/>
+          <w:bCs/>
+          <w:color w:val="101010"/>
+          <w:sz w:val="21"/>
+          <w:szCs w:val="21"/>
+          <w:lang w:eastAsia="fr-FR"/>
+        </w:rPr>
+        <w:t>Create</w:t>
+      </w:r>
+      <w:proofErr w:type="spellEnd"/>
+      <w:r>
+        <w:rPr>
+          <w:rFonts w:ascii="Segoe UI" w:eastAsia="Times New Roman" w:hAnsi="Segoe UI" w:cs="Segoe UI"/>
+          <w:b/>
+          <w:bCs/>
+          <w:color w:val="101010"/>
+          <w:sz w:val="21"/>
+          <w:szCs w:val="21"/>
+          <w:lang w:eastAsia="fr-FR"/>
+        </w:rPr>
+        <w:t xml:space="preserve"> Web Service"</w:t>
+      </w:r>
+      <w:r>
+        <w:rPr>
+          <w:rFonts w:ascii="Segoe UI" w:eastAsia="Times New Roman" w:hAnsi="Segoe UI" w:cs="Segoe UI"/>
+          <w:color w:val="101010"/>
+          <w:sz w:val="21"/>
+          <w:szCs w:val="21"/>
+          <w:lang w:eastAsia="fr-FR"/>
+        </w:rPr>
+        <w:t>.</w:t>
+      </w:r>
+    </w:p>
+    <w:p>
+      <w:pPr>
+        <w:shd w:val="clear" w:color="auto" w:fill="F9F9F9"/>
+        <w:spacing w:after="0" w:line="240" w:lineRule="auto"/>
+        <w:rPr>
+          <w:rFonts w:ascii="Segoe UI" w:eastAsia="Times New Roman" w:hAnsi="Segoe UI" w:cs="Segoe UI"/>
+          <w:color w:val="101010"/>
+          <w:sz w:val="21"/>
+          <w:szCs w:val="21"/>
+          <w:lang w:eastAsia="fr-FR"/>
+        </w:rPr>
+      </w:pPr>
+      <w:r>
+        <w:rPr>
+          <w:rFonts w:ascii="Segoe UI" w:eastAsia="Times New Roman" w:hAnsi="Segoe UI" w:cs="Segoe UI"/>
+          <w:color w:val="101010"/>
+          <w:sz w:val="21"/>
+          <w:szCs w:val="21"/>
+          <w:lang w:eastAsia="fr-FR"/>
+        </w:rPr>
+        <w:t xml:space="preserve">Et voilà ! Laissez l'écran ouvert, vous allez voir défiler du texte (c'est </w:t>
+      </w:r>
+      <w:proofErr w:type="spellStart"/>
+      <w:r>
+        <w:rPr>
+          <w:rFonts w:ascii="Segoe UI" w:eastAsia="Times New Roman" w:hAnsi="Segoe UI" w:cs="Segoe UI"/>
+          <w:color w:val="101010"/>
+          <w:sz w:val="21"/>
+          <w:szCs w:val="21"/>
+          <w:lang w:eastAsia="fr-FR"/>
+        </w:rPr>
+        <w:t>Render</w:t>
+      </w:r>
+      <w:proofErr w:type="spellEnd"/>
+      <w:r>
+        <w:rPr>
+          <w:rFonts w:ascii="Segoe UI" w:eastAsia="Times New Roman" w:hAnsi="Segoe UI" w:cs="Segoe UI"/>
+          <w:color w:val="101010"/>
+          <w:sz w:val="21"/>
+          <w:szCs w:val="21"/>
+          <w:lang w:eastAsia="fr-FR"/>
+        </w:rPr>
+        <w:t xml:space="preserve"> qui installe votre site). Au bout de 2 ou 3 minutes, vous verrez un petit badge vert </w:t>
+      </w:r>
+      <w:r>
+        <w:rPr>
+          <w:rFonts w:ascii="Segoe UI" w:eastAsia="Times New Roman" w:hAnsi="Segoe UI" w:cs="Segoe UI"/>
+          <w:b/>
+          <w:bCs/>
+          <w:color w:val="101010"/>
+          <w:sz w:val="21"/>
+          <w:szCs w:val="21"/>
+          <w:lang w:eastAsia="fr-FR"/>
+        </w:rPr>
+        <w:t>"Live"</w:t>
+      </w:r>
+      <w:r>
+        <w:rPr>
+          <w:rFonts w:ascii="Segoe UI" w:eastAsia="Times New Roman" w:hAnsi="Segoe UI" w:cs="Segoe UI"/>
+          <w:color w:val="101010"/>
+          <w:sz w:val="21"/>
+          <w:szCs w:val="21"/>
+          <w:lang w:eastAsia="fr-FR"/>
+        </w:rPr>
+        <w:t>, et votre lien </w:t>
+      </w:r>
+      <w:r>
+        <w:rPr>
+          <w:rFonts w:ascii="Consolas" w:eastAsia="Times New Roman" w:hAnsi="Consolas" w:cs="Courier New"/>
+          <w:color w:val="A31515"/>
+          <w:sz w:val="19"/>
+          <w:szCs w:val="19"/>
+          <w:lang w:eastAsia="fr-FR"/>
+        </w:rPr>
+        <w:t>https://service-go.onrender.com</w:t>
+      </w:r>
+      <w:r>
+        <w:rPr>
+          <w:rFonts w:ascii="Segoe UI" w:eastAsia="Times New Roman" w:hAnsi="Segoe UI" w:cs="Segoe UI"/>
+          <w:color w:val="101010"/>
+          <w:sz w:val="21"/>
+          <w:szCs w:val="21"/>
+          <w:lang w:eastAsia="fr-FR"/>
+        </w:rPr>
+        <w:t> sera cliquable en haut à gauche !</w:t>
+      </w:r>
+    </w:p>
+    <w:p>
+      <w:pPr>
+        <w:shd w:val="clear" w:color="auto" w:fill="F9F9F9"/>
+        <w:spacing w:after="0" w:line="240" w:lineRule="auto"/>
+        <w:rPr>
+          <w:rFonts w:ascii="Segoe UI" w:eastAsia="Times New Roman" w:hAnsi="Segoe UI" w:cs="Segoe UI"/>
+          <w:color w:val="101010"/>
+          <w:sz w:val="21"/>
+          <w:szCs w:val="21"/>
+          <w:lang w:eastAsia="fr-FR"/>
+        </w:rPr>
+      </w:pPr>
+      <w:r>
+        <w:rPr>
+          <w:rFonts w:ascii="Segoe UI" w:eastAsia="Times New Roman" w:hAnsi="Segoe UI" w:cs="Segoe UI"/>
+          <w:color w:val="101010"/>
+          <w:sz w:val="21"/>
+          <w:szCs w:val="21"/>
+          <w:lang w:eastAsia="fr-FR"/>
+        </w:rPr>
+        <w:t xml:space="preserve">Envoyez-moi le lien dès que c'est terminé ! </w:t>
+      </w:r>
+      <w:r>
+        <w:rPr>
+          <w:rFonts w:ascii="Segoe UI Symbol" w:eastAsia="Times New Roman" w:hAnsi="Segoe UI Symbol" w:cs="Segoe UI Symbol"/>
+          <w:color w:val="101010"/>
+          <w:sz w:val="21"/>
+          <w:szCs w:val="21"/>
+          <w:lang w:eastAsia="fr-FR"/>
+        </w:rPr>
+        <w:t>🚀</w:t>
+      </w:r>
+    </w:p>
+    <w:p>
+      <w:pPr>
+        <w:shd w:val="clear" w:color="auto" w:fill="F9F9F9"/>
+        <w:spacing w:after="0" w:line="240" w:lineRule="auto"/>
+        <w:rPr>
+          <w:rFonts w:ascii="Segoe UI" w:eastAsia="Times New Roman" w:hAnsi="Segoe UI" w:cs="Segoe UI"/>
+          <w:color w:val="101010"/>
+          <w:sz w:val="18"/>
+          <w:szCs w:val="18"/>
+          <w:lang w:eastAsia="fr-FR"/>
+        </w:rPr>
+      </w:pPr>
+      <w:proofErr w:type="gramStart"/>
+      <w:r>
+        <w:rPr>
+          <w:rFonts w:ascii="Segoe UI" w:eastAsia="Times New Roman" w:hAnsi="Segoe UI" w:cs="Segoe UI"/>
+          <w:color w:val="101010"/>
+          <w:sz w:val="18"/>
+          <w:szCs w:val="18"/>
+          <w:lang w:eastAsia="fr-FR"/>
+        </w:rPr>
+        <w:t>15:</w:t>
+      </w:r>
+      <w:proofErr w:type="gramEnd"/>
+      <w:r>
+        <w:rPr>
+          <w:rFonts w:ascii="Segoe UI" w:eastAsia="Times New Roman" w:hAnsi="Segoe UI" w:cs="Segoe UI"/>
+          <w:color w:val="101010"/>
+          <w:sz w:val="18"/>
+          <w:szCs w:val="18"/>
+          <w:lang w:eastAsia="fr-FR"/>
+        </w:rPr>
+        <w:t>44</w:t>
+      </w:r>
+    </w:p>
+    <w:p>
+      <w:pPr>
+        <w:rPr>
+          <w:rFonts w:asciiTheme="majorBidi" w:hAnsiTheme="majorBidi" w:cstheme="majorBidi"/>
+          <w:sz w:val="24"/>
+          <w:szCs w:val="24"/>
+        </w:rPr>
+      </w:pPr>
+      <w:bookmarkStart w:id="0" w:name="_GoBack"/>
+      <w:bookmarkEnd w:id="0"/>
     </w:p>
     <w:sectPr>
       <w:pgSz w:w="11906" w:h="16838" w:code="9"/>
@@ -9252,6 +11587,119 @@
     </w:lvl>
   </w:abstractNum>
   <w:abstractNum w:abstractNumId="4" w15:restartNumberingAfterBreak="0">
+    <w:nsid w:val="123C32E8"/>
+    <w:multiLevelType w:val="multilevel"/>
+    <w:tmpl w:val="7616BAF6"/>
+    <w:lvl w:ilvl="0">
+      <w:start w:val="1"/>
+      <w:numFmt w:val="decimal"/>
+      <w:lvlText w:val="%1."/>
+      <w:lvlJc w:val="left"/>
+      <w:pPr>
+        <w:tabs>
+          <w:tab w:val="num" w:pos="720"/>
+        </w:tabs>
+        <w:ind w:left="720" w:hanging="360"/>
+      </w:pPr>
+    </w:lvl>
+    <w:lvl w:ilvl="1" w:tentative="1">
+      <w:start w:val="1"/>
+      <w:numFmt w:val="decimal"/>
+      <w:lvlText w:val="%2."/>
+      <w:lvlJc w:val="left"/>
+      <w:pPr>
+        <w:tabs>
+          <w:tab w:val="num" w:pos="1440"/>
+        </w:tabs>
+        <w:ind w:left="1440" w:hanging="360"/>
+      </w:pPr>
+    </w:lvl>
+    <w:lvl w:ilvl="2" w:tentative="1">
+      <w:start w:val="1"/>
+      <w:numFmt w:val="decimal"/>
+      <w:lvlText w:val="%3."/>
+      <w:lvlJc w:val="left"/>
+      <w:pPr>
+        <w:tabs>
+          <w:tab w:val="num" w:pos="2160"/>
+        </w:tabs>
+        <w:ind w:left="2160" w:hanging="360"/>
+      </w:pPr>
+    </w:lvl>
+    <w:lvl w:ilvl="3" w:tentative="1">
+      <w:start w:val="1"/>
+      <w:numFmt w:val="decimal"/>
+      <w:lvlText w:val="%4."/>
+      <w:lvlJc w:val="left"/>
+      <w:pPr>
+        <w:tabs>
+          <w:tab w:val="num" w:pos="2880"/>
+        </w:tabs>
+        <w:ind w:left="2880" w:hanging="360"/>
+      </w:pPr>
+    </w:lvl>
+    <w:lvl w:ilvl="4" w:tentative="1">
+      <w:start w:val="1"/>
+      <w:numFmt w:val="decimal"/>
+      <w:lvlText w:val="%5."/>
+      <w:lvlJc w:val="left"/>
+      <w:pPr>
+        <w:tabs>
+          <w:tab w:val="num" w:pos="3600"/>
+        </w:tabs>
+        <w:ind w:left="3600" w:hanging="360"/>
+      </w:pPr>
+    </w:lvl>
+    <w:lvl w:ilvl="5" w:tentative="1">
+      <w:start w:val="1"/>
+      <w:numFmt w:val="decimal"/>
+      <w:lvlText w:val="%6."/>
+      <w:lvlJc w:val="left"/>
+      <w:pPr>
+        <w:tabs>
+          <w:tab w:val="num" w:pos="4320"/>
+        </w:tabs>
+        <w:ind w:left="4320" w:hanging="360"/>
+      </w:pPr>
+    </w:lvl>
+    <w:lvl w:ilvl="6" w:tentative="1">
+      <w:start w:val="1"/>
+      <w:numFmt w:val="decimal"/>
+      <w:lvlText w:val="%7."/>
+      <w:lvlJc w:val="left"/>
+      <w:pPr>
+        <w:tabs>
+          <w:tab w:val="num" w:pos="5040"/>
+        </w:tabs>
+        <w:ind w:left="5040" w:hanging="360"/>
+      </w:pPr>
+    </w:lvl>
+    <w:lvl w:ilvl="7" w:tentative="1">
+      <w:start w:val="1"/>
+      <w:numFmt w:val="decimal"/>
+      <w:lvlText w:val="%8."/>
+      <w:lvlJc w:val="left"/>
+      <w:pPr>
+        <w:tabs>
+          <w:tab w:val="num" w:pos="5760"/>
+        </w:tabs>
+        <w:ind w:left="5760" w:hanging="360"/>
+      </w:pPr>
+    </w:lvl>
+    <w:lvl w:ilvl="8" w:tentative="1">
+      <w:start w:val="1"/>
+      <w:numFmt w:val="decimal"/>
+      <w:lvlText w:val="%9."/>
+      <w:lvlJc w:val="left"/>
+      <w:pPr>
+        <w:tabs>
+          <w:tab w:val="num" w:pos="6480"/>
+        </w:tabs>
+        <w:ind w:left="6480" w:hanging="360"/>
+      </w:pPr>
+    </w:lvl>
+  </w:abstractNum>
+  <w:abstractNum w:abstractNumId="5" w15:restartNumberingAfterBreak="0">
     <w:nsid w:val="150B7B1F"/>
     <w:multiLevelType w:val="multilevel"/>
     <w:tmpl w:val="2C4CDEB6"/>
@@ -9364,7 +11812,7 @@
       </w:pPr>
     </w:lvl>
   </w:abstractNum>
-  <w:abstractNum w:abstractNumId="5" w15:restartNumberingAfterBreak="0">
+  <w:abstractNum w:abstractNumId="6" w15:restartNumberingAfterBreak="0">
     <w:nsid w:val="1A7F3071"/>
     <w:multiLevelType w:val="multilevel"/>
     <w:tmpl w:val="4B94DCA0"/>
@@ -9477,7 +11925,7 @@
       </w:pPr>
     </w:lvl>
   </w:abstractNum>
-  <w:abstractNum w:abstractNumId="6" w15:restartNumberingAfterBreak="0">
+  <w:abstractNum w:abstractNumId="7" w15:restartNumberingAfterBreak="0">
     <w:nsid w:val="1C645F4A"/>
     <w:multiLevelType w:val="multilevel"/>
     <w:tmpl w:val="B130F956"/>
@@ -9590,7 +12038,120 @@
       </w:pPr>
     </w:lvl>
   </w:abstractNum>
-  <w:abstractNum w:abstractNumId="7" w15:restartNumberingAfterBreak="0">
+  <w:abstractNum w:abstractNumId="8" w15:restartNumberingAfterBreak="0">
+    <w:nsid w:val="23082BAF"/>
+    <w:multiLevelType w:val="multilevel"/>
+    <w:tmpl w:val="0744182A"/>
+    <w:lvl w:ilvl="0">
+      <w:start w:val="1"/>
+      <w:numFmt w:val="decimal"/>
+      <w:lvlText w:val="%1."/>
+      <w:lvlJc w:val="left"/>
+      <w:pPr>
+        <w:tabs>
+          <w:tab w:val="num" w:pos="720"/>
+        </w:tabs>
+        <w:ind w:left="720" w:hanging="360"/>
+      </w:pPr>
+    </w:lvl>
+    <w:lvl w:ilvl="1" w:tentative="1">
+      <w:start w:val="1"/>
+      <w:numFmt w:val="decimal"/>
+      <w:lvlText w:val="%2."/>
+      <w:lvlJc w:val="left"/>
+      <w:pPr>
+        <w:tabs>
+          <w:tab w:val="num" w:pos="1440"/>
+        </w:tabs>
+        <w:ind w:left="1440" w:hanging="360"/>
+      </w:pPr>
+    </w:lvl>
+    <w:lvl w:ilvl="2" w:tentative="1">
+      <w:start w:val="1"/>
+      <w:numFmt w:val="decimal"/>
+      <w:lvlText w:val="%3."/>
+      <w:lvlJc w:val="left"/>
+      <w:pPr>
+        <w:tabs>
+          <w:tab w:val="num" w:pos="2160"/>
+        </w:tabs>
+        <w:ind w:left="2160" w:hanging="360"/>
+      </w:pPr>
+    </w:lvl>
+    <w:lvl w:ilvl="3" w:tentative="1">
+      <w:start w:val="1"/>
+      <w:numFmt w:val="decimal"/>
+      <w:lvlText w:val="%4."/>
+      <w:lvlJc w:val="left"/>
+      <w:pPr>
+        <w:tabs>
+          <w:tab w:val="num" w:pos="2880"/>
+        </w:tabs>
+        <w:ind w:left="2880" w:hanging="360"/>
+      </w:pPr>
+    </w:lvl>
+    <w:lvl w:ilvl="4" w:tentative="1">
+      <w:start w:val="1"/>
+      <w:numFmt w:val="decimal"/>
+      <w:lvlText w:val="%5."/>
+      <w:lvlJc w:val="left"/>
+      <w:pPr>
+        <w:tabs>
+          <w:tab w:val="num" w:pos="3600"/>
+        </w:tabs>
+        <w:ind w:left="3600" w:hanging="360"/>
+      </w:pPr>
+    </w:lvl>
+    <w:lvl w:ilvl="5" w:tentative="1">
+      <w:start w:val="1"/>
+      <w:numFmt w:val="decimal"/>
+      <w:lvlText w:val="%6."/>
+      <w:lvlJc w:val="left"/>
+      <w:pPr>
+        <w:tabs>
+          <w:tab w:val="num" w:pos="4320"/>
+        </w:tabs>
+        <w:ind w:left="4320" w:hanging="360"/>
+      </w:pPr>
+    </w:lvl>
+    <w:lvl w:ilvl="6" w:tentative="1">
+      <w:start w:val="1"/>
+      <w:numFmt w:val="decimal"/>
+      <w:lvlText w:val="%7."/>
+      <w:lvlJc w:val="left"/>
+      <w:pPr>
+        <w:tabs>
+          <w:tab w:val="num" w:pos="5040"/>
+        </w:tabs>
+        <w:ind w:left="5040" w:hanging="360"/>
+      </w:pPr>
+    </w:lvl>
+    <w:lvl w:ilvl="7" w:tentative="1">
+      <w:start w:val="1"/>
+      <w:numFmt w:val="decimal"/>
+      <w:lvlText w:val="%8."/>
+      <w:lvlJc w:val="left"/>
+      <w:pPr>
+        <w:tabs>
+          <w:tab w:val="num" w:pos="5760"/>
+        </w:tabs>
+        <w:ind w:left="5760" w:hanging="360"/>
+      </w:pPr>
+    </w:lvl>
+    <w:lvl w:ilvl="8" w:tentative="1">
+      <w:start w:val="1"/>
+      <w:numFmt w:val="decimal"/>
+      <w:lvlText w:val="%9."/>
+      <w:lvlJc w:val="left"/>
+      <w:pPr>
+        <w:tabs>
+          <w:tab w:val="num" w:pos="6480"/>
+        </w:tabs>
+        <w:ind w:left="6480" w:hanging="360"/>
+      </w:pPr>
+    </w:lvl>
+  </w:abstractNum>
+  <w:abstractNum w:abstractNumId="9" w15:restartNumberingAfterBreak="0">
     <w:nsid w:val="255D163E"/>
     <w:multiLevelType w:val="multilevel"/>
     <w:tmpl w:val="09100952"/>
@@ -9739,7 +12300,7 @@
       </w:rPr>
     </w:lvl>
   </w:abstractNum>
-  <w:abstractNum w:abstractNumId="8" w15:restartNumberingAfterBreak="0">
+  <w:abstractNum w:abstractNumId="10" w15:restartNumberingAfterBreak="0">
     <w:nsid w:val="30434474"/>
     <w:multiLevelType w:val="multilevel"/>
     <w:tmpl w:val="D35E6898"/>
@@ -9888,7 +12449,7 @@
       </w:rPr>
     </w:lvl>
   </w:abstractNum>
-  <w:abstractNum w:abstractNumId="9" w15:restartNumberingAfterBreak="0">
+  <w:abstractNum w:abstractNumId="11" w15:restartNumberingAfterBreak="0">
     <w:nsid w:val="30D465EC"/>
     <w:multiLevelType w:val="multilevel"/>
     <w:tmpl w:val="96023E28"/>
@@ -10001,7 +12562,7 @@
       </w:pPr>
     </w:lvl>
   </w:abstractNum>
-  <w:abstractNum w:abstractNumId="10" w15:restartNumberingAfterBreak="0">
+  <w:abstractNum w:abstractNumId="12" w15:restartNumberingAfterBreak="0">
     <w:nsid w:val="36AB793B"/>
     <w:multiLevelType w:val="multilevel"/>
     <w:tmpl w:val="58BA525C"/>
@@ -10114,7 +12675,156 @@
       </w:pPr>
     </w:lvl>
   </w:abstractNum>
-  <w:abstractNum w:abstractNumId="11" w15:restartNumberingAfterBreak="0">
+  <w:abstractNum w:abstractNumId="13" w15:restartNumberingAfterBreak="0">
+    <w:nsid w:val="3E174719"/>
+    <w:multiLevelType w:val="multilevel"/>
+    <w:tmpl w:val="8B6ACB7C"/>
+    <w:lvl w:ilvl="0">
+      <w:start w:val="1"/>
+      <w:numFmt w:val="bullet"/>
+      <w:lvlText w:val=""/>
+      <w:lvlJc w:val="left"/>
+      <w:pPr>
+        <w:tabs>
+          <w:tab w:val="num" w:pos="720"/>
+        </w:tabs>
+        <w:ind w:left="720" w:hanging="360"/>
+      </w:pPr>
+      <w:rPr>
+        <w:rFonts w:ascii="Symbol" w:hAnsi="Symbol" w:hint="default"/>
+        <w:sz w:val="20"/>
+      </w:rPr>
+    </w:lvl>
+    <w:lvl w:ilvl="1" w:tentative="1">
+      <w:start w:val="1"/>
+      <w:numFmt w:val="bullet"/>
+      <w:lvlText w:val=""/>
+      <w:lvlJc w:val="left"/>
+      <w:pPr>
+        <w:tabs>
+          <w:tab w:val="num" w:pos="1440"/>
+        </w:tabs>
+        <w:ind w:left="1440" w:hanging="360"/>
+      </w:pPr>
+      <w:rPr>
+        <w:rFonts w:ascii="Symbol" w:hAnsi="Symbol" w:hint="default"/>
+        <w:sz w:val="20"/>
+      </w:rPr>
+    </w:lvl>
+    <w:lvl w:ilvl="2" w:tentative="1">
+      <w:start w:val="1"/>
+      <w:numFmt w:val="bullet"/>
+      <w:lvlText w:val=""/>
+      <w:lvlJc w:val="left"/>
+      <w:pPr>
+        <w:tabs>
+          <w:tab w:val="num" w:pos="2160"/>
+        </w:tabs>
+        <w:ind w:left="2160" w:hanging="360"/>
+      </w:pPr>
+      <w:rPr>
+        <w:rFonts w:ascii="Symbol" w:hAnsi="Symbol" w:hint="default"/>
+        <w:sz w:val="20"/>
+      </w:rPr>
+    </w:lvl>
+    <w:lvl w:ilvl="3" w:tentative="1">
+      <w:start w:val="1"/>
+      <w:numFmt w:val="bullet"/>
+      <w:lvlText w:val=""/>
+      <w:lvlJc w:val="left"/>
+      <w:pPr>
+        <w:tabs>
+          <w:tab w:val="num" w:pos="2880"/>
+        </w:tabs>
+        <w:ind w:left="2880" w:hanging="360"/>
+      </w:pPr>
+      <w:rPr>
+        <w:rFonts w:ascii="Symbol" w:hAnsi="Symbol" w:hint="default"/>
+        <w:sz w:val="20"/>
+      </w:rPr>
+    </w:lvl>
+    <w:lvl w:ilvl="4" w:tentative="1">
+      <w:start w:val="1"/>
+      <w:numFmt w:val="bullet"/>
+      <w:lvlText w:val=""/>
+      <w:lvlJc w:val="left"/>
+      <w:pPr>
+        <w:tabs>
+          <w:tab w:val="num" w:pos="3600"/>
+        </w:tabs>
+        <w:ind w:left="3600" w:hanging="360"/>
+      </w:pPr>
+      <w:rPr>
+        <w:rFonts w:ascii="Symbol" w:hAnsi="Symbol" w:hint="default"/>
+        <w:sz w:val="20"/>
+      </w:rPr>
+    </w:lvl>
+    <w:lvl w:ilvl="5" w:tentative="1">
+      <w:start w:val="1"/>
+      <w:numFmt w:val="bullet"/>
+      <w:lvlText w:val=""/>
+      <w:lvlJc w:val="left"/>
+      <w:pPr>
+        <w:tabs>
+          <w:tab w:val="num" w:pos="4320"/>
+        </w:tabs>
+        <w:ind w:left="4320" w:hanging="360"/>
+      </w:pPr>
+      <w:rPr>
+        <w:rFonts w:ascii="Symbol" w:hAnsi="Symbol" w:hint="default"/>
+        <w:sz w:val="20"/>
+      </w:rPr>
+    </w:lvl>
+    <w:lvl w:ilvl="6" w:tentative="1">
+      <w:start w:val="1"/>
+      <w:numFmt w:val="bullet"/>
+      <w:lvlText w:val=""/>
+      <w:lvlJc w:val="left"/>
+      <w:pPr>
+        <w:tabs>
+          <w:tab w:val="num" w:pos="5040"/>
+        </w:tabs>
+        <w:ind w:left="5040" w:hanging="360"/>
+      </w:pPr>
+      <w:rPr>
+        <w:rFonts w:ascii="Symbol" w:hAnsi="Symbol" w:hint="default"/>
+        <w:sz w:val="20"/>
+      </w:rPr>
+    </w:lvl>
+    <w:lvl w:ilvl="7" w:tentative="1">
+      <w:start w:val="1"/>
+      <w:numFmt w:val="bullet"/>
+      <w:lvlText w:val=""/>
+      <w:lvlJc w:val="left"/>
+      <w:pPr>
+        <w:tabs>
+          <w:tab w:val="num" w:pos="5760"/>
+        </w:tabs>
+        <w:ind w:left="5760" w:hanging="360"/>
+      </w:pPr>
+      <w:rPr>
+        <w:rFonts w:ascii="Symbol" w:hAnsi="Symbol" w:hint="default"/>
+        <w:sz w:val="20"/>
+      </w:rPr>
+    </w:lvl>
+    <w:lvl w:ilvl="8" w:tentative="1">
+      <w:start w:val="1"/>
+      <w:numFmt w:val="bullet"/>
+      <w:lvlText w:val=""/>
+      <w:lvlJc w:val="left"/>
+      <w:pPr>
+        <w:tabs>
+          <w:tab w:val="num" w:pos="6480"/>
+        </w:tabs>
+        <w:ind w:left="6480" w:hanging="360"/>
+      </w:pPr>
+      <w:rPr>
+        <w:rFonts w:ascii="Symbol" w:hAnsi="Symbol" w:hint="default"/>
+        <w:sz w:val="20"/>
+      </w:rPr>
+    </w:lvl>
+  </w:abstractNum>
+  <w:abstractNum w:abstractNumId="14" w15:restartNumberingAfterBreak="0">
     <w:nsid w:val="41255EDF"/>
     <w:multiLevelType w:val="multilevel"/>
     <w:tmpl w:val="D51633B0"/>
@@ -10263,7 +12973,7 @@
       </w:rPr>
     </w:lvl>
   </w:abstractNum>
-  <w:abstractNum w:abstractNumId="12" w15:restartNumberingAfterBreak="0">
+  <w:abstractNum w:abstractNumId="15" w15:restartNumberingAfterBreak="0">
     <w:nsid w:val="56F716FF"/>
     <w:multiLevelType w:val="multilevel"/>
     <w:tmpl w:val="C4FE0146"/>
@@ -10412,7 +13122,7 @@
       </w:rPr>
     </w:lvl>
   </w:abstractNum>
-  <w:abstractNum w:abstractNumId="13" w15:restartNumberingAfterBreak="0">
+  <w:abstractNum w:abstractNumId="16" w15:restartNumberingAfterBreak="0">
     <w:nsid w:val="58A74BAC"/>
     <w:multiLevelType w:val="multilevel"/>
     <w:tmpl w:val="A0E02532"/>
@@ -10525,7 +13235,7 @@
       </w:pPr>
     </w:lvl>
   </w:abstractNum>
-  <w:abstractNum w:abstractNumId="14" w15:restartNumberingAfterBreak="0">
+  <w:abstractNum w:abstractNumId="17" w15:restartNumberingAfterBreak="0">
     <w:nsid w:val="58C07C39"/>
     <w:multiLevelType w:val="multilevel"/>
     <w:tmpl w:val="F0302736"/>
@@ -10674,7 +13384,7 @@
       </w:rPr>
     </w:lvl>
   </w:abstractNum>
-  <w:abstractNum w:abstractNumId="15" w15:restartNumberingAfterBreak="0">
+  <w:abstractNum w:abstractNumId="18" w15:restartNumberingAfterBreak="0">
     <w:nsid w:val="61292230"/>
     <w:multiLevelType w:val="multilevel"/>
     <w:tmpl w:val="6AD610F0"/>
@@ -10791,7 +13501,7 @@
       </w:pPr>
     </w:lvl>
   </w:abstractNum>
-  <w:abstractNum w:abstractNumId="16" w15:restartNumberingAfterBreak="0">
+  <w:abstractNum w:abstractNumId="19" w15:restartNumberingAfterBreak="0">
     <w:nsid w:val="62A76490"/>
     <w:multiLevelType w:val="multilevel"/>
     <w:tmpl w:val="4F1C5316"/>
@@ -10908,7 +13618,7 @@
       </w:pPr>
     </w:lvl>
   </w:abstractNum>
-  <w:abstractNum w:abstractNumId="17" w15:restartNumberingAfterBreak="0">
+  <w:abstractNum w:abstractNumId="20" w15:restartNumberingAfterBreak="0">
     <w:nsid w:val="63573F96"/>
     <w:multiLevelType w:val="multilevel"/>
     <w:tmpl w:val="2CB21D70"/>
@@ -11057,7 +13767,7 @@
       </w:rPr>
     </w:lvl>
   </w:abstractNum>
-  <w:abstractNum w:abstractNumId="18" w15:restartNumberingAfterBreak="0">
+  <w:abstractNum w:abstractNumId="21" w15:restartNumberingAfterBreak="0">
     <w:nsid w:val="63C26785"/>
     <w:multiLevelType w:val="multilevel"/>
     <w:tmpl w:val="6818FAC8"/>
@@ -11170,7 +13880,7 @@
       </w:pPr>
     </w:lvl>
   </w:abstractNum>
-  <w:abstractNum w:abstractNumId="19" w15:restartNumberingAfterBreak="0">
+  <w:abstractNum w:abstractNumId="22" w15:restartNumberingAfterBreak="0">
     <w:nsid w:val="6D64703A"/>
     <w:multiLevelType w:val="multilevel"/>
     <w:tmpl w:val="4A8A1276"/>
@@ -11283,7 +13993,7 @@
       </w:pPr>
     </w:lvl>
   </w:abstractNum>
-  <w:abstractNum w:abstractNumId="20" w15:restartNumberingAfterBreak="0">
+  <w:abstractNum w:abstractNumId="23" w15:restartNumberingAfterBreak="0">
     <w:nsid w:val="6D906C01"/>
     <w:multiLevelType w:val="multilevel"/>
     <w:tmpl w:val="4DF63D4A"/>
@@ -11432,7 +14142,7 @@
       </w:rPr>
     </w:lvl>
   </w:abstractNum>
-  <w:abstractNum w:abstractNumId="21" w15:restartNumberingAfterBreak="0">
+  <w:abstractNum w:abstractNumId="24" w15:restartNumberingAfterBreak="0">
     <w:nsid w:val="71E65246"/>
     <w:multiLevelType w:val="multilevel"/>
     <w:tmpl w:val="F9944F54"/>
@@ -11581,7 +14291,7 @@
       </w:rPr>
     </w:lvl>
   </w:abstractNum>
-  <w:abstractNum w:abstractNumId="22" w15:restartNumberingAfterBreak="0">
+  <w:abstractNum w:abstractNumId="25" w15:restartNumberingAfterBreak="0">
     <w:nsid w:val="75FC1139"/>
     <w:multiLevelType w:val="multilevel"/>
     <w:tmpl w:val="CC5A3DA6"/>
@@ -11731,64 +14441,64 @@
     </w:lvl>
   </w:abstractNum>
   <w:num w:numId="1">
-    <w:abstractNumId w:val="13"/>
+    <w:abstractNumId w:val="16"/>
   </w:num>
   <w:num w:numId="2">
+    <w:abstractNumId w:val="12"/>
+  </w:num>
+  <w:num w:numId="3">
+    <w:abstractNumId w:val="24"/>
+  </w:num>
+  <w:num w:numId="4">
+    <w:abstractNumId w:val="18"/>
+  </w:num>
+  <w:num w:numId="5">
+    <w:abstractNumId w:val="9"/>
+  </w:num>
+  <w:num w:numId="6">
+    <w:abstractNumId w:val="19"/>
+  </w:num>
+  <w:num w:numId="7">
+    <w:abstractNumId w:val="20"/>
+  </w:num>
+  <w:num w:numId="8">
+    <w:abstractNumId w:val="22"/>
+  </w:num>
+  <w:num w:numId="9">
+    <w:abstractNumId w:val="5"/>
+  </w:num>
+  <w:num w:numId="10">
+    <w:abstractNumId w:val="6"/>
+  </w:num>
+  <w:num w:numId="11">
+    <w:abstractNumId w:val="17"/>
+  </w:num>
+  <w:num w:numId="12">
+    <w:abstractNumId w:val="21"/>
+  </w:num>
+  <w:num w:numId="13">
+    <w:abstractNumId w:val="14"/>
+  </w:num>
+  <w:num w:numId="14">
     <w:abstractNumId w:val="10"/>
   </w:num>
-  <w:num w:numId="3">
-    <w:abstractNumId w:val="21"/>
-  </w:num>
-  <w:num w:numId="4">
-    <w:abstractNumId w:val="15"/>
-  </w:num>
-  <w:num w:numId="5">
-    <w:abstractNumId w:val="7"/>
-  </w:num>
-  <w:num w:numId="6">
-    <w:abstractNumId w:val="16"/>
-  </w:num>
-  <w:num w:numId="7">
-    <w:abstractNumId w:val="17"/>
-  </w:num>
-  <w:num w:numId="8">
-    <w:abstractNumId w:val="19"/>
-  </w:num>
-  <w:num w:numId="9">
-    <w:abstractNumId w:val="4"/>
-  </w:num>
-  <w:num w:numId="10">
-    <w:abstractNumId w:val="5"/>
-  </w:num>
-  <w:num w:numId="11">
-    <w:abstractNumId w:val="14"/>
-  </w:num>
-  <w:num w:numId="12">
-    <w:abstractNumId w:val="18"/>
-  </w:num>
-  <w:num w:numId="13">
-    <w:abstractNumId w:val="11"/>
-  </w:num>
-  <w:num w:numId="14">
-    <w:abstractNumId w:val="8"/>
-  </w:num>
   <w:num w:numId="15">
-    <w:abstractNumId w:val="22"/>
+    <w:abstractNumId w:val="25"/>
   </w:num>
   <w:num w:numId="16">
-    <w:abstractNumId w:val="9"/>
+    <w:abstractNumId w:val="11"/>
   </w:num>
   <w:num w:numId="17">
     <w:abstractNumId w:val="2"/>
   </w:num>
   <w:num w:numId="18">
-    <w:abstractNumId w:val="12"/>
+    <w:abstractNumId w:val="15"/>
   </w:num>
   <w:num w:numId="19">
     <w:abstractNumId w:val="1"/>
   </w:num>
   <w:num w:numId="20">
-    <w:abstractNumId w:val="6"/>
+    <w:abstractNumId w:val="7"/>
   </w:num>
   <w:num w:numId="21">
     <w:abstractNumId w:val="0"/>
@@ -11797,7 +14507,16 @@
     <w:abstractNumId w:val="3"/>
   </w:num>
   <w:num w:numId="23">
-    <w:abstractNumId w:val="20"/>
+    <w:abstractNumId w:val="23"/>
+  </w:num>
+  <w:num w:numId="24">
+    <w:abstractNumId w:val="4"/>
+  </w:num>
+  <w:num w:numId="25">
+    <w:abstractNumId w:val="8"/>
+  </w:num>
+  <w:num w:numId="26">
+    <w:abstractNumId w:val="13"/>
   </w:num>
 </w:numbering>
 </file>
@@ -12396,6 +15115,61 @@
       <w:u w:val="single"/>
     </w:rPr>
   </w:style>
+  <w:style w:type="paragraph" w:styleId="HTMLPreformatted">
+    <w:name w:val="HTML Preformatted"/>
+    <w:basedOn w:val="Normal"/>
+    <w:link w:val="HTMLPreformattedChar"/>
+    <w:uiPriority w:val="99"/>
+    <w:semiHidden/>
+    <w:unhideWhenUsed/>
+    <w:rsid w:val="00D72BBA"/>
+    <w:pPr>
+      <w:tabs>
+        <w:tab w:val="left" w:pos="916"/>
+        <w:tab w:val="left" w:pos="1832"/>
+        <w:tab w:val="left" w:pos="2748"/>
+        <w:tab w:val="left" w:pos="3664"/>
+        <w:tab w:val="left" w:pos="4580"/>
+        <w:tab w:val="left" w:pos="5496"/>
+        <w:tab w:val="left" w:pos="6412"/>
+        <w:tab w:val="left" w:pos="7328"/>
+        <w:tab w:val="left" w:pos="8244"/>
+        <w:tab w:val="left" w:pos="9160"/>
+        <w:tab w:val="left" w:pos="10076"/>
+        <w:tab w:val="left" w:pos="10992"/>
+        <w:tab w:val="left" w:pos="11908"/>
+        <w:tab w:val="left" w:pos="12824"/>
+        <w:tab w:val="left" w:pos="13740"/>
+        <w:tab w:val="left" w:pos="14656"/>
+      </w:tabs>
+      <w:spacing w:after="0" w:line="240" w:lineRule="auto"/>
+    </w:pPr>
+    <w:rPr>
+      <w:rFonts w:ascii="Courier New" w:eastAsia="Times New Roman" w:hAnsi="Courier New" w:cs="Courier New"/>
+      <w:sz w:val="20"/>
+      <w:szCs w:val="20"/>
+      <w:lang w:eastAsia="fr-FR"/>
+    </w:rPr>
+  </w:style>
+  <w:style w:type="character" w:customStyle="1" w:styleId="HTMLPreformattedChar">
+    <w:name w:val="HTML Preformatted Char"/>
+    <w:basedOn w:val="DefaultParagraphFont"/>
+    <w:link w:val="HTMLPreformatted"/>
+    <w:uiPriority w:val="99"/>
+    <w:semiHidden/>
+    <w:rsid w:val="00D72BBA"/>
+    <w:rPr>
+      <w:rFonts w:ascii="Courier New" w:eastAsia="Times New Roman" w:hAnsi="Courier New" w:cs="Courier New"/>
+      <w:sz w:val="20"/>
+      <w:szCs w:val="20"/>
+      <w:lang w:eastAsia="fr-FR"/>
+    </w:rPr>
+  </w:style>
+  <w:style w:type="character" w:customStyle="1" w:styleId="token">
+    <w:name w:val="token"/>
+    <w:basedOn w:val="DefaultParagraphFont"/>
+    <w:rsid w:val="00D72BBA"/>
+  </w:style>
 </w:styles>
 </file>
 
@@ -12665,7 +15439,7 @@
 </file>
 
 <file path=customXml/itemProps1.xml><?xml version="1.0" encoding="utf-8"?>
-<ds:datastoreItem xmlns:ds="http://schemas.openxmlformats.org/officeDocument/2006/customXml" ds:itemID="{994FBF32-0496-4972-B566-71CE19DBBFFA}">
+<ds:datastoreItem xmlns:ds="http://schemas.openxmlformats.org/officeDocument/2006/customXml" ds:itemID="{D0F19772-4BBF-420D-903A-FC46F8653960}">
   <ds:schemaRefs>
     <ds:schemaRef ds:uri="http://schemas.openxmlformats.org/officeDocument/2006/bibliography"/>
   </ds:schemaRefs>

</xml_diff>

<commit_message>
Ajout GPS et Photos
</commit_message>
<xml_diff>
--- a/Application de Réservation de Techniciens à Domicile.docx
+++ b/Application de Réservation de Techniciens à Domicile.docx
@@ -10640,17 +10640,107 @@
           <w:szCs w:val="21"/>
           <w:lang w:val="en-US" w:eastAsia="fr-FR"/>
         </w:rPr>
-        <w:t>(Copiez-collez exactement ceci)</w:t>
-      </w:r>
-      <w:r>
-        <w:rPr>
-          <w:rFonts w:ascii="Segoe UI" w:eastAsia="Times New Roman" w:hAnsi="Segoe UI" w:cs="Segoe UI"/>
+        <w:t>(</w:t>
+      </w:r>
+      <w:proofErr w:type="spellStart"/>
+      <w:r>
+        <w:rPr>
+          <w:rFonts w:ascii="Segoe UI" w:eastAsia="Times New Roman" w:hAnsi="Segoe UI" w:cs="Segoe UI"/>
+          <w:i/>
+          <w:iCs/>
           <w:color w:val="101010"/>
           <w:sz w:val="21"/>
           <w:szCs w:val="21"/>
           <w:lang w:val="en-US" w:eastAsia="fr-FR"/>
         </w:rPr>
-        <w:t> : </w:t>
+        <w:t>Copiez-collez</w:t>
+      </w:r>
+      <w:proofErr w:type="spellEnd"/>
+      <w:r>
+        <w:rPr>
+          <w:rFonts w:ascii="Segoe UI" w:eastAsia="Times New Roman" w:hAnsi="Segoe UI" w:cs="Segoe UI"/>
+          <w:i/>
+          <w:iCs/>
+          <w:color w:val="101010"/>
+          <w:sz w:val="21"/>
+          <w:szCs w:val="21"/>
+          <w:lang w:val="en-US" w:eastAsia="fr-FR"/>
+        </w:rPr>
+        <w:t xml:space="preserve"> </w:t>
+      </w:r>
+      <w:proofErr w:type="spellStart"/>
+      <w:r>
+        <w:rPr>
+          <w:rFonts w:ascii="Segoe UI" w:eastAsia="Times New Roman" w:hAnsi="Segoe UI" w:cs="Segoe UI"/>
+          <w:i/>
+          <w:iCs/>
+          <w:color w:val="101010"/>
+          <w:sz w:val="21"/>
+          <w:szCs w:val="21"/>
+          <w:lang w:val="en-US" w:eastAsia="fr-FR"/>
+        </w:rPr>
+        <w:t>exactement</w:t>
+      </w:r>
+      <w:proofErr w:type="spellEnd"/>
+      <w:r>
+        <w:rPr>
+          <w:rFonts w:ascii="Segoe UI" w:eastAsia="Times New Roman" w:hAnsi="Segoe UI" w:cs="Segoe UI"/>
+          <w:i/>
+          <w:iCs/>
+          <w:color w:val="101010"/>
+          <w:sz w:val="21"/>
+          <w:szCs w:val="21"/>
+          <w:lang w:val="en-US" w:eastAsia="fr-FR"/>
+        </w:rPr>
+        <w:t xml:space="preserve"> </w:t>
+      </w:r>
+      <w:proofErr w:type="spellStart"/>
+      <w:r>
+        <w:rPr>
+          <w:rFonts w:ascii="Segoe UI" w:eastAsia="Times New Roman" w:hAnsi="Segoe UI" w:cs="Segoe UI"/>
+          <w:i/>
+          <w:iCs/>
+          <w:color w:val="101010"/>
+          <w:sz w:val="21"/>
+          <w:szCs w:val="21"/>
+          <w:lang w:val="en-US" w:eastAsia="fr-FR"/>
+        </w:rPr>
+        <w:t>ceci</w:t>
+      </w:r>
+      <w:proofErr w:type="spellEnd"/>
+      <w:proofErr w:type="gramStart"/>
+      <w:r>
+        <w:rPr>
+          <w:rFonts w:ascii="Segoe UI" w:eastAsia="Times New Roman" w:hAnsi="Segoe UI" w:cs="Segoe UI"/>
+          <w:i/>
+          <w:iCs/>
+          <w:color w:val="101010"/>
+          <w:sz w:val="21"/>
+          <w:szCs w:val="21"/>
+          <w:lang w:val="en-US" w:eastAsia="fr-FR"/>
+        </w:rPr>
+        <w:t>)</w:t>
+      </w:r>
+      <w:r>
+        <w:rPr>
+          <w:rFonts w:ascii="Segoe UI" w:eastAsia="Times New Roman" w:hAnsi="Segoe UI" w:cs="Segoe UI"/>
+          <w:color w:val="101010"/>
+          <w:sz w:val="21"/>
+          <w:szCs w:val="21"/>
+          <w:lang w:val="en-US" w:eastAsia="fr-FR"/>
+        </w:rPr>
+        <w:t> :</w:t>
+      </w:r>
+      <w:proofErr w:type="gramEnd"/>
+      <w:r>
+        <w:rPr>
+          <w:rFonts w:ascii="Segoe UI" w:eastAsia="Times New Roman" w:hAnsi="Segoe UI" w:cs="Segoe UI"/>
+          <w:color w:val="101010"/>
+          <w:sz w:val="21"/>
+          <w:szCs w:val="21"/>
+          <w:lang w:val="en-US" w:eastAsia="fr-FR"/>
+        </w:rPr>
+        <w:t> </w:t>
       </w:r>
       <w:r>
         <w:rPr>
@@ -10660,7 +10750,73 @@
           <w:szCs w:val="19"/>
           <w:lang w:val="en-US" w:eastAsia="fr-FR"/>
         </w:rPr>
-        <w:t>cd frontend &amp;&amp; npm install &amp;&amp; npm run build &amp;&amp; cd ../backend &amp;&amp; npm install</w:t>
+        <w:t xml:space="preserve">cd frontend &amp;&amp; </w:t>
+      </w:r>
+      <w:proofErr w:type="spellStart"/>
+      <w:r>
+        <w:rPr>
+          <w:rFonts w:ascii="Consolas" w:eastAsia="Times New Roman" w:hAnsi="Consolas" w:cs="Courier New"/>
+          <w:color w:val="A31515"/>
+          <w:sz w:val="19"/>
+          <w:szCs w:val="19"/>
+          <w:lang w:val="en-US" w:eastAsia="fr-FR"/>
+        </w:rPr>
+        <w:t>npm</w:t>
+      </w:r>
+      <w:proofErr w:type="spellEnd"/>
+      <w:r>
+        <w:rPr>
+          <w:rFonts w:ascii="Consolas" w:eastAsia="Times New Roman" w:hAnsi="Consolas" w:cs="Courier New"/>
+          <w:color w:val="A31515"/>
+          <w:sz w:val="19"/>
+          <w:szCs w:val="19"/>
+          <w:lang w:val="en-US" w:eastAsia="fr-FR"/>
+        </w:rPr>
+        <w:t xml:space="preserve"> install &amp;&amp; </w:t>
+      </w:r>
+      <w:proofErr w:type="spellStart"/>
+      <w:r>
+        <w:rPr>
+          <w:rFonts w:ascii="Consolas" w:eastAsia="Times New Roman" w:hAnsi="Consolas" w:cs="Courier New"/>
+          <w:color w:val="A31515"/>
+          <w:sz w:val="19"/>
+          <w:szCs w:val="19"/>
+          <w:lang w:val="en-US" w:eastAsia="fr-FR"/>
+        </w:rPr>
+        <w:t>npm</w:t>
+      </w:r>
+      <w:proofErr w:type="spellEnd"/>
+      <w:r>
+        <w:rPr>
+          <w:rFonts w:ascii="Consolas" w:eastAsia="Times New Roman" w:hAnsi="Consolas" w:cs="Courier New"/>
+          <w:color w:val="A31515"/>
+          <w:sz w:val="19"/>
+          <w:szCs w:val="19"/>
+          <w:lang w:val="en-US" w:eastAsia="fr-FR"/>
+        </w:rPr>
+        <w:t xml:space="preserve"> run build &amp;&amp; cd ../backend &amp;&amp; </w:t>
+      </w:r>
+      <w:proofErr w:type="spellStart"/>
+      <w:r>
+        <w:rPr>
+          <w:rFonts w:ascii="Consolas" w:eastAsia="Times New Roman" w:hAnsi="Consolas" w:cs="Courier New"/>
+          <w:color w:val="A31515"/>
+          <w:sz w:val="19"/>
+          <w:szCs w:val="19"/>
+          <w:lang w:val="en-US" w:eastAsia="fr-FR"/>
+        </w:rPr>
+        <w:t>npm</w:t>
+      </w:r>
+      <w:proofErr w:type="spellEnd"/>
+      <w:r>
+        <w:rPr>
+          <w:rFonts w:ascii="Consolas" w:eastAsia="Times New Roman" w:hAnsi="Consolas" w:cs="Courier New"/>
+          <w:color w:val="A31515"/>
+          <w:sz w:val="19"/>
+          <w:szCs w:val="19"/>
+          <w:lang w:val="en-US" w:eastAsia="fr-FR"/>
+        </w:rPr>
+        <w:t xml:space="preserve"> install</w:t>
       </w:r>
     </w:p>
     <w:p>
@@ -11034,37 +11190,1064 @@
     </w:p>
     <w:p>
       <w:pPr>
+        <w:rPr>
+          <w:rFonts w:ascii="Segoe UI" w:eastAsia="Times New Roman" w:hAnsi="Segoe UI" w:cs="Segoe UI"/>
+          <w:color w:val="101010"/>
+          <w:sz w:val="18"/>
+          <w:szCs w:val="18"/>
+          <w:lang w:eastAsia="fr-FR"/>
+        </w:rPr>
+      </w:pPr>
+    </w:p>
+    <w:p>
+      <w:pPr>
+        <w:rPr>
+          <w:rFonts w:ascii="Segoe UI" w:eastAsia="Times New Roman" w:hAnsi="Segoe UI" w:cs="Segoe UI"/>
+          <w:color w:val="101010"/>
+          <w:sz w:val="18"/>
+          <w:szCs w:val="18"/>
+          <w:lang w:eastAsia="fr-FR"/>
+        </w:rPr>
+      </w:pPr>
+    </w:p>
+    <w:p>
+      <w:pPr>
+        <w:rPr>
+          <w:rFonts w:ascii="Segoe UI" w:eastAsia="Times New Roman" w:hAnsi="Segoe UI" w:cs="Segoe UI"/>
+          <w:color w:val="101010"/>
+          <w:sz w:val="18"/>
+          <w:szCs w:val="18"/>
+          <w:lang w:eastAsia="fr-FR"/>
+        </w:rPr>
+      </w:pPr>
+    </w:p>
+    <w:p>
+      <w:pPr>
+        <w:rPr>
+          <w:rFonts w:ascii="Segoe UI" w:eastAsia="Times New Roman" w:hAnsi="Segoe UI" w:cs="Segoe UI"/>
+          <w:color w:val="101010"/>
+          <w:sz w:val="18"/>
+          <w:szCs w:val="18"/>
+          <w:lang w:eastAsia="fr-FR"/>
+        </w:rPr>
+      </w:pPr>
+    </w:p>
+    <w:p>
+      <w:pPr>
+        <w:rPr>
+          <w:rFonts w:ascii="Segoe UI" w:eastAsia="Times New Roman" w:hAnsi="Segoe UI" w:cs="Segoe UI"/>
+          <w:color w:val="101010"/>
+          <w:sz w:val="18"/>
+          <w:szCs w:val="18"/>
+          <w:lang w:eastAsia="fr-FR"/>
+        </w:rPr>
+      </w:pPr>
+    </w:p>
+    <w:p>
+      <w:pPr>
+        <w:rPr>
+          <w:rFonts w:ascii="Segoe UI" w:eastAsia="Times New Roman" w:hAnsi="Segoe UI" w:cs="Segoe UI"/>
+          <w:color w:val="101010"/>
+          <w:sz w:val="18"/>
+          <w:szCs w:val="18"/>
+          <w:lang w:eastAsia="fr-FR"/>
+        </w:rPr>
+      </w:pPr>
+    </w:p>
+    <w:p>
+      <w:pPr>
+        <w:shd w:val="clear" w:color="auto" w:fill="F9F9F9"/>
+        <w:spacing w:before="100" w:beforeAutospacing="1" w:after="100" w:afterAutospacing="1" w:line="240" w:lineRule="auto"/>
+        <w:outlineLvl w:val="0"/>
+        <w:rPr>
+          <w:rFonts w:ascii="Segoe UI" w:eastAsia="Times New Roman" w:hAnsi="Segoe UI" w:cs="Segoe UI"/>
+          <w:b/>
+          <w:bCs/>
+          <w:color w:val="101010"/>
+          <w:kern w:val="36"/>
+          <w:sz w:val="48"/>
+          <w:szCs w:val="48"/>
+          <w:lang w:eastAsia="fr-FR"/>
+        </w:rPr>
+      </w:pPr>
+      <w:r>
+        <w:rPr>
+          <w:rFonts w:ascii="Segoe UI" w:eastAsia="Times New Roman" w:hAnsi="Segoe UI" w:cs="Segoe UI"/>
+          <w:b/>
+          <w:bCs/>
+          <w:color w:val="101010"/>
+          <w:kern w:val="36"/>
+          <w:sz w:val="48"/>
+          <w:szCs w:val="48"/>
+          <w:lang w:eastAsia="fr-FR"/>
+        </w:rPr>
+        <w:t>Ajout de la Localisation GPS et Photos</w:t>
+      </w:r>
+    </w:p>
+    <w:p>
+      <w:pPr>
+        <w:shd w:val="clear" w:color="auto" w:fill="F9F9F9"/>
+        <w:spacing w:before="100" w:beforeAutospacing="1" w:after="100" w:afterAutospacing="1" w:line="240" w:lineRule="auto"/>
+        <w:outlineLvl w:val="1"/>
+        <w:rPr>
+          <w:rFonts w:ascii="Segoe UI" w:eastAsia="Times New Roman" w:hAnsi="Segoe UI" w:cs="Segoe UI"/>
+          <w:b/>
+          <w:bCs/>
+          <w:color w:val="101010"/>
+          <w:sz w:val="27"/>
+          <w:szCs w:val="27"/>
+          <w:lang w:eastAsia="fr-FR"/>
+        </w:rPr>
+      </w:pPr>
+      <w:r>
+        <w:rPr>
+          <w:rFonts w:ascii="Segoe UI" w:eastAsia="Times New Roman" w:hAnsi="Segoe UI" w:cs="Segoe UI"/>
+          <w:b/>
+          <w:bCs/>
+          <w:color w:val="101010"/>
+          <w:sz w:val="27"/>
+          <w:szCs w:val="27"/>
+          <w:lang w:eastAsia="fr-FR"/>
+        </w:rPr>
+        <w:t>1. Localisation GPS (Très facile pour le client)</w:t>
+      </w:r>
+    </w:p>
+    <w:p>
+      <w:pPr>
         <w:shd w:val="clear" w:color="auto" w:fill="F9F9F9"/>
         <w:spacing w:after="0" w:line="240" w:lineRule="auto"/>
         <w:rPr>
           <w:rFonts w:ascii="Segoe UI" w:eastAsia="Times New Roman" w:hAnsi="Segoe UI" w:cs="Segoe UI"/>
           <w:color w:val="101010"/>
-          <w:sz w:val="18"/>
-          <w:szCs w:val="18"/>
-          <w:lang w:eastAsia="fr-FR"/>
-        </w:rPr>
-      </w:pPr>
+          <w:sz w:val="21"/>
+          <w:szCs w:val="21"/>
+          <w:lang w:eastAsia="fr-FR"/>
+        </w:rPr>
+      </w:pPr>
+      <w:r>
+        <w:rPr>
+          <w:rFonts w:ascii="Segoe UI" w:eastAsia="Times New Roman" w:hAnsi="Segoe UI" w:cs="Segoe UI"/>
+          <w:b/>
+          <w:bCs/>
+          <w:color w:val="101010"/>
+          <w:sz w:val="21"/>
+          <w:szCs w:val="21"/>
+          <w:lang w:eastAsia="fr-FR"/>
+        </w:rPr>
+        <w:t>Comment ça va marcher pour le client ?</w:t>
+      </w:r>
+      <w:r>
+        <w:rPr>
+          <w:rFonts w:ascii="Segoe UI" w:eastAsia="Times New Roman" w:hAnsi="Segoe UI" w:cs="Segoe UI"/>
+          <w:color w:val="101010"/>
+          <w:sz w:val="21"/>
+          <w:szCs w:val="21"/>
+          <w:lang w:eastAsia="fr-FR"/>
+        </w:rPr>
+        <w:t> Nous allons ajouter un petit bouton bleu </w:t>
+      </w:r>
+      <w:r>
+        <w:rPr>
+          <w:rFonts w:ascii="Segoe UI" w:eastAsia="Times New Roman" w:hAnsi="Segoe UI" w:cs="Segoe UI"/>
+          <w:b/>
+          <w:bCs/>
+          <w:color w:val="101010"/>
+          <w:sz w:val="21"/>
+          <w:szCs w:val="21"/>
+          <w:lang w:eastAsia="fr-FR"/>
+        </w:rPr>
+        <w:t>"</w:t>
+      </w:r>
+      <w:r>
+        <w:rPr>
+          <w:rFonts w:ascii="Segoe UI Symbol" w:eastAsia="Times New Roman" w:hAnsi="Segoe UI Symbol" w:cs="Segoe UI Symbol"/>
+          <w:b/>
+          <w:bCs/>
+          <w:color w:val="101010"/>
+          <w:sz w:val="21"/>
+          <w:szCs w:val="21"/>
+          <w:lang w:eastAsia="fr-FR"/>
+        </w:rPr>
+        <w:t>📍</w:t>
+      </w:r>
+      <w:r>
+        <w:rPr>
+          <w:rFonts w:ascii="Segoe UI" w:eastAsia="Times New Roman" w:hAnsi="Segoe UI" w:cs="Segoe UI"/>
+          <w:b/>
+          <w:bCs/>
+          <w:color w:val="101010"/>
+          <w:sz w:val="21"/>
+          <w:szCs w:val="21"/>
+          <w:lang w:eastAsia="fr-FR"/>
+        </w:rPr>
+        <w:t xml:space="preserve"> Utiliser ma position actuelle"</w:t>
+      </w:r>
+      <w:r>
+        <w:rPr>
+          <w:rFonts w:ascii="Segoe UI" w:eastAsia="Times New Roman" w:hAnsi="Segoe UI" w:cs="Segoe UI"/>
+          <w:color w:val="101010"/>
+          <w:sz w:val="21"/>
+          <w:szCs w:val="21"/>
+          <w:lang w:eastAsia="fr-FR"/>
+        </w:rPr>
+        <w:t> juste au-dessus du champ "Adresse". Quand le client appuie dessus :</w:t>
+      </w:r>
+    </w:p>
+    <w:p>
+      <w:pPr>
+        <w:numPr>
+          <w:ilvl w:val="0"/>
+          <w:numId w:val="27"/>
+        </w:numPr>
+        <w:shd w:val="clear" w:color="auto" w:fill="F9F9F9"/>
+        <w:spacing w:after="0" w:line="240" w:lineRule="auto"/>
+        <w:ind w:left="0"/>
+        <w:rPr>
+          <w:rFonts w:ascii="Segoe UI" w:eastAsia="Times New Roman" w:hAnsi="Segoe UI" w:cs="Segoe UI"/>
+          <w:color w:val="101010"/>
+          <w:sz w:val="21"/>
+          <w:szCs w:val="21"/>
+          <w:lang w:eastAsia="fr-FR"/>
+        </w:rPr>
+      </w:pPr>
+      <w:r>
+        <w:rPr>
+          <w:rFonts w:ascii="Segoe UI" w:eastAsia="Times New Roman" w:hAnsi="Segoe UI" w:cs="Segoe UI"/>
+          <w:color w:val="101010"/>
+          <w:sz w:val="21"/>
+          <w:szCs w:val="21"/>
+          <w:lang w:eastAsia="fr-FR"/>
+        </w:rPr>
+        <w:t>Son téléphone lui demande "Autorisez-vous SERVICE-GO à accéder à votre position ?".</w:t>
+      </w:r>
+    </w:p>
+    <w:p>
+      <w:pPr>
+        <w:numPr>
+          <w:ilvl w:val="0"/>
+          <w:numId w:val="27"/>
+        </w:numPr>
+        <w:shd w:val="clear" w:color="auto" w:fill="F9F9F9"/>
+        <w:spacing w:after="0" w:line="240" w:lineRule="auto"/>
+        <w:ind w:left="0"/>
+        <w:rPr>
+          <w:rFonts w:ascii="Segoe UI" w:eastAsia="Times New Roman" w:hAnsi="Segoe UI" w:cs="Segoe UI"/>
+          <w:color w:val="101010"/>
+          <w:sz w:val="21"/>
+          <w:szCs w:val="21"/>
+          <w:lang w:eastAsia="fr-FR"/>
+        </w:rPr>
+      </w:pPr>
+      <w:r>
+        <w:rPr>
+          <w:rFonts w:ascii="Segoe UI" w:eastAsia="Times New Roman" w:hAnsi="Segoe UI" w:cs="Segoe UI"/>
+          <w:color w:val="101010"/>
+          <w:sz w:val="21"/>
+          <w:szCs w:val="21"/>
+          <w:lang w:eastAsia="fr-FR"/>
+        </w:rPr>
+        <w:t>S'il dit "Oui", le système récupère ses coordonnées exactes (Latitude / Longitude).</w:t>
+      </w:r>
+    </w:p>
+    <w:p>
+      <w:pPr>
+        <w:numPr>
+          <w:ilvl w:val="0"/>
+          <w:numId w:val="27"/>
+        </w:numPr>
+        <w:shd w:val="clear" w:color="auto" w:fill="F9F9F9"/>
+        <w:spacing w:after="0" w:line="240" w:lineRule="auto"/>
+        <w:ind w:left="0"/>
+        <w:rPr>
+          <w:rFonts w:ascii="Segoe UI" w:eastAsia="Times New Roman" w:hAnsi="Segoe UI" w:cs="Segoe UI"/>
+          <w:color w:val="101010"/>
+          <w:sz w:val="21"/>
+          <w:szCs w:val="21"/>
+          <w:lang w:eastAsia="fr-FR"/>
+        </w:rPr>
+      </w:pPr>
+      <w:r>
+        <w:rPr>
+          <w:rFonts w:ascii="Segoe UI" w:eastAsia="Times New Roman" w:hAnsi="Segoe UI" w:cs="Segoe UI"/>
+          <w:color w:val="101010"/>
+          <w:sz w:val="21"/>
+          <w:szCs w:val="21"/>
+          <w:lang w:eastAsia="fr-FR"/>
+        </w:rPr>
+        <w:t xml:space="preserve">Le champ adresse se remplit tout seul avec un lien direct (Google </w:t>
+      </w:r>
+      <w:proofErr w:type="spellStart"/>
+      <w:r>
+        <w:rPr>
+          <w:rFonts w:ascii="Segoe UI" w:eastAsia="Times New Roman" w:hAnsi="Segoe UI" w:cs="Segoe UI"/>
+          <w:color w:val="101010"/>
+          <w:sz w:val="21"/>
+          <w:szCs w:val="21"/>
+          <w:lang w:eastAsia="fr-FR"/>
+        </w:rPr>
+        <w:t>Maps</w:t>
+      </w:r>
+      <w:proofErr w:type="spellEnd"/>
+      <w:r>
+        <w:rPr>
+          <w:rFonts w:ascii="Segoe UI" w:eastAsia="Times New Roman" w:hAnsi="Segoe UI" w:cs="Segoe UI"/>
+          <w:color w:val="101010"/>
+          <w:sz w:val="21"/>
+          <w:szCs w:val="21"/>
+          <w:lang w:eastAsia="fr-FR"/>
+        </w:rPr>
+        <w:t>). L'administrateur recevra donc un lien cliquable pour voir la maison exacte sur la carte !</w:t>
+      </w:r>
+    </w:p>
+    <w:p>
+      <w:pPr>
+        <w:shd w:val="clear" w:color="auto" w:fill="F9F9F9"/>
+        <w:spacing w:before="100" w:beforeAutospacing="1" w:after="100" w:afterAutospacing="1" w:line="240" w:lineRule="auto"/>
+        <w:outlineLvl w:val="1"/>
+        <w:rPr>
+          <w:rFonts w:ascii="Segoe UI" w:eastAsia="Times New Roman" w:hAnsi="Segoe UI" w:cs="Segoe UI"/>
+          <w:b/>
+          <w:bCs/>
+          <w:color w:val="101010"/>
+          <w:sz w:val="27"/>
+          <w:szCs w:val="27"/>
+          <w:lang w:eastAsia="fr-FR"/>
+        </w:rPr>
+      </w:pPr>
+      <w:r>
+        <w:rPr>
+          <w:rFonts w:ascii="Segoe UI" w:eastAsia="Times New Roman" w:hAnsi="Segoe UI" w:cs="Segoe UI"/>
+          <w:b/>
+          <w:bCs/>
+          <w:color w:val="101010"/>
+          <w:sz w:val="27"/>
+          <w:szCs w:val="27"/>
+          <w:lang w:eastAsia="fr-FR"/>
+        </w:rPr>
+        <w:t xml:space="preserve">2. </w:t>
+      </w:r>
+      <w:proofErr w:type="spellStart"/>
+      <w:r>
+        <w:rPr>
+          <w:rFonts w:ascii="Segoe UI" w:eastAsia="Times New Roman" w:hAnsi="Segoe UI" w:cs="Segoe UI"/>
+          <w:b/>
+          <w:bCs/>
+          <w:color w:val="101010"/>
+          <w:sz w:val="27"/>
+          <w:szCs w:val="27"/>
+          <w:lang w:eastAsia="fr-FR"/>
+        </w:rPr>
+        <w:t>Upload</w:t>
+      </w:r>
+      <w:proofErr w:type="spellEnd"/>
+      <w:r>
+        <w:rPr>
+          <w:rFonts w:ascii="Segoe UI" w:eastAsia="Times New Roman" w:hAnsi="Segoe UI" w:cs="Segoe UI"/>
+          <w:b/>
+          <w:bCs/>
+          <w:color w:val="101010"/>
+          <w:sz w:val="27"/>
+          <w:szCs w:val="27"/>
+          <w:lang w:eastAsia="fr-FR"/>
+        </w:rPr>
+        <w:t xml:space="preserve"> de Photos (Prendre une photo du problème)</w:t>
+      </w:r>
+    </w:p>
+    <w:p>
+      <w:pPr>
+        <w:shd w:val="clear" w:color="auto" w:fill="F9F9F9"/>
+        <w:spacing w:after="0" w:line="240" w:lineRule="auto"/>
+        <w:rPr>
+          <w:rFonts w:ascii="Segoe UI" w:eastAsia="Times New Roman" w:hAnsi="Segoe UI" w:cs="Segoe UI"/>
+          <w:color w:val="101010"/>
+          <w:sz w:val="21"/>
+          <w:szCs w:val="21"/>
+          <w:lang w:eastAsia="fr-FR"/>
+        </w:rPr>
+      </w:pPr>
+      <w:r>
+        <w:rPr>
+          <w:rFonts w:ascii="Segoe UI" w:eastAsia="Times New Roman" w:hAnsi="Segoe UI" w:cs="Segoe UI"/>
+          <w:b/>
+          <w:bCs/>
+          <w:color w:val="101010"/>
+          <w:sz w:val="21"/>
+          <w:szCs w:val="21"/>
+          <w:lang w:eastAsia="fr-FR"/>
+        </w:rPr>
+        <w:t>Comment ça va marcher pour le client ?</w:t>
+      </w:r>
+      <w:r>
+        <w:rPr>
+          <w:rFonts w:ascii="Segoe UI" w:eastAsia="Times New Roman" w:hAnsi="Segoe UI" w:cs="Segoe UI"/>
+          <w:color w:val="101010"/>
+          <w:sz w:val="21"/>
+          <w:szCs w:val="21"/>
+          <w:lang w:eastAsia="fr-FR"/>
+        </w:rPr>
+        <w:t> Nous allons ajouter un bouton </w:t>
+      </w:r>
+      <w:r>
+        <w:rPr>
+          <w:rFonts w:ascii="Segoe UI" w:eastAsia="Times New Roman" w:hAnsi="Segoe UI" w:cs="Segoe UI"/>
+          <w:b/>
+          <w:bCs/>
+          <w:color w:val="101010"/>
+          <w:sz w:val="21"/>
+          <w:szCs w:val="21"/>
+          <w:lang w:eastAsia="fr-FR"/>
+        </w:rPr>
+        <w:t>"</w:t>
+      </w:r>
+      <w:r>
+        <w:rPr>
+          <w:rFonts w:ascii="Segoe UI Symbol" w:eastAsia="Times New Roman" w:hAnsi="Segoe UI Symbol" w:cs="Segoe UI Symbol"/>
+          <w:b/>
+          <w:bCs/>
+          <w:color w:val="101010"/>
+          <w:sz w:val="21"/>
+          <w:szCs w:val="21"/>
+          <w:lang w:eastAsia="fr-FR"/>
+        </w:rPr>
+        <w:t>📸</w:t>
+      </w:r>
+      <w:r>
+        <w:rPr>
+          <w:rFonts w:ascii="Segoe UI" w:eastAsia="Times New Roman" w:hAnsi="Segoe UI" w:cs="Segoe UI"/>
+          <w:b/>
+          <w:bCs/>
+          <w:color w:val="101010"/>
+          <w:sz w:val="21"/>
+          <w:szCs w:val="21"/>
+          <w:lang w:eastAsia="fr-FR"/>
+        </w:rPr>
+        <w:t xml:space="preserve"> Ajouter une photo (Optionnel)"</w:t>
+      </w:r>
+      <w:r>
+        <w:rPr>
+          <w:rFonts w:ascii="Segoe UI" w:eastAsia="Times New Roman" w:hAnsi="Segoe UI" w:cs="Segoe UI"/>
+          <w:color w:val="101010"/>
+          <w:sz w:val="21"/>
+          <w:szCs w:val="21"/>
+          <w:lang w:eastAsia="fr-FR"/>
+        </w:rPr>
+        <w:t>. Le client pourra :</w:t>
+      </w:r>
+    </w:p>
+    <w:p>
+      <w:pPr>
+        <w:numPr>
+          <w:ilvl w:val="0"/>
+          <w:numId w:val="28"/>
+        </w:numPr>
+        <w:shd w:val="clear" w:color="auto" w:fill="F9F9F9"/>
+        <w:spacing w:after="0" w:line="240" w:lineRule="auto"/>
+        <w:ind w:left="0"/>
+        <w:rPr>
+          <w:rFonts w:ascii="Segoe UI" w:eastAsia="Times New Roman" w:hAnsi="Segoe UI" w:cs="Segoe UI"/>
+          <w:color w:val="101010"/>
+          <w:sz w:val="21"/>
+          <w:szCs w:val="21"/>
+          <w:lang w:eastAsia="fr-FR"/>
+        </w:rPr>
+      </w:pPr>
+      <w:r>
+        <w:rPr>
+          <w:rFonts w:ascii="Segoe UI" w:eastAsia="Times New Roman" w:hAnsi="Segoe UI" w:cs="Segoe UI"/>
+          <w:color w:val="101010"/>
+          <w:sz w:val="21"/>
+          <w:szCs w:val="21"/>
+          <w:lang w:eastAsia="fr-FR"/>
+        </w:rPr>
+        <w:t>Prendre une photo directement avec l'appareil photo de son téléphone.</w:t>
+      </w:r>
+    </w:p>
+    <w:p>
+      <w:pPr>
+        <w:numPr>
+          <w:ilvl w:val="0"/>
+          <w:numId w:val="28"/>
+        </w:numPr>
+        <w:shd w:val="clear" w:color="auto" w:fill="F9F9F9"/>
+        <w:spacing w:after="0" w:line="240" w:lineRule="auto"/>
+        <w:ind w:left="0"/>
+        <w:rPr>
+          <w:rFonts w:ascii="Segoe UI" w:eastAsia="Times New Roman" w:hAnsi="Segoe UI" w:cs="Segoe UI"/>
+          <w:color w:val="101010"/>
+          <w:sz w:val="21"/>
+          <w:szCs w:val="21"/>
+          <w:lang w:eastAsia="fr-FR"/>
+        </w:rPr>
+      </w:pPr>
+      <w:r>
+        <w:rPr>
+          <w:rFonts w:ascii="Segoe UI" w:eastAsia="Times New Roman" w:hAnsi="Segoe UI" w:cs="Segoe UI"/>
+          <w:color w:val="101010"/>
+          <w:sz w:val="21"/>
+          <w:szCs w:val="21"/>
+          <w:lang w:eastAsia="fr-FR"/>
+        </w:rPr>
+        <w:t>Ou choisir une photo dans sa galerie.</w:t>
+      </w:r>
+    </w:p>
+    <w:p>
+      <w:pPr>
+        <w:shd w:val="clear" w:color="auto" w:fill="F9F9F9"/>
+        <w:spacing w:after="0" w:line="240" w:lineRule="auto"/>
+        <w:rPr>
+          <w:rFonts w:ascii="Segoe UI" w:eastAsia="Times New Roman" w:hAnsi="Segoe UI" w:cs="Segoe UI"/>
+          <w:color w:val="101010"/>
+          <w:sz w:val="21"/>
+          <w:szCs w:val="21"/>
+          <w:lang w:eastAsia="fr-FR"/>
+        </w:rPr>
+      </w:pPr>
+      <w:r>
+        <w:rPr>
+          <w:rFonts w:ascii="Segoe UI Symbol" w:eastAsia="Times New Roman" w:hAnsi="Segoe UI Symbol" w:cs="Segoe UI Symbol"/>
+          <w:b/>
+          <w:bCs/>
+          <w:color w:val="101010"/>
+          <w:sz w:val="21"/>
+          <w:szCs w:val="21"/>
+          <w:lang w:eastAsia="fr-FR"/>
+        </w:rPr>
+        <w:t>⚠️</w:t>
+      </w:r>
+      <w:r>
+        <w:rPr>
+          <w:rFonts w:ascii="Segoe UI" w:eastAsia="Times New Roman" w:hAnsi="Segoe UI" w:cs="Segoe UI"/>
+          <w:b/>
+          <w:bCs/>
+          <w:color w:val="101010"/>
+          <w:sz w:val="21"/>
+          <w:szCs w:val="21"/>
+          <w:lang w:eastAsia="fr-FR"/>
+        </w:rPr>
+        <w:t xml:space="preserve"> Contrainte Technique (Important) :</w:t>
+      </w:r>
+      <w:r>
+        <w:rPr>
+          <w:rFonts w:ascii="Segoe UI" w:eastAsia="Times New Roman" w:hAnsi="Segoe UI" w:cs="Segoe UI"/>
+          <w:color w:val="101010"/>
+          <w:sz w:val="21"/>
+          <w:szCs w:val="21"/>
+          <w:lang w:eastAsia="fr-FR"/>
+        </w:rPr>
+        <w:t> Puisque vous utilisez le plan </w:t>
+      </w:r>
+      <w:r>
+        <w:rPr>
+          <w:rFonts w:ascii="Segoe UI" w:eastAsia="Times New Roman" w:hAnsi="Segoe UI" w:cs="Segoe UI"/>
+          <w:b/>
+          <w:bCs/>
+          <w:color w:val="101010"/>
+          <w:sz w:val="21"/>
+          <w:szCs w:val="21"/>
+          <w:lang w:eastAsia="fr-FR"/>
+        </w:rPr>
+        <w:t>Gratuit</w:t>
+      </w:r>
+      <w:r>
+        <w:rPr>
+          <w:rFonts w:ascii="Segoe UI" w:eastAsia="Times New Roman" w:hAnsi="Segoe UI" w:cs="Segoe UI"/>
+          <w:color w:val="101010"/>
+          <w:sz w:val="21"/>
+          <w:szCs w:val="21"/>
+          <w:lang w:eastAsia="fr-FR"/>
+        </w:rPr>
+        <w:t xml:space="preserve"> de </w:t>
+      </w:r>
+      <w:proofErr w:type="spellStart"/>
+      <w:r>
+        <w:rPr>
+          <w:rFonts w:ascii="Segoe UI" w:eastAsia="Times New Roman" w:hAnsi="Segoe UI" w:cs="Segoe UI"/>
+          <w:color w:val="101010"/>
+          <w:sz w:val="21"/>
+          <w:szCs w:val="21"/>
+          <w:lang w:eastAsia="fr-FR"/>
+        </w:rPr>
+        <w:t>Render</w:t>
+      </w:r>
+      <w:proofErr w:type="spellEnd"/>
+      <w:r>
+        <w:rPr>
+          <w:rFonts w:ascii="Segoe UI" w:eastAsia="Times New Roman" w:hAnsi="Segoe UI" w:cs="Segoe UI"/>
+          <w:color w:val="101010"/>
+          <w:sz w:val="21"/>
+          <w:szCs w:val="21"/>
+          <w:lang w:eastAsia="fr-FR"/>
+        </w:rPr>
+        <w:t xml:space="preserve">, le serveur s'éteint lorsqu'il est inactif et efface ses fichiers temporaires. Pour éviter que les photos ne disparaissent, nous allons compresser la photo (pour qu'elle soit très légère) et l'enregistrer sous forme de texte directement dans la base de données </w:t>
+      </w:r>
+      <w:proofErr w:type="spellStart"/>
+      <w:r>
+        <w:rPr>
+          <w:rFonts w:ascii="Segoe UI" w:eastAsia="Times New Roman" w:hAnsi="Segoe UI" w:cs="Segoe UI"/>
+          <w:color w:val="101010"/>
+          <w:sz w:val="21"/>
+          <w:szCs w:val="21"/>
+          <w:lang w:eastAsia="fr-FR"/>
+        </w:rPr>
+        <w:t>SQLite</w:t>
+      </w:r>
+      <w:proofErr w:type="spellEnd"/>
+      <w:r>
+        <w:rPr>
+          <w:rFonts w:ascii="Segoe UI" w:eastAsia="Times New Roman" w:hAnsi="Segoe UI" w:cs="Segoe UI"/>
+          <w:color w:val="101010"/>
+          <w:sz w:val="21"/>
+          <w:szCs w:val="21"/>
+          <w:lang w:eastAsia="fr-FR"/>
+        </w:rPr>
+        <w:t>.</w:t>
+      </w:r>
+    </w:p>
+    <w:p>
+      <w:pPr>
+        <w:shd w:val="clear" w:color="auto" w:fill="F9F9F9"/>
+        <w:spacing w:before="100" w:beforeAutospacing="1" w:after="100" w:afterAutospacing="1" w:line="240" w:lineRule="auto"/>
+        <w:outlineLvl w:val="1"/>
+        <w:rPr>
+          <w:rFonts w:ascii="Segoe UI" w:eastAsia="Times New Roman" w:hAnsi="Segoe UI" w:cs="Segoe UI"/>
+          <w:b/>
+          <w:bCs/>
+          <w:color w:val="101010"/>
+          <w:sz w:val="27"/>
+          <w:szCs w:val="27"/>
+          <w:lang w:eastAsia="fr-FR"/>
+        </w:rPr>
+      </w:pPr>
+      <w:r>
+        <w:rPr>
+          <w:rFonts w:ascii="Segoe UI" w:eastAsia="Times New Roman" w:hAnsi="Segoe UI" w:cs="Segoe UI"/>
+          <w:b/>
+          <w:bCs/>
+          <w:color w:val="101010"/>
+          <w:sz w:val="27"/>
+          <w:szCs w:val="27"/>
+          <w:lang w:eastAsia="fr-FR"/>
+        </w:rPr>
+        <w:t>Modifications Prévues :</w:t>
+      </w:r>
+    </w:p>
+    <w:p>
+      <w:pPr>
+        <w:shd w:val="clear" w:color="auto" w:fill="F9F9F9"/>
+        <w:spacing w:before="100" w:beforeAutospacing="1" w:after="100" w:afterAutospacing="1" w:line="240" w:lineRule="auto"/>
+        <w:outlineLvl w:val="2"/>
+        <w:rPr>
+          <w:rFonts w:ascii="Segoe UI" w:eastAsia="Times New Roman" w:hAnsi="Segoe UI" w:cs="Segoe UI"/>
+          <w:color w:val="101010"/>
+          <w:sz w:val="24"/>
+          <w:szCs w:val="24"/>
+          <w:lang w:eastAsia="fr-FR"/>
+        </w:rPr>
+      </w:pPr>
+      <w:r>
+        <w:rPr>
+          <w:rFonts w:ascii="Segoe UI" w:eastAsia="Times New Roman" w:hAnsi="Segoe UI" w:cs="Segoe UI"/>
+          <w:color w:val="101010"/>
+          <w:sz w:val="24"/>
+          <w:szCs w:val="24"/>
+          <w:lang w:eastAsia="fr-FR"/>
+        </w:rPr>
+        <w:t>Base de données (</w:t>
+      </w:r>
+      <w:proofErr w:type="spellStart"/>
+      <w:r>
+        <w:rPr>
+          <w:rFonts w:ascii="Segoe UI" w:eastAsia="Times New Roman" w:hAnsi="Segoe UI" w:cs="Segoe UI"/>
+          <w:color w:val="101010"/>
+          <w:sz w:val="24"/>
+          <w:szCs w:val="24"/>
+          <w:lang w:eastAsia="fr-FR"/>
+        </w:rPr>
+        <w:t>Backend</w:t>
+      </w:r>
+      <w:proofErr w:type="spellEnd"/>
+      <w:r>
+        <w:rPr>
+          <w:rFonts w:ascii="Segoe UI" w:eastAsia="Times New Roman" w:hAnsi="Segoe UI" w:cs="Segoe UI"/>
+          <w:color w:val="101010"/>
+          <w:sz w:val="24"/>
+          <w:szCs w:val="24"/>
+          <w:lang w:eastAsia="fr-FR"/>
+        </w:rPr>
+        <w:t>)</w:t>
+      </w:r>
+    </w:p>
+    <w:p>
+      <w:pPr>
+        <w:numPr>
+          <w:ilvl w:val="0"/>
+          <w:numId w:val="29"/>
+        </w:numPr>
+        <w:shd w:val="clear" w:color="auto" w:fill="F9F9F9"/>
+        <w:spacing w:after="0" w:line="240" w:lineRule="auto"/>
+        <w:ind w:left="0"/>
+        <w:rPr>
+          <w:rFonts w:ascii="Segoe UI" w:eastAsia="Times New Roman" w:hAnsi="Segoe UI" w:cs="Segoe UI"/>
+          <w:color w:val="101010"/>
+          <w:sz w:val="21"/>
+          <w:szCs w:val="21"/>
+          <w:lang w:eastAsia="fr-FR"/>
+        </w:rPr>
+      </w:pPr>
+      <w:r>
+        <w:rPr>
+          <w:rFonts w:ascii="Segoe UI" w:eastAsia="Times New Roman" w:hAnsi="Segoe UI" w:cs="Segoe UI"/>
+          <w:color w:val="101010"/>
+          <w:sz w:val="21"/>
+          <w:szCs w:val="21"/>
+          <w:lang w:eastAsia="fr-FR"/>
+        </w:rPr>
+        <w:t>[MODIFY] </w:t>
+      </w:r>
+      <w:r>
+        <w:rPr>
+          <w:rFonts w:ascii="Consolas" w:eastAsia="Times New Roman" w:hAnsi="Consolas" w:cs="Courier New"/>
+          <w:color w:val="A31515"/>
+          <w:sz w:val="19"/>
+          <w:szCs w:val="19"/>
+          <w:lang w:eastAsia="fr-FR"/>
+        </w:rPr>
+        <w:t>server.js</w:t>
+      </w:r>
+      <w:r>
+        <w:rPr>
+          <w:rFonts w:ascii="Segoe UI" w:eastAsia="Times New Roman" w:hAnsi="Segoe UI" w:cs="Segoe UI"/>
+          <w:color w:val="101010"/>
+          <w:sz w:val="21"/>
+          <w:szCs w:val="21"/>
+          <w:lang w:eastAsia="fr-FR"/>
+        </w:rPr>
+        <w:t> : Ajouter une nouvelle colonne </w:t>
+      </w:r>
+      <w:proofErr w:type="spellStart"/>
+      <w:r>
+        <w:rPr>
+          <w:rFonts w:ascii="Consolas" w:eastAsia="Times New Roman" w:hAnsi="Consolas" w:cs="Courier New"/>
+          <w:color w:val="A31515"/>
+          <w:sz w:val="19"/>
+          <w:szCs w:val="19"/>
+          <w:lang w:eastAsia="fr-FR"/>
+        </w:rPr>
+        <w:t>photo_data</w:t>
+      </w:r>
+      <w:proofErr w:type="spellEnd"/>
+      <w:r>
+        <w:rPr>
+          <w:rFonts w:ascii="Segoe UI" w:eastAsia="Times New Roman" w:hAnsi="Segoe UI" w:cs="Segoe UI"/>
+          <w:color w:val="101010"/>
+          <w:sz w:val="21"/>
+          <w:szCs w:val="21"/>
+          <w:lang w:eastAsia="fr-FR"/>
+        </w:rPr>
+        <w:t> dans la table </w:t>
+      </w:r>
+      <w:proofErr w:type="spellStart"/>
+      <w:r>
+        <w:rPr>
+          <w:rFonts w:ascii="Consolas" w:eastAsia="Times New Roman" w:hAnsi="Consolas" w:cs="Courier New"/>
+          <w:color w:val="A31515"/>
+          <w:sz w:val="19"/>
+          <w:szCs w:val="19"/>
+          <w:lang w:eastAsia="fr-FR"/>
+        </w:rPr>
+        <w:t>reservations</w:t>
+      </w:r>
+      <w:proofErr w:type="spellEnd"/>
+      <w:r>
+        <w:rPr>
+          <w:rFonts w:ascii="Segoe UI" w:eastAsia="Times New Roman" w:hAnsi="Segoe UI" w:cs="Segoe UI"/>
+          <w:color w:val="101010"/>
+          <w:sz w:val="21"/>
+          <w:szCs w:val="21"/>
+          <w:lang w:eastAsia="fr-FR"/>
+        </w:rPr>
+        <w:t>.</w:t>
+      </w:r>
+    </w:p>
+    <w:p>
+      <w:pPr>
+        <w:numPr>
+          <w:ilvl w:val="0"/>
+          <w:numId w:val="29"/>
+        </w:numPr>
+        <w:shd w:val="clear" w:color="auto" w:fill="F9F9F9"/>
+        <w:spacing w:after="0" w:line="240" w:lineRule="auto"/>
+        <w:ind w:left="0"/>
+        <w:rPr>
+          <w:rFonts w:ascii="Segoe UI" w:eastAsia="Times New Roman" w:hAnsi="Segoe UI" w:cs="Segoe UI"/>
+          <w:color w:val="101010"/>
+          <w:sz w:val="21"/>
+          <w:szCs w:val="21"/>
+          <w:lang w:eastAsia="fr-FR"/>
+        </w:rPr>
+      </w:pPr>
+      <w:r>
+        <w:rPr>
+          <w:rFonts w:ascii="Segoe UI" w:eastAsia="Times New Roman" w:hAnsi="Segoe UI" w:cs="Segoe UI"/>
+          <w:color w:val="101010"/>
+          <w:sz w:val="21"/>
+          <w:szCs w:val="21"/>
+          <w:lang w:eastAsia="fr-FR"/>
+        </w:rPr>
+        <w:t>[MODIFY] </w:t>
+      </w:r>
+      <w:r>
+        <w:rPr>
+          <w:rFonts w:ascii="Consolas" w:eastAsia="Times New Roman" w:hAnsi="Consolas" w:cs="Courier New"/>
+          <w:color w:val="A31515"/>
+          <w:sz w:val="19"/>
+          <w:szCs w:val="19"/>
+          <w:lang w:eastAsia="fr-FR"/>
+        </w:rPr>
+        <w:t>server.js</w:t>
+      </w:r>
+      <w:r>
+        <w:rPr>
+          <w:rFonts w:ascii="Segoe UI" w:eastAsia="Times New Roman" w:hAnsi="Segoe UI" w:cs="Segoe UI"/>
+          <w:color w:val="101010"/>
+          <w:sz w:val="21"/>
+          <w:szCs w:val="21"/>
+          <w:lang w:eastAsia="fr-FR"/>
+        </w:rPr>
+        <w:t> : Mettre à jour l'API pour accepter et sauvegarder l'image.</w:t>
+      </w:r>
+    </w:p>
+    <w:p>
+      <w:pPr>
+        <w:shd w:val="clear" w:color="auto" w:fill="F9F9F9"/>
+        <w:spacing w:before="100" w:beforeAutospacing="1" w:after="100" w:afterAutospacing="1" w:line="240" w:lineRule="auto"/>
+        <w:outlineLvl w:val="2"/>
+        <w:rPr>
+          <w:rFonts w:ascii="Segoe UI" w:eastAsia="Times New Roman" w:hAnsi="Segoe UI" w:cs="Segoe UI"/>
+          <w:color w:val="101010"/>
+          <w:sz w:val="24"/>
+          <w:szCs w:val="24"/>
+          <w:lang w:eastAsia="fr-FR"/>
+        </w:rPr>
+      </w:pPr>
+      <w:proofErr w:type="spellStart"/>
+      <w:r>
+        <w:rPr>
+          <w:rFonts w:ascii="Segoe UI" w:eastAsia="Times New Roman" w:hAnsi="Segoe UI" w:cs="Segoe UI"/>
+          <w:color w:val="101010"/>
+          <w:sz w:val="24"/>
+          <w:szCs w:val="24"/>
+          <w:lang w:eastAsia="fr-FR"/>
+        </w:rPr>
+        <w:t>Frontend</w:t>
+      </w:r>
+      <w:proofErr w:type="spellEnd"/>
+      <w:r>
+        <w:rPr>
+          <w:rFonts w:ascii="Segoe UI" w:eastAsia="Times New Roman" w:hAnsi="Segoe UI" w:cs="Segoe UI"/>
+          <w:color w:val="101010"/>
+          <w:sz w:val="24"/>
+          <w:szCs w:val="24"/>
+          <w:lang w:eastAsia="fr-FR"/>
+        </w:rPr>
+        <w:t xml:space="preserve"> (Client &amp; Admin)</w:t>
+      </w:r>
+    </w:p>
+    <w:p>
+      <w:pPr>
+        <w:numPr>
+          <w:ilvl w:val="0"/>
+          <w:numId w:val="30"/>
+        </w:numPr>
+        <w:shd w:val="clear" w:color="auto" w:fill="F9F9F9"/>
+        <w:spacing w:after="0" w:line="240" w:lineRule="auto"/>
+        <w:ind w:left="0"/>
+        <w:rPr>
+          <w:rFonts w:ascii="Segoe UI" w:eastAsia="Times New Roman" w:hAnsi="Segoe UI" w:cs="Segoe UI"/>
+          <w:color w:val="101010"/>
+          <w:sz w:val="21"/>
+          <w:szCs w:val="21"/>
+          <w:lang w:eastAsia="fr-FR"/>
+        </w:rPr>
+      </w:pPr>
+      <w:r>
+        <w:rPr>
+          <w:rFonts w:ascii="Segoe UI" w:eastAsia="Times New Roman" w:hAnsi="Segoe UI" w:cs="Segoe UI"/>
+          <w:color w:val="101010"/>
+          <w:sz w:val="21"/>
+          <w:szCs w:val="21"/>
+          <w:lang w:eastAsia="fr-FR"/>
+        </w:rPr>
+        <w:t>[MODIFY] </w:t>
+      </w:r>
+      <w:proofErr w:type="spellStart"/>
+      <w:r>
+        <w:rPr>
+          <w:rFonts w:ascii="Consolas" w:eastAsia="Times New Roman" w:hAnsi="Consolas" w:cs="Courier New"/>
+          <w:color w:val="A31515"/>
+          <w:sz w:val="19"/>
+          <w:szCs w:val="19"/>
+          <w:lang w:eastAsia="fr-FR"/>
+        </w:rPr>
+        <w:t>Booking.jsx</w:t>
+      </w:r>
+      <w:proofErr w:type="spellEnd"/>
+      <w:r>
+        <w:rPr>
+          <w:rFonts w:ascii="Segoe UI" w:eastAsia="Times New Roman" w:hAnsi="Segoe UI" w:cs="Segoe UI"/>
+          <w:color w:val="101010"/>
+          <w:sz w:val="21"/>
+          <w:szCs w:val="21"/>
+          <w:lang w:eastAsia="fr-FR"/>
+        </w:rPr>
+        <w:t> : Ajouter le bouton GPS et le bouton pour ajouter une image (avec compression intégrée pour ne pas saturer la base de données).</w:t>
+      </w:r>
+    </w:p>
+    <w:p>
+      <w:pPr>
+        <w:numPr>
+          <w:ilvl w:val="0"/>
+          <w:numId w:val="30"/>
+        </w:numPr>
+        <w:shd w:val="clear" w:color="auto" w:fill="F9F9F9"/>
+        <w:spacing w:after="0" w:line="240" w:lineRule="auto"/>
+        <w:ind w:left="0"/>
+        <w:rPr>
+          <w:rFonts w:ascii="Segoe UI" w:eastAsia="Times New Roman" w:hAnsi="Segoe UI" w:cs="Segoe UI"/>
+          <w:color w:val="101010"/>
+          <w:sz w:val="21"/>
+          <w:szCs w:val="21"/>
+          <w:lang w:eastAsia="fr-FR"/>
+        </w:rPr>
+      </w:pPr>
+      <w:r>
+        <w:rPr>
+          <w:rFonts w:ascii="Segoe UI" w:eastAsia="Times New Roman" w:hAnsi="Segoe UI" w:cs="Segoe UI"/>
+          <w:color w:val="101010"/>
+          <w:sz w:val="21"/>
+          <w:szCs w:val="21"/>
+          <w:lang w:eastAsia="fr-FR"/>
+        </w:rPr>
+        <w:t>[MODIFY] </w:t>
+      </w:r>
+      <w:proofErr w:type="spellStart"/>
+      <w:r>
+        <w:rPr>
+          <w:rFonts w:ascii="Consolas" w:eastAsia="Times New Roman" w:hAnsi="Consolas" w:cs="Courier New"/>
+          <w:color w:val="A31515"/>
+          <w:sz w:val="19"/>
+          <w:szCs w:val="19"/>
+          <w:lang w:eastAsia="fr-FR"/>
+        </w:rPr>
+        <w:t>Admin.jsx</w:t>
+      </w:r>
+      <w:proofErr w:type="spellEnd"/>
+      <w:r>
+        <w:rPr>
+          <w:rFonts w:ascii="Segoe UI" w:eastAsia="Times New Roman" w:hAnsi="Segoe UI" w:cs="Segoe UI"/>
+          <w:color w:val="101010"/>
+          <w:sz w:val="21"/>
+          <w:szCs w:val="21"/>
+          <w:lang w:eastAsia="fr-FR"/>
+        </w:rPr>
+        <w:t> : Ajouter un bouton "</w:t>
+      </w:r>
       <w:proofErr w:type="gramStart"/>
       <w:r>
         <w:rPr>
           <w:rFonts w:ascii="Segoe UI" w:eastAsia="Times New Roman" w:hAnsi="Segoe UI" w:cs="Segoe UI"/>
           <w:color w:val="101010"/>
-          <w:sz w:val="18"/>
-          <w:szCs w:val="18"/>
-          <w:lang w:eastAsia="fr-FR"/>
-        </w:rPr>
-        <w:t>15:</w:t>
+          <w:sz w:val="21"/>
+          <w:szCs w:val="21"/>
+          <w:lang w:eastAsia="fr-FR"/>
+        </w:rPr>
+        <w:t>Voir</w:t>
       </w:r>
       <w:proofErr w:type="gramEnd"/>
       <w:r>
         <w:rPr>
           <w:rFonts w:ascii="Segoe UI" w:eastAsia="Times New Roman" w:hAnsi="Segoe UI" w:cs="Segoe UI"/>
           <w:color w:val="101010"/>
-          <w:sz w:val="18"/>
-          <w:szCs w:val="18"/>
-          <w:lang w:eastAsia="fr-FR"/>
-        </w:rPr>
-        <w:t>44</w:t>
+          <w:sz w:val="21"/>
+          <w:szCs w:val="21"/>
+          <w:lang w:eastAsia="fr-FR"/>
+        </w:rPr>
+        <w:t xml:space="preserve"> la photo" dans la carte de la réservation pour que vous puissiez voir le problème.</w:t>
+      </w:r>
+    </w:p>
+    <w:p>
+      <w:pPr>
+        <w:shd w:val="clear" w:color="auto" w:fill="F9F9F9"/>
+        <w:spacing w:before="100" w:beforeAutospacing="1" w:after="100" w:afterAutospacing="1" w:line="240" w:lineRule="auto"/>
+        <w:outlineLvl w:val="1"/>
+        <w:rPr>
+          <w:rFonts w:ascii="Segoe UI" w:eastAsia="Times New Roman" w:hAnsi="Segoe UI" w:cs="Segoe UI"/>
+          <w:b/>
+          <w:bCs/>
+          <w:color w:val="101010"/>
+          <w:sz w:val="27"/>
+          <w:szCs w:val="27"/>
+          <w:lang w:eastAsia="fr-FR"/>
+        </w:rPr>
+      </w:pPr>
+      <w:r>
+        <w:rPr>
+          <w:rFonts w:ascii="Segoe UI" w:eastAsia="Times New Roman" w:hAnsi="Segoe UI" w:cs="Segoe UI"/>
+          <w:b/>
+          <w:bCs/>
+          <w:color w:val="101010"/>
+          <w:sz w:val="27"/>
+          <w:szCs w:val="27"/>
+          <w:lang w:eastAsia="fr-FR"/>
+        </w:rPr>
+        <w:t>Validation</w:t>
+      </w:r>
+    </w:p>
+    <w:p>
+      <w:pPr>
+        <w:shd w:val="clear" w:color="auto" w:fill="F9F9F9"/>
+        <w:spacing w:after="0" w:line="240" w:lineRule="auto"/>
+        <w:rPr>
+          <w:rFonts w:ascii="Segoe UI" w:eastAsia="Times New Roman" w:hAnsi="Segoe UI" w:cs="Segoe UI"/>
+          <w:color w:val="101010"/>
+          <w:sz w:val="21"/>
+          <w:szCs w:val="21"/>
+          <w:lang w:eastAsia="fr-FR"/>
+        </w:rPr>
+      </w:pPr>
+      <w:r>
+        <w:rPr>
+          <w:rFonts w:ascii="Segoe UI" w:eastAsia="Times New Roman" w:hAnsi="Segoe UI" w:cs="Segoe UI"/>
+          <w:color w:val="101010"/>
+          <w:sz w:val="21"/>
+          <w:szCs w:val="21"/>
+          <w:lang w:eastAsia="fr-FR"/>
+        </w:rPr>
+        <w:t>Si cette approche (GPS en 1 clic + Photo compressée) vous convient, cliquez sur </w:t>
+      </w:r>
+      <w:proofErr w:type="spellStart"/>
+      <w:r>
+        <w:rPr>
+          <w:rFonts w:ascii="Segoe UI" w:eastAsia="Times New Roman" w:hAnsi="Segoe UI" w:cs="Segoe UI"/>
+          <w:b/>
+          <w:bCs/>
+          <w:color w:val="101010"/>
+          <w:sz w:val="21"/>
+          <w:szCs w:val="21"/>
+          <w:lang w:eastAsia="fr-FR"/>
+        </w:rPr>
+        <w:t>Proceed</w:t>
+      </w:r>
+      <w:proofErr w:type="spellEnd"/>
+      <w:r>
+        <w:rPr>
+          <w:rFonts w:ascii="Segoe UI" w:eastAsia="Times New Roman" w:hAnsi="Segoe UI" w:cs="Segoe UI"/>
+          <w:color w:val="101010"/>
+          <w:sz w:val="21"/>
+          <w:szCs w:val="21"/>
+          <w:lang w:eastAsia="fr-FR"/>
+        </w:rPr>
+        <w:t> (ou répondez "Oui") et je lance la programmation !</w:t>
       </w:r>
     </w:p>
     <w:p>
@@ -11091,6 +12274,119 @@
 <file path=word/numbering.xml><?xml version="1.0" encoding="utf-8"?>
 <w:numbering xmlns:wpc="http://schemas.microsoft.com/office/word/2010/wordprocessingCanvas" xmlns:cx="http://schemas.microsoft.com/office/drawing/2014/chartex" xmlns:mc="http://schemas.openxmlformats.org/markup-compatibility/2006" xmlns:o="urn:schemas-microsoft-com:office:office" xmlns:r="http://schemas.openxmlformats.org/officeDocument/2006/relationships" xmlns:m="http://schemas.openxmlformats.org/officeDocument/2006/math" xmlns:v="urn:schemas-microsoft-com:vml" xmlns:wp14="http://schemas.microsoft.com/office/word/2010/wordprocessingDrawing" xmlns:wp="http://schemas.openxmlformats.org/drawingml/2006/wordprocessingDrawing" xmlns:w10="urn:schemas-microsoft-com:office:word" xmlns:w="http://schemas.openxmlformats.org/wordprocessingml/2006/main" xmlns:w14="http://schemas.microsoft.com/office/word/2010/wordml" xmlns:w15="http://schemas.microsoft.com/office/word/2012/wordml" xmlns:w16se="http://schemas.microsoft.com/office/word/2015/wordml/symex" xmlns:wpg="http://schemas.microsoft.com/office/word/2010/wordprocessingGroup" xmlns:wpi="http://schemas.microsoft.com/office/word/2010/wordprocessingInk" xmlns:wne="http://schemas.microsoft.com/office/word/2006/wordml" xmlns:wps="http://schemas.microsoft.com/office/word/2010/wordprocessingShape" mc:Ignorable="w14 w15 w16se wp14">
   <w:abstractNum w:abstractNumId="0" w15:restartNumberingAfterBreak="0">
+    <w:nsid w:val="02B7614E"/>
+    <w:multiLevelType w:val="multilevel"/>
+    <w:tmpl w:val="805241AE"/>
+    <w:lvl w:ilvl="0">
+      <w:start w:val="1"/>
+      <w:numFmt w:val="decimal"/>
+      <w:lvlText w:val="%1."/>
+      <w:lvlJc w:val="left"/>
+      <w:pPr>
+        <w:tabs>
+          <w:tab w:val="num" w:pos="720"/>
+        </w:tabs>
+        <w:ind w:left="720" w:hanging="360"/>
+      </w:pPr>
+    </w:lvl>
+    <w:lvl w:ilvl="1" w:tentative="1">
+      <w:start w:val="1"/>
+      <w:numFmt w:val="decimal"/>
+      <w:lvlText w:val="%2."/>
+      <w:lvlJc w:val="left"/>
+      <w:pPr>
+        <w:tabs>
+          <w:tab w:val="num" w:pos="1440"/>
+        </w:tabs>
+        <w:ind w:left="1440" w:hanging="360"/>
+      </w:pPr>
+    </w:lvl>
+    <w:lvl w:ilvl="2" w:tentative="1">
+      <w:start w:val="1"/>
+      <w:numFmt w:val="decimal"/>
+      <w:lvlText w:val="%3."/>
+      <w:lvlJc w:val="left"/>
+      <w:pPr>
+        <w:tabs>
+          <w:tab w:val="num" w:pos="2160"/>
+        </w:tabs>
+        <w:ind w:left="2160" w:hanging="360"/>
+      </w:pPr>
+    </w:lvl>
+    <w:lvl w:ilvl="3" w:tentative="1">
+      <w:start w:val="1"/>
+      <w:numFmt w:val="decimal"/>
+      <w:lvlText w:val="%4."/>
+      <w:lvlJc w:val="left"/>
+      <w:pPr>
+        <w:tabs>
+          <w:tab w:val="num" w:pos="2880"/>
+        </w:tabs>
+        <w:ind w:left="2880" w:hanging="360"/>
+      </w:pPr>
+    </w:lvl>
+    <w:lvl w:ilvl="4" w:tentative="1">
+      <w:start w:val="1"/>
+      <w:numFmt w:val="decimal"/>
+      <w:lvlText w:val="%5."/>
+      <w:lvlJc w:val="left"/>
+      <w:pPr>
+        <w:tabs>
+          <w:tab w:val="num" w:pos="3600"/>
+        </w:tabs>
+        <w:ind w:left="3600" w:hanging="360"/>
+      </w:pPr>
+    </w:lvl>
+    <w:lvl w:ilvl="5" w:tentative="1">
+      <w:start w:val="1"/>
+      <w:numFmt w:val="decimal"/>
+      <w:lvlText w:val="%6."/>
+      <w:lvlJc w:val="left"/>
+      <w:pPr>
+        <w:tabs>
+          <w:tab w:val="num" w:pos="4320"/>
+        </w:tabs>
+        <w:ind w:left="4320" w:hanging="360"/>
+      </w:pPr>
+    </w:lvl>
+    <w:lvl w:ilvl="6" w:tentative="1">
+      <w:start w:val="1"/>
+      <w:numFmt w:val="decimal"/>
+      <w:lvlText w:val="%7."/>
+      <w:lvlJc w:val="left"/>
+      <w:pPr>
+        <w:tabs>
+          <w:tab w:val="num" w:pos="5040"/>
+        </w:tabs>
+        <w:ind w:left="5040" w:hanging="360"/>
+      </w:pPr>
+    </w:lvl>
+    <w:lvl w:ilvl="7" w:tentative="1">
+      <w:start w:val="1"/>
+      <w:numFmt w:val="decimal"/>
+      <w:lvlText w:val="%8."/>
+      <w:lvlJc w:val="left"/>
+      <w:pPr>
+        <w:tabs>
+          <w:tab w:val="num" w:pos="5760"/>
+        </w:tabs>
+        <w:ind w:left="5760" w:hanging="360"/>
+      </w:pPr>
+    </w:lvl>
+    <w:lvl w:ilvl="8" w:tentative="1">
+      <w:start w:val="1"/>
+      <w:numFmt w:val="decimal"/>
+      <w:lvlText w:val="%9."/>
+      <w:lvlJc w:val="left"/>
+      <w:pPr>
+        <w:tabs>
+          <w:tab w:val="num" w:pos="6480"/>
+        </w:tabs>
+        <w:ind w:left="6480" w:hanging="360"/>
+      </w:pPr>
+    </w:lvl>
+  </w:abstractNum>
+  <w:abstractNum w:abstractNumId="1" w15:restartNumberingAfterBreak="0">
     <w:nsid w:val="07C30586"/>
     <w:multiLevelType w:val="multilevel"/>
     <w:tmpl w:val="2804AFEA"/>
@@ -11203,7 +12499,7 @@
       </w:pPr>
     </w:lvl>
   </w:abstractNum>
-  <w:abstractNum w:abstractNumId="1" w15:restartNumberingAfterBreak="0">
+  <w:abstractNum w:abstractNumId="2" w15:restartNumberingAfterBreak="0">
     <w:nsid w:val="09A37527"/>
     <w:multiLevelType w:val="multilevel"/>
     <w:tmpl w:val="77CEB33C"/>
@@ -11352,7 +12648,7 @@
       </w:rPr>
     </w:lvl>
   </w:abstractNum>
-  <w:abstractNum w:abstractNumId="2" w15:restartNumberingAfterBreak="0">
+  <w:abstractNum w:abstractNumId="3" w15:restartNumberingAfterBreak="0">
     <w:nsid w:val="0ABC10F1"/>
     <w:multiLevelType w:val="multilevel"/>
     <w:tmpl w:val="5D748474"/>
@@ -11473,7 +12769,7 @@
       </w:pPr>
     </w:lvl>
   </w:abstractNum>
-  <w:abstractNum w:abstractNumId="3" w15:restartNumberingAfterBreak="0">
+  <w:abstractNum w:abstractNumId="4" w15:restartNumberingAfterBreak="0">
     <w:nsid w:val="120152D5"/>
     <w:multiLevelType w:val="multilevel"/>
     <w:tmpl w:val="EAD6AC4E"/>
@@ -11586,7 +12882,7 @@
       </w:pPr>
     </w:lvl>
   </w:abstractNum>
-  <w:abstractNum w:abstractNumId="4" w15:restartNumberingAfterBreak="0">
+  <w:abstractNum w:abstractNumId="5" w15:restartNumberingAfterBreak="0">
     <w:nsid w:val="123C32E8"/>
     <w:multiLevelType w:val="multilevel"/>
     <w:tmpl w:val="7616BAF6"/>
@@ -11699,7 +12995,7 @@
       </w:pPr>
     </w:lvl>
   </w:abstractNum>
-  <w:abstractNum w:abstractNumId="5" w15:restartNumberingAfterBreak="0">
+  <w:abstractNum w:abstractNumId="6" w15:restartNumberingAfterBreak="0">
     <w:nsid w:val="150B7B1F"/>
     <w:multiLevelType w:val="multilevel"/>
     <w:tmpl w:val="2C4CDEB6"/>
@@ -11812,7 +13108,7 @@
       </w:pPr>
     </w:lvl>
   </w:abstractNum>
-  <w:abstractNum w:abstractNumId="6" w15:restartNumberingAfterBreak="0">
+  <w:abstractNum w:abstractNumId="7" w15:restartNumberingAfterBreak="0">
     <w:nsid w:val="1A7F3071"/>
     <w:multiLevelType w:val="multilevel"/>
     <w:tmpl w:val="4B94DCA0"/>
@@ -11925,7 +13221,7 @@
       </w:pPr>
     </w:lvl>
   </w:abstractNum>
-  <w:abstractNum w:abstractNumId="7" w15:restartNumberingAfterBreak="0">
+  <w:abstractNum w:abstractNumId="8" w15:restartNumberingAfterBreak="0">
     <w:nsid w:val="1C645F4A"/>
     <w:multiLevelType w:val="multilevel"/>
     <w:tmpl w:val="B130F956"/>
@@ -12038,7 +13334,156 @@
       </w:pPr>
     </w:lvl>
   </w:abstractNum>
-  <w:abstractNum w:abstractNumId="8" w15:restartNumberingAfterBreak="0">
+  <w:abstractNum w:abstractNumId="9" w15:restartNumberingAfterBreak="0">
+    <w:nsid w:val="1CD66C34"/>
+    <w:multiLevelType w:val="multilevel"/>
+    <w:tmpl w:val="86969966"/>
+    <w:lvl w:ilvl="0">
+      <w:start w:val="1"/>
+      <w:numFmt w:val="bullet"/>
+      <w:lvlText w:val=""/>
+      <w:lvlJc w:val="left"/>
+      <w:pPr>
+        <w:tabs>
+          <w:tab w:val="num" w:pos="720"/>
+        </w:tabs>
+        <w:ind w:left="720" w:hanging="360"/>
+      </w:pPr>
+      <w:rPr>
+        <w:rFonts w:ascii="Symbol" w:hAnsi="Symbol" w:hint="default"/>
+        <w:sz w:val="20"/>
+      </w:rPr>
+    </w:lvl>
+    <w:lvl w:ilvl="1" w:tentative="1">
+      <w:start w:val="1"/>
+      <w:numFmt w:val="bullet"/>
+      <w:lvlText w:val=""/>
+      <w:lvlJc w:val="left"/>
+      <w:pPr>
+        <w:tabs>
+          <w:tab w:val="num" w:pos="1440"/>
+        </w:tabs>
+        <w:ind w:left="1440" w:hanging="360"/>
+      </w:pPr>
+      <w:rPr>
+        <w:rFonts w:ascii="Symbol" w:hAnsi="Symbol" w:hint="default"/>
+        <w:sz w:val="20"/>
+      </w:rPr>
+    </w:lvl>
+    <w:lvl w:ilvl="2" w:tentative="1">
+      <w:start w:val="1"/>
+      <w:numFmt w:val="bullet"/>
+      <w:lvlText w:val=""/>
+      <w:lvlJc w:val="left"/>
+      <w:pPr>
+        <w:tabs>
+          <w:tab w:val="num" w:pos="2160"/>
+        </w:tabs>
+        <w:ind w:left="2160" w:hanging="360"/>
+      </w:pPr>
+      <w:rPr>
+        <w:rFonts w:ascii="Symbol" w:hAnsi="Symbol" w:hint="default"/>
+        <w:sz w:val="20"/>
+      </w:rPr>
+    </w:lvl>
+    <w:lvl w:ilvl="3" w:tentative="1">
+      <w:start w:val="1"/>
+      <w:numFmt w:val="bullet"/>
+      <w:lvlText w:val=""/>
+      <w:lvlJc w:val="left"/>
+      <w:pPr>
+        <w:tabs>
+          <w:tab w:val="num" w:pos="2880"/>
+        </w:tabs>
+        <w:ind w:left="2880" w:hanging="360"/>
+      </w:pPr>
+      <w:rPr>
+        <w:rFonts w:ascii="Symbol" w:hAnsi="Symbol" w:hint="default"/>
+        <w:sz w:val="20"/>
+      </w:rPr>
+    </w:lvl>
+    <w:lvl w:ilvl="4" w:tentative="1">
+      <w:start w:val="1"/>
+      <w:numFmt w:val="bullet"/>
+      <w:lvlText w:val=""/>
+      <w:lvlJc w:val="left"/>
+      <w:pPr>
+        <w:tabs>
+          <w:tab w:val="num" w:pos="3600"/>
+        </w:tabs>
+        <w:ind w:left="3600" w:hanging="360"/>
+      </w:pPr>
+      <w:rPr>
+        <w:rFonts w:ascii="Symbol" w:hAnsi="Symbol" w:hint="default"/>
+        <w:sz w:val="20"/>
+      </w:rPr>
+    </w:lvl>
+    <w:lvl w:ilvl="5" w:tentative="1">
+      <w:start w:val="1"/>
+      <w:numFmt w:val="bullet"/>
+      <w:lvlText w:val=""/>
+      <w:lvlJc w:val="left"/>
+      <w:pPr>
+        <w:tabs>
+          <w:tab w:val="num" w:pos="4320"/>
+        </w:tabs>
+        <w:ind w:left="4320" w:hanging="360"/>
+      </w:pPr>
+      <w:rPr>
+        <w:rFonts w:ascii="Symbol" w:hAnsi="Symbol" w:hint="default"/>
+        <w:sz w:val="20"/>
+      </w:rPr>
+    </w:lvl>
+    <w:lvl w:ilvl="6" w:tentative="1">
+      <w:start w:val="1"/>
+      <w:numFmt w:val="bullet"/>
+      <w:lvlText w:val=""/>
+      <w:lvlJc w:val="left"/>
+      <w:pPr>
+        <w:tabs>
+          <w:tab w:val="num" w:pos="5040"/>
+        </w:tabs>
+        <w:ind w:left="5040" w:hanging="360"/>
+      </w:pPr>
+      <w:rPr>
+        <w:rFonts w:ascii="Symbol" w:hAnsi="Symbol" w:hint="default"/>
+        <w:sz w:val="20"/>
+      </w:rPr>
+    </w:lvl>
+    <w:lvl w:ilvl="7" w:tentative="1">
+      <w:start w:val="1"/>
+      <w:numFmt w:val="bullet"/>
+      <w:lvlText w:val=""/>
+      <w:lvlJc w:val="left"/>
+      <w:pPr>
+        <w:tabs>
+          <w:tab w:val="num" w:pos="5760"/>
+        </w:tabs>
+        <w:ind w:left="5760" w:hanging="360"/>
+      </w:pPr>
+      <w:rPr>
+        <w:rFonts w:ascii="Symbol" w:hAnsi="Symbol" w:hint="default"/>
+        <w:sz w:val="20"/>
+      </w:rPr>
+    </w:lvl>
+    <w:lvl w:ilvl="8" w:tentative="1">
+      <w:start w:val="1"/>
+      <w:numFmt w:val="bullet"/>
+      <w:lvlText w:val=""/>
+      <w:lvlJc w:val="left"/>
+      <w:pPr>
+        <w:tabs>
+          <w:tab w:val="num" w:pos="6480"/>
+        </w:tabs>
+        <w:ind w:left="6480" w:hanging="360"/>
+      </w:pPr>
+      <w:rPr>
+        <w:rFonts w:ascii="Symbol" w:hAnsi="Symbol" w:hint="default"/>
+        <w:sz w:val="20"/>
+      </w:rPr>
+    </w:lvl>
+  </w:abstractNum>
+  <w:abstractNum w:abstractNumId="10" w15:restartNumberingAfterBreak="0">
     <w:nsid w:val="23082BAF"/>
     <w:multiLevelType w:val="multilevel"/>
     <w:tmpl w:val="0744182A"/>
@@ -12151,7 +13596,7 @@
       </w:pPr>
     </w:lvl>
   </w:abstractNum>
-  <w:abstractNum w:abstractNumId="9" w15:restartNumberingAfterBreak="0">
+  <w:abstractNum w:abstractNumId="11" w15:restartNumberingAfterBreak="0">
     <w:nsid w:val="255D163E"/>
     <w:multiLevelType w:val="multilevel"/>
     <w:tmpl w:val="09100952"/>
@@ -12300,7 +13745,156 @@
       </w:rPr>
     </w:lvl>
   </w:abstractNum>
-  <w:abstractNum w:abstractNumId="10" w15:restartNumberingAfterBreak="0">
+  <w:abstractNum w:abstractNumId="12" w15:restartNumberingAfterBreak="0">
+    <w:nsid w:val="30237355"/>
+    <w:multiLevelType w:val="multilevel"/>
+    <w:tmpl w:val="C3C00F0E"/>
+    <w:lvl w:ilvl="0">
+      <w:start w:val="1"/>
+      <w:numFmt w:val="bullet"/>
+      <w:lvlText w:val=""/>
+      <w:lvlJc w:val="left"/>
+      <w:pPr>
+        <w:tabs>
+          <w:tab w:val="num" w:pos="720"/>
+        </w:tabs>
+        <w:ind w:left="720" w:hanging="360"/>
+      </w:pPr>
+      <w:rPr>
+        <w:rFonts w:ascii="Symbol" w:hAnsi="Symbol" w:hint="default"/>
+        <w:sz w:val="20"/>
+      </w:rPr>
+    </w:lvl>
+    <w:lvl w:ilvl="1" w:tentative="1">
+      <w:start w:val="1"/>
+      <w:numFmt w:val="bullet"/>
+      <w:lvlText w:val=""/>
+      <w:lvlJc w:val="left"/>
+      <w:pPr>
+        <w:tabs>
+          <w:tab w:val="num" w:pos="1440"/>
+        </w:tabs>
+        <w:ind w:left="1440" w:hanging="360"/>
+      </w:pPr>
+      <w:rPr>
+        <w:rFonts w:ascii="Symbol" w:hAnsi="Symbol" w:hint="default"/>
+        <w:sz w:val="20"/>
+      </w:rPr>
+    </w:lvl>
+    <w:lvl w:ilvl="2" w:tentative="1">
+      <w:start w:val="1"/>
+      <w:numFmt w:val="bullet"/>
+      <w:lvlText w:val=""/>
+      <w:lvlJc w:val="left"/>
+      <w:pPr>
+        <w:tabs>
+          <w:tab w:val="num" w:pos="2160"/>
+        </w:tabs>
+        <w:ind w:left="2160" w:hanging="360"/>
+      </w:pPr>
+      <w:rPr>
+        <w:rFonts w:ascii="Symbol" w:hAnsi="Symbol" w:hint="default"/>
+        <w:sz w:val="20"/>
+      </w:rPr>
+    </w:lvl>
+    <w:lvl w:ilvl="3" w:tentative="1">
+      <w:start w:val="1"/>
+      <w:numFmt w:val="bullet"/>
+      <w:lvlText w:val=""/>
+      <w:lvlJc w:val="left"/>
+      <w:pPr>
+        <w:tabs>
+          <w:tab w:val="num" w:pos="2880"/>
+        </w:tabs>
+        <w:ind w:left="2880" w:hanging="360"/>
+      </w:pPr>
+      <w:rPr>
+        <w:rFonts w:ascii="Symbol" w:hAnsi="Symbol" w:hint="default"/>
+        <w:sz w:val="20"/>
+      </w:rPr>
+    </w:lvl>
+    <w:lvl w:ilvl="4" w:tentative="1">
+      <w:start w:val="1"/>
+      <w:numFmt w:val="bullet"/>
+      <w:lvlText w:val=""/>
+      <w:lvlJc w:val="left"/>
+      <w:pPr>
+        <w:tabs>
+          <w:tab w:val="num" w:pos="3600"/>
+        </w:tabs>
+        <w:ind w:left="3600" w:hanging="360"/>
+      </w:pPr>
+      <w:rPr>
+        <w:rFonts w:ascii="Symbol" w:hAnsi="Symbol" w:hint="default"/>
+        <w:sz w:val="20"/>
+      </w:rPr>
+    </w:lvl>
+    <w:lvl w:ilvl="5" w:tentative="1">
+      <w:start w:val="1"/>
+      <w:numFmt w:val="bullet"/>
+      <w:lvlText w:val=""/>
+      <w:lvlJc w:val="left"/>
+      <w:pPr>
+        <w:tabs>
+          <w:tab w:val="num" w:pos="4320"/>
+        </w:tabs>
+        <w:ind w:left="4320" w:hanging="360"/>
+      </w:pPr>
+      <w:rPr>
+        <w:rFonts w:ascii="Symbol" w:hAnsi="Symbol" w:hint="default"/>
+        <w:sz w:val="20"/>
+      </w:rPr>
+    </w:lvl>
+    <w:lvl w:ilvl="6" w:tentative="1">
+      <w:start w:val="1"/>
+      <w:numFmt w:val="bullet"/>
+      <w:lvlText w:val=""/>
+      <w:lvlJc w:val="left"/>
+      <w:pPr>
+        <w:tabs>
+          <w:tab w:val="num" w:pos="5040"/>
+        </w:tabs>
+        <w:ind w:left="5040" w:hanging="360"/>
+      </w:pPr>
+      <w:rPr>
+        <w:rFonts w:ascii="Symbol" w:hAnsi="Symbol" w:hint="default"/>
+        <w:sz w:val="20"/>
+      </w:rPr>
+    </w:lvl>
+    <w:lvl w:ilvl="7" w:tentative="1">
+      <w:start w:val="1"/>
+      <w:numFmt w:val="bullet"/>
+      <w:lvlText w:val=""/>
+      <w:lvlJc w:val="left"/>
+      <w:pPr>
+        <w:tabs>
+          <w:tab w:val="num" w:pos="5760"/>
+        </w:tabs>
+        <w:ind w:left="5760" w:hanging="360"/>
+      </w:pPr>
+      <w:rPr>
+        <w:rFonts w:ascii="Symbol" w:hAnsi="Symbol" w:hint="default"/>
+        <w:sz w:val="20"/>
+      </w:rPr>
+    </w:lvl>
+    <w:lvl w:ilvl="8" w:tentative="1">
+      <w:start w:val="1"/>
+      <w:numFmt w:val="bullet"/>
+      <w:lvlText w:val=""/>
+      <w:lvlJc w:val="left"/>
+      <w:pPr>
+        <w:tabs>
+          <w:tab w:val="num" w:pos="6480"/>
+        </w:tabs>
+        <w:ind w:left="6480" w:hanging="360"/>
+      </w:pPr>
+      <w:rPr>
+        <w:rFonts w:ascii="Symbol" w:hAnsi="Symbol" w:hint="default"/>
+        <w:sz w:val="20"/>
+      </w:rPr>
+    </w:lvl>
+  </w:abstractNum>
+  <w:abstractNum w:abstractNumId="13" w15:restartNumberingAfterBreak="0">
     <w:nsid w:val="30434474"/>
     <w:multiLevelType w:val="multilevel"/>
     <w:tmpl w:val="D35E6898"/>
@@ -12449,7 +14043,7 @@
       </w:rPr>
     </w:lvl>
   </w:abstractNum>
-  <w:abstractNum w:abstractNumId="11" w15:restartNumberingAfterBreak="0">
+  <w:abstractNum w:abstractNumId="14" w15:restartNumberingAfterBreak="0">
     <w:nsid w:val="30D465EC"/>
     <w:multiLevelType w:val="multilevel"/>
     <w:tmpl w:val="96023E28"/>
@@ -12562,7 +14156,7 @@
       </w:pPr>
     </w:lvl>
   </w:abstractNum>
-  <w:abstractNum w:abstractNumId="12" w15:restartNumberingAfterBreak="0">
+  <w:abstractNum w:abstractNumId="15" w15:restartNumberingAfterBreak="0">
     <w:nsid w:val="36AB793B"/>
     <w:multiLevelType w:val="multilevel"/>
     <w:tmpl w:val="58BA525C"/>
@@ -12675,7 +14269,7 @@
       </w:pPr>
     </w:lvl>
   </w:abstractNum>
-  <w:abstractNum w:abstractNumId="13" w15:restartNumberingAfterBreak="0">
+  <w:abstractNum w:abstractNumId="16" w15:restartNumberingAfterBreak="0">
     <w:nsid w:val="3E174719"/>
     <w:multiLevelType w:val="multilevel"/>
     <w:tmpl w:val="8B6ACB7C"/>
@@ -12824,7 +14418,7 @@
       </w:rPr>
     </w:lvl>
   </w:abstractNum>
-  <w:abstractNum w:abstractNumId="14" w15:restartNumberingAfterBreak="0">
+  <w:abstractNum w:abstractNumId="17" w15:restartNumberingAfterBreak="0">
     <w:nsid w:val="41255EDF"/>
     <w:multiLevelType w:val="multilevel"/>
     <w:tmpl w:val="D51633B0"/>
@@ -12973,7 +14567,7 @@
       </w:rPr>
     </w:lvl>
   </w:abstractNum>
-  <w:abstractNum w:abstractNumId="15" w15:restartNumberingAfterBreak="0">
+  <w:abstractNum w:abstractNumId="18" w15:restartNumberingAfterBreak="0">
     <w:nsid w:val="56F716FF"/>
     <w:multiLevelType w:val="multilevel"/>
     <w:tmpl w:val="C4FE0146"/>
@@ -13122,7 +14716,7 @@
       </w:rPr>
     </w:lvl>
   </w:abstractNum>
-  <w:abstractNum w:abstractNumId="16" w15:restartNumberingAfterBreak="0">
+  <w:abstractNum w:abstractNumId="19" w15:restartNumberingAfterBreak="0">
     <w:nsid w:val="58A74BAC"/>
     <w:multiLevelType w:val="multilevel"/>
     <w:tmpl w:val="A0E02532"/>
@@ -13235,7 +14829,7 @@
       </w:pPr>
     </w:lvl>
   </w:abstractNum>
-  <w:abstractNum w:abstractNumId="17" w15:restartNumberingAfterBreak="0">
+  <w:abstractNum w:abstractNumId="20" w15:restartNumberingAfterBreak="0">
     <w:nsid w:val="58C07C39"/>
     <w:multiLevelType w:val="multilevel"/>
     <w:tmpl w:val="F0302736"/>
@@ -13384,7 +14978,7 @@
       </w:rPr>
     </w:lvl>
   </w:abstractNum>
-  <w:abstractNum w:abstractNumId="18" w15:restartNumberingAfterBreak="0">
+  <w:abstractNum w:abstractNumId="21" w15:restartNumberingAfterBreak="0">
     <w:nsid w:val="61292230"/>
     <w:multiLevelType w:val="multilevel"/>
     <w:tmpl w:val="6AD610F0"/>
@@ -13501,7 +15095,7 @@
       </w:pPr>
     </w:lvl>
   </w:abstractNum>
-  <w:abstractNum w:abstractNumId="19" w15:restartNumberingAfterBreak="0">
+  <w:abstractNum w:abstractNumId="22" w15:restartNumberingAfterBreak="0">
     <w:nsid w:val="62A76490"/>
     <w:multiLevelType w:val="multilevel"/>
     <w:tmpl w:val="4F1C5316"/>
@@ -13618,7 +15212,7 @@
       </w:pPr>
     </w:lvl>
   </w:abstractNum>
-  <w:abstractNum w:abstractNumId="20" w15:restartNumberingAfterBreak="0">
+  <w:abstractNum w:abstractNumId="23" w15:restartNumberingAfterBreak="0">
     <w:nsid w:val="63573F96"/>
     <w:multiLevelType w:val="multilevel"/>
     <w:tmpl w:val="2CB21D70"/>
@@ -13767,7 +15361,7 @@
       </w:rPr>
     </w:lvl>
   </w:abstractNum>
-  <w:abstractNum w:abstractNumId="21" w15:restartNumberingAfterBreak="0">
+  <w:abstractNum w:abstractNumId="24" w15:restartNumberingAfterBreak="0">
     <w:nsid w:val="63C26785"/>
     <w:multiLevelType w:val="multilevel"/>
     <w:tmpl w:val="6818FAC8"/>
@@ -13880,7 +15474,156 @@
       </w:pPr>
     </w:lvl>
   </w:abstractNum>
-  <w:abstractNum w:abstractNumId="22" w15:restartNumberingAfterBreak="0">
+  <w:abstractNum w:abstractNumId="25" w15:restartNumberingAfterBreak="0">
+    <w:nsid w:val="6BB13E57"/>
+    <w:multiLevelType w:val="multilevel"/>
+    <w:tmpl w:val="947E31F6"/>
+    <w:lvl w:ilvl="0">
+      <w:start w:val="1"/>
+      <w:numFmt w:val="bullet"/>
+      <w:lvlText w:val=""/>
+      <w:lvlJc w:val="left"/>
+      <w:pPr>
+        <w:tabs>
+          <w:tab w:val="num" w:pos="720"/>
+        </w:tabs>
+        <w:ind w:left="720" w:hanging="360"/>
+      </w:pPr>
+      <w:rPr>
+        <w:rFonts w:ascii="Symbol" w:hAnsi="Symbol" w:hint="default"/>
+        <w:sz w:val="20"/>
+      </w:rPr>
+    </w:lvl>
+    <w:lvl w:ilvl="1" w:tentative="1">
+      <w:start w:val="1"/>
+      <w:numFmt w:val="bullet"/>
+      <w:lvlText w:val=""/>
+      <w:lvlJc w:val="left"/>
+      <w:pPr>
+        <w:tabs>
+          <w:tab w:val="num" w:pos="1440"/>
+        </w:tabs>
+        <w:ind w:left="1440" w:hanging="360"/>
+      </w:pPr>
+      <w:rPr>
+        <w:rFonts w:ascii="Symbol" w:hAnsi="Symbol" w:hint="default"/>
+        <w:sz w:val="20"/>
+      </w:rPr>
+    </w:lvl>
+    <w:lvl w:ilvl="2" w:tentative="1">
+      <w:start w:val="1"/>
+      <w:numFmt w:val="bullet"/>
+      <w:lvlText w:val=""/>
+      <w:lvlJc w:val="left"/>
+      <w:pPr>
+        <w:tabs>
+          <w:tab w:val="num" w:pos="2160"/>
+        </w:tabs>
+        <w:ind w:left="2160" w:hanging="360"/>
+      </w:pPr>
+      <w:rPr>
+        <w:rFonts w:ascii="Symbol" w:hAnsi="Symbol" w:hint="default"/>
+        <w:sz w:val="20"/>
+      </w:rPr>
+    </w:lvl>
+    <w:lvl w:ilvl="3" w:tentative="1">
+      <w:start w:val="1"/>
+      <w:numFmt w:val="bullet"/>
+      <w:lvlText w:val=""/>
+      <w:lvlJc w:val="left"/>
+      <w:pPr>
+        <w:tabs>
+          <w:tab w:val="num" w:pos="2880"/>
+        </w:tabs>
+        <w:ind w:left="2880" w:hanging="360"/>
+      </w:pPr>
+      <w:rPr>
+        <w:rFonts w:ascii="Symbol" w:hAnsi="Symbol" w:hint="default"/>
+        <w:sz w:val="20"/>
+      </w:rPr>
+    </w:lvl>
+    <w:lvl w:ilvl="4" w:tentative="1">
+      <w:start w:val="1"/>
+      <w:numFmt w:val="bullet"/>
+      <w:lvlText w:val=""/>
+      <w:lvlJc w:val="left"/>
+      <w:pPr>
+        <w:tabs>
+          <w:tab w:val="num" w:pos="3600"/>
+        </w:tabs>
+        <w:ind w:left="3600" w:hanging="360"/>
+      </w:pPr>
+      <w:rPr>
+        <w:rFonts w:ascii="Symbol" w:hAnsi="Symbol" w:hint="default"/>
+        <w:sz w:val="20"/>
+      </w:rPr>
+    </w:lvl>
+    <w:lvl w:ilvl="5" w:tentative="1">
+      <w:start w:val="1"/>
+      <w:numFmt w:val="bullet"/>
+      <w:lvlText w:val=""/>
+      <w:lvlJc w:val="left"/>
+      <w:pPr>
+        <w:tabs>
+          <w:tab w:val="num" w:pos="4320"/>
+        </w:tabs>
+        <w:ind w:left="4320" w:hanging="360"/>
+      </w:pPr>
+      <w:rPr>
+        <w:rFonts w:ascii="Symbol" w:hAnsi="Symbol" w:hint="default"/>
+        <w:sz w:val="20"/>
+      </w:rPr>
+    </w:lvl>
+    <w:lvl w:ilvl="6" w:tentative="1">
+      <w:start w:val="1"/>
+      <w:numFmt w:val="bullet"/>
+      <w:lvlText w:val=""/>
+      <w:lvlJc w:val="left"/>
+      <w:pPr>
+        <w:tabs>
+          <w:tab w:val="num" w:pos="5040"/>
+        </w:tabs>
+        <w:ind w:left="5040" w:hanging="360"/>
+      </w:pPr>
+      <w:rPr>
+        <w:rFonts w:ascii="Symbol" w:hAnsi="Symbol" w:hint="default"/>
+        <w:sz w:val="20"/>
+      </w:rPr>
+    </w:lvl>
+    <w:lvl w:ilvl="7" w:tentative="1">
+      <w:start w:val="1"/>
+      <w:numFmt w:val="bullet"/>
+      <w:lvlText w:val=""/>
+      <w:lvlJc w:val="left"/>
+      <w:pPr>
+        <w:tabs>
+          <w:tab w:val="num" w:pos="5760"/>
+        </w:tabs>
+        <w:ind w:left="5760" w:hanging="360"/>
+      </w:pPr>
+      <w:rPr>
+        <w:rFonts w:ascii="Symbol" w:hAnsi="Symbol" w:hint="default"/>
+        <w:sz w:val="20"/>
+      </w:rPr>
+    </w:lvl>
+    <w:lvl w:ilvl="8" w:tentative="1">
+      <w:start w:val="1"/>
+      <w:numFmt w:val="bullet"/>
+      <w:lvlText w:val=""/>
+      <w:lvlJc w:val="left"/>
+      <w:pPr>
+        <w:tabs>
+          <w:tab w:val="num" w:pos="6480"/>
+        </w:tabs>
+        <w:ind w:left="6480" w:hanging="360"/>
+      </w:pPr>
+      <w:rPr>
+        <w:rFonts w:ascii="Symbol" w:hAnsi="Symbol" w:hint="default"/>
+        <w:sz w:val="20"/>
+      </w:rPr>
+    </w:lvl>
+  </w:abstractNum>
+  <w:abstractNum w:abstractNumId="26" w15:restartNumberingAfterBreak="0">
     <w:nsid w:val="6D64703A"/>
     <w:multiLevelType w:val="multilevel"/>
     <w:tmpl w:val="4A8A1276"/>
@@ -13993,7 +15736,7 @@
       </w:pPr>
     </w:lvl>
   </w:abstractNum>
-  <w:abstractNum w:abstractNumId="23" w15:restartNumberingAfterBreak="0">
+  <w:abstractNum w:abstractNumId="27" w15:restartNumberingAfterBreak="0">
     <w:nsid w:val="6D906C01"/>
     <w:multiLevelType w:val="multilevel"/>
     <w:tmpl w:val="4DF63D4A"/>
@@ -14142,7 +15885,7 @@
       </w:rPr>
     </w:lvl>
   </w:abstractNum>
-  <w:abstractNum w:abstractNumId="24" w15:restartNumberingAfterBreak="0">
+  <w:abstractNum w:abstractNumId="28" w15:restartNumberingAfterBreak="0">
     <w:nsid w:val="71E65246"/>
     <w:multiLevelType w:val="multilevel"/>
     <w:tmpl w:val="F9944F54"/>
@@ -14291,7 +16034,7 @@
       </w:rPr>
     </w:lvl>
   </w:abstractNum>
-  <w:abstractNum w:abstractNumId="25" w15:restartNumberingAfterBreak="0">
+  <w:abstractNum w:abstractNumId="29" w15:restartNumberingAfterBreak="0">
     <w:nsid w:val="75FC1139"/>
     <w:multiLevelType w:val="multilevel"/>
     <w:tmpl w:val="CC5A3DA6"/>
@@ -14441,82 +16184,94 @@
     </w:lvl>
   </w:abstractNum>
   <w:num w:numId="1">
+    <w:abstractNumId w:val="19"/>
+  </w:num>
+  <w:num w:numId="2">
+    <w:abstractNumId w:val="15"/>
+  </w:num>
+  <w:num w:numId="3">
+    <w:abstractNumId w:val="28"/>
+  </w:num>
+  <w:num w:numId="4">
+    <w:abstractNumId w:val="21"/>
+  </w:num>
+  <w:num w:numId="5">
+    <w:abstractNumId w:val="11"/>
+  </w:num>
+  <w:num w:numId="6">
+    <w:abstractNumId w:val="22"/>
+  </w:num>
+  <w:num w:numId="7">
+    <w:abstractNumId w:val="23"/>
+  </w:num>
+  <w:num w:numId="8">
+    <w:abstractNumId w:val="26"/>
+  </w:num>
+  <w:num w:numId="9">
+    <w:abstractNumId w:val="6"/>
+  </w:num>
+  <w:num w:numId="10">
+    <w:abstractNumId w:val="7"/>
+  </w:num>
+  <w:num w:numId="11">
+    <w:abstractNumId w:val="20"/>
+  </w:num>
+  <w:num w:numId="12">
+    <w:abstractNumId w:val="24"/>
+  </w:num>
+  <w:num w:numId="13">
+    <w:abstractNumId w:val="17"/>
+  </w:num>
+  <w:num w:numId="14">
+    <w:abstractNumId w:val="13"/>
+  </w:num>
+  <w:num w:numId="15">
+    <w:abstractNumId w:val="29"/>
+  </w:num>
+  <w:num w:numId="16">
+    <w:abstractNumId w:val="14"/>
+  </w:num>
+  <w:num w:numId="17">
+    <w:abstractNumId w:val="3"/>
+  </w:num>
+  <w:num w:numId="18">
+    <w:abstractNumId w:val="18"/>
+  </w:num>
+  <w:num w:numId="19">
+    <w:abstractNumId w:val="2"/>
+  </w:num>
+  <w:num w:numId="20">
+    <w:abstractNumId w:val="8"/>
+  </w:num>
+  <w:num w:numId="21">
+    <w:abstractNumId w:val="1"/>
+  </w:num>
+  <w:num w:numId="22">
+    <w:abstractNumId w:val="4"/>
+  </w:num>
+  <w:num w:numId="23">
+    <w:abstractNumId w:val="27"/>
+  </w:num>
+  <w:num w:numId="24">
+    <w:abstractNumId w:val="5"/>
+  </w:num>
+  <w:num w:numId="25">
+    <w:abstractNumId w:val="10"/>
+  </w:num>
+  <w:num w:numId="26">
     <w:abstractNumId w:val="16"/>
   </w:num>
-  <w:num w:numId="2">
+  <w:num w:numId="27">
+    <w:abstractNumId w:val="0"/>
+  </w:num>
+  <w:num w:numId="28">
+    <w:abstractNumId w:val="9"/>
+  </w:num>
+  <w:num w:numId="29">
     <w:abstractNumId w:val="12"/>
   </w:num>
-  <w:num w:numId="3">
-    <w:abstractNumId w:val="24"/>
-  </w:num>
-  <w:num w:numId="4">
-    <w:abstractNumId w:val="18"/>
-  </w:num>
-  <w:num w:numId="5">
-    <w:abstractNumId w:val="9"/>
-  </w:num>
-  <w:num w:numId="6">
-    <w:abstractNumId w:val="19"/>
-  </w:num>
-  <w:num w:numId="7">
-    <w:abstractNumId w:val="20"/>
-  </w:num>
-  <w:num w:numId="8">
-    <w:abstractNumId w:val="22"/>
-  </w:num>
-  <w:num w:numId="9">
-    <w:abstractNumId w:val="5"/>
-  </w:num>
-  <w:num w:numId="10">
-    <w:abstractNumId w:val="6"/>
-  </w:num>
-  <w:num w:numId="11">
-    <w:abstractNumId w:val="17"/>
-  </w:num>
-  <w:num w:numId="12">
-    <w:abstractNumId w:val="21"/>
-  </w:num>
-  <w:num w:numId="13">
-    <w:abstractNumId w:val="14"/>
-  </w:num>
-  <w:num w:numId="14">
-    <w:abstractNumId w:val="10"/>
-  </w:num>
-  <w:num w:numId="15">
+  <w:num w:numId="30">
     <w:abstractNumId w:val="25"/>
-  </w:num>
-  <w:num w:numId="16">
-    <w:abstractNumId w:val="11"/>
-  </w:num>
-  <w:num w:numId="17">
-    <w:abstractNumId w:val="2"/>
-  </w:num>
-  <w:num w:numId="18">
-    <w:abstractNumId w:val="15"/>
-  </w:num>
-  <w:num w:numId="19">
-    <w:abstractNumId w:val="1"/>
-  </w:num>
-  <w:num w:numId="20">
-    <w:abstractNumId w:val="7"/>
-  </w:num>
-  <w:num w:numId="21">
-    <w:abstractNumId w:val="0"/>
-  </w:num>
-  <w:num w:numId="22">
-    <w:abstractNumId w:val="3"/>
-  </w:num>
-  <w:num w:numId="23">
-    <w:abstractNumId w:val="23"/>
-  </w:num>
-  <w:num w:numId="24">
-    <w:abstractNumId w:val="4"/>
-  </w:num>
-  <w:num w:numId="25">
-    <w:abstractNumId w:val="8"/>
-  </w:num>
-  <w:num w:numId="26">
-    <w:abstractNumId w:val="13"/>
   </w:num>
 </w:numbering>
 </file>
@@ -15439,7 +17194,7 @@
 </file>
 
 <file path=customXml/itemProps1.xml><?xml version="1.0" encoding="utf-8"?>
-<ds:datastoreItem xmlns:ds="http://schemas.openxmlformats.org/officeDocument/2006/customXml" ds:itemID="{D0F19772-4BBF-420D-903A-FC46F8653960}">
+<ds:datastoreItem xmlns:ds="http://schemas.openxmlformats.org/officeDocument/2006/customXml" ds:itemID="{0D5C52A4-9420-4CEB-A295-E4520E912EF1}">
   <ds:schemaRefs>
     <ds:schemaRef ds:uri="http://schemas.openxmlformats.org/officeDocument/2006/bibliography"/>
   </ds:schemaRefs>

</xml_diff>

<commit_message>
UI: Correction bordures champs de texte et bouton GPS mobile
</commit_message>
<xml_diff>
--- a/Application de Réservation de Techniciens à Domicile.docx
+++ b/Application de Réservation de Techniciens à Domicile.docx
@@ -12258,8 +12258,562 @@
           <w:szCs w:val="24"/>
         </w:rPr>
       </w:pPr>
+    </w:p>
+    <w:p>
+      <w:pPr>
+        <w:rPr>
+          <w:rFonts w:asciiTheme="majorBidi" w:hAnsiTheme="majorBidi" w:cstheme="majorBidi"/>
+          <w:sz w:val="24"/>
+          <w:szCs w:val="24"/>
+        </w:rPr>
+      </w:pPr>
+    </w:p>
+    <w:p>
+      <w:pPr>
+        <w:rPr>
+          <w:rFonts w:asciiTheme="majorBidi" w:hAnsiTheme="majorBidi" w:cstheme="majorBidi"/>
+          <w:sz w:val="24"/>
+          <w:szCs w:val="24"/>
+        </w:rPr>
+      </w:pPr>
+    </w:p>
+    <w:p>
+      <w:pPr>
+        <w:rPr>
+          <w:rFonts w:asciiTheme="majorBidi" w:hAnsiTheme="majorBidi" w:cstheme="majorBidi"/>
+          <w:sz w:val="24"/>
+          <w:szCs w:val="24"/>
+        </w:rPr>
+      </w:pPr>
+    </w:p>
+    <w:p>
+      <w:pPr>
+        <w:rPr>
+          <w:rFonts w:asciiTheme="majorBidi" w:hAnsiTheme="majorBidi" w:cstheme="majorBidi"/>
+          <w:sz w:val="24"/>
+          <w:szCs w:val="24"/>
+        </w:rPr>
+      </w:pPr>
+    </w:p>
+    <w:p>
+      <w:pPr>
+        <w:rPr>
+          <w:rFonts w:asciiTheme="majorBidi" w:hAnsiTheme="majorBidi" w:cstheme="majorBidi"/>
+          <w:sz w:val="24"/>
+          <w:szCs w:val="24"/>
+        </w:rPr>
+      </w:pPr>
+    </w:p>
+    <w:p>
+      <w:pPr>
+        <w:rPr>
+          <w:rFonts w:asciiTheme="majorBidi" w:hAnsiTheme="majorBidi" w:cstheme="majorBidi"/>
+          <w:sz w:val="24"/>
+          <w:szCs w:val="24"/>
+        </w:rPr>
+      </w:pPr>
+    </w:p>
+    <w:p>
+      <w:pPr>
+        <w:rPr>
+          <w:rFonts w:asciiTheme="majorBidi" w:hAnsiTheme="majorBidi" w:cstheme="majorBidi"/>
+          <w:sz w:val="24"/>
+          <w:szCs w:val="24"/>
+        </w:rPr>
+      </w:pPr>
+    </w:p>
+    <w:p>
+      <w:pPr>
+        <w:shd w:val="clear" w:color="auto" w:fill="F9F9F9"/>
+        <w:spacing w:after="0" w:line="240" w:lineRule="auto"/>
+        <w:rPr>
+          <w:rFonts w:asciiTheme="majorBidi" w:eastAsia="Times New Roman" w:hAnsiTheme="majorBidi" w:cstheme="majorBidi"/>
+          <w:color w:val="101010"/>
+          <w:sz w:val="24"/>
+          <w:szCs w:val="24"/>
+          <w:lang w:eastAsia="fr-FR"/>
+        </w:rPr>
+      </w:pPr>
       <w:bookmarkStart w:id="0" w:name="_GoBack"/>
-      <w:bookmarkEnd w:id="0"/>
+      <w:r>
+        <w:rPr>
+          <w:rFonts w:asciiTheme="majorBidi" w:eastAsia="Times New Roman" w:hAnsiTheme="majorBidi" w:cstheme="majorBidi"/>
+          <w:color w:val="101010"/>
+          <w:sz w:val="24"/>
+          <w:szCs w:val="24"/>
+          <w:lang w:eastAsia="fr-FR"/>
+        </w:rPr>
+        <w:t xml:space="preserve">C'est fait ! J'ai programmé tout ça et la mise à jour est en cours d'envoi vers </w:t>
+      </w:r>
+      <w:proofErr w:type="spellStart"/>
+      <w:r>
+        <w:rPr>
+          <w:rFonts w:asciiTheme="majorBidi" w:eastAsia="Times New Roman" w:hAnsiTheme="majorBidi" w:cstheme="majorBidi"/>
+          <w:color w:val="101010"/>
+          <w:sz w:val="24"/>
+          <w:szCs w:val="24"/>
+          <w:lang w:eastAsia="fr-FR"/>
+        </w:rPr>
+        <w:t>Render</w:t>
+      </w:r>
+      <w:proofErr w:type="spellEnd"/>
+      <w:r>
+        <w:rPr>
+          <w:rFonts w:asciiTheme="majorBidi" w:eastAsia="Times New Roman" w:hAnsiTheme="majorBidi" w:cstheme="majorBidi"/>
+          <w:color w:val="101010"/>
+          <w:sz w:val="24"/>
+          <w:szCs w:val="24"/>
+          <w:lang w:eastAsia="fr-FR"/>
+        </w:rPr>
+        <w:t>.</w:t>
+      </w:r>
+    </w:p>
+    <w:p>
+      <w:pPr>
+        <w:shd w:val="clear" w:color="auto" w:fill="F9F9F9"/>
+        <w:spacing w:after="0" w:line="240" w:lineRule="auto"/>
+        <w:rPr>
+          <w:rFonts w:asciiTheme="majorBidi" w:eastAsia="Times New Roman" w:hAnsiTheme="majorBidi" w:cstheme="majorBidi"/>
+          <w:color w:val="101010"/>
+          <w:sz w:val="24"/>
+          <w:szCs w:val="24"/>
+          <w:lang w:eastAsia="fr-FR"/>
+        </w:rPr>
+      </w:pPr>
+      <w:r>
+        <w:rPr>
+          <w:rFonts w:asciiTheme="majorBidi" w:eastAsia="Times New Roman" w:hAnsiTheme="majorBidi" w:cstheme="majorBidi"/>
+          <w:color w:val="101010"/>
+          <w:sz w:val="24"/>
+          <w:szCs w:val="24"/>
+          <w:lang w:eastAsia="fr-FR"/>
+        </w:rPr>
+        <w:t>Voici ce que vous allez découvrir d'ici une ou deux minutes sur votre téléphone :</w:t>
+      </w:r>
+    </w:p>
+    <w:p>
+      <w:pPr>
+        <w:shd w:val="clear" w:color="auto" w:fill="F9F9F9"/>
+        <w:spacing w:after="0" w:line="240" w:lineRule="auto"/>
+        <w:rPr>
+          <w:rFonts w:asciiTheme="majorBidi" w:eastAsia="Times New Roman" w:hAnsiTheme="majorBidi" w:cstheme="majorBidi"/>
+          <w:color w:val="101010"/>
+          <w:sz w:val="24"/>
+          <w:szCs w:val="24"/>
+          <w:lang w:eastAsia="fr-FR"/>
+        </w:rPr>
+      </w:pPr>
+      <w:r>
+        <w:rPr>
+          <w:rFonts w:ascii="Segoe UI Symbol" w:eastAsia="Times New Roman" w:hAnsi="Segoe UI Symbol" w:cs="Segoe UI Symbol"/>
+          <w:color w:val="101010"/>
+          <w:sz w:val="24"/>
+          <w:szCs w:val="24"/>
+          <w:lang w:eastAsia="fr-FR"/>
+        </w:rPr>
+        <w:t>📍</w:t>
+      </w:r>
+      <w:r>
+        <w:rPr>
+          <w:rFonts w:asciiTheme="majorBidi" w:eastAsia="Times New Roman" w:hAnsiTheme="majorBidi" w:cstheme="majorBidi"/>
+          <w:color w:val="101010"/>
+          <w:sz w:val="24"/>
+          <w:szCs w:val="24"/>
+          <w:lang w:eastAsia="fr-FR"/>
+        </w:rPr>
+        <w:t> </w:t>
+      </w:r>
+      <w:r>
+        <w:rPr>
+          <w:rFonts w:asciiTheme="majorBidi" w:eastAsia="Times New Roman" w:hAnsiTheme="majorBidi" w:cstheme="majorBidi"/>
+          <w:b/>
+          <w:bCs/>
+          <w:color w:val="101010"/>
+          <w:sz w:val="24"/>
+          <w:szCs w:val="24"/>
+          <w:lang w:eastAsia="fr-FR"/>
+        </w:rPr>
+        <w:t>Localisation GPS Intelligente :</w:t>
+      </w:r>
+      <w:r>
+        <w:rPr>
+          <w:rFonts w:asciiTheme="majorBidi" w:eastAsia="Times New Roman" w:hAnsiTheme="majorBidi" w:cstheme="majorBidi"/>
+          <w:color w:val="101010"/>
+          <w:sz w:val="24"/>
+          <w:szCs w:val="24"/>
+          <w:lang w:eastAsia="fr-FR"/>
+        </w:rPr>
+        <w:t> Dans le formulaire, au-dessus de la case adresse, il y a maintenant un petit bouton bleu avec une boussole : </w:t>
+      </w:r>
+      <w:r>
+        <w:rPr>
+          <w:rFonts w:asciiTheme="majorBidi" w:eastAsia="Times New Roman" w:hAnsiTheme="majorBidi" w:cstheme="majorBidi"/>
+          <w:b/>
+          <w:bCs/>
+          <w:color w:val="101010"/>
+          <w:sz w:val="24"/>
+          <w:szCs w:val="24"/>
+          <w:lang w:eastAsia="fr-FR"/>
+        </w:rPr>
+        <w:t>"</w:t>
+      </w:r>
+      <w:r>
+        <w:rPr>
+          <w:rFonts w:ascii="Segoe UI Symbol" w:eastAsia="Times New Roman" w:hAnsi="Segoe UI Symbol" w:cs="Segoe UI Symbol"/>
+          <w:b/>
+          <w:bCs/>
+          <w:color w:val="101010"/>
+          <w:sz w:val="24"/>
+          <w:szCs w:val="24"/>
+          <w:lang w:eastAsia="fr-FR"/>
+        </w:rPr>
+        <w:t>📍</w:t>
+      </w:r>
+      <w:r>
+        <w:rPr>
+          <w:rFonts w:asciiTheme="majorBidi" w:eastAsia="Times New Roman" w:hAnsiTheme="majorBidi" w:cstheme="majorBidi"/>
+          <w:b/>
+          <w:bCs/>
+          <w:color w:val="101010"/>
+          <w:sz w:val="24"/>
+          <w:szCs w:val="24"/>
+          <w:lang w:eastAsia="fr-FR"/>
+        </w:rPr>
+        <w:t xml:space="preserve"> Utiliser ma position"</w:t>
+      </w:r>
+      <w:r>
+        <w:rPr>
+          <w:rFonts w:asciiTheme="majorBidi" w:eastAsia="Times New Roman" w:hAnsiTheme="majorBidi" w:cstheme="majorBidi"/>
+          <w:color w:val="101010"/>
+          <w:sz w:val="24"/>
+          <w:szCs w:val="24"/>
+          <w:lang w:eastAsia="fr-FR"/>
+        </w:rPr>
+        <w:t>. Le client appuie dessus, autorise l'accès, et HOP, un lien </w:t>
+      </w:r>
+      <w:r>
+        <w:rPr>
+          <w:rFonts w:asciiTheme="majorBidi" w:eastAsia="Times New Roman" w:hAnsiTheme="majorBidi" w:cstheme="majorBidi"/>
+          <w:i/>
+          <w:iCs/>
+          <w:color w:val="101010"/>
+          <w:sz w:val="24"/>
+          <w:szCs w:val="24"/>
+          <w:lang w:eastAsia="fr-FR"/>
+        </w:rPr>
+        <w:t xml:space="preserve">Google </w:t>
+      </w:r>
+      <w:proofErr w:type="spellStart"/>
+      <w:r>
+        <w:rPr>
+          <w:rFonts w:asciiTheme="majorBidi" w:eastAsia="Times New Roman" w:hAnsiTheme="majorBidi" w:cstheme="majorBidi"/>
+          <w:i/>
+          <w:iCs/>
+          <w:color w:val="101010"/>
+          <w:sz w:val="24"/>
+          <w:szCs w:val="24"/>
+          <w:lang w:eastAsia="fr-FR"/>
+        </w:rPr>
+        <w:t>Maps</w:t>
+      </w:r>
+      <w:proofErr w:type="spellEnd"/>
+      <w:r>
+        <w:rPr>
+          <w:rFonts w:asciiTheme="majorBidi" w:eastAsia="Times New Roman" w:hAnsiTheme="majorBidi" w:cstheme="majorBidi"/>
+          <w:color w:val="101010"/>
+          <w:sz w:val="24"/>
+          <w:szCs w:val="24"/>
+          <w:lang w:eastAsia="fr-FR"/>
+        </w:rPr>
+        <w:t> ultra-précis s'écrit tout seul dans l'adresse.</w:t>
+      </w:r>
+    </w:p>
+    <w:p>
+      <w:pPr>
+        <w:shd w:val="clear" w:color="auto" w:fill="F9F9F9"/>
+        <w:spacing w:after="0" w:line="240" w:lineRule="auto"/>
+        <w:rPr>
+          <w:rFonts w:asciiTheme="majorBidi" w:eastAsia="Times New Roman" w:hAnsiTheme="majorBidi" w:cstheme="majorBidi"/>
+          <w:color w:val="101010"/>
+          <w:sz w:val="24"/>
+          <w:szCs w:val="24"/>
+          <w:lang w:eastAsia="fr-FR"/>
+        </w:rPr>
+      </w:pPr>
+      <w:r>
+        <w:rPr>
+          <w:rFonts w:ascii="Segoe UI Symbol" w:eastAsia="Times New Roman" w:hAnsi="Segoe UI Symbol" w:cs="Segoe UI Symbol"/>
+          <w:color w:val="101010"/>
+          <w:sz w:val="24"/>
+          <w:szCs w:val="24"/>
+          <w:lang w:eastAsia="fr-FR"/>
+        </w:rPr>
+        <w:t>📸</w:t>
+      </w:r>
+      <w:r>
+        <w:rPr>
+          <w:rFonts w:asciiTheme="majorBidi" w:eastAsia="Times New Roman" w:hAnsiTheme="majorBidi" w:cstheme="majorBidi"/>
+          <w:color w:val="101010"/>
+          <w:sz w:val="24"/>
+          <w:szCs w:val="24"/>
+          <w:lang w:eastAsia="fr-FR"/>
+        </w:rPr>
+        <w:t> </w:t>
+      </w:r>
+      <w:proofErr w:type="spellStart"/>
+      <w:r>
+        <w:rPr>
+          <w:rFonts w:asciiTheme="majorBidi" w:eastAsia="Times New Roman" w:hAnsiTheme="majorBidi" w:cstheme="majorBidi"/>
+          <w:b/>
+          <w:bCs/>
+          <w:color w:val="101010"/>
+          <w:sz w:val="24"/>
+          <w:szCs w:val="24"/>
+          <w:lang w:eastAsia="fr-FR"/>
+        </w:rPr>
+        <w:t>Upload</w:t>
+      </w:r>
+      <w:proofErr w:type="spellEnd"/>
+      <w:r>
+        <w:rPr>
+          <w:rFonts w:asciiTheme="majorBidi" w:eastAsia="Times New Roman" w:hAnsiTheme="majorBidi" w:cstheme="majorBidi"/>
+          <w:b/>
+          <w:bCs/>
+          <w:color w:val="101010"/>
+          <w:sz w:val="24"/>
+          <w:szCs w:val="24"/>
+          <w:lang w:eastAsia="fr-FR"/>
+        </w:rPr>
+        <w:t xml:space="preserve"> de Photo (Sécurisé) :</w:t>
+      </w:r>
+      <w:r>
+        <w:rPr>
+          <w:rFonts w:asciiTheme="majorBidi" w:eastAsia="Times New Roman" w:hAnsiTheme="majorBidi" w:cstheme="majorBidi"/>
+          <w:color w:val="101010"/>
+          <w:sz w:val="24"/>
+          <w:szCs w:val="24"/>
+          <w:lang w:eastAsia="fr-FR"/>
+        </w:rPr>
+        <w:t> J'ai ajouté un bouton avec une icône appareil photo sous les détails : </w:t>
+      </w:r>
+      <w:r>
+        <w:rPr>
+          <w:rFonts w:asciiTheme="majorBidi" w:eastAsia="Times New Roman" w:hAnsiTheme="majorBidi" w:cstheme="majorBidi"/>
+          <w:b/>
+          <w:bCs/>
+          <w:color w:val="101010"/>
+          <w:sz w:val="24"/>
+          <w:szCs w:val="24"/>
+          <w:lang w:eastAsia="fr-FR"/>
+        </w:rPr>
+        <w:t>"</w:t>
+      </w:r>
+      <w:r>
+        <w:rPr>
+          <w:rFonts w:ascii="Segoe UI Symbol" w:eastAsia="Times New Roman" w:hAnsi="Segoe UI Symbol" w:cs="Segoe UI Symbol"/>
+          <w:b/>
+          <w:bCs/>
+          <w:color w:val="101010"/>
+          <w:sz w:val="24"/>
+          <w:szCs w:val="24"/>
+          <w:lang w:eastAsia="fr-FR"/>
+        </w:rPr>
+        <w:t>📸</w:t>
+      </w:r>
+      <w:r>
+        <w:rPr>
+          <w:rFonts w:asciiTheme="majorBidi" w:eastAsia="Times New Roman" w:hAnsiTheme="majorBidi" w:cstheme="majorBidi"/>
+          <w:b/>
+          <w:bCs/>
+          <w:color w:val="101010"/>
+          <w:sz w:val="24"/>
+          <w:szCs w:val="24"/>
+          <w:lang w:eastAsia="fr-FR"/>
+        </w:rPr>
+        <w:t xml:space="preserve"> Choisir une image"</w:t>
+      </w:r>
+      <w:r>
+        <w:rPr>
+          <w:rFonts w:asciiTheme="majorBidi" w:eastAsia="Times New Roman" w:hAnsiTheme="majorBidi" w:cstheme="majorBidi"/>
+          <w:color w:val="101010"/>
+          <w:sz w:val="24"/>
+          <w:szCs w:val="24"/>
+          <w:lang w:eastAsia="fr-FR"/>
+        </w:rPr>
+        <w:t>. Le client peut ouvrir son appareil photo ou sa galerie. J'ai ajouté un mécanisme invisible qui </w:t>
+      </w:r>
+      <w:r>
+        <w:rPr>
+          <w:rFonts w:asciiTheme="majorBidi" w:eastAsia="Times New Roman" w:hAnsiTheme="majorBidi" w:cstheme="majorBidi"/>
+          <w:b/>
+          <w:bCs/>
+          <w:color w:val="101010"/>
+          <w:sz w:val="24"/>
+          <w:szCs w:val="24"/>
+          <w:lang w:eastAsia="fr-FR"/>
+        </w:rPr>
+        <w:t>compresse</w:t>
+      </w:r>
+      <w:r>
+        <w:rPr>
+          <w:rFonts w:asciiTheme="majorBidi" w:eastAsia="Times New Roman" w:hAnsiTheme="majorBidi" w:cstheme="majorBidi"/>
+          <w:color w:val="101010"/>
+          <w:sz w:val="24"/>
+          <w:szCs w:val="24"/>
+          <w:lang w:eastAsia="fr-FR"/>
+        </w:rPr>
+        <w:t> la photo (la réduit de taille intelligemment) pour qu'elle s'enregistre de manière très légère dans la base de données.</w:t>
+      </w:r>
+    </w:p>
+    <w:p>
+      <w:pPr>
+        <w:shd w:val="clear" w:color="auto" w:fill="F9F9F9"/>
+        <w:spacing w:after="0" w:line="240" w:lineRule="auto"/>
+        <w:rPr>
+          <w:rFonts w:asciiTheme="majorBidi" w:eastAsia="Times New Roman" w:hAnsiTheme="majorBidi" w:cstheme="majorBidi"/>
+          <w:color w:val="101010"/>
+          <w:sz w:val="24"/>
+          <w:szCs w:val="24"/>
+          <w:lang w:eastAsia="fr-FR"/>
+        </w:rPr>
+      </w:pPr>
+      <w:r>
+        <w:rPr>
+          <w:rFonts w:ascii="Segoe UI Symbol" w:eastAsia="Times New Roman" w:hAnsi="Segoe UI Symbol" w:cs="Segoe UI Symbol"/>
+          <w:color w:val="101010"/>
+          <w:sz w:val="24"/>
+          <w:szCs w:val="24"/>
+          <w:lang w:eastAsia="fr-FR"/>
+        </w:rPr>
+        <w:t>👨</w:t>
+      </w:r>
+      <w:r>
+        <w:rPr>
+          <w:rFonts w:asciiTheme="majorBidi" w:eastAsia="Times New Roman" w:hAnsiTheme="majorBidi" w:cstheme="majorBidi"/>
+          <w:color w:val="101010"/>
+          <w:sz w:val="24"/>
+          <w:szCs w:val="24"/>
+          <w:lang w:eastAsia="fr-FR"/>
+        </w:rPr>
+        <w:t>‍</w:t>
+      </w:r>
+      <w:r>
+        <w:rPr>
+          <w:rFonts w:ascii="Segoe UI Symbol" w:eastAsia="Times New Roman" w:hAnsi="Segoe UI Symbol" w:cs="Segoe UI Symbol"/>
+          <w:color w:val="101010"/>
+          <w:sz w:val="24"/>
+          <w:szCs w:val="24"/>
+          <w:lang w:eastAsia="fr-FR"/>
+        </w:rPr>
+        <w:t>💻</w:t>
+      </w:r>
+      <w:r>
+        <w:rPr>
+          <w:rFonts w:asciiTheme="majorBidi" w:eastAsia="Times New Roman" w:hAnsiTheme="majorBidi" w:cstheme="majorBidi"/>
+          <w:color w:val="101010"/>
+          <w:sz w:val="24"/>
+          <w:szCs w:val="24"/>
+          <w:lang w:eastAsia="fr-FR"/>
+        </w:rPr>
+        <w:t> </w:t>
+      </w:r>
+      <w:r>
+        <w:rPr>
+          <w:rFonts w:asciiTheme="majorBidi" w:eastAsia="Times New Roman" w:hAnsiTheme="majorBidi" w:cstheme="majorBidi"/>
+          <w:b/>
+          <w:bCs/>
+          <w:color w:val="101010"/>
+          <w:sz w:val="24"/>
+          <w:szCs w:val="24"/>
+          <w:lang w:eastAsia="fr-FR"/>
+        </w:rPr>
+        <w:t>Côté Administrateur (Pour vous) :</w:t>
+      </w:r>
+      <w:r>
+        <w:rPr>
+          <w:rFonts w:asciiTheme="majorBidi" w:eastAsia="Times New Roman" w:hAnsiTheme="majorBidi" w:cstheme="majorBidi"/>
+          <w:color w:val="101010"/>
+          <w:sz w:val="24"/>
+          <w:szCs w:val="24"/>
+          <w:lang w:eastAsia="fr-FR"/>
+        </w:rPr>
+        <w:t> Quand vous irez sur votre espace "Admin", si un client a cliqué sur le GPS, vous verrez le lien "</w:t>
+      </w:r>
+      <w:r>
+        <w:rPr>
+          <w:rFonts w:ascii="Segoe UI Symbol" w:eastAsia="Times New Roman" w:hAnsi="Segoe UI Symbol" w:cs="Segoe UI Symbol"/>
+          <w:color w:val="101010"/>
+          <w:sz w:val="24"/>
+          <w:szCs w:val="24"/>
+          <w:lang w:eastAsia="fr-FR"/>
+        </w:rPr>
+        <w:t>📍</w:t>
+      </w:r>
+      <w:r>
+        <w:rPr>
+          <w:rFonts w:asciiTheme="majorBidi" w:eastAsia="Times New Roman" w:hAnsiTheme="majorBidi" w:cstheme="majorBidi"/>
+          <w:color w:val="101010"/>
+          <w:sz w:val="24"/>
+          <w:szCs w:val="24"/>
+          <w:lang w:eastAsia="fr-FR"/>
+        </w:rPr>
+        <w:t xml:space="preserve"> Ouvrir dans Google </w:t>
+      </w:r>
+      <w:proofErr w:type="spellStart"/>
+      <w:r>
+        <w:rPr>
+          <w:rFonts w:asciiTheme="majorBidi" w:eastAsia="Times New Roman" w:hAnsiTheme="majorBidi" w:cstheme="majorBidi"/>
+          <w:color w:val="101010"/>
+          <w:sz w:val="24"/>
+          <w:szCs w:val="24"/>
+          <w:lang w:eastAsia="fr-FR"/>
+        </w:rPr>
+        <w:t>Maps</w:t>
+      </w:r>
+      <w:proofErr w:type="spellEnd"/>
+      <w:r>
+        <w:rPr>
+          <w:rFonts w:asciiTheme="majorBidi" w:eastAsia="Times New Roman" w:hAnsiTheme="majorBidi" w:cstheme="majorBidi"/>
+          <w:color w:val="101010"/>
+          <w:sz w:val="24"/>
+          <w:szCs w:val="24"/>
+          <w:lang w:eastAsia="fr-FR"/>
+        </w:rPr>
+        <w:t>". Et s'il a envoyé une photo, elle s'affichera directement en dessous de sa description de problème.</w:t>
+      </w:r>
+    </w:p>
+    <w:p>
+      <w:pPr>
+        <w:shd w:val="clear" w:color="auto" w:fill="F9F9F9"/>
+        <w:spacing w:after="0" w:line="240" w:lineRule="auto"/>
+        <w:rPr>
+          <w:rFonts w:asciiTheme="majorBidi" w:eastAsia="Times New Roman" w:hAnsiTheme="majorBidi" w:cstheme="majorBidi"/>
+          <w:color w:val="101010"/>
+          <w:sz w:val="24"/>
+          <w:szCs w:val="24"/>
+          <w:lang w:eastAsia="fr-FR"/>
+        </w:rPr>
+      </w:pPr>
+      <w:r>
+        <w:rPr>
+          <w:rFonts w:asciiTheme="majorBidi" w:eastAsia="Times New Roman" w:hAnsiTheme="majorBidi" w:cstheme="majorBidi"/>
+          <w:color w:val="101010"/>
+          <w:sz w:val="24"/>
+          <w:szCs w:val="24"/>
+          <w:lang w:eastAsia="fr-FR"/>
+        </w:rPr>
+        <w:t>N'hésitez pas à tester le GPS en temps réel sur votre mobile une fois la page actualisée !</w:t>
+      </w:r>
+    </w:p>
+    <w:bookmarkEnd w:id="0"/>
+    <w:p>
+      <w:pPr>
+        <w:rPr>
+          <w:rFonts w:asciiTheme="majorBidi" w:hAnsiTheme="majorBidi" w:cstheme="majorBidi"/>
+          <w:sz w:val="24"/>
+          <w:szCs w:val="24"/>
+        </w:rPr>
+      </w:pPr>
     </w:p>
     <w:sectPr>
       <w:pgSz w:w="11906" w:h="16838" w:code="9"/>
@@ -17194,7 +17748,7 @@
 </file>
 
 <file path=customXml/itemProps1.xml><?xml version="1.0" encoding="utf-8"?>
-<ds:datastoreItem xmlns:ds="http://schemas.openxmlformats.org/officeDocument/2006/customXml" ds:itemID="{0D5C52A4-9420-4CEB-A295-E4520E912EF1}">
+<ds:datastoreItem xmlns:ds="http://schemas.openxmlformats.org/officeDocument/2006/customXml" ds:itemID="{827B84DA-A779-4B0E-A221-8F4D9AC77329}">
   <ds:schemaRefs>
     <ds:schemaRef ds:uri="http://schemas.openxmlformats.org/officeDocument/2006/bibliography"/>
   </ds:schemaRefs>

</xml_diff>

<commit_message>
feat/db: Migration SQLite vers PostgreSQL Supabase
</commit_message>
<xml_diff>
--- a/Application de Réservation de Techniciens à Domicile.docx
+++ b/Application de Réservation de Techniciens à Domicile.docx
@@ -12334,7 +12334,6 @@
           <w:lang w:eastAsia="fr-FR"/>
         </w:rPr>
       </w:pPr>
-      <w:bookmarkStart w:id="0" w:name="_GoBack"/>
       <w:r>
         <w:rPr>
           <w:rFonts w:asciiTheme="majorBidi" w:eastAsia="Times New Roman" w:hAnsiTheme="majorBidi" w:cstheme="majorBidi"/>
@@ -12805,7 +12804,6 @@
         <w:t>N'hésitez pas à tester le GPS en temps réel sur votre mobile une fois la page actualisée !</w:t>
       </w:r>
     </w:p>
-    <w:bookmarkEnd w:id="0"/>
     <w:p>
       <w:pPr>
         <w:rPr>
@@ -12814,6 +12812,902 @@
           <w:szCs w:val="24"/>
         </w:rPr>
       </w:pPr>
+    </w:p>
+    <w:p>
+      <w:pPr>
+        <w:rPr>
+          <w:rFonts w:asciiTheme="majorBidi" w:hAnsiTheme="majorBidi" w:cstheme="majorBidi"/>
+          <w:sz w:val="24"/>
+          <w:szCs w:val="24"/>
+        </w:rPr>
+      </w:pPr>
+    </w:p>
+    <w:p>
+      <w:pPr>
+        <w:rPr>
+          <w:rFonts w:asciiTheme="majorBidi" w:hAnsiTheme="majorBidi" w:cstheme="majorBidi"/>
+          <w:sz w:val="24"/>
+          <w:szCs w:val="24"/>
+        </w:rPr>
+      </w:pPr>
+    </w:p>
+    <w:p>
+      <w:pPr>
+        <w:shd w:val="clear" w:color="auto" w:fill="F9F9F9"/>
+        <w:spacing w:after="0" w:line="240" w:lineRule="auto"/>
+        <w:rPr>
+          <w:rFonts w:ascii="Segoe UI" w:eastAsia="Times New Roman" w:hAnsi="Segoe UI" w:cs="Segoe UI"/>
+          <w:color w:val="101010"/>
+          <w:sz w:val="21"/>
+          <w:szCs w:val="21"/>
+          <w:lang w:eastAsia="fr-FR"/>
+        </w:rPr>
+      </w:pPr>
+      <w:r>
+        <w:rPr>
+          <w:rFonts w:ascii="Segoe UI" w:eastAsia="Times New Roman" w:hAnsi="Segoe UI" w:cs="Segoe UI"/>
+          <w:color w:val="101010"/>
+          <w:sz w:val="21"/>
+          <w:szCs w:val="21"/>
+          <w:lang w:eastAsia="fr-FR"/>
+        </w:rPr>
+        <w:t>C'est parti ! J'ai appliqué les 3 correctifs essentiels et la mise à jour est en cours d'envoi. D'ici quelques minutes, vous aurez les nouveautés suivantes :</w:t>
+      </w:r>
+    </w:p>
+    <w:p>
+      <w:pPr>
+        <w:shd w:val="clear" w:color="auto" w:fill="F9F9F9"/>
+        <w:spacing w:before="100" w:beforeAutospacing="1" w:after="100" w:afterAutospacing="1" w:line="240" w:lineRule="auto"/>
+        <w:outlineLvl w:val="2"/>
+        <w:rPr>
+          <w:rFonts w:ascii="Segoe UI" w:eastAsia="Times New Roman" w:hAnsi="Segoe UI" w:cs="Segoe UI"/>
+          <w:color w:val="101010"/>
+          <w:sz w:val="24"/>
+          <w:szCs w:val="24"/>
+          <w:lang w:eastAsia="fr-FR"/>
+        </w:rPr>
+      </w:pPr>
+      <w:r>
+        <w:rPr>
+          <w:rFonts w:ascii="Segoe UI Symbol" w:eastAsia="Times New Roman" w:hAnsi="Segoe UI Symbol" w:cs="Segoe UI Symbol"/>
+          <w:color w:val="101010"/>
+          <w:sz w:val="24"/>
+          <w:szCs w:val="24"/>
+          <w:lang w:eastAsia="fr-FR"/>
+        </w:rPr>
+        <w:t>✅</w:t>
+      </w:r>
+      <w:r>
+        <w:rPr>
+          <w:rFonts w:ascii="Segoe UI" w:eastAsia="Times New Roman" w:hAnsi="Segoe UI" w:cs="Segoe UI"/>
+          <w:color w:val="101010"/>
+          <w:sz w:val="24"/>
+          <w:szCs w:val="24"/>
+          <w:lang w:eastAsia="fr-FR"/>
+        </w:rPr>
+        <w:t xml:space="preserve"> 1. Sécurité Admin (Fait)</w:t>
+      </w:r>
+    </w:p>
+    <w:p>
+      <w:pPr>
+        <w:shd w:val="clear" w:color="auto" w:fill="F9F9F9"/>
+        <w:spacing w:after="0" w:line="240" w:lineRule="auto"/>
+        <w:rPr>
+          <w:rFonts w:ascii="Segoe UI" w:eastAsia="Times New Roman" w:hAnsi="Segoe UI" w:cs="Segoe UI"/>
+          <w:color w:val="101010"/>
+          <w:sz w:val="21"/>
+          <w:szCs w:val="21"/>
+          <w:lang w:eastAsia="fr-FR"/>
+        </w:rPr>
+      </w:pPr>
+      <w:r>
+        <w:rPr>
+          <w:rFonts w:ascii="Segoe UI" w:eastAsia="Times New Roman" w:hAnsi="Segoe UI" w:cs="Segoe UI"/>
+          <w:color w:val="101010"/>
+          <w:sz w:val="21"/>
+          <w:szCs w:val="21"/>
+          <w:lang w:eastAsia="fr-FR"/>
+        </w:rPr>
+        <w:t xml:space="preserve">Désormais, le </w:t>
+      </w:r>
+      <w:proofErr w:type="spellStart"/>
+      <w:r>
+        <w:rPr>
+          <w:rFonts w:ascii="Segoe UI" w:eastAsia="Times New Roman" w:hAnsi="Segoe UI" w:cs="Segoe UI"/>
+          <w:color w:val="101010"/>
+          <w:sz w:val="21"/>
+          <w:szCs w:val="21"/>
+          <w:lang w:eastAsia="fr-FR"/>
+        </w:rPr>
+        <w:t>backend</w:t>
+      </w:r>
+      <w:proofErr w:type="spellEnd"/>
+      <w:r>
+        <w:rPr>
+          <w:rFonts w:ascii="Segoe UI" w:eastAsia="Times New Roman" w:hAnsi="Segoe UI" w:cs="Segoe UI"/>
+          <w:color w:val="101010"/>
+          <w:sz w:val="21"/>
+          <w:szCs w:val="21"/>
+          <w:lang w:eastAsia="fr-FR"/>
+        </w:rPr>
+        <w:t xml:space="preserve"> de votre application est </w:t>
+      </w:r>
+      <w:r>
+        <w:rPr>
+          <w:rFonts w:ascii="Segoe UI" w:eastAsia="Times New Roman" w:hAnsi="Segoe UI" w:cs="Segoe UI"/>
+          <w:b/>
+          <w:bCs/>
+          <w:color w:val="101010"/>
+          <w:sz w:val="21"/>
+          <w:szCs w:val="21"/>
+          <w:lang w:eastAsia="fr-FR"/>
+        </w:rPr>
+        <w:t>cadenassé</w:t>
+      </w:r>
+      <w:r>
+        <w:rPr>
+          <w:rFonts w:ascii="Segoe UI" w:eastAsia="Times New Roman" w:hAnsi="Segoe UI" w:cs="Segoe UI"/>
+          <w:color w:val="101010"/>
+          <w:sz w:val="21"/>
+          <w:szCs w:val="21"/>
+          <w:lang w:eastAsia="fr-FR"/>
+        </w:rPr>
+        <w:t>. Même si un pirate informatique trouve l'adresse directe de votre base de données API, il sera rejeté avec une erreur "401 Non autorisé". Seul le mot de passe que vous tapez dans la page </w:t>
+      </w:r>
+      <w:r>
+        <w:rPr>
+          <w:rFonts w:ascii="Consolas" w:eastAsia="Times New Roman" w:hAnsi="Consolas" w:cs="Courier New"/>
+          <w:color w:val="A31515"/>
+          <w:sz w:val="19"/>
+          <w:szCs w:val="19"/>
+          <w:lang w:eastAsia="fr-FR"/>
+        </w:rPr>
+        <w:t>Espace Client &gt; Admin</w:t>
+      </w:r>
+      <w:r>
+        <w:rPr>
+          <w:rFonts w:ascii="Segoe UI" w:eastAsia="Times New Roman" w:hAnsi="Segoe UI" w:cs="Segoe UI"/>
+          <w:color w:val="101010"/>
+          <w:sz w:val="21"/>
+          <w:szCs w:val="21"/>
+          <w:lang w:eastAsia="fr-FR"/>
+        </w:rPr>
+        <w:t> génère désormais une clé secrète (</w:t>
+      </w:r>
+      <w:proofErr w:type="spellStart"/>
+      <w:r>
+        <w:rPr>
+          <w:rFonts w:ascii="Segoe UI" w:eastAsia="Times New Roman" w:hAnsi="Segoe UI" w:cs="Segoe UI"/>
+          <w:color w:val="101010"/>
+          <w:sz w:val="21"/>
+          <w:szCs w:val="21"/>
+          <w:lang w:eastAsia="fr-FR"/>
+        </w:rPr>
+        <w:t>Token</w:t>
+      </w:r>
+      <w:proofErr w:type="spellEnd"/>
+      <w:r>
+        <w:rPr>
+          <w:rFonts w:ascii="Segoe UI" w:eastAsia="Times New Roman" w:hAnsi="Segoe UI" w:cs="Segoe UI"/>
+          <w:color w:val="101010"/>
+          <w:sz w:val="21"/>
+          <w:szCs w:val="21"/>
+          <w:lang w:eastAsia="fr-FR"/>
+        </w:rPr>
+        <w:t>) qui vous donne l'accès.</w:t>
+      </w:r>
+    </w:p>
+    <w:p>
+      <w:pPr>
+        <w:shd w:val="clear" w:color="auto" w:fill="F9F9F9"/>
+        <w:spacing w:before="100" w:beforeAutospacing="1" w:after="100" w:afterAutospacing="1" w:line="240" w:lineRule="auto"/>
+        <w:outlineLvl w:val="2"/>
+        <w:rPr>
+          <w:rFonts w:ascii="Segoe UI" w:eastAsia="Times New Roman" w:hAnsi="Segoe UI" w:cs="Segoe UI"/>
+          <w:color w:val="101010"/>
+          <w:sz w:val="24"/>
+          <w:szCs w:val="24"/>
+          <w:lang w:eastAsia="fr-FR"/>
+        </w:rPr>
+      </w:pPr>
+      <w:r>
+        <w:rPr>
+          <w:rFonts w:ascii="Segoe UI Symbol" w:eastAsia="Times New Roman" w:hAnsi="Segoe UI Symbol" w:cs="Segoe UI Symbol"/>
+          <w:color w:val="101010"/>
+          <w:sz w:val="24"/>
+          <w:szCs w:val="24"/>
+          <w:lang w:eastAsia="fr-FR"/>
+        </w:rPr>
+        <w:t>✅</w:t>
+      </w:r>
+      <w:r>
+        <w:rPr>
+          <w:rFonts w:ascii="Segoe UI" w:eastAsia="Times New Roman" w:hAnsi="Segoe UI" w:cs="Segoe UI"/>
+          <w:color w:val="101010"/>
+          <w:sz w:val="24"/>
+          <w:szCs w:val="24"/>
+          <w:lang w:eastAsia="fr-FR"/>
+        </w:rPr>
+        <w:t xml:space="preserve"> 2. Bouton WhatsApp (Fait)</w:t>
+      </w:r>
+    </w:p>
+    <w:p>
+      <w:pPr>
+        <w:shd w:val="clear" w:color="auto" w:fill="F9F9F9"/>
+        <w:spacing w:after="0" w:line="240" w:lineRule="auto"/>
+        <w:rPr>
+          <w:rFonts w:ascii="Segoe UI" w:eastAsia="Times New Roman" w:hAnsi="Segoe UI" w:cs="Segoe UI"/>
+          <w:color w:val="101010"/>
+          <w:sz w:val="21"/>
+          <w:szCs w:val="21"/>
+          <w:lang w:eastAsia="fr-FR"/>
+        </w:rPr>
+      </w:pPr>
+      <w:r>
+        <w:rPr>
+          <w:rFonts w:ascii="Segoe UI" w:eastAsia="Times New Roman" w:hAnsi="Segoe UI" w:cs="Segoe UI"/>
+          <w:color w:val="101010"/>
+          <w:sz w:val="21"/>
+          <w:szCs w:val="21"/>
+          <w:lang w:eastAsia="fr-FR"/>
+        </w:rPr>
+        <w:t>Dans votre tableau de bord, à côté du numéro de chaque client, vous allez voir un petit bouton vert </w:t>
+      </w:r>
+      <w:r>
+        <w:rPr>
+          <w:rFonts w:ascii="Segoe UI" w:eastAsia="Times New Roman" w:hAnsi="Segoe UI" w:cs="Segoe UI"/>
+          <w:b/>
+          <w:bCs/>
+          <w:color w:val="101010"/>
+          <w:sz w:val="21"/>
+          <w:szCs w:val="21"/>
+          <w:lang w:eastAsia="fr-FR"/>
+        </w:rPr>
+        <w:t>"WhatsApp"</w:t>
+      </w:r>
+      <w:r>
+        <w:rPr>
+          <w:rFonts w:ascii="Segoe UI" w:eastAsia="Times New Roman" w:hAnsi="Segoe UI" w:cs="Segoe UI"/>
+          <w:color w:val="101010"/>
+          <w:sz w:val="21"/>
+          <w:szCs w:val="21"/>
+          <w:lang w:eastAsia="fr-FR"/>
+        </w:rPr>
+        <w:t> </w:t>
+      </w:r>
+      <w:r>
+        <w:rPr>
+          <w:rFonts w:ascii="Segoe UI" w:eastAsia="Times New Roman" w:hAnsi="Segoe UI" w:cs="Segoe UI"/>
+          <w:i/>
+          <w:iCs/>
+          <w:color w:val="101010"/>
+          <w:sz w:val="21"/>
+          <w:szCs w:val="21"/>
+          <w:lang w:eastAsia="fr-FR"/>
+        </w:rPr>
+        <w:t>(à condition que le client ait tapé un numéro valide 05, 06 ou 07)</w:t>
+      </w:r>
+      <w:r>
+        <w:rPr>
+          <w:rFonts w:ascii="Segoe UI" w:eastAsia="Times New Roman" w:hAnsi="Segoe UI" w:cs="Segoe UI"/>
+          <w:color w:val="101010"/>
+          <w:sz w:val="21"/>
+          <w:szCs w:val="21"/>
+          <w:lang w:eastAsia="fr-FR"/>
+        </w:rPr>
+        <w:t>. Un seul clic dessus et WhatsApp s'ouvre avec un message prêt à être envoyé : </w:t>
+      </w:r>
+      <w:r>
+        <w:rPr>
+          <w:rFonts w:ascii="Segoe UI" w:eastAsia="Times New Roman" w:hAnsi="Segoe UI" w:cs="Segoe UI"/>
+          <w:i/>
+          <w:iCs/>
+          <w:color w:val="101010"/>
+          <w:sz w:val="21"/>
+          <w:szCs w:val="21"/>
+          <w:lang w:eastAsia="fr-FR"/>
+        </w:rPr>
+        <w:t>"Bonjour [Nom], c'est le technicien SERVICE-GO..."</w:t>
+      </w:r>
+      <w:r>
+        <w:rPr>
+          <w:rFonts w:ascii="Segoe UI" w:eastAsia="Times New Roman" w:hAnsi="Segoe UI" w:cs="Segoe UI"/>
+          <w:color w:val="101010"/>
+          <w:sz w:val="21"/>
+          <w:szCs w:val="21"/>
+          <w:lang w:eastAsia="fr-FR"/>
+        </w:rPr>
+        <w:t> !</w:t>
+      </w:r>
+    </w:p>
+    <w:p>
+      <w:pPr>
+        <w:shd w:val="clear" w:color="auto" w:fill="F9F9F9"/>
+        <w:spacing w:before="100" w:beforeAutospacing="1" w:after="100" w:afterAutospacing="1" w:line="240" w:lineRule="auto"/>
+        <w:outlineLvl w:val="2"/>
+        <w:rPr>
+          <w:rFonts w:ascii="Segoe UI" w:eastAsia="Times New Roman" w:hAnsi="Segoe UI" w:cs="Segoe UI"/>
+          <w:color w:val="101010"/>
+          <w:sz w:val="24"/>
+          <w:szCs w:val="24"/>
+          <w:lang w:eastAsia="fr-FR"/>
+        </w:rPr>
+      </w:pPr>
+      <w:r>
+        <w:rPr>
+          <w:rFonts w:ascii="Segoe UI Symbol" w:eastAsia="Times New Roman" w:hAnsi="Segoe UI Symbol" w:cs="Segoe UI Symbol"/>
+          <w:color w:val="101010"/>
+          <w:sz w:val="24"/>
+          <w:szCs w:val="24"/>
+          <w:lang w:eastAsia="fr-FR"/>
+        </w:rPr>
+        <w:t>✅</w:t>
+      </w:r>
+      <w:r>
+        <w:rPr>
+          <w:rFonts w:ascii="Segoe UI" w:eastAsia="Times New Roman" w:hAnsi="Segoe UI" w:cs="Segoe UI"/>
+          <w:color w:val="101010"/>
+          <w:sz w:val="24"/>
+          <w:szCs w:val="24"/>
+          <w:lang w:eastAsia="fr-FR"/>
+        </w:rPr>
+        <w:t xml:space="preserve"> 3. Numéro de téléphone strict (Fait)</w:t>
+      </w:r>
+    </w:p>
+    <w:p>
+      <w:pPr>
+        <w:shd w:val="clear" w:color="auto" w:fill="F9F9F9"/>
+        <w:spacing w:after="0" w:afterAutospacing="1" w:line="240" w:lineRule="auto"/>
+        <w:rPr>
+          <w:rFonts w:ascii="Segoe UI" w:eastAsia="Times New Roman" w:hAnsi="Segoe UI" w:cs="Segoe UI"/>
+          <w:color w:val="101010"/>
+          <w:sz w:val="21"/>
+          <w:szCs w:val="21"/>
+          <w:lang w:eastAsia="fr-FR"/>
+        </w:rPr>
+      </w:pPr>
+      <w:r>
+        <w:rPr>
+          <w:rFonts w:ascii="Segoe UI" w:eastAsia="Times New Roman" w:hAnsi="Segoe UI" w:cs="Segoe UI"/>
+          <w:color w:val="101010"/>
+          <w:sz w:val="21"/>
+          <w:szCs w:val="21"/>
+          <w:lang w:eastAsia="fr-FR"/>
+        </w:rPr>
+        <w:t>Si un client s'amuse à taper "123456" ou un faux numéro, le formulaire affichera une erreur rouge en haut : </w:t>
+      </w:r>
+      <w:r>
+        <w:rPr>
+          <w:rFonts w:ascii="Segoe UI" w:eastAsia="Times New Roman" w:hAnsi="Segoe UI" w:cs="Segoe UI"/>
+          <w:i/>
+          <w:iCs/>
+          <w:color w:val="101010"/>
+          <w:sz w:val="21"/>
+          <w:szCs w:val="21"/>
+          <w:lang w:eastAsia="fr-FR"/>
+        </w:rPr>
+        <w:t>"Veuillez entrer un numéro de téléphone valide (</w:t>
+      </w:r>
+      <w:proofErr w:type="gramStart"/>
+      <w:r>
+        <w:rPr>
+          <w:rFonts w:ascii="Segoe UI" w:eastAsia="Times New Roman" w:hAnsi="Segoe UI" w:cs="Segoe UI"/>
+          <w:i/>
+          <w:iCs/>
+          <w:color w:val="101010"/>
+          <w:sz w:val="21"/>
+          <w:szCs w:val="21"/>
+          <w:lang w:eastAsia="fr-FR"/>
+        </w:rPr>
+        <w:t>ex:</w:t>
+      </w:r>
+      <w:proofErr w:type="gramEnd"/>
+      <w:r>
+        <w:rPr>
+          <w:rFonts w:ascii="Segoe UI" w:eastAsia="Times New Roman" w:hAnsi="Segoe UI" w:cs="Segoe UI"/>
+          <w:i/>
+          <w:iCs/>
+          <w:color w:val="101010"/>
+          <w:sz w:val="21"/>
+          <w:szCs w:val="21"/>
+          <w:lang w:eastAsia="fr-FR"/>
+        </w:rPr>
+        <w:t xml:space="preserve"> 05xx, 06xx, 07xx)"</w:t>
+      </w:r>
+      <w:r>
+        <w:rPr>
+          <w:rFonts w:ascii="Segoe UI" w:eastAsia="Times New Roman" w:hAnsi="Segoe UI" w:cs="Segoe UI"/>
+          <w:color w:val="101010"/>
+          <w:sz w:val="21"/>
+          <w:szCs w:val="21"/>
+          <w:lang w:eastAsia="fr-FR"/>
+        </w:rPr>
+        <w:t>.</w:t>
+      </w:r>
+    </w:p>
+    <w:p>
+      <w:pPr>
+        <w:shd w:val="clear" w:color="auto" w:fill="F9F9F9"/>
+        <w:spacing w:after="0" w:line="240" w:lineRule="auto"/>
+        <w:rPr>
+          <w:rFonts w:ascii="Segoe UI" w:eastAsia="Times New Roman" w:hAnsi="Segoe UI" w:cs="Segoe UI"/>
+          <w:color w:val="101010"/>
+          <w:sz w:val="21"/>
+          <w:szCs w:val="21"/>
+          <w:lang w:eastAsia="fr-FR"/>
+        </w:rPr>
+      </w:pPr>
+      <w:r>
+        <w:rPr>
+          <w:rFonts w:ascii="Segoe UI" w:eastAsia="Times New Roman" w:hAnsi="Segoe UI" w:cs="Segoe UI"/>
+          <w:color w:val="101010"/>
+          <w:sz w:val="21"/>
+          <w:szCs w:val="21"/>
+          <w:lang w:eastAsia="fr-FR"/>
+        </w:rPr>
+        <w:pict>
+          <v:rect id="_x0000_i1025" style="width:453.45pt;height:.75pt" o:hrpct="0" o:hralign="center" o:hrstd="t" o:hr="t" fillcolor="#a0a0a0" stroked="f"/>
+        </w:pict>
+      </w:r>
+    </w:p>
+    <w:p>
+      <w:pPr>
+        <w:shd w:val="clear" w:color="auto" w:fill="F9F9F9"/>
+        <w:spacing w:before="100" w:beforeAutospacing="1" w:after="100" w:afterAutospacing="1" w:line="240" w:lineRule="auto"/>
+        <w:outlineLvl w:val="2"/>
+        <w:rPr>
+          <w:rFonts w:ascii="Segoe UI" w:eastAsia="Times New Roman" w:hAnsi="Segoe UI" w:cs="Segoe UI"/>
+          <w:color w:val="101010"/>
+          <w:sz w:val="24"/>
+          <w:szCs w:val="24"/>
+          <w:lang w:eastAsia="fr-FR"/>
+        </w:rPr>
+      </w:pPr>
+      <w:r>
+        <w:rPr>
+          <w:rFonts w:ascii="Segoe UI Symbol" w:eastAsia="Times New Roman" w:hAnsi="Segoe UI Symbol" w:cs="Segoe UI Symbol"/>
+          <w:color w:val="101010"/>
+          <w:sz w:val="24"/>
+          <w:szCs w:val="24"/>
+          <w:lang w:eastAsia="fr-FR"/>
+        </w:rPr>
+        <w:t>🚨</w:t>
+      </w:r>
+      <w:r>
+        <w:rPr>
+          <w:rFonts w:ascii="Segoe UI" w:eastAsia="Times New Roman" w:hAnsi="Segoe UI" w:cs="Segoe UI"/>
+          <w:color w:val="101010"/>
+          <w:sz w:val="24"/>
+          <w:szCs w:val="24"/>
+          <w:lang w:eastAsia="fr-FR"/>
+        </w:rPr>
+        <w:t xml:space="preserve"> La suite très importante : La Base de Données</w:t>
+      </w:r>
+    </w:p>
+    <w:p>
+      <w:pPr>
+        <w:shd w:val="clear" w:color="auto" w:fill="F9F9F9"/>
+        <w:spacing w:after="0" w:line="240" w:lineRule="auto"/>
+        <w:rPr>
+          <w:rFonts w:ascii="Segoe UI" w:eastAsia="Times New Roman" w:hAnsi="Segoe UI" w:cs="Segoe UI"/>
+          <w:color w:val="101010"/>
+          <w:sz w:val="21"/>
+          <w:szCs w:val="21"/>
+          <w:lang w:eastAsia="fr-FR"/>
+        </w:rPr>
+      </w:pPr>
+      <w:r>
+        <w:rPr>
+          <w:rFonts w:ascii="Segoe UI" w:eastAsia="Times New Roman" w:hAnsi="Segoe UI" w:cs="Segoe UI"/>
+          <w:color w:val="101010"/>
+          <w:sz w:val="21"/>
+          <w:szCs w:val="21"/>
+          <w:lang w:eastAsia="fr-FR"/>
+        </w:rPr>
+        <w:t>Puisque votre application est hébergée gratuitement sur </w:t>
+      </w:r>
+      <w:proofErr w:type="spellStart"/>
+      <w:r>
+        <w:rPr>
+          <w:rFonts w:ascii="Segoe UI" w:eastAsia="Times New Roman" w:hAnsi="Segoe UI" w:cs="Segoe UI"/>
+          <w:b/>
+          <w:bCs/>
+          <w:color w:val="101010"/>
+          <w:sz w:val="21"/>
+          <w:szCs w:val="21"/>
+          <w:lang w:eastAsia="fr-FR"/>
+        </w:rPr>
+        <w:t>Render</w:t>
+      </w:r>
+      <w:proofErr w:type="spellEnd"/>
+      <w:r>
+        <w:rPr>
+          <w:rFonts w:ascii="Segoe UI" w:eastAsia="Times New Roman" w:hAnsi="Segoe UI" w:cs="Segoe UI"/>
+          <w:color w:val="101010"/>
+          <w:sz w:val="21"/>
+          <w:szCs w:val="21"/>
+          <w:lang w:eastAsia="fr-FR"/>
+        </w:rPr>
+        <w:t xml:space="preserve">, leur système va formater (effacer) son disque dur de temps en temps. Dès que ça arrivera, vous allez perdre l'historique de vos réservations </w:t>
+      </w:r>
+      <w:proofErr w:type="spellStart"/>
+      <w:r>
+        <w:rPr>
+          <w:rFonts w:ascii="Segoe UI" w:eastAsia="Times New Roman" w:hAnsi="Segoe UI" w:cs="Segoe UI"/>
+          <w:color w:val="101010"/>
+          <w:sz w:val="21"/>
+          <w:szCs w:val="21"/>
+          <w:lang w:eastAsia="fr-FR"/>
+        </w:rPr>
+        <w:t>SQLite</w:t>
+      </w:r>
+      <w:proofErr w:type="spellEnd"/>
+      <w:r>
+        <w:rPr>
+          <w:rFonts w:ascii="Segoe UI" w:eastAsia="Times New Roman" w:hAnsi="Segoe UI" w:cs="Segoe UI"/>
+          <w:color w:val="101010"/>
+          <w:sz w:val="21"/>
+          <w:szCs w:val="21"/>
+          <w:lang w:eastAsia="fr-FR"/>
+        </w:rPr>
+        <w:t>.</w:t>
+      </w:r>
+    </w:p>
+    <w:p>
+      <w:pPr>
+        <w:shd w:val="clear" w:color="auto" w:fill="F9F9F9"/>
+        <w:spacing w:after="0" w:line="240" w:lineRule="auto"/>
+        <w:rPr>
+          <w:rFonts w:ascii="Segoe UI" w:eastAsia="Times New Roman" w:hAnsi="Segoe UI" w:cs="Segoe UI"/>
+          <w:color w:val="101010"/>
+          <w:sz w:val="21"/>
+          <w:szCs w:val="21"/>
+          <w:lang w:eastAsia="fr-FR"/>
+        </w:rPr>
+      </w:pPr>
+      <w:r>
+        <w:rPr>
+          <w:rFonts w:ascii="Segoe UI" w:eastAsia="Times New Roman" w:hAnsi="Segoe UI" w:cs="Segoe UI"/>
+          <w:color w:val="101010"/>
+          <w:sz w:val="21"/>
+          <w:szCs w:val="21"/>
+          <w:lang w:eastAsia="fr-FR"/>
+        </w:rPr>
+        <w:t>Pour régler ça définitivement (et gratuitement), voici la marche à suivre :</w:t>
+      </w:r>
+    </w:p>
+    <w:p>
+      <w:pPr>
+        <w:numPr>
+          <w:ilvl w:val="0"/>
+          <w:numId w:val="31"/>
+        </w:numPr>
+        <w:shd w:val="clear" w:color="auto" w:fill="F9F9F9"/>
+        <w:spacing w:after="0" w:line="240" w:lineRule="auto"/>
+        <w:ind w:left="0"/>
+        <w:rPr>
+          <w:rFonts w:ascii="Segoe UI" w:eastAsia="Times New Roman" w:hAnsi="Segoe UI" w:cs="Segoe UI"/>
+          <w:color w:val="101010"/>
+          <w:sz w:val="21"/>
+          <w:szCs w:val="21"/>
+          <w:lang w:eastAsia="fr-FR"/>
+        </w:rPr>
+      </w:pPr>
+      <w:r>
+        <w:rPr>
+          <w:rFonts w:ascii="Segoe UI" w:eastAsia="Times New Roman" w:hAnsi="Segoe UI" w:cs="Segoe UI"/>
+          <w:color w:val="101010"/>
+          <w:sz w:val="21"/>
+          <w:szCs w:val="21"/>
+          <w:lang w:eastAsia="fr-FR"/>
+        </w:rPr>
+        <w:t>Créez un compte gratuit sur le site </w:t>
+      </w:r>
+      <w:proofErr w:type="spellStart"/>
+      <w:r>
+        <w:rPr>
+          <w:rFonts w:ascii="Segoe UI" w:eastAsia="Times New Roman" w:hAnsi="Segoe UI" w:cs="Segoe UI"/>
+          <w:b/>
+          <w:bCs/>
+          <w:color w:val="101010"/>
+          <w:sz w:val="21"/>
+          <w:szCs w:val="21"/>
+          <w:lang w:eastAsia="fr-FR"/>
+        </w:rPr>
+        <w:fldChar w:fldCharType="begin"/>
+      </w:r>
+      <w:r>
+        <w:rPr>
+          <w:rFonts w:ascii="Segoe UI" w:eastAsia="Times New Roman" w:hAnsi="Segoe UI" w:cs="Segoe UI"/>
+          <w:b/>
+          <w:bCs/>
+          <w:color w:val="101010"/>
+          <w:sz w:val="21"/>
+          <w:szCs w:val="21"/>
+          <w:lang w:eastAsia="fr-FR"/>
+        </w:rPr>
+        <w:instrText xml:space="preserve"> HYPERLINK "https://supabase.com/" </w:instrText>
+      </w:r>
+      <w:r>
+        <w:rPr>
+          <w:rFonts w:ascii="Segoe UI" w:eastAsia="Times New Roman" w:hAnsi="Segoe UI" w:cs="Segoe UI"/>
+          <w:b/>
+          <w:bCs/>
+          <w:color w:val="101010"/>
+          <w:sz w:val="21"/>
+          <w:szCs w:val="21"/>
+          <w:lang w:eastAsia="fr-FR"/>
+        </w:rPr>
+        <w:fldChar w:fldCharType="separate"/>
+      </w:r>
+      <w:r>
+        <w:rPr>
+          <w:rFonts w:ascii="Segoe UI" w:eastAsia="Times New Roman" w:hAnsi="Segoe UI" w:cs="Segoe UI"/>
+          <w:b/>
+          <w:bCs/>
+          <w:color w:val="3E8ED1"/>
+          <w:sz w:val="21"/>
+          <w:szCs w:val="21"/>
+          <w:u w:val="single"/>
+          <w:lang w:eastAsia="fr-FR"/>
+        </w:rPr>
+        <w:t>Supabase</w:t>
+      </w:r>
+      <w:proofErr w:type="spellEnd"/>
+      <w:r>
+        <w:rPr>
+          <w:rFonts w:ascii="Segoe UI" w:eastAsia="Times New Roman" w:hAnsi="Segoe UI" w:cs="Segoe UI"/>
+          <w:b/>
+          <w:bCs/>
+          <w:color w:val="101010"/>
+          <w:sz w:val="21"/>
+          <w:szCs w:val="21"/>
+          <w:lang w:eastAsia="fr-FR"/>
+        </w:rPr>
+        <w:fldChar w:fldCharType="end"/>
+      </w:r>
+      <w:r>
+        <w:rPr>
+          <w:rFonts w:ascii="Segoe UI" w:eastAsia="Times New Roman" w:hAnsi="Segoe UI" w:cs="Segoe UI"/>
+          <w:color w:val="101010"/>
+          <w:sz w:val="21"/>
+          <w:szCs w:val="21"/>
+          <w:lang w:eastAsia="fr-FR"/>
+        </w:rPr>
+        <w:t> (C'est une base de données professionnelle gratuite).</w:t>
+      </w:r>
+    </w:p>
+    <w:p>
+      <w:pPr>
+        <w:numPr>
+          <w:ilvl w:val="0"/>
+          <w:numId w:val="31"/>
+        </w:numPr>
+        <w:shd w:val="clear" w:color="auto" w:fill="F9F9F9"/>
+        <w:spacing w:after="0" w:line="240" w:lineRule="auto"/>
+        <w:ind w:left="0"/>
+        <w:rPr>
+          <w:rFonts w:ascii="Segoe UI" w:eastAsia="Times New Roman" w:hAnsi="Segoe UI" w:cs="Segoe UI"/>
+          <w:color w:val="101010"/>
+          <w:sz w:val="21"/>
+          <w:szCs w:val="21"/>
+          <w:lang w:eastAsia="fr-FR"/>
+        </w:rPr>
+      </w:pPr>
+      <w:r>
+        <w:rPr>
+          <w:rFonts w:ascii="Segoe UI" w:eastAsia="Times New Roman" w:hAnsi="Segoe UI" w:cs="Segoe UI"/>
+          <w:color w:val="101010"/>
+          <w:sz w:val="21"/>
+          <w:szCs w:val="21"/>
+          <w:lang w:eastAsia="fr-FR"/>
+        </w:rPr>
+        <w:t>Cliquez sur "New Project" (Nouveau projet).</w:t>
+      </w:r>
+    </w:p>
+    <w:p>
+      <w:pPr>
+        <w:numPr>
+          <w:ilvl w:val="0"/>
+          <w:numId w:val="31"/>
+        </w:numPr>
+        <w:shd w:val="clear" w:color="auto" w:fill="F9F9F9"/>
+        <w:spacing w:after="0" w:line="240" w:lineRule="auto"/>
+        <w:ind w:left="0"/>
+        <w:rPr>
+          <w:rFonts w:ascii="Segoe UI" w:eastAsia="Times New Roman" w:hAnsi="Segoe UI" w:cs="Segoe UI"/>
+          <w:color w:val="101010"/>
+          <w:sz w:val="21"/>
+          <w:szCs w:val="21"/>
+          <w:lang w:eastAsia="fr-FR"/>
+        </w:rPr>
+      </w:pPr>
+      <w:r>
+        <w:rPr>
+          <w:rFonts w:ascii="Segoe UI" w:eastAsia="Times New Roman" w:hAnsi="Segoe UI" w:cs="Segoe UI"/>
+          <w:color w:val="101010"/>
+          <w:sz w:val="21"/>
+          <w:szCs w:val="21"/>
+          <w:lang w:eastAsia="fr-FR"/>
+        </w:rPr>
+        <w:t xml:space="preserve">Allez dans les réglages (Settings) &gt; </w:t>
+      </w:r>
+      <w:proofErr w:type="spellStart"/>
+      <w:r>
+        <w:rPr>
+          <w:rFonts w:ascii="Segoe UI" w:eastAsia="Times New Roman" w:hAnsi="Segoe UI" w:cs="Segoe UI"/>
+          <w:color w:val="101010"/>
+          <w:sz w:val="21"/>
+          <w:szCs w:val="21"/>
+          <w:lang w:eastAsia="fr-FR"/>
+        </w:rPr>
+        <w:t>Database</w:t>
+      </w:r>
+      <w:proofErr w:type="spellEnd"/>
+      <w:r>
+        <w:rPr>
+          <w:rFonts w:ascii="Segoe UI" w:eastAsia="Times New Roman" w:hAnsi="Segoe UI" w:cs="Segoe UI"/>
+          <w:color w:val="101010"/>
+          <w:sz w:val="21"/>
+          <w:szCs w:val="21"/>
+          <w:lang w:eastAsia="fr-FR"/>
+        </w:rPr>
+        <w:t>, et copiez le </w:t>
+      </w:r>
+      <w:r>
+        <w:rPr>
+          <w:rFonts w:ascii="Segoe UI" w:eastAsia="Times New Roman" w:hAnsi="Segoe UI" w:cs="Segoe UI"/>
+          <w:b/>
+          <w:bCs/>
+          <w:color w:val="101010"/>
+          <w:sz w:val="21"/>
+          <w:szCs w:val="21"/>
+          <w:lang w:eastAsia="fr-FR"/>
+        </w:rPr>
+        <w:t xml:space="preserve">lien de connexion </w:t>
+      </w:r>
+      <w:proofErr w:type="spellStart"/>
+      <w:r>
+        <w:rPr>
+          <w:rFonts w:ascii="Segoe UI" w:eastAsia="Times New Roman" w:hAnsi="Segoe UI" w:cs="Segoe UI"/>
+          <w:b/>
+          <w:bCs/>
+          <w:color w:val="101010"/>
+          <w:sz w:val="21"/>
+          <w:szCs w:val="21"/>
+          <w:lang w:eastAsia="fr-FR"/>
+        </w:rPr>
+        <w:t>Postgres</w:t>
+      </w:r>
+      <w:proofErr w:type="spellEnd"/>
+      <w:r>
+        <w:rPr>
+          <w:rFonts w:ascii="Segoe UI" w:eastAsia="Times New Roman" w:hAnsi="Segoe UI" w:cs="Segoe UI"/>
+          <w:color w:val="101010"/>
+          <w:sz w:val="21"/>
+          <w:szCs w:val="21"/>
+          <w:lang w:eastAsia="fr-FR"/>
+        </w:rPr>
+        <w:t> (URI).</w:t>
+      </w:r>
+    </w:p>
+    <w:p>
+      <w:pPr>
+        <w:numPr>
+          <w:ilvl w:val="0"/>
+          <w:numId w:val="31"/>
+        </w:numPr>
+        <w:shd w:val="clear" w:color="auto" w:fill="F9F9F9"/>
+        <w:spacing w:after="0" w:line="240" w:lineRule="auto"/>
+        <w:ind w:left="0"/>
+        <w:rPr>
+          <w:rFonts w:ascii="Segoe UI" w:eastAsia="Times New Roman" w:hAnsi="Segoe UI" w:cs="Segoe UI"/>
+          <w:color w:val="101010"/>
+          <w:sz w:val="21"/>
+          <w:szCs w:val="21"/>
+          <w:lang w:eastAsia="fr-FR"/>
+        </w:rPr>
+      </w:pPr>
+      <w:r>
+        <w:rPr>
+          <w:rFonts w:ascii="Segoe UI" w:eastAsia="Times New Roman" w:hAnsi="Segoe UI" w:cs="Segoe UI"/>
+          <w:color w:val="101010"/>
+          <w:sz w:val="21"/>
+          <w:szCs w:val="21"/>
+          <w:lang w:eastAsia="fr-FR"/>
+        </w:rPr>
+        <w:t xml:space="preserve">Dès que vous avez ce lien, </w:t>
+      </w:r>
+      <w:proofErr w:type="gramStart"/>
+      <w:r>
+        <w:rPr>
+          <w:rFonts w:ascii="Segoe UI" w:eastAsia="Times New Roman" w:hAnsi="Segoe UI" w:cs="Segoe UI"/>
+          <w:color w:val="101010"/>
+          <w:sz w:val="21"/>
+          <w:szCs w:val="21"/>
+          <w:lang w:eastAsia="fr-FR"/>
+        </w:rPr>
+        <w:t>donnez</w:t>
+      </w:r>
+      <w:proofErr w:type="spellStart"/>
+      <w:r>
+        <w:rPr>
+          <w:rFonts w:ascii="Segoe UI" w:eastAsia="Times New Roman" w:hAnsi="Segoe UI" w:cs="Segoe UI"/>
+          <w:color w:val="101010"/>
+          <w:sz w:val="21"/>
+          <w:szCs w:val="21"/>
+          <w:lang w:eastAsia="fr-FR"/>
+        </w:rPr>
+        <w:t>-le moi</w:t>
+      </w:r>
+      <w:proofErr w:type="spellEnd"/>
+      <w:proofErr w:type="gramEnd"/>
+      <w:r>
+        <w:rPr>
+          <w:rFonts w:ascii="Segoe UI" w:eastAsia="Times New Roman" w:hAnsi="Segoe UI" w:cs="Segoe UI"/>
+          <w:color w:val="101010"/>
+          <w:sz w:val="21"/>
+          <w:szCs w:val="21"/>
+          <w:lang w:eastAsia="fr-FR"/>
+        </w:rPr>
+        <w:t xml:space="preserve"> ici ! Je m'occuperai de lier définitivement votre application à cette base de données indestructible.</w:t>
+      </w:r>
+    </w:p>
+    <w:p>
+      <w:pPr>
+        <w:shd w:val="clear" w:color="auto" w:fill="F9F9F9"/>
+        <w:spacing w:after="0" w:line="240" w:lineRule="auto"/>
+        <w:rPr>
+          <w:rFonts w:ascii="Segoe UI" w:eastAsia="Times New Roman" w:hAnsi="Segoe UI" w:cs="Segoe UI"/>
+          <w:color w:val="101010"/>
+          <w:sz w:val="21"/>
+          <w:szCs w:val="21"/>
+          <w:lang w:eastAsia="fr-FR"/>
+        </w:rPr>
+      </w:pPr>
+      <w:r>
+        <w:rPr>
+          <w:rFonts w:ascii="Segoe UI" w:eastAsia="Times New Roman" w:hAnsi="Segoe UI" w:cs="Segoe UI"/>
+          <w:color w:val="101010"/>
+          <w:sz w:val="21"/>
+          <w:szCs w:val="21"/>
+          <w:lang w:eastAsia="fr-FR"/>
+        </w:rPr>
+        <w:t xml:space="preserve">Avez-vous besoin d'aide pour créer le compte </w:t>
+      </w:r>
+      <w:proofErr w:type="spellStart"/>
+      <w:r>
+        <w:rPr>
+          <w:rFonts w:ascii="Segoe UI" w:eastAsia="Times New Roman" w:hAnsi="Segoe UI" w:cs="Segoe UI"/>
+          <w:color w:val="101010"/>
+          <w:sz w:val="21"/>
+          <w:szCs w:val="21"/>
+          <w:lang w:eastAsia="fr-FR"/>
+        </w:rPr>
+        <w:t>Supabase</w:t>
+      </w:r>
+      <w:proofErr w:type="spellEnd"/>
+      <w:r>
+        <w:rPr>
+          <w:rFonts w:ascii="Segoe UI" w:eastAsia="Times New Roman" w:hAnsi="Segoe UI" w:cs="Segoe UI"/>
+          <w:color w:val="101010"/>
+          <w:sz w:val="21"/>
+          <w:szCs w:val="21"/>
+          <w:lang w:eastAsia="fr-FR"/>
+        </w:rPr>
+        <w:t>, ou souhaitez-vous qu'on ajoute d'autres fonctionnalités en attendant ?</w:t>
+      </w:r>
+    </w:p>
+    <w:p>
+      <w:pPr>
+        <w:rPr>
+          <w:rFonts w:asciiTheme="majorBidi" w:hAnsiTheme="majorBidi" w:cstheme="majorBidi"/>
+          <w:sz w:val="24"/>
+          <w:szCs w:val="24"/>
+        </w:rPr>
+      </w:pPr>
+      <w:bookmarkStart w:id="0" w:name="_GoBack"/>
+      <w:bookmarkEnd w:id="0"/>
     </w:p>
     <w:sectPr>
       <w:pgSz w:w="11906" w:h="16838" w:code="9"/>
@@ -15122,6 +16016,119 @@
     </w:lvl>
   </w:abstractNum>
   <w:abstractNum w:abstractNumId="18" w15:restartNumberingAfterBreak="0">
+    <w:nsid w:val="50592E68"/>
+    <w:multiLevelType w:val="multilevel"/>
+    <w:tmpl w:val="FC96CB4C"/>
+    <w:lvl w:ilvl="0">
+      <w:start w:val="1"/>
+      <w:numFmt w:val="decimal"/>
+      <w:lvlText w:val="%1."/>
+      <w:lvlJc w:val="left"/>
+      <w:pPr>
+        <w:tabs>
+          <w:tab w:val="num" w:pos="720"/>
+        </w:tabs>
+        <w:ind w:left="720" w:hanging="360"/>
+      </w:pPr>
+    </w:lvl>
+    <w:lvl w:ilvl="1" w:tentative="1">
+      <w:start w:val="1"/>
+      <w:numFmt w:val="decimal"/>
+      <w:lvlText w:val="%2."/>
+      <w:lvlJc w:val="left"/>
+      <w:pPr>
+        <w:tabs>
+          <w:tab w:val="num" w:pos="1440"/>
+        </w:tabs>
+        <w:ind w:left="1440" w:hanging="360"/>
+      </w:pPr>
+    </w:lvl>
+    <w:lvl w:ilvl="2" w:tentative="1">
+      <w:start w:val="1"/>
+      <w:numFmt w:val="decimal"/>
+      <w:lvlText w:val="%3."/>
+      <w:lvlJc w:val="left"/>
+      <w:pPr>
+        <w:tabs>
+          <w:tab w:val="num" w:pos="2160"/>
+        </w:tabs>
+        <w:ind w:left="2160" w:hanging="360"/>
+      </w:pPr>
+    </w:lvl>
+    <w:lvl w:ilvl="3" w:tentative="1">
+      <w:start w:val="1"/>
+      <w:numFmt w:val="decimal"/>
+      <w:lvlText w:val="%4."/>
+      <w:lvlJc w:val="left"/>
+      <w:pPr>
+        <w:tabs>
+          <w:tab w:val="num" w:pos="2880"/>
+        </w:tabs>
+        <w:ind w:left="2880" w:hanging="360"/>
+      </w:pPr>
+    </w:lvl>
+    <w:lvl w:ilvl="4" w:tentative="1">
+      <w:start w:val="1"/>
+      <w:numFmt w:val="decimal"/>
+      <w:lvlText w:val="%5."/>
+      <w:lvlJc w:val="left"/>
+      <w:pPr>
+        <w:tabs>
+          <w:tab w:val="num" w:pos="3600"/>
+        </w:tabs>
+        <w:ind w:left="3600" w:hanging="360"/>
+      </w:pPr>
+    </w:lvl>
+    <w:lvl w:ilvl="5" w:tentative="1">
+      <w:start w:val="1"/>
+      <w:numFmt w:val="decimal"/>
+      <w:lvlText w:val="%6."/>
+      <w:lvlJc w:val="left"/>
+      <w:pPr>
+        <w:tabs>
+          <w:tab w:val="num" w:pos="4320"/>
+        </w:tabs>
+        <w:ind w:left="4320" w:hanging="360"/>
+      </w:pPr>
+    </w:lvl>
+    <w:lvl w:ilvl="6" w:tentative="1">
+      <w:start w:val="1"/>
+      <w:numFmt w:val="decimal"/>
+      <w:lvlText w:val="%7."/>
+      <w:lvlJc w:val="left"/>
+      <w:pPr>
+        <w:tabs>
+          <w:tab w:val="num" w:pos="5040"/>
+        </w:tabs>
+        <w:ind w:left="5040" w:hanging="360"/>
+      </w:pPr>
+    </w:lvl>
+    <w:lvl w:ilvl="7" w:tentative="1">
+      <w:start w:val="1"/>
+      <w:numFmt w:val="decimal"/>
+      <w:lvlText w:val="%8."/>
+      <w:lvlJc w:val="left"/>
+      <w:pPr>
+        <w:tabs>
+          <w:tab w:val="num" w:pos="5760"/>
+        </w:tabs>
+        <w:ind w:left="5760" w:hanging="360"/>
+      </w:pPr>
+    </w:lvl>
+    <w:lvl w:ilvl="8" w:tentative="1">
+      <w:start w:val="1"/>
+      <w:numFmt w:val="decimal"/>
+      <w:lvlText w:val="%9."/>
+      <w:lvlJc w:val="left"/>
+      <w:pPr>
+        <w:tabs>
+          <w:tab w:val="num" w:pos="6480"/>
+        </w:tabs>
+        <w:ind w:left="6480" w:hanging="360"/>
+      </w:pPr>
+    </w:lvl>
+  </w:abstractNum>
+  <w:abstractNum w:abstractNumId="19" w15:restartNumberingAfterBreak="0">
     <w:nsid w:val="56F716FF"/>
     <w:multiLevelType w:val="multilevel"/>
     <w:tmpl w:val="C4FE0146"/>
@@ -15270,7 +16277,7 @@
       </w:rPr>
     </w:lvl>
   </w:abstractNum>
-  <w:abstractNum w:abstractNumId="19" w15:restartNumberingAfterBreak="0">
+  <w:abstractNum w:abstractNumId="20" w15:restartNumberingAfterBreak="0">
     <w:nsid w:val="58A74BAC"/>
     <w:multiLevelType w:val="multilevel"/>
     <w:tmpl w:val="A0E02532"/>
@@ -15383,7 +16390,7 @@
       </w:pPr>
     </w:lvl>
   </w:abstractNum>
-  <w:abstractNum w:abstractNumId="20" w15:restartNumberingAfterBreak="0">
+  <w:abstractNum w:abstractNumId="21" w15:restartNumberingAfterBreak="0">
     <w:nsid w:val="58C07C39"/>
     <w:multiLevelType w:val="multilevel"/>
     <w:tmpl w:val="F0302736"/>
@@ -15532,7 +16539,7 @@
       </w:rPr>
     </w:lvl>
   </w:abstractNum>
-  <w:abstractNum w:abstractNumId="21" w15:restartNumberingAfterBreak="0">
+  <w:abstractNum w:abstractNumId="22" w15:restartNumberingAfterBreak="0">
     <w:nsid w:val="61292230"/>
     <w:multiLevelType w:val="multilevel"/>
     <w:tmpl w:val="6AD610F0"/>
@@ -15649,7 +16656,7 @@
       </w:pPr>
     </w:lvl>
   </w:abstractNum>
-  <w:abstractNum w:abstractNumId="22" w15:restartNumberingAfterBreak="0">
+  <w:abstractNum w:abstractNumId="23" w15:restartNumberingAfterBreak="0">
     <w:nsid w:val="62A76490"/>
     <w:multiLevelType w:val="multilevel"/>
     <w:tmpl w:val="4F1C5316"/>
@@ -15766,7 +16773,7 @@
       </w:pPr>
     </w:lvl>
   </w:abstractNum>
-  <w:abstractNum w:abstractNumId="23" w15:restartNumberingAfterBreak="0">
+  <w:abstractNum w:abstractNumId="24" w15:restartNumberingAfterBreak="0">
     <w:nsid w:val="63573F96"/>
     <w:multiLevelType w:val="multilevel"/>
     <w:tmpl w:val="2CB21D70"/>
@@ -15915,7 +16922,7 @@
       </w:rPr>
     </w:lvl>
   </w:abstractNum>
-  <w:abstractNum w:abstractNumId="24" w15:restartNumberingAfterBreak="0">
+  <w:abstractNum w:abstractNumId="25" w15:restartNumberingAfterBreak="0">
     <w:nsid w:val="63C26785"/>
     <w:multiLevelType w:val="multilevel"/>
     <w:tmpl w:val="6818FAC8"/>
@@ -16028,7 +17035,7 @@
       </w:pPr>
     </w:lvl>
   </w:abstractNum>
-  <w:abstractNum w:abstractNumId="25" w15:restartNumberingAfterBreak="0">
+  <w:abstractNum w:abstractNumId="26" w15:restartNumberingAfterBreak="0">
     <w:nsid w:val="6BB13E57"/>
     <w:multiLevelType w:val="multilevel"/>
     <w:tmpl w:val="947E31F6"/>
@@ -16177,7 +17184,7 @@
       </w:rPr>
     </w:lvl>
   </w:abstractNum>
-  <w:abstractNum w:abstractNumId="26" w15:restartNumberingAfterBreak="0">
+  <w:abstractNum w:abstractNumId="27" w15:restartNumberingAfterBreak="0">
     <w:nsid w:val="6D64703A"/>
     <w:multiLevelType w:val="multilevel"/>
     <w:tmpl w:val="4A8A1276"/>
@@ -16290,7 +17297,7 @@
       </w:pPr>
     </w:lvl>
   </w:abstractNum>
-  <w:abstractNum w:abstractNumId="27" w15:restartNumberingAfterBreak="0">
+  <w:abstractNum w:abstractNumId="28" w15:restartNumberingAfterBreak="0">
     <w:nsid w:val="6D906C01"/>
     <w:multiLevelType w:val="multilevel"/>
     <w:tmpl w:val="4DF63D4A"/>
@@ -16439,7 +17446,7 @@
       </w:rPr>
     </w:lvl>
   </w:abstractNum>
-  <w:abstractNum w:abstractNumId="28" w15:restartNumberingAfterBreak="0">
+  <w:abstractNum w:abstractNumId="29" w15:restartNumberingAfterBreak="0">
     <w:nsid w:val="71E65246"/>
     <w:multiLevelType w:val="multilevel"/>
     <w:tmpl w:val="F9944F54"/>
@@ -16588,7 +17595,7 @@
       </w:rPr>
     </w:lvl>
   </w:abstractNum>
-  <w:abstractNum w:abstractNumId="29" w15:restartNumberingAfterBreak="0">
+  <w:abstractNum w:abstractNumId="30" w15:restartNumberingAfterBreak="0">
     <w:nsid w:val="75FC1139"/>
     <w:multiLevelType w:val="multilevel"/>
     <w:tmpl w:val="CC5A3DA6"/>
@@ -16738,28 +17745,28 @@
     </w:lvl>
   </w:abstractNum>
   <w:num w:numId="1">
-    <w:abstractNumId w:val="19"/>
+    <w:abstractNumId w:val="20"/>
   </w:num>
   <w:num w:numId="2">
     <w:abstractNumId w:val="15"/>
   </w:num>
   <w:num w:numId="3">
-    <w:abstractNumId w:val="28"/>
+    <w:abstractNumId w:val="29"/>
   </w:num>
   <w:num w:numId="4">
-    <w:abstractNumId w:val="21"/>
+    <w:abstractNumId w:val="22"/>
   </w:num>
   <w:num w:numId="5">
     <w:abstractNumId w:val="11"/>
   </w:num>
   <w:num w:numId="6">
-    <w:abstractNumId w:val="22"/>
+    <w:abstractNumId w:val="23"/>
   </w:num>
   <w:num w:numId="7">
-    <w:abstractNumId w:val="23"/>
+    <w:abstractNumId w:val="24"/>
   </w:num>
   <w:num w:numId="8">
-    <w:abstractNumId w:val="26"/>
+    <w:abstractNumId w:val="27"/>
   </w:num>
   <w:num w:numId="9">
     <w:abstractNumId w:val="6"/>
@@ -16768,10 +17775,10 @@
     <w:abstractNumId w:val="7"/>
   </w:num>
   <w:num w:numId="11">
-    <w:abstractNumId w:val="20"/>
+    <w:abstractNumId w:val="21"/>
   </w:num>
   <w:num w:numId="12">
-    <w:abstractNumId w:val="24"/>
+    <w:abstractNumId w:val="25"/>
   </w:num>
   <w:num w:numId="13">
     <w:abstractNumId w:val="17"/>
@@ -16780,7 +17787,7 @@
     <w:abstractNumId w:val="13"/>
   </w:num>
   <w:num w:numId="15">
-    <w:abstractNumId w:val="29"/>
+    <w:abstractNumId w:val="30"/>
   </w:num>
   <w:num w:numId="16">
     <w:abstractNumId w:val="14"/>
@@ -16789,7 +17796,7 @@
     <w:abstractNumId w:val="3"/>
   </w:num>
   <w:num w:numId="18">
-    <w:abstractNumId w:val="18"/>
+    <w:abstractNumId w:val="19"/>
   </w:num>
   <w:num w:numId="19">
     <w:abstractNumId w:val="2"/>
@@ -16804,7 +17811,7 @@
     <w:abstractNumId w:val="4"/>
   </w:num>
   <w:num w:numId="23">
-    <w:abstractNumId w:val="27"/>
+    <w:abstractNumId w:val="28"/>
   </w:num>
   <w:num w:numId="24">
     <w:abstractNumId w:val="5"/>
@@ -16825,7 +17832,10 @@
     <w:abstractNumId w:val="12"/>
   </w:num>
   <w:num w:numId="30">
-    <w:abstractNumId w:val="25"/>
+    <w:abstractNumId w:val="26"/>
+  </w:num>
+  <w:num w:numId="31">
+    <w:abstractNumId w:val="18"/>
   </w:num>
 </w:numbering>
 </file>
@@ -17748,7 +18758,7 @@
 </file>
 
 <file path=customXml/itemProps1.xml><?xml version="1.0" encoding="utf-8"?>
-<ds:datastoreItem xmlns:ds="http://schemas.openxmlformats.org/officeDocument/2006/customXml" ds:itemID="{827B84DA-A779-4B0E-A221-8F4D9AC77329}">
+<ds:datastoreItem xmlns:ds="http://schemas.openxmlformats.org/officeDocument/2006/customXml" ds:itemID="{455FD12C-5756-485F-ABBB-41BF2E4DF435}">
   <ds:schemaRefs>
     <ds:schemaRef ds:uri="http://schemas.openxmlformats.org/officeDocument/2006/bibliography"/>
   </ds:schemaRefs>

</xml_diff>

<commit_message>
fix: Ajouter CheckCircle2 dans les imports
</commit_message>
<xml_diff>
--- a/Application de Réservation de Techniciens à Domicile.docx
+++ b/Application de Réservation de Techniciens à Domicile.docx
@@ -13706,8 +13706,1772 @@
           <w:szCs w:val="24"/>
         </w:rPr>
       </w:pPr>
+    </w:p>
+    <w:p>
+      <w:pPr>
+        <w:rPr>
+          <w:rFonts w:asciiTheme="majorBidi" w:hAnsiTheme="majorBidi" w:cstheme="majorBidi"/>
+          <w:sz w:val="24"/>
+          <w:szCs w:val="24"/>
+        </w:rPr>
+      </w:pPr>
+    </w:p>
+    <w:p>
+      <w:pPr>
+        <w:shd w:val="clear" w:color="auto" w:fill="F9F9F9"/>
+        <w:spacing w:after="0" w:line="240" w:lineRule="auto"/>
+        <w:rPr>
+          <w:rFonts w:ascii="Segoe UI" w:eastAsia="Times New Roman" w:hAnsi="Segoe UI" w:cs="Segoe UI"/>
+          <w:color w:val="101010"/>
+          <w:sz w:val="21"/>
+          <w:szCs w:val="21"/>
+          <w:lang w:eastAsia="fr-FR"/>
+        </w:rPr>
+      </w:pPr>
+      <w:r>
+        <w:rPr>
+          <w:rFonts w:ascii="Segoe UI" w:eastAsia="Times New Roman" w:hAnsi="Segoe UI" w:cs="Segoe UI"/>
+          <w:color w:val="101010"/>
+          <w:sz w:val="21"/>
+          <w:szCs w:val="21"/>
+          <w:lang w:eastAsia="fr-FR"/>
+        </w:rPr>
+        <w:t>J'ai pris le lien avec votre mot de passe, je l'ai adapté pour Node.js et j'ai procédé à la migration complète de votre serveur :</w:t>
+      </w:r>
+    </w:p>
+    <w:p>
+      <w:pPr>
+        <w:numPr>
+          <w:ilvl w:val="0"/>
+          <w:numId w:val="32"/>
+        </w:numPr>
+        <w:shd w:val="clear" w:color="auto" w:fill="F9F9F9"/>
+        <w:spacing w:after="0" w:line="240" w:lineRule="auto"/>
+        <w:ind w:left="0"/>
+        <w:rPr>
+          <w:rFonts w:ascii="Segoe UI" w:eastAsia="Times New Roman" w:hAnsi="Segoe UI" w:cs="Segoe UI"/>
+          <w:color w:val="101010"/>
+          <w:sz w:val="21"/>
+          <w:szCs w:val="21"/>
+          <w:lang w:eastAsia="fr-FR"/>
+        </w:rPr>
+      </w:pPr>
+      <w:r>
+        <w:rPr>
+          <w:rFonts w:ascii="Segoe UI" w:eastAsia="Times New Roman" w:hAnsi="Segoe UI" w:cs="Segoe UI"/>
+          <w:b/>
+          <w:bCs/>
+          <w:color w:val="101010"/>
+          <w:sz w:val="21"/>
+          <w:szCs w:val="21"/>
+          <w:lang w:eastAsia="fr-FR"/>
+        </w:rPr>
+        <w:t xml:space="preserve">Remplacement de </w:t>
+      </w:r>
+      <w:proofErr w:type="spellStart"/>
+      <w:r>
+        <w:rPr>
+          <w:rFonts w:ascii="Segoe UI" w:eastAsia="Times New Roman" w:hAnsi="Segoe UI" w:cs="Segoe UI"/>
+          <w:b/>
+          <w:bCs/>
+          <w:color w:val="101010"/>
+          <w:sz w:val="21"/>
+          <w:szCs w:val="21"/>
+          <w:lang w:eastAsia="fr-FR"/>
+        </w:rPr>
+        <w:t>SQLite</w:t>
+      </w:r>
+      <w:proofErr w:type="spellEnd"/>
+      <w:r>
+        <w:rPr>
+          <w:rFonts w:ascii="Segoe UI" w:eastAsia="Times New Roman" w:hAnsi="Segoe UI" w:cs="Segoe UI"/>
+          <w:b/>
+          <w:bCs/>
+          <w:color w:val="101010"/>
+          <w:sz w:val="21"/>
+          <w:szCs w:val="21"/>
+          <w:lang w:eastAsia="fr-FR"/>
+        </w:rPr>
+        <w:t xml:space="preserve"> par PostgreSQL (</w:t>
+      </w:r>
+      <w:proofErr w:type="spellStart"/>
+      <w:r>
+        <w:rPr>
+          <w:rFonts w:ascii="Segoe UI" w:eastAsia="Times New Roman" w:hAnsi="Segoe UI" w:cs="Segoe UI"/>
+          <w:b/>
+          <w:bCs/>
+          <w:color w:val="101010"/>
+          <w:sz w:val="21"/>
+          <w:szCs w:val="21"/>
+          <w:lang w:eastAsia="fr-FR"/>
+        </w:rPr>
+        <w:t>Supabase</w:t>
+      </w:r>
+      <w:proofErr w:type="spellEnd"/>
+      <w:r>
+        <w:rPr>
+          <w:rFonts w:ascii="Segoe UI" w:eastAsia="Times New Roman" w:hAnsi="Segoe UI" w:cs="Segoe UI"/>
+          <w:b/>
+          <w:bCs/>
+          <w:color w:val="101010"/>
+          <w:sz w:val="21"/>
+          <w:szCs w:val="21"/>
+          <w:lang w:eastAsia="fr-FR"/>
+        </w:rPr>
+        <w:t>)</w:t>
+      </w:r>
+      <w:r>
+        <w:rPr>
+          <w:rFonts w:ascii="Segoe UI" w:eastAsia="Times New Roman" w:hAnsi="Segoe UI" w:cs="Segoe UI"/>
+          <w:color w:val="101010"/>
+          <w:sz w:val="21"/>
+          <w:szCs w:val="21"/>
+          <w:lang w:eastAsia="fr-FR"/>
+        </w:rPr>
+        <w:t>.</w:t>
+      </w:r>
+    </w:p>
+    <w:p>
+      <w:pPr>
+        <w:numPr>
+          <w:ilvl w:val="0"/>
+          <w:numId w:val="32"/>
+        </w:numPr>
+        <w:shd w:val="clear" w:color="auto" w:fill="F9F9F9"/>
+        <w:spacing w:after="0" w:line="240" w:lineRule="auto"/>
+        <w:ind w:left="0"/>
+        <w:rPr>
+          <w:rFonts w:ascii="Segoe UI" w:eastAsia="Times New Roman" w:hAnsi="Segoe UI" w:cs="Segoe UI"/>
+          <w:color w:val="101010"/>
+          <w:sz w:val="21"/>
+          <w:szCs w:val="21"/>
+          <w:lang w:eastAsia="fr-FR"/>
+        </w:rPr>
+      </w:pPr>
+      <w:r>
+        <w:rPr>
+          <w:rFonts w:ascii="Segoe UI" w:eastAsia="Times New Roman" w:hAnsi="Segoe UI" w:cs="Segoe UI"/>
+          <w:b/>
+          <w:bCs/>
+          <w:color w:val="101010"/>
+          <w:sz w:val="21"/>
+          <w:szCs w:val="21"/>
+          <w:lang w:eastAsia="fr-FR"/>
+        </w:rPr>
+        <w:t>Création automatique de toutes les tables</w:t>
+      </w:r>
+      <w:r>
+        <w:rPr>
+          <w:rFonts w:ascii="Segoe UI" w:eastAsia="Times New Roman" w:hAnsi="Segoe UI" w:cs="Segoe UI"/>
+          <w:color w:val="101010"/>
+          <w:sz w:val="21"/>
+          <w:szCs w:val="21"/>
+          <w:lang w:eastAsia="fr-FR"/>
+        </w:rPr>
+        <w:t> (</w:t>
+      </w:r>
+      <w:proofErr w:type="spellStart"/>
+      <w:r>
+        <w:rPr>
+          <w:rFonts w:ascii="Consolas" w:eastAsia="Times New Roman" w:hAnsi="Consolas" w:cs="Courier New"/>
+          <w:color w:val="A31515"/>
+          <w:sz w:val="19"/>
+          <w:szCs w:val="19"/>
+          <w:lang w:eastAsia="fr-FR"/>
+        </w:rPr>
+        <w:t>users</w:t>
+      </w:r>
+      <w:proofErr w:type="spellEnd"/>
+      <w:r>
+        <w:rPr>
+          <w:rFonts w:ascii="Segoe UI" w:eastAsia="Times New Roman" w:hAnsi="Segoe UI" w:cs="Segoe UI"/>
+          <w:color w:val="101010"/>
+          <w:sz w:val="21"/>
+          <w:szCs w:val="21"/>
+          <w:lang w:eastAsia="fr-FR"/>
+        </w:rPr>
+        <w:t>, </w:t>
+      </w:r>
+      <w:proofErr w:type="spellStart"/>
+      <w:r>
+        <w:rPr>
+          <w:rFonts w:ascii="Consolas" w:eastAsia="Times New Roman" w:hAnsi="Consolas" w:cs="Courier New"/>
+          <w:color w:val="A31515"/>
+          <w:sz w:val="19"/>
+          <w:szCs w:val="19"/>
+          <w:lang w:eastAsia="fr-FR"/>
+        </w:rPr>
+        <w:t>reservations</w:t>
+      </w:r>
+      <w:proofErr w:type="spellEnd"/>
+      <w:r>
+        <w:rPr>
+          <w:rFonts w:ascii="Segoe UI" w:eastAsia="Times New Roman" w:hAnsi="Segoe UI" w:cs="Segoe UI"/>
+          <w:color w:val="101010"/>
+          <w:sz w:val="21"/>
+          <w:szCs w:val="21"/>
+          <w:lang w:eastAsia="fr-FR"/>
+        </w:rPr>
+        <w:t>, </w:t>
+      </w:r>
+      <w:proofErr w:type="spellStart"/>
+      <w:r>
+        <w:rPr>
+          <w:rFonts w:ascii="Consolas" w:eastAsia="Times New Roman" w:hAnsi="Consolas" w:cs="Courier New"/>
+          <w:color w:val="A31515"/>
+          <w:sz w:val="19"/>
+          <w:szCs w:val="19"/>
+          <w:lang w:eastAsia="fr-FR"/>
+        </w:rPr>
+        <w:t>technicians</w:t>
+      </w:r>
+      <w:proofErr w:type="spellEnd"/>
+      <w:r>
+        <w:rPr>
+          <w:rFonts w:ascii="Segoe UI" w:eastAsia="Times New Roman" w:hAnsi="Segoe UI" w:cs="Segoe UI"/>
+          <w:color w:val="101010"/>
+          <w:sz w:val="21"/>
+          <w:szCs w:val="21"/>
+          <w:lang w:eastAsia="fr-FR"/>
+        </w:rPr>
+        <w:t xml:space="preserve">, etc.) directement sur votre base de données </w:t>
+      </w:r>
+      <w:proofErr w:type="spellStart"/>
+      <w:r>
+        <w:rPr>
+          <w:rFonts w:ascii="Segoe UI" w:eastAsia="Times New Roman" w:hAnsi="Segoe UI" w:cs="Segoe UI"/>
+          <w:color w:val="101010"/>
+          <w:sz w:val="21"/>
+          <w:szCs w:val="21"/>
+          <w:lang w:eastAsia="fr-FR"/>
+        </w:rPr>
+        <w:t>Supabase</w:t>
+      </w:r>
+      <w:proofErr w:type="spellEnd"/>
+      <w:r>
+        <w:rPr>
+          <w:rFonts w:ascii="Segoe UI" w:eastAsia="Times New Roman" w:hAnsi="Segoe UI" w:cs="Segoe UI"/>
+          <w:color w:val="101010"/>
+          <w:sz w:val="21"/>
+          <w:szCs w:val="21"/>
+          <w:lang w:eastAsia="fr-FR"/>
+        </w:rPr>
+        <w:t>.</w:t>
+      </w:r>
+    </w:p>
+    <w:p>
+      <w:pPr>
+        <w:numPr>
+          <w:ilvl w:val="0"/>
+          <w:numId w:val="32"/>
+        </w:numPr>
+        <w:shd w:val="clear" w:color="auto" w:fill="F9F9F9"/>
+        <w:spacing w:after="0" w:line="240" w:lineRule="auto"/>
+        <w:ind w:left="0"/>
+        <w:rPr>
+          <w:rFonts w:ascii="Segoe UI" w:eastAsia="Times New Roman" w:hAnsi="Segoe UI" w:cs="Segoe UI"/>
+          <w:color w:val="101010"/>
+          <w:sz w:val="21"/>
+          <w:szCs w:val="21"/>
+          <w:lang w:eastAsia="fr-FR"/>
+        </w:rPr>
+      </w:pPr>
+      <w:r>
+        <w:rPr>
+          <w:rFonts w:ascii="Segoe UI" w:eastAsia="Times New Roman" w:hAnsi="Segoe UI" w:cs="Segoe UI"/>
+          <w:color w:val="101010"/>
+          <w:sz w:val="21"/>
+          <w:szCs w:val="21"/>
+          <w:lang w:eastAsia="fr-FR"/>
+        </w:rPr>
+        <w:t xml:space="preserve">J'ai envoyé la mise à jour sur </w:t>
+      </w:r>
+      <w:proofErr w:type="spellStart"/>
+      <w:r>
+        <w:rPr>
+          <w:rFonts w:ascii="Segoe UI" w:eastAsia="Times New Roman" w:hAnsi="Segoe UI" w:cs="Segoe UI"/>
+          <w:color w:val="101010"/>
+          <w:sz w:val="21"/>
+          <w:szCs w:val="21"/>
+          <w:lang w:eastAsia="fr-FR"/>
+        </w:rPr>
+        <w:t>Github</w:t>
+      </w:r>
+      <w:proofErr w:type="spellEnd"/>
+      <w:r>
+        <w:rPr>
+          <w:rFonts w:ascii="Segoe UI" w:eastAsia="Times New Roman" w:hAnsi="Segoe UI" w:cs="Segoe UI"/>
+          <w:color w:val="101010"/>
+          <w:sz w:val="21"/>
+          <w:szCs w:val="21"/>
+          <w:lang w:eastAsia="fr-FR"/>
+        </w:rPr>
+        <w:t xml:space="preserve"> !</w:t>
+      </w:r>
+    </w:p>
+    <w:p>
+      <w:pPr>
+        <w:shd w:val="clear" w:color="auto" w:fill="F9F9F9"/>
+        <w:spacing w:after="0" w:line="240" w:lineRule="auto"/>
+        <w:rPr>
+          <w:rFonts w:ascii="Segoe UI" w:eastAsia="Times New Roman" w:hAnsi="Segoe UI" w:cs="Segoe UI"/>
+          <w:color w:val="101010"/>
+          <w:sz w:val="21"/>
+          <w:szCs w:val="21"/>
+          <w:lang w:eastAsia="fr-FR"/>
+        </w:rPr>
+      </w:pPr>
+      <w:proofErr w:type="spellStart"/>
+      <w:r>
+        <w:rPr>
+          <w:rFonts w:ascii="Segoe UI" w:eastAsia="Times New Roman" w:hAnsi="Segoe UI" w:cs="Segoe UI"/>
+          <w:color w:val="101010"/>
+          <w:sz w:val="21"/>
+          <w:szCs w:val="21"/>
+          <w:lang w:eastAsia="fr-FR"/>
+        </w:rPr>
+        <w:t>Render</w:t>
+      </w:r>
+      <w:proofErr w:type="spellEnd"/>
+      <w:r>
+        <w:rPr>
+          <w:rFonts w:ascii="Segoe UI" w:eastAsia="Times New Roman" w:hAnsi="Segoe UI" w:cs="Segoe UI"/>
+          <w:color w:val="101010"/>
+          <w:sz w:val="21"/>
+          <w:szCs w:val="21"/>
+          <w:lang w:eastAsia="fr-FR"/>
+        </w:rPr>
+        <w:t xml:space="preserve"> est en ce moment même en train de redémarrer votre serveur (ça devrait prendre environ 2 minutes).</w:t>
+      </w:r>
+    </w:p>
+    <w:p>
+      <w:pPr>
+        <w:shd w:val="clear" w:color="auto" w:fill="F9F9F9"/>
+        <w:spacing w:after="0" w:line="240" w:lineRule="auto"/>
+        <w:rPr>
+          <w:rFonts w:ascii="Segoe UI" w:eastAsia="Times New Roman" w:hAnsi="Segoe UI" w:cs="Segoe UI"/>
+          <w:color w:val="101010"/>
+          <w:sz w:val="21"/>
+          <w:szCs w:val="21"/>
+          <w:lang w:eastAsia="fr-FR"/>
+        </w:rPr>
+      </w:pPr>
+      <w:r>
+        <w:rPr>
+          <w:rFonts w:ascii="Segoe UI" w:eastAsia="Times New Roman" w:hAnsi="Segoe UI" w:cs="Segoe UI"/>
+          <w:b/>
+          <w:bCs/>
+          <w:color w:val="101010"/>
+          <w:sz w:val="21"/>
+          <w:szCs w:val="21"/>
+          <w:lang w:eastAsia="fr-FR"/>
+        </w:rPr>
+        <w:t>À noter :</w:t>
+      </w:r>
+      <w:r>
+        <w:rPr>
+          <w:rFonts w:ascii="Segoe UI" w:eastAsia="Times New Roman" w:hAnsi="Segoe UI" w:cs="Segoe UI"/>
+          <w:color w:val="101010"/>
+          <w:sz w:val="21"/>
+          <w:szCs w:val="21"/>
+          <w:lang w:eastAsia="fr-FR"/>
+        </w:rPr>
+        <w:t> Puisque c'est une toute nouvelle base de données toute propre, l'historique de test que vous aviez fait avant est vierge (c'est normal). Les prochaines réservations que vous ferez sur l'application seront désormais enregistrées </w:t>
+      </w:r>
+      <w:r>
+        <w:rPr>
+          <w:rFonts w:ascii="Segoe UI" w:eastAsia="Times New Roman" w:hAnsi="Segoe UI" w:cs="Segoe UI"/>
+          <w:b/>
+          <w:bCs/>
+          <w:color w:val="101010"/>
+          <w:sz w:val="21"/>
+          <w:szCs w:val="21"/>
+          <w:lang w:eastAsia="fr-FR"/>
+        </w:rPr>
+        <w:t>définitivement</w:t>
+      </w:r>
+      <w:r>
+        <w:rPr>
+          <w:rFonts w:ascii="Segoe UI" w:eastAsia="Times New Roman" w:hAnsi="Segoe UI" w:cs="Segoe UI"/>
+          <w:color w:val="101010"/>
+          <w:sz w:val="21"/>
+          <w:szCs w:val="21"/>
+          <w:lang w:eastAsia="fr-FR"/>
+        </w:rPr>
+        <w:t xml:space="preserve"> sur </w:t>
+      </w:r>
+      <w:proofErr w:type="spellStart"/>
+      <w:r>
+        <w:rPr>
+          <w:rFonts w:ascii="Segoe UI" w:eastAsia="Times New Roman" w:hAnsi="Segoe UI" w:cs="Segoe UI"/>
+          <w:color w:val="101010"/>
+          <w:sz w:val="21"/>
+          <w:szCs w:val="21"/>
+          <w:lang w:eastAsia="fr-FR"/>
+        </w:rPr>
+        <w:t>Supabase</w:t>
+      </w:r>
+      <w:proofErr w:type="spellEnd"/>
+      <w:r>
+        <w:rPr>
+          <w:rFonts w:ascii="Segoe UI" w:eastAsia="Times New Roman" w:hAnsi="Segoe UI" w:cs="Segoe UI"/>
+          <w:color w:val="101010"/>
+          <w:sz w:val="21"/>
+          <w:szCs w:val="21"/>
+          <w:lang w:eastAsia="fr-FR"/>
+        </w:rPr>
+        <w:t xml:space="preserve"> et vous ne les perdrez jamais, même si </w:t>
+      </w:r>
+      <w:proofErr w:type="spellStart"/>
+      <w:r>
+        <w:rPr>
+          <w:rFonts w:ascii="Segoe UI" w:eastAsia="Times New Roman" w:hAnsi="Segoe UI" w:cs="Segoe UI"/>
+          <w:color w:val="101010"/>
+          <w:sz w:val="21"/>
+          <w:szCs w:val="21"/>
+          <w:lang w:eastAsia="fr-FR"/>
+        </w:rPr>
+        <w:t>Render</w:t>
+      </w:r>
+      <w:proofErr w:type="spellEnd"/>
+      <w:r>
+        <w:rPr>
+          <w:rFonts w:ascii="Segoe UI" w:eastAsia="Times New Roman" w:hAnsi="Segoe UI" w:cs="Segoe UI"/>
+          <w:color w:val="101010"/>
+          <w:sz w:val="21"/>
+          <w:szCs w:val="21"/>
+          <w:lang w:eastAsia="fr-FR"/>
+        </w:rPr>
+        <w:t xml:space="preserve"> s'éteint.</w:t>
+      </w:r>
+    </w:p>
+    <w:p>
+      <w:pPr>
+        <w:shd w:val="clear" w:color="auto" w:fill="F9F9F9"/>
+        <w:spacing w:after="0" w:line="240" w:lineRule="auto"/>
+        <w:rPr>
+          <w:rFonts w:ascii="Segoe UI" w:eastAsia="Times New Roman" w:hAnsi="Segoe UI" w:cs="Segoe UI"/>
+          <w:color w:val="101010"/>
+          <w:sz w:val="21"/>
+          <w:szCs w:val="21"/>
+          <w:lang w:eastAsia="fr-FR"/>
+        </w:rPr>
+      </w:pPr>
+      <w:r>
+        <w:rPr>
+          <w:rFonts w:ascii="Segoe UI" w:eastAsia="Times New Roman" w:hAnsi="Segoe UI" w:cs="Segoe UI"/>
+          <w:color w:val="101010"/>
+          <w:sz w:val="21"/>
+          <w:szCs w:val="21"/>
+          <w:lang w:eastAsia="fr-FR"/>
+        </w:rPr>
+        <w:t>Avez-vous besoin d'autres ajustements sur l'application (design, fonctionnalités, services...), ou voulez-vous faire un petit test pour voir si tout marche bien ?</w:t>
+      </w:r>
+    </w:p>
+    <w:p>
+      <w:pPr>
+        <w:rPr>
+          <w:rFonts w:asciiTheme="majorBidi" w:hAnsiTheme="majorBidi" w:cstheme="majorBidi"/>
+          <w:sz w:val="24"/>
+          <w:szCs w:val="24"/>
+        </w:rPr>
+      </w:pPr>
+    </w:p>
+    <w:p>
+      <w:pPr>
+        <w:rPr>
+          <w:rFonts w:asciiTheme="majorBidi" w:hAnsiTheme="majorBidi" w:cstheme="majorBidi"/>
+          <w:sz w:val="24"/>
+          <w:szCs w:val="24"/>
+        </w:rPr>
+      </w:pPr>
+    </w:p>
+    <w:p>
+      <w:pPr>
+        <w:rPr>
+          <w:rFonts w:asciiTheme="majorBidi" w:hAnsiTheme="majorBidi" w:cstheme="majorBidi"/>
+          <w:sz w:val="24"/>
+          <w:szCs w:val="24"/>
+        </w:rPr>
+      </w:pPr>
+    </w:p>
+    <w:p>
+      <w:pPr>
+        <w:rPr>
+          <w:rFonts w:asciiTheme="majorBidi" w:hAnsiTheme="majorBidi" w:cstheme="majorBidi"/>
+          <w:sz w:val="24"/>
+          <w:szCs w:val="24"/>
+        </w:rPr>
+      </w:pPr>
+    </w:p>
+    <w:p>
+      <w:pPr>
+        <w:shd w:val="clear" w:color="auto" w:fill="F9F9F9"/>
+        <w:spacing w:line="240" w:lineRule="auto"/>
+        <w:rPr>
+          <w:rFonts w:ascii="Segoe UI" w:eastAsia="Times New Roman" w:hAnsi="Segoe UI" w:cs="Segoe UI"/>
+          <w:color w:val="101010"/>
+          <w:sz w:val="21"/>
+          <w:szCs w:val="21"/>
+          <w:lang w:eastAsia="fr-FR"/>
+        </w:rPr>
+      </w:pPr>
+      <w:proofErr w:type="spellStart"/>
+      <w:proofErr w:type="gramStart"/>
+      <w:r>
+        <w:rPr>
+          <w:rFonts w:ascii="Segoe UI" w:eastAsia="Times New Roman" w:hAnsi="Segoe UI" w:cs="Segoe UI"/>
+          <w:color w:val="101010"/>
+          <w:sz w:val="21"/>
+          <w:szCs w:val="21"/>
+          <w:lang w:eastAsia="fr-FR"/>
+        </w:rPr>
+        <w:t>metre</w:t>
+      </w:r>
+      <w:proofErr w:type="spellEnd"/>
+      <w:proofErr w:type="gramEnd"/>
+      <w:r>
+        <w:rPr>
+          <w:rFonts w:ascii="Segoe UI" w:eastAsia="Times New Roman" w:hAnsi="Segoe UI" w:cs="Segoe UI"/>
+          <w:color w:val="101010"/>
+          <w:sz w:val="21"/>
+          <w:szCs w:val="21"/>
+          <w:lang w:eastAsia="fr-FR"/>
+        </w:rPr>
+        <w:t xml:space="preserve"> </w:t>
+      </w:r>
+      <w:proofErr w:type="spellStart"/>
+      <w:r>
+        <w:rPr>
+          <w:rFonts w:ascii="Segoe UI" w:eastAsia="Times New Roman" w:hAnsi="Segoe UI" w:cs="Segoe UI"/>
+          <w:color w:val="101010"/>
+          <w:sz w:val="21"/>
+          <w:szCs w:val="21"/>
+          <w:lang w:eastAsia="fr-FR"/>
+        </w:rPr>
+        <w:t>Render</w:t>
+      </w:r>
+      <w:proofErr w:type="spellEnd"/>
+      <w:r>
+        <w:rPr>
+          <w:rFonts w:ascii="Segoe UI" w:eastAsia="Times New Roman" w:hAnsi="Segoe UI" w:cs="Segoe UI"/>
+          <w:color w:val="101010"/>
+          <w:sz w:val="21"/>
+          <w:szCs w:val="21"/>
+          <w:lang w:eastAsia="fr-FR"/>
+        </w:rPr>
+        <w:t xml:space="preserve"> jamais s'endormait comme </w:t>
+      </w:r>
+      <w:proofErr w:type="spellStart"/>
+      <w:r>
+        <w:rPr>
+          <w:rFonts w:ascii="Segoe UI" w:eastAsia="Times New Roman" w:hAnsi="Segoe UI" w:cs="Segoe UI"/>
+          <w:color w:val="101010"/>
+          <w:sz w:val="21"/>
+          <w:szCs w:val="21"/>
+          <w:lang w:eastAsia="fr-FR"/>
+        </w:rPr>
+        <w:t>Qaaty</w:t>
+      </w:r>
+      <w:proofErr w:type="spellEnd"/>
+    </w:p>
+    <w:p>
+      <w:pPr>
+        <w:shd w:val="clear" w:color="auto" w:fill="F9F9F9"/>
+        <w:spacing w:after="0" w:line="240" w:lineRule="auto"/>
+        <w:rPr>
+          <w:rFonts w:ascii="Segoe UI" w:eastAsia="Times New Roman" w:hAnsi="Segoe UI" w:cs="Segoe UI"/>
+          <w:color w:val="101010"/>
+          <w:sz w:val="21"/>
+          <w:szCs w:val="21"/>
+          <w:lang w:eastAsia="fr-FR"/>
+        </w:rPr>
+      </w:pPr>
+      <w:r>
+        <w:rPr>
+          <w:rFonts w:ascii="Segoe UI" w:eastAsia="Times New Roman" w:hAnsi="Segoe UI" w:cs="Segoe UI"/>
+          <w:color w:val="101010"/>
+          <w:sz w:val="21"/>
+          <w:szCs w:val="21"/>
+          <w:lang w:eastAsia="fr-FR"/>
+        </w:rPr>
+        <w:t xml:space="preserve">Ah, je vois ! Sur le plan gratuit de </w:t>
+      </w:r>
+      <w:proofErr w:type="spellStart"/>
+      <w:r>
+        <w:rPr>
+          <w:rFonts w:ascii="Segoe UI" w:eastAsia="Times New Roman" w:hAnsi="Segoe UI" w:cs="Segoe UI"/>
+          <w:color w:val="101010"/>
+          <w:sz w:val="21"/>
+          <w:szCs w:val="21"/>
+          <w:lang w:eastAsia="fr-FR"/>
+        </w:rPr>
+        <w:t>Render</w:t>
+      </w:r>
+      <w:proofErr w:type="spellEnd"/>
+      <w:r>
+        <w:rPr>
+          <w:rFonts w:ascii="Segoe UI" w:eastAsia="Times New Roman" w:hAnsi="Segoe UI" w:cs="Segoe UI"/>
+          <w:color w:val="101010"/>
+          <w:sz w:val="21"/>
+          <w:szCs w:val="21"/>
+          <w:lang w:eastAsia="fr-FR"/>
+        </w:rPr>
+        <w:t>, la règle est que le serveur s'endort après 15 minutes sans visiteur.</w:t>
+      </w:r>
+    </w:p>
+    <w:p>
+      <w:pPr>
+        <w:shd w:val="clear" w:color="auto" w:fill="F9F9F9"/>
+        <w:spacing w:after="0" w:line="240" w:lineRule="auto"/>
+        <w:rPr>
+          <w:rFonts w:ascii="Segoe UI" w:eastAsia="Times New Roman" w:hAnsi="Segoe UI" w:cs="Segoe UI"/>
+          <w:color w:val="101010"/>
+          <w:sz w:val="21"/>
+          <w:szCs w:val="21"/>
+          <w:lang w:eastAsia="fr-FR"/>
+        </w:rPr>
+      </w:pPr>
+      <w:r>
+        <w:rPr>
+          <w:rFonts w:ascii="Segoe UI" w:eastAsia="Times New Roman" w:hAnsi="Segoe UI" w:cs="Segoe UI"/>
+          <w:color w:val="101010"/>
+          <w:sz w:val="21"/>
+          <w:szCs w:val="21"/>
+          <w:lang w:eastAsia="fr-FR"/>
+        </w:rPr>
+        <w:t xml:space="preserve">Pour "tricher" légalement et forcer </w:t>
+      </w:r>
+      <w:proofErr w:type="spellStart"/>
+      <w:r>
+        <w:rPr>
+          <w:rFonts w:ascii="Segoe UI" w:eastAsia="Times New Roman" w:hAnsi="Segoe UI" w:cs="Segoe UI"/>
+          <w:color w:val="101010"/>
+          <w:sz w:val="21"/>
+          <w:szCs w:val="21"/>
+          <w:lang w:eastAsia="fr-FR"/>
+        </w:rPr>
+        <w:t>Render</w:t>
+      </w:r>
+      <w:proofErr w:type="spellEnd"/>
+      <w:r>
+        <w:rPr>
+          <w:rFonts w:ascii="Segoe UI" w:eastAsia="Times New Roman" w:hAnsi="Segoe UI" w:cs="Segoe UI"/>
+          <w:color w:val="101010"/>
+          <w:sz w:val="21"/>
+          <w:szCs w:val="21"/>
+          <w:lang w:eastAsia="fr-FR"/>
+        </w:rPr>
+        <w:t xml:space="preserve"> à rester éveillé 24h/24 et 7j/7 sans payer (pour que l'application s'ouvre toujours en 1 seconde), la technique classique est d'utiliser un </w:t>
+      </w:r>
+      <w:r>
+        <w:rPr>
+          <w:rFonts w:ascii="Segoe UI" w:eastAsia="Times New Roman" w:hAnsi="Segoe UI" w:cs="Segoe UI"/>
+          <w:b/>
+          <w:bCs/>
+          <w:color w:val="101010"/>
+          <w:sz w:val="21"/>
+          <w:szCs w:val="21"/>
+          <w:lang w:eastAsia="fr-FR"/>
+        </w:rPr>
+        <w:t>robot gratuit qui visite votre site toutes les 5 minutes</w:t>
+      </w:r>
+      <w:r>
+        <w:rPr>
+          <w:rFonts w:ascii="Segoe UI" w:eastAsia="Times New Roman" w:hAnsi="Segoe UI" w:cs="Segoe UI"/>
+          <w:color w:val="101010"/>
+          <w:sz w:val="21"/>
+          <w:szCs w:val="21"/>
+          <w:lang w:eastAsia="fr-FR"/>
+        </w:rPr>
+        <w:t>.</w:t>
+      </w:r>
+    </w:p>
+    <w:p>
+      <w:pPr>
+        <w:shd w:val="clear" w:color="auto" w:fill="F9F9F9"/>
+        <w:spacing w:after="0" w:line="240" w:lineRule="auto"/>
+        <w:rPr>
+          <w:rFonts w:ascii="Segoe UI" w:eastAsia="Times New Roman" w:hAnsi="Segoe UI" w:cs="Segoe UI"/>
+          <w:color w:val="101010"/>
+          <w:sz w:val="21"/>
+          <w:szCs w:val="21"/>
+          <w:lang w:eastAsia="fr-FR"/>
+        </w:rPr>
+      </w:pPr>
+      <w:r>
+        <w:rPr>
+          <w:rFonts w:ascii="Segoe UI" w:eastAsia="Times New Roman" w:hAnsi="Segoe UI" w:cs="Segoe UI"/>
+          <w:color w:val="101010"/>
+          <w:sz w:val="21"/>
+          <w:szCs w:val="21"/>
+          <w:lang w:eastAsia="fr-FR"/>
+        </w:rPr>
+        <w:t>Voici comment mettre ça en place très facilement et gratuitement :</w:t>
+      </w:r>
+    </w:p>
+    <w:p>
+      <w:pPr>
+        <w:shd w:val="clear" w:color="auto" w:fill="F9F9F9"/>
+        <w:spacing w:after="0" w:line="240" w:lineRule="auto"/>
+        <w:rPr>
+          <w:rFonts w:ascii="Segoe UI" w:eastAsia="Times New Roman" w:hAnsi="Segoe UI" w:cs="Segoe UI"/>
+          <w:color w:val="101010"/>
+          <w:sz w:val="21"/>
+          <w:szCs w:val="21"/>
+          <w:lang w:eastAsia="fr-FR"/>
+        </w:rPr>
+      </w:pPr>
+      <w:r>
+        <w:rPr>
+          <w:rFonts w:ascii="Segoe UI" w:eastAsia="Times New Roman" w:hAnsi="Segoe UI" w:cs="Segoe UI"/>
+          <w:b/>
+          <w:bCs/>
+          <w:color w:val="101010"/>
+          <w:sz w:val="21"/>
+          <w:szCs w:val="21"/>
+          <w:lang w:eastAsia="fr-FR"/>
+        </w:rPr>
+        <w:t xml:space="preserve">L'astuce avec </w:t>
+      </w:r>
+      <w:proofErr w:type="spellStart"/>
+      <w:r>
+        <w:rPr>
+          <w:rFonts w:ascii="Segoe UI" w:eastAsia="Times New Roman" w:hAnsi="Segoe UI" w:cs="Segoe UI"/>
+          <w:b/>
+          <w:bCs/>
+          <w:color w:val="101010"/>
+          <w:sz w:val="21"/>
+          <w:szCs w:val="21"/>
+          <w:lang w:eastAsia="fr-FR"/>
+        </w:rPr>
+        <w:t>UptimeRobot</w:t>
+      </w:r>
+      <w:proofErr w:type="spellEnd"/>
+      <w:r>
+        <w:rPr>
+          <w:rFonts w:ascii="Segoe UI" w:eastAsia="Times New Roman" w:hAnsi="Segoe UI" w:cs="Segoe UI"/>
+          <w:b/>
+          <w:bCs/>
+          <w:color w:val="101010"/>
+          <w:sz w:val="21"/>
+          <w:szCs w:val="21"/>
+          <w:lang w:eastAsia="fr-FR"/>
+        </w:rPr>
+        <w:t xml:space="preserve"> :</w:t>
+      </w:r>
+    </w:p>
+    <w:p>
+      <w:pPr>
+        <w:numPr>
+          <w:ilvl w:val="0"/>
+          <w:numId w:val="33"/>
+        </w:numPr>
+        <w:shd w:val="clear" w:color="auto" w:fill="F9F9F9"/>
+        <w:spacing w:after="0" w:line="240" w:lineRule="auto"/>
+        <w:ind w:left="0"/>
+        <w:rPr>
+          <w:rFonts w:ascii="Segoe UI" w:eastAsia="Times New Roman" w:hAnsi="Segoe UI" w:cs="Segoe UI"/>
+          <w:color w:val="101010"/>
+          <w:sz w:val="21"/>
+          <w:szCs w:val="21"/>
+          <w:lang w:eastAsia="fr-FR"/>
+        </w:rPr>
+      </w:pPr>
+      <w:r>
+        <w:rPr>
+          <w:rFonts w:ascii="Segoe UI" w:eastAsia="Times New Roman" w:hAnsi="Segoe UI" w:cs="Segoe UI"/>
+          <w:color w:val="101010"/>
+          <w:sz w:val="21"/>
+          <w:szCs w:val="21"/>
+          <w:lang w:eastAsia="fr-FR"/>
+        </w:rPr>
+        <w:t>Allez sur le site gratuit </w:t>
+      </w:r>
+      <w:hyperlink r:id="rId10" w:history="1">
+        <w:r>
+          <w:rPr>
+            <w:rFonts w:ascii="Segoe UI" w:eastAsia="Times New Roman" w:hAnsi="Segoe UI" w:cs="Segoe UI"/>
+            <w:b/>
+            <w:bCs/>
+            <w:color w:val="3E8ED1"/>
+            <w:sz w:val="21"/>
+            <w:szCs w:val="21"/>
+            <w:u w:val="single"/>
+            <w:lang w:eastAsia="fr-FR"/>
+          </w:rPr>
+          <w:t>UptimeRobot.com</w:t>
+        </w:r>
+      </w:hyperlink>
+      <w:r>
+        <w:rPr>
+          <w:rFonts w:ascii="Segoe UI" w:eastAsia="Times New Roman" w:hAnsi="Segoe UI" w:cs="Segoe UI"/>
+          <w:color w:val="101010"/>
+          <w:sz w:val="21"/>
+          <w:szCs w:val="21"/>
+          <w:lang w:eastAsia="fr-FR"/>
+        </w:rPr>
+        <w:t> et créez un compte.</w:t>
+      </w:r>
+    </w:p>
+    <w:p>
+      <w:pPr>
+        <w:numPr>
+          <w:ilvl w:val="0"/>
+          <w:numId w:val="33"/>
+        </w:numPr>
+        <w:shd w:val="clear" w:color="auto" w:fill="F9F9F9"/>
+        <w:spacing w:after="0" w:line="240" w:lineRule="auto"/>
+        <w:ind w:left="0"/>
+        <w:rPr>
+          <w:rFonts w:ascii="Segoe UI" w:eastAsia="Times New Roman" w:hAnsi="Segoe UI" w:cs="Segoe UI"/>
+          <w:color w:val="101010"/>
+          <w:sz w:val="21"/>
+          <w:szCs w:val="21"/>
+          <w:lang w:eastAsia="fr-FR"/>
+        </w:rPr>
+      </w:pPr>
+      <w:r>
+        <w:rPr>
+          <w:rFonts w:ascii="Segoe UI" w:eastAsia="Times New Roman" w:hAnsi="Segoe UI" w:cs="Segoe UI"/>
+          <w:color w:val="101010"/>
+          <w:sz w:val="21"/>
+          <w:szCs w:val="21"/>
+          <w:lang w:eastAsia="fr-FR"/>
+        </w:rPr>
+        <w:t>Une fois connecté, cliquez sur le bouton vert </w:t>
+      </w:r>
+      <w:r>
+        <w:rPr>
+          <w:rFonts w:ascii="Segoe UI" w:eastAsia="Times New Roman" w:hAnsi="Segoe UI" w:cs="Segoe UI"/>
+          <w:b/>
+          <w:bCs/>
+          <w:color w:val="101010"/>
+          <w:sz w:val="21"/>
+          <w:szCs w:val="21"/>
+          <w:lang w:eastAsia="fr-FR"/>
+        </w:rPr>
+        <w:t xml:space="preserve">"+ </w:t>
+      </w:r>
+      <w:proofErr w:type="spellStart"/>
+      <w:r>
+        <w:rPr>
+          <w:rFonts w:ascii="Segoe UI" w:eastAsia="Times New Roman" w:hAnsi="Segoe UI" w:cs="Segoe UI"/>
+          <w:b/>
+          <w:bCs/>
+          <w:color w:val="101010"/>
+          <w:sz w:val="21"/>
+          <w:szCs w:val="21"/>
+          <w:lang w:eastAsia="fr-FR"/>
+        </w:rPr>
+        <w:t>Add</w:t>
+      </w:r>
+      <w:proofErr w:type="spellEnd"/>
+      <w:r>
+        <w:rPr>
+          <w:rFonts w:ascii="Segoe UI" w:eastAsia="Times New Roman" w:hAnsi="Segoe UI" w:cs="Segoe UI"/>
+          <w:b/>
+          <w:bCs/>
+          <w:color w:val="101010"/>
+          <w:sz w:val="21"/>
+          <w:szCs w:val="21"/>
+          <w:lang w:eastAsia="fr-FR"/>
+        </w:rPr>
+        <w:t xml:space="preserve"> New Monitor"</w:t>
+      </w:r>
+      <w:r>
+        <w:rPr>
+          <w:rFonts w:ascii="Segoe UI" w:eastAsia="Times New Roman" w:hAnsi="Segoe UI" w:cs="Segoe UI"/>
+          <w:color w:val="101010"/>
+          <w:sz w:val="21"/>
+          <w:szCs w:val="21"/>
+          <w:lang w:eastAsia="fr-FR"/>
+        </w:rPr>
+        <w:t> (Ajouter un moniteur).</w:t>
+      </w:r>
+    </w:p>
+    <w:p>
+      <w:pPr>
+        <w:numPr>
+          <w:ilvl w:val="0"/>
+          <w:numId w:val="33"/>
+        </w:numPr>
+        <w:shd w:val="clear" w:color="auto" w:fill="F9F9F9"/>
+        <w:spacing w:after="0" w:line="240" w:lineRule="auto"/>
+        <w:ind w:left="0"/>
+        <w:rPr>
+          <w:rFonts w:ascii="Segoe UI" w:eastAsia="Times New Roman" w:hAnsi="Segoe UI" w:cs="Segoe UI"/>
+          <w:color w:val="101010"/>
+          <w:sz w:val="21"/>
+          <w:szCs w:val="21"/>
+          <w:lang w:eastAsia="fr-FR"/>
+        </w:rPr>
+      </w:pPr>
+      <w:r>
+        <w:rPr>
+          <w:rFonts w:ascii="Segoe UI" w:eastAsia="Times New Roman" w:hAnsi="Segoe UI" w:cs="Segoe UI"/>
+          <w:color w:val="101010"/>
+          <w:sz w:val="21"/>
+          <w:szCs w:val="21"/>
+          <w:lang w:eastAsia="fr-FR"/>
+        </w:rPr>
+        <w:t>Remplissez le petit formulaire comme ceci :</w:t>
+      </w:r>
+    </w:p>
+    <w:p>
+      <w:pPr>
+        <w:numPr>
+          <w:ilvl w:val="1"/>
+          <w:numId w:val="33"/>
+        </w:numPr>
+        <w:shd w:val="clear" w:color="auto" w:fill="F9F9F9"/>
+        <w:spacing w:after="0" w:line="240" w:lineRule="auto"/>
+        <w:ind w:left="0"/>
+        <w:rPr>
+          <w:rFonts w:ascii="Segoe UI" w:eastAsia="Times New Roman" w:hAnsi="Segoe UI" w:cs="Segoe UI"/>
+          <w:color w:val="101010"/>
+          <w:sz w:val="21"/>
+          <w:szCs w:val="21"/>
+          <w:lang w:eastAsia="fr-FR"/>
+        </w:rPr>
+      </w:pPr>
+      <w:r>
+        <w:rPr>
+          <w:rFonts w:ascii="Segoe UI" w:eastAsia="Times New Roman" w:hAnsi="Segoe UI" w:cs="Segoe UI"/>
+          <w:b/>
+          <w:bCs/>
+          <w:color w:val="101010"/>
+          <w:sz w:val="21"/>
+          <w:szCs w:val="21"/>
+          <w:lang w:eastAsia="fr-FR"/>
+        </w:rPr>
+        <w:t>Monitor Type</w:t>
+      </w:r>
+      <w:r>
+        <w:rPr>
+          <w:rFonts w:ascii="Segoe UI" w:eastAsia="Times New Roman" w:hAnsi="Segoe UI" w:cs="Segoe UI"/>
+          <w:color w:val="101010"/>
+          <w:sz w:val="21"/>
+          <w:szCs w:val="21"/>
+          <w:lang w:eastAsia="fr-FR"/>
+        </w:rPr>
+        <w:t> : Choisissez </w:t>
+      </w:r>
+      <w:r>
+        <w:rPr>
+          <w:rFonts w:ascii="Consolas" w:eastAsia="Times New Roman" w:hAnsi="Consolas" w:cs="Courier New"/>
+          <w:color w:val="A31515"/>
+          <w:sz w:val="19"/>
+          <w:szCs w:val="19"/>
+          <w:lang w:eastAsia="fr-FR"/>
+        </w:rPr>
+        <w:t>HTTP(s)</w:t>
+      </w:r>
+    </w:p>
+    <w:p>
+      <w:pPr>
+        <w:numPr>
+          <w:ilvl w:val="1"/>
+          <w:numId w:val="33"/>
+        </w:numPr>
+        <w:shd w:val="clear" w:color="auto" w:fill="F9F9F9"/>
+        <w:spacing w:after="0" w:line="240" w:lineRule="auto"/>
+        <w:ind w:left="0"/>
+        <w:rPr>
+          <w:rFonts w:ascii="Segoe UI" w:eastAsia="Times New Roman" w:hAnsi="Segoe UI" w:cs="Segoe UI"/>
+          <w:color w:val="101010"/>
+          <w:sz w:val="21"/>
+          <w:szCs w:val="21"/>
+          <w:lang w:eastAsia="fr-FR"/>
+        </w:rPr>
+      </w:pPr>
+      <w:proofErr w:type="spellStart"/>
+      <w:r>
+        <w:rPr>
+          <w:rFonts w:ascii="Segoe UI" w:eastAsia="Times New Roman" w:hAnsi="Segoe UI" w:cs="Segoe UI"/>
+          <w:b/>
+          <w:bCs/>
+          <w:color w:val="101010"/>
+          <w:sz w:val="21"/>
+          <w:szCs w:val="21"/>
+          <w:lang w:eastAsia="fr-FR"/>
+        </w:rPr>
+        <w:t>Friendly</w:t>
+      </w:r>
+      <w:proofErr w:type="spellEnd"/>
+      <w:r>
+        <w:rPr>
+          <w:rFonts w:ascii="Segoe UI" w:eastAsia="Times New Roman" w:hAnsi="Segoe UI" w:cs="Segoe UI"/>
+          <w:b/>
+          <w:bCs/>
+          <w:color w:val="101010"/>
+          <w:sz w:val="21"/>
+          <w:szCs w:val="21"/>
+          <w:lang w:eastAsia="fr-FR"/>
+        </w:rPr>
+        <w:t xml:space="preserve"> Name</w:t>
+      </w:r>
+      <w:r>
+        <w:rPr>
+          <w:rFonts w:ascii="Segoe UI" w:eastAsia="Times New Roman" w:hAnsi="Segoe UI" w:cs="Segoe UI"/>
+          <w:color w:val="101010"/>
+          <w:sz w:val="21"/>
+          <w:szCs w:val="21"/>
+          <w:lang w:eastAsia="fr-FR"/>
+        </w:rPr>
+        <w:t> : Mettez </w:t>
+      </w:r>
+      <w:r>
+        <w:rPr>
+          <w:rFonts w:ascii="Consolas" w:eastAsia="Times New Roman" w:hAnsi="Consolas" w:cs="Courier New"/>
+          <w:color w:val="A31515"/>
+          <w:sz w:val="19"/>
+          <w:szCs w:val="19"/>
+          <w:lang w:eastAsia="fr-FR"/>
+        </w:rPr>
+        <w:t>Service-Go</w:t>
+      </w:r>
+    </w:p>
+    <w:p>
+      <w:pPr>
+        <w:numPr>
+          <w:ilvl w:val="1"/>
+          <w:numId w:val="33"/>
+        </w:numPr>
+        <w:shd w:val="clear" w:color="auto" w:fill="F9F9F9"/>
+        <w:spacing w:after="0" w:line="240" w:lineRule="auto"/>
+        <w:ind w:left="0"/>
+        <w:rPr>
+          <w:rFonts w:ascii="Segoe UI" w:eastAsia="Times New Roman" w:hAnsi="Segoe UI" w:cs="Segoe UI"/>
+          <w:color w:val="101010"/>
+          <w:sz w:val="21"/>
+          <w:szCs w:val="21"/>
+          <w:lang w:eastAsia="fr-FR"/>
+        </w:rPr>
+      </w:pPr>
+      <w:r>
+        <w:rPr>
+          <w:rFonts w:ascii="Segoe UI" w:eastAsia="Times New Roman" w:hAnsi="Segoe UI" w:cs="Segoe UI"/>
+          <w:b/>
+          <w:bCs/>
+          <w:color w:val="101010"/>
+          <w:sz w:val="21"/>
+          <w:szCs w:val="21"/>
+          <w:lang w:eastAsia="fr-FR"/>
+        </w:rPr>
+        <w:t>URL (or IP)</w:t>
+      </w:r>
+      <w:r>
+        <w:rPr>
+          <w:rFonts w:ascii="Segoe UI" w:eastAsia="Times New Roman" w:hAnsi="Segoe UI" w:cs="Segoe UI"/>
+          <w:color w:val="101010"/>
+          <w:sz w:val="21"/>
+          <w:szCs w:val="21"/>
+          <w:lang w:eastAsia="fr-FR"/>
+        </w:rPr>
+        <w:t> : Collez le lien de votre site : </w:t>
+      </w:r>
+      <w:r>
+        <w:rPr>
+          <w:rFonts w:ascii="Consolas" w:eastAsia="Times New Roman" w:hAnsi="Consolas" w:cs="Courier New"/>
+          <w:color w:val="A31515"/>
+          <w:sz w:val="19"/>
+          <w:szCs w:val="19"/>
+          <w:lang w:eastAsia="fr-FR"/>
+        </w:rPr>
+        <w:t>https://service-go.onrender.com</w:t>
+      </w:r>
+    </w:p>
+    <w:p>
+      <w:pPr>
+        <w:numPr>
+          <w:ilvl w:val="1"/>
+          <w:numId w:val="33"/>
+        </w:numPr>
+        <w:shd w:val="clear" w:color="auto" w:fill="F9F9F9"/>
+        <w:spacing w:after="0" w:line="240" w:lineRule="auto"/>
+        <w:ind w:left="0"/>
+        <w:rPr>
+          <w:rFonts w:ascii="Segoe UI" w:eastAsia="Times New Roman" w:hAnsi="Segoe UI" w:cs="Segoe UI"/>
+          <w:color w:val="101010"/>
+          <w:sz w:val="21"/>
+          <w:szCs w:val="21"/>
+          <w:lang w:eastAsia="fr-FR"/>
+        </w:rPr>
+      </w:pPr>
+      <w:r>
+        <w:rPr>
+          <w:rFonts w:ascii="Segoe UI" w:eastAsia="Times New Roman" w:hAnsi="Segoe UI" w:cs="Segoe UI"/>
+          <w:b/>
+          <w:bCs/>
+          <w:color w:val="101010"/>
+          <w:sz w:val="21"/>
+          <w:szCs w:val="21"/>
+          <w:lang w:eastAsia="fr-FR"/>
+        </w:rPr>
+        <w:t xml:space="preserve">Monitoring </w:t>
+      </w:r>
+      <w:proofErr w:type="spellStart"/>
+      <w:r>
+        <w:rPr>
+          <w:rFonts w:ascii="Segoe UI" w:eastAsia="Times New Roman" w:hAnsi="Segoe UI" w:cs="Segoe UI"/>
+          <w:b/>
+          <w:bCs/>
+          <w:color w:val="101010"/>
+          <w:sz w:val="21"/>
+          <w:szCs w:val="21"/>
+          <w:lang w:eastAsia="fr-FR"/>
+        </w:rPr>
+        <w:t>Interval</w:t>
+      </w:r>
+      <w:proofErr w:type="spellEnd"/>
+      <w:r>
+        <w:rPr>
+          <w:rFonts w:ascii="Segoe UI" w:eastAsia="Times New Roman" w:hAnsi="Segoe UI" w:cs="Segoe UI"/>
+          <w:color w:val="101010"/>
+          <w:sz w:val="21"/>
+          <w:szCs w:val="21"/>
+          <w:lang w:eastAsia="fr-FR"/>
+        </w:rPr>
+        <w:t> : Réglez le curseur sur </w:t>
+      </w:r>
+      <w:r>
+        <w:rPr>
+          <w:rFonts w:ascii="Segoe UI" w:eastAsia="Times New Roman" w:hAnsi="Segoe UI" w:cs="Segoe UI"/>
+          <w:b/>
+          <w:bCs/>
+          <w:color w:val="101010"/>
+          <w:sz w:val="21"/>
+          <w:szCs w:val="21"/>
+          <w:lang w:eastAsia="fr-FR"/>
+        </w:rPr>
+        <w:t>5 minutes</w:t>
+      </w:r>
+      <w:r>
+        <w:rPr>
+          <w:rFonts w:ascii="Segoe UI" w:eastAsia="Times New Roman" w:hAnsi="Segoe UI" w:cs="Segoe UI"/>
+          <w:color w:val="101010"/>
+          <w:sz w:val="21"/>
+          <w:szCs w:val="21"/>
+          <w:lang w:eastAsia="fr-FR"/>
+        </w:rPr>
+        <w:t>.</w:t>
+      </w:r>
+    </w:p>
+    <w:p>
+      <w:pPr>
+        <w:numPr>
+          <w:ilvl w:val="0"/>
+          <w:numId w:val="33"/>
+        </w:numPr>
+        <w:shd w:val="clear" w:color="auto" w:fill="F9F9F9"/>
+        <w:spacing w:after="0" w:line="240" w:lineRule="auto"/>
+        <w:ind w:left="0"/>
+        <w:rPr>
+          <w:rFonts w:ascii="Segoe UI" w:eastAsia="Times New Roman" w:hAnsi="Segoe UI" w:cs="Segoe UI"/>
+          <w:color w:val="101010"/>
+          <w:sz w:val="21"/>
+          <w:szCs w:val="21"/>
+          <w:lang w:eastAsia="fr-FR"/>
+        </w:rPr>
+      </w:pPr>
+      <w:r>
+        <w:rPr>
+          <w:rFonts w:ascii="Segoe UI" w:eastAsia="Times New Roman" w:hAnsi="Segoe UI" w:cs="Segoe UI"/>
+          <w:color w:val="101010"/>
+          <w:sz w:val="21"/>
+          <w:szCs w:val="21"/>
+          <w:lang w:eastAsia="fr-FR"/>
+        </w:rPr>
+        <w:t>Cliquez sur </w:t>
+      </w:r>
+      <w:r>
+        <w:rPr>
+          <w:rFonts w:ascii="Segoe UI" w:eastAsia="Times New Roman" w:hAnsi="Segoe UI" w:cs="Segoe UI"/>
+          <w:b/>
+          <w:bCs/>
+          <w:color w:val="101010"/>
+          <w:sz w:val="21"/>
+          <w:szCs w:val="21"/>
+          <w:lang w:eastAsia="fr-FR"/>
+        </w:rPr>
+        <w:t>"</w:t>
+      </w:r>
+      <w:proofErr w:type="spellStart"/>
+      <w:r>
+        <w:rPr>
+          <w:rFonts w:ascii="Segoe UI" w:eastAsia="Times New Roman" w:hAnsi="Segoe UI" w:cs="Segoe UI"/>
+          <w:b/>
+          <w:bCs/>
+          <w:color w:val="101010"/>
+          <w:sz w:val="21"/>
+          <w:szCs w:val="21"/>
+          <w:lang w:eastAsia="fr-FR"/>
+        </w:rPr>
+        <w:t>Create</w:t>
+      </w:r>
+      <w:proofErr w:type="spellEnd"/>
+      <w:r>
+        <w:rPr>
+          <w:rFonts w:ascii="Segoe UI" w:eastAsia="Times New Roman" w:hAnsi="Segoe UI" w:cs="Segoe UI"/>
+          <w:b/>
+          <w:bCs/>
+          <w:color w:val="101010"/>
+          <w:sz w:val="21"/>
+          <w:szCs w:val="21"/>
+          <w:lang w:eastAsia="fr-FR"/>
+        </w:rPr>
+        <w:t xml:space="preserve"> Monitor"</w:t>
+      </w:r>
+      <w:r>
+        <w:rPr>
+          <w:rFonts w:ascii="Segoe UI" w:eastAsia="Times New Roman" w:hAnsi="Segoe UI" w:cs="Segoe UI"/>
+          <w:color w:val="101010"/>
+          <w:sz w:val="21"/>
+          <w:szCs w:val="21"/>
+          <w:lang w:eastAsia="fr-FR"/>
+        </w:rPr>
+        <w:t> pour sauvegarder.</w:t>
+      </w:r>
+    </w:p>
+    <w:p>
+      <w:pPr>
+        <w:shd w:val="clear" w:color="auto" w:fill="F9F9F9"/>
+        <w:spacing w:after="0" w:line="240" w:lineRule="auto"/>
+        <w:rPr>
+          <w:rFonts w:ascii="Segoe UI" w:eastAsia="Times New Roman" w:hAnsi="Segoe UI" w:cs="Segoe UI"/>
+          <w:color w:val="101010"/>
+          <w:sz w:val="21"/>
+          <w:szCs w:val="21"/>
+          <w:lang w:eastAsia="fr-FR"/>
+        </w:rPr>
+      </w:pPr>
+      <w:r>
+        <w:rPr>
+          <w:rFonts w:ascii="Segoe UI" w:eastAsia="Times New Roman" w:hAnsi="Segoe UI" w:cs="Segoe UI"/>
+          <w:b/>
+          <w:bCs/>
+          <w:color w:val="101010"/>
+          <w:sz w:val="21"/>
+          <w:szCs w:val="21"/>
+          <w:lang w:eastAsia="fr-FR"/>
+        </w:rPr>
+        <w:t>Le résultat :</w:t>
+      </w:r>
+      <w:r>
+        <w:rPr>
+          <w:rFonts w:ascii="Segoe UI" w:eastAsia="Times New Roman" w:hAnsi="Segoe UI" w:cs="Segoe UI"/>
+          <w:color w:val="101010"/>
+          <w:sz w:val="21"/>
+          <w:szCs w:val="21"/>
+          <w:lang w:eastAsia="fr-FR"/>
+        </w:rPr>
+        <w:t xml:space="preserve"> Ce robot va faire "Toc </w:t>
+      </w:r>
+      <w:proofErr w:type="spellStart"/>
+      <w:r>
+        <w:rPr>
+          <w:rFonts w:ascii="Segoe UI" w:eastAsia="Times New Roman" w:hAnsi="Segoe UI" w:cs="Segoe UI"/>
+          <w:color w:val="101010"/>
+          <w:sz w:val="21"/>
+          <w:szCs w:val="21"/>
+          <w:lang w:eastAsia="fr-FR"/>
+        </w:rPr>
+        <w:t>Toc</w:t>
+      </w:r>
+      <w:proofErr w:type="spellEnd"/>
+      <w:r>
+        <w:rPr>
+          <w:rFonts w:ascii="Segoe UI" w:eastAsia="Times New Roman" w:hAnsi="Segoe UI" w:cs="Segoe UI"/>
+          <w:color w:val="101010"/>
+          <w:sz w:val="21"/>
+          <w:szCs w:val="21"/>
+          <w:lang w:eastAsia="fr-FR"/>
+        </w:rPr>
+        <w:t xml:space="preserve">" sur votre site web toutes les 5 minutes. </w:t>
+      </w:r>
+      <w:proofErr w:type="spellStart"/>
+      <w:r>
+        <w:rPr>
+          <w:rFonts w:ascii="Segoe UI" w:eastAsia="Times New Roman" w:hAnsi="Segoe UI" w:cs="Segoe UI"/>
+          <w:color w:val="101010"/>
+          <w:sz w:val="21"/>
+          <w:szCs w:val="21"/>
+          <w:lang w:eastAsia="fr-FR"/>
+        </w:rPr>
+        <w:t>Render</w:t>
+      </w:r>
+      <w:proofErr w:type="spellEnd"/>
+      <w:r>
+        <w:rPr>
+          <w:rFonts w:ascii="Segoe UI" w:eastAsia="Times New Roman" w:hAnsi="Segoe UI" w:cs="Segoe UI"/>
+          <w:color w:val="101010"/>
+          <w:sz w:val="21"/>
+          <w:szCs w:val="21"/>
+          <w:lang w:eastAsia="fr-FR"/>
+        </w:rPr>
+        <w:t xml:space="preserve"> va croire qu'un client est en train de visiter la page, donc le compte à rebours de 15 minutes va se remettre à zéro à chaque fois. Votre serveur ne s'endormira plus jamais ! </w:t>
+      </w:r>
+      <w:r>
+        <w:rPr>
+          <w:rFonts w:ascii="Segoe UI Symbol" w:eastAsia="Times New Roman" w:hAnsi="Segoe UI Symbol" w:cs="Segoe UI Symbol"/>
+          <w:color w:val="101010"/>
+          <w:sz w:val="21"/>
+          <w:szCs w:val="21"/>
+          <w:lang w:eastAsia="fr-FR"/>
+        </w:rPr>
+        <w:t>🚀</w:t>
+      </w:r>
+    </w:p>
+    <w:p>
+      <w:pPr>
+        <w:shd w:val="clear" w:color="auto" w:fill="F9F9F9"/>
+        <w:spacing w:after="0" w:line="240" w:lineRule="auto"/>
+        <w:rPr>
+          <w:rFonts w:ascii="Segoe UI" w:eastAsia="Times New Roman" w:hAnsi="Segoe UI" w:cs="Segoe UI"/>
+          <w:color w:val="101010"/>
+          <w:sz w:val="21"/>
+          <w:szCs w:val="21"/>
+          <w:lang w:eastAsia="fr-FR"/>
+        </w:rPr>
+      </w:pPr>
+      <w:r>
+        <w:rPr>
+          <w:rFonts w:ascii="Segoe UI" w:eastAsia="Times New Roman" w:hAnsi="Segoe UI" w:cs="Segoe UI"/>
+          <w:i/>
+          <w:iCs/>
+          <w:color w:val="101010"/>
+          <w:sz w:val="21"/>
+          <w:szCs w:val="21"/>
+          <w:lang w:eastAsia="fr-FR"/>
+        </w:rPr>
+        <w:t xml:space="preserve">(Note : Si un jour votre application devient très grande et a des centaines de clients par jour, l'autre solution sera de passer au plan basique de </w:t>
+      </w:r>
+      <w:proofErr w:type="spellStart"/>
+      <w:r>
+        <w:rPr>
+          <w:rFonts w:ascii="Segoe UI" w:eastAsia="Times New Roman" w:hAnsi="Segoe UI" w:cs="Segoe UI"/>
+          <w:i/>
+          <w:iCs/>
+          <w:color w:val="101010"/>
+          <w:sz w:val="21"/>
+          <w:szCs w:val="21"/>
+          <w:lang w:eastAsia="fr-FR"/>
+        </w:rPr>
+        <w:t>Render</w:t>
+      </w:r>
+      <w:proofErr w:type="spellEnd"/>
+      <w:r>
+        <w:rPr>
+          <w:rFonts w:ascii="Segoe UI" w:eastAsia="Times New Roman" w:hAnsi="Segoe UI" w:cs="Segoe UI"/>
+          <w:i/>
+          <w:iCs/>
+          <w:color w:val="101010"/>
+          <w:sz w:val="21"/>
+          <w:szCs w:val="21"/>
+          <w:lang w:eastAsia="fr-FR"/>
+        </w:rPr>
+        <w:t xml:space="preserve"> à 7$/mois, mais en attendant, l'astuce du robot est parfaite pour démarrer !)</w:t>
+      </w:r>
+    </w:p>
+    <w:p>
+      <w:pPr>
+        <w:rPr>
+          <w:rFonts w:ascii="Segoe UI" w:eastAsia="Times New Roman" w:hAnsi="Segoe UI" w:cs="Segoe UI"/>
+          <w:color w:val="101010"/>
+          <w:sz w:val="18"/>
+          <w:szCs w:val="18"/>
+          <w:lang w:eastAsia="fr-FR"/>
+        </w:rPr>
+      </w:pPr>
       <w:bookmarkStart w:id="0" w:name="_GoBack"/>
-      <w:bookmarkEnd w:id="0"/>
+    </w:p>
+    <w:p>
+      <w:pPr>
+        <w:rPr>
+          <w:rFonts w:ascii="Segoe UI" w:eastAsia="Times New Roman" w:hAnsi="Segoe UI" w:cs="Segoe UI"/>
+          <w:color w:val="101010"/>
+          <w:sz w:val="18"/>
+          <w:szCs w:val="18"/>
+          <w:lang w:eastAsia="fr-FR"/>
+        </w:rPr>
+      </w:pPr>
+    </w:p>
+    <w:p>
+      <w:pPr>
+        <w:shd w:val="clear" w:color="auto" w:fill="F9F9F9"/>
+        <w:spacing w:after="0" w:line="240" w:lineRule="auto"/>
+        <w:rPr>
+          <w:rFonts w:ascii="Segoe UI" w:eastAsia="Times New Roman" w:hAnsi="Segoe UI" w:cs="Segoe UI"/>
+          <w:color w:val="101010"/>
+          <w:sz w:val="21"/>
+          <w:szCs w:val="21"/>
+          <w:lang w:eastAsia="fr-FR"/>
+        </w:rPr>
+      </w:pPr>
+      <w:r>
+        <w:rPr>
+          <w:rFonts w:ascii="Segoe UI" w:eastAsia="Times New Roman" w:hAnsi="Segoe UI" w:cs="Segoe UI"/>
+          <w:b/>
+          <w:bCs/>
+          <w:color w:val="101010"/>
+          <w:sz w:val="21"/>
+          <w:szCs w:val="21"/>
+          <w:lang w:eastAsia="fr-FR"/>
+        </w:rPr>
+        <w:t xml:space="preserve">Parfait, mission accomplie ! </w:t>
+      </w:r>
+      <w:r>
+        <w:rPr>
+          <w:rFonts w:ascii="Segoe UI Symbol" w:eastAsia="Times New Roman" w:hAnsi="Segoe UI Symbol" w:cs="Segoe UI Symbol"/>
+          <w:b/>
+          <w:bCs/>
+          <w:color w:val="101010"/>
+          <w:sz w:val="21"/>
+          <w:szCs w:val="21"/>
+          <w:lang w:eastAsia="fr-FR"/>
+        </w:rPr>
+        <w:t>🎯</w:t>
+      </w:r>
+    </w:p>
+    <w:p>
+      <w:pPr>
+        <w:shd w:val="clear" w:color="auto" w:fill="F9F9F9"/>
+        <w:spacing w:after="0" w:line="240" w:lineRule="auto"/>
+        <w:rPr>
+          <w:rFonts w:ascii="Segoe UI" w:eastAsia="Times New Roman" w:hAnsi="Segoe UI" w:cs="Segoe UI"/>
+          <w:color w:val="101010"/>
+          <w:sz w:val="21"/>
+          <w:szCs w:val="21"/>
+          <w:lang w:eastAsia="fr-FR"/>
+        </w:rPr>
+      </w:pPr>
+      <w:r>
+        <w:rPr>
+          <w:rFonts w:ascii="Segoe UI" w:eastAsia="Times New Roman" w:hAnsi="Segoe UI" w:cs="Segoe UI"/>
+          <w:color w:val="101010"/>
+          <w:sz w:val="21"/>
+          <w:szCs w:val="21"/>
+          <w:lang w:eastAsia="fr-FR"/>
+        </w:rPr>
+        <w:t>L'URL est maintenant correcte. Le statut affiche "Préparation..." car le robot vient tout juste d'être lancé. D'ici 1 ou 2 minutes maximum, il fera son premier test et passera au vert ("En haut"), et votre site ne s'endormira plus jamais !</w:t>
+      </w:r>
+    </w:p>
+    <w:p>
+      <w:pPr>
+        <w:shd w:val="clear" w:color="auto" w:fill="F9F9F9"/>
+        <w:spacing w:after="0" w:line="240" w:lineRule="auto"/>
+        <w:rPr>
+          <w:rFonts w:ascii="Segoe UI" w:eastAsia="Times New Roman" w:hAnsi="Segoe UI" w:cs="Segoe UI"/>
+          <w:color w:val="101010"/>
+          <w:sz w:val="21"/>
+          <w:szCs w:val="21"/>
+          <w:lang w:eastAsia="fr-FR"/>
+        </w:rPr>
+      </w:pPr>
+      <w:r>
+        <w:rPr>
+          <w:rFonts w:ascii="Segoe UI" w:eastAsia="Times New Roman" w:hAnsi="Segoe UI" w:cs="Segoe UI"/>
+          <w:color w:val="101010"/>
+          <w:sz w:val="21"/>
+          <w:szCs w:val="21"/>
+          <w:lang w:eastAsia="fr-FR"/>
+        </w:rPr>
+        <w:t>Si on fait le bilan de ce qu'on a accompli pour </w:t>
+      </w:r>
+      <w:r>
+        <w:rPr>
+          <w:rFonts w:ascii="Segoe UI" w:eastAsia="Times New Roman" w:hAnsi="Segoe UI" w:cs="Segoe UI"/>
+          <w:b/>
+          <w:bCs/>
+          <w:color w:val="101010"/>
+          <w:sz w:val="21"/>
+          <w:szCs w:val="21"/>
+          <w:lang w:eastAsia="fr-FR"/>
+        </w:rPr>
+        <w:t>SERVICE-GO</w:t>
+      </w:r>
+      <w:r>
+        <w:rPr>
+          <w:rFonts w:ascii="Segoe UI" w:eastAsia="Times New Roman" w:hAnsi="Segoe UI" w:cs="Segoe UI"/>
+          <w:color w:val="101010"/>
+          <w:sz w:val="21"/>
+          <w:szCs w:val="21"/>
+          <w:lang w:eastAsia="fr-FR"/>
+        </w:rPr>
+        <w:t xml:space="preserve"> : </w:t>
+      </w:r>
+      <w:r>
+        <w:rPr>
+          <w:rFonts w:ascii="Segoe UI Symbol" w:eastAsia="Times New Roman" w:hAnsi="Segoe UI Symbol" w:cs="Segoe UI Symbol"/>
+          <w:color w:val="101010"/>
+          <w:sz w:val="21"/>
+          <w:szCs w:val="21"/>
+          <w:lang w:eastAsia="fr-FR"/>
+        </w:rPr>
+        <w:t>✅</w:t>
+      </w:r>
+      <w:r>
+        <w:rPr>
+          <w:rFonts w:ascii="Segoe UI" w:eastAsia="Times New Roman" w:hAnsi="Segoe UI" w:cs="Segoe UI"/>
+          <w:color w:val="101010"/>
+          <w:sz w:val="21"/>
+          <w:szCs w:val="21"/>
+          <w:lang w:eastAsia="fr-FR"/>
+        </w:rPr>
+        <w:t xml:space="preserve"> Votre base de données est désormais indestructible et hébergée sur </w:t>
+      </w:r>
+      <w:proofErr w:type="spellStart"/>
+      <w:r>
+        <w:rPr>
+          <w:rFonts w:ascii="Segoe UI" w:eastAsia="Times New Roman" w:hAnsi="Segoe UI" w:cs="Segoe UI"/>
+          <w:b/>
+          <w:bCs/>
+          <w:color w:val="101010"/>
+          <w:sz w:val="21"/>
+          <w:szCs w:val="21"/>
+          <w:lang w:eastAsia="fr-FR"/>
+        </w:rPr>
+        <w:t>Supabase</w:t>
+      </w:r>
+      <w:proofErr w:type="spellEnd"/>
+      <w:r>
+        <w:rPr>
+          <w:rFonts w:ascii="Segoe UI" w:eastAsia="Times New Roman" w:hAnsi="Segoe UI" w:cs="Segoe UI"/>
+          <w:color w:val="101010"/>
+          <w:sz w:val="21"/>
+          <w:szCs w:val="21"/>
+          <w:lang w:eastAsia="fr-FR"/>
+        </w:rPr>
+        <w:t xml:space="preserve"> (PostgreSQL). </w:t>
+      </w:r>
+      <w:r>
+        <w:rPr>
+          <w:rFonts w:ascii="Segoe UI Symbol" w:eastAsia="Times New Roman" w:hAnsi="Segoe UI Symbol" w:cs="Segoe UI Symbol"/>
+          <w:color w:val="101010"/>
+          <w:sz w:val="21"/>
+          <w:szCs w:val="21"/>
+          <w:lang w:eastAsia="fr-FR"/>
+        </w:rPr>
+        <w:t>✅</w:t>
+      </w:r>
+      <w:r>
+        <w:rPr>
+          <w:rFonts w:ascii="Segoe UI" w:eastAsia="Times New Roman" w:hAnsi="Segoe UI" w:cs="Segoe UI"/>
+          <w:color w:val="101010"/>
+          <w:sz w:val="21"/>
+          <w:szCs w:val="21"/>
+          <w:lang w:eastAsia="fr-FR"/>
+        </w:rPr>
+        <w:t xml:space="preserve"> Votre Espace Admin est protégé par une </w:t>
+      </w:r>
+      <w:r>
+        <w:rPr>
+          <w:rFonts w:ascii="Segoe UI" w:eastAsia="Times New Roman" w:hAnsi="Segoe UI" w:cs="Segoe UI"/>
+          <w:b/>
+          <w:bCs/>
+          <w:color w:val="101010"/>
+          <w:sz w:val="21"/>
+          <w:szCs w:val="21"/>
+          <w:lang w:eastAsia="fr-FR"/>
+        </w:rPr>
+        <w:t>véritable sécurité (</w:t>
+      </w:r>
+      <w:proofErr w:type="spellStart"/>
+      <w:r>
+        <w:rPr>
+          <w:rFonts w:ascii="Segoe UI" w:eastAsia="Times New Roman" w:hAnsi="Segoe UI" w:cs="Segoe UI"/>
+          <w:b/>
+          <w:bCs/>
+          <w:color w:val="101010"/>
+          <w:sz w:val="21"/>
+          <w:szCs w:val="21"/>
+          <w:lang w:eastAsia="fr-FR"/>
+        </w:rPr>
+        <w:t>Token</w:t>
+      </w:r>
+      <w:proofErr w:type="spellEnd"/>
+      <w:r>
+        <w:rPr>
+          <w:rFonts w:ascii="Segoe UI" w:eastAsia="Times New Roman" w:hAnsi="Segoe UI" w:cs="Segoe UI"/>
+          <w:b/>
+          <w:bCs/>
+          <w:color w:val="101010"/>
+          <w:sz w:val="21"/>
+          <w:szCs w:val="21"/>
+          <w:lang w:eastAsia="fr-FR"/>
+        </w:rPr>
+        <w:t xml:space="preserve"> JWT)</w:t>
+      </w:r>
+      <w:r>
+        <w:rPr>
+          <w:rFonts w:ascii="Segoe UI" w:eastAsia="Times New Roman" w:hAnsi="Segoe UI" w:cs="Segoe UI"/>
+          <w:color w:val="101010"/>
+          <w:sz w:val="21"/>
+          <w:szCs w:val="21"/>
+          <w:lang w:eastAsia="fr-FR"/>
+        </w:rPr>
+        <w:t xml:space="preserve">. </w:t>
+      </w:r>
+      <w:r>
+        <w:rPr>
+          <w:rFonts w:ascii="Segoe UI Symbol" w:eastAsia="Times New Roman" w:hAnsi="Segoe UI Symbol" w:cs="Segoe UI Symbol"/>
+          <w:color w:val="101010"/>
+          <w:sz w:val="21"/>
+          <w:szCs w:val="21"/>
+          <w:lang w:eastAsia="fr-FR"/>
+        </w:rPr>
+        <w:t>✅</w:t>
+      </w:r>
+      <w:r>
+        <w:rPr>
+          <w:rFonts w:ascii="Segoe UI" w:eastAsia="Times New Roman" w:hAnsi="Segoe UI" w:cs="Segoe UI"/>
+          <w:color w:val="101010"/>
+          <w:sz w:val="21"/>
+          <w:szCs w:val="21"/>
+          <w:lang w:eastAsia="fr-FR"/>
+        </w:rPr>
+        <w:t xml:space="preserve"> Vous avez le bouton de contact direct </w:t>
+      </w:r>
+      <w:r>
+        <w:rPr>
+          <w:rFonts w:ascii="Segoe UI" w:eastAsia="Times New Roman" w:hAnsi="Segoe UI" w:cs="Segoe UI"/>
+          <w:b/>
+          <w:bCs/>
+          <w:color w:val="101010"/>
+          <w:sz w:val="21"/>
+          <w:szCs w:val="21"/>
+          <w:lang w:eastAsia="fr-FR"/>
+        </w:rPr>
+        <w:t>WhatsApp</w:t>
+      </w:r>
+      <w:r>
+        <w:rPr>
+          <w:rFonts w:ascii="Segoe UI" w:eastAsia="Times New Roman" w:hAnsi="Segoe UI" w:cs="Segoe UI"/>
+          <w:color w:val="101010"/>
+          <w:sz w:val="21"/>
+          <w:szCs w:val="21"/>
+          <w:lang w:eastAsia="fr-FR"/>
+        </w:rPr>
+        <w:t xml:space="preserve"> dans l'admin. </w:t>
+      </w:r>
+      <w:r>
+        <w:rPr>
+          <w:rFonts w:ascii="Segoe UI Symbol" w:eastAsia="Times New Roman" w:hAnsi="Segoe UI Symbol" w:cs="Segoe UI Symbol"/>
+          <w:color w:val="101010"/>
+          <w:sz w:val="21"/>
+          <w:szCs w:val="21"/>
+          <w:lang w:eastAsia="fr-FR"/>
+        </w:rPr>
+        <w:t>✅</w:t>
+      </w:r>
+      <w:r>
+        <w:rPr>
+          <w:rFonts w:ascii="Segoe UI" w:eastAsia="Times New Roman" w:hAnsi="Segoe UI" w:cs="Segoe UI"/>
+          <w:color w:val="101010"/>
+          <w:sz w:val="21"/>
+          <w:szCs w:val="21"/>
+          <w:lang w:eastAsia="fr-FR"/>
+        </w:rPr>
+        <w:t xml:space="preserve"> Les clients sont obligés d'écrire de </w:t>
+      </w:r>
+      <w:r>
+        <w:rPr>
+          <w:rFonts w:ascii="Segoe UI" w:eastAsia="Times New Roman" w:hAnsi="Segoe UI" w:cs="Segoe UI"/>
+          <w:b/>
+          <w:bCs/>
+          <w:color w:val="101010"/>
+          <w:sz w:val="21"/>
+          <w:szCs w:val="21"/>
+          <w:lang w:eastAsia="fr-FR"/>
+        </w:rPr>
+        <w:t>vrais numéros</w:t>
+      </w:r>
+      <w:r>
+        <w:rPr>
+          <w:rFonts w:ascii="Segoe UI" w:eastAsia="Times New Roman" w:hAnsi="Segoe UI" w:cs="Segoe UI"/>
+          <w:color w:val="101010"/>
+          <w:sz w:val="21"/>
+          <w:szCs w:val="21"/>
+          <w:lang w:eastAsia="fr-FR"/>
+        </w:rPr>
+        <w:t xml:space="preserve"> algériens (05, 06, 07). </w:t>
+      </w:r>
+      <w:r>
+        <w:rPr>
+          <w:rFonts w:ascii="Segoe UI Symbol" w:eastAsia="Times New Roman" w:hAnsi="Segoe UI Symbol" w:cs="Segoe UI Symbol"/>
+          <w:color w:val="101010"/>
+          <w:sz w:val="21"/>
+          <w:szCs w:val="21"/>
+          <w:lang w:eastAsia="fr-FR"/>
+        </w:rPr>
+        <w:t>✅</w:t>
+      </w:r>
+      <w:r>
+        <w:rPr>
+          <w:rFonts w:ascii="Segoe UI" w:eastAsia="Times New Roman" w:hAnsi="Segoe UI" w:cs="Segoe UI"/>
+          <w:color w:val="101010"/>
+          <w:sz w:val="21"/>
+          <w:szCs w:val="21"/>
+          <w:lang w:eastAsia="fr-FR"/>
+        </w:rPr>
+        <w:t xml:space="preserve"> Et maintenant, votre site restera </w:t>
+      </w:r>
+      <w:r>
+        <w:rPr>
+          <w:rFonts w:ascii="Segoe UI" w:eastAsia="Times New Roman" w:hAnsi="Segoe UI" w:cs="Segoe UI"/>
+          <w:b/>
+          <w:bCs/>
+          <w:color w:val="101010"/>
+          <w:sz w:val="21"/>
+          <w:szCs w:val="21"/>
+          <w:lang w:eastAsia="fr-FR"/>
+        </w:rPr>
+        <w:t>rapide et allumé 24h/24</w:t>
+      </w:r>
+      <w:r>
+        <w:rPr>
+          <w:rFonts w:ascii="Segoe UI" w:eastAsia="Times New Roman" w:hAnsi="Segoe UI" w:cs="Segoe UI"/>
+          <w:color w:val="101010"/>
+          <w:sz w:val="21"/>
+          <w:szCs w:val="21"/>
+          <w:lang w:eastAsia="fr-FR"/>
+        </w:rPr>
+        <w:t> !</w:t>
+      </w:r>
+    </w:p>
+    <w:p>
+      <w:pPr>
+        <w:shd w:val="clear" w:color="auto" w:fill="F9F9F9"/>
+        <w:spacing w:after="0" w:line="240" w:lineRule="auto"/>
+        <w:rPr>
+          <w:rFonts w:ascii="Segoe UI" w:eastAsia="Times New Roman" w:hAnsi="Segoe UI" w:cs="Segoe UI"/>
+          <w:color w:val="101010"/>
+          <w:sz w:val="21"/>
+          <w:szCs w:val="21"/>
+          <w:lang w:eastAsia="fr-FR"/>
+        </w:rPr>
+      </w:pPr>
+      <w:r>
+        <w:rPr>
+          <w:rFonts w:ascii="Segoe UI" w:eastAsia="Times New Roman" w:hAnsi="Segoe UI" w:cs="Segoe UI"/>
+          <w:color w:val="101010"/>
+          <w:sz w:val="21"/>
+          <w:szCs w:val="21"/>
+          <w:lang w:eastAsia="fr-FR"/>
+        </w:rPr>
+        <w:t>L'application est super solide maintenant. Est-ce que tout vous semble bon ou voulez-vous qu'on</w:t>
+      </w:r>
+    </w:p>
+    <w:bookmarkEnd w:id="0"/>
+    <w:p>
+      <w:pPr>
+        <w:rPr>
+          <w:rFonts w:asciiTheme="majorBidi" w:hAnsiTheme="majorBidi" w:cstheme="majorBidi"/>
+          <w:sz w:val="24"/>
+          <w:szCs w:val="24"/>
+        </w:rPr>
+      </w:pPr>
     </w:p>
     <w:sectPr>
       <w:pgSz w:w="11906" w:h="16838" w:code="9"/>
@@ -15605,6 +17369,123 @@
     </w:lvl>
   </w:abstractNum>
   <w:abstractNum w:abstractNumId="15" w15:restartNumberingAfterBreak="0">
+    <w:nsid w:val="336A28FD"/>
+    <w:multiLevelType w:val="multilevel"/>
+    <w:tmpl w:val="739A6E1C"/>
+    <w:lvl w:ilvl="0">
+      <w:start w:val="1"/>
+      <w:numFmt w:val="decimal"/>
+      <w:lvlText w:val="%1."/>
+      <w:lvlJc w:val="left"/>
+      <w:pPr>
+        <w:tabs>
+          <w:tab w:val="num" w:pos="720"/>
+        </w:tabs>
+        <w:ind w:left="720" w:hanging="360"/>
+      </w:pPr>
+    </w:lvl>
+    <w:lvl w:ilvl="1">
+      <w:start w:val="1"/>
+      <w:numFmt w:val="bullet"/>
+      <w:lvlText w:val=""/>
+      <w:lvlJc w:val="left"/>
+      <w:pPr>
+        <w:tabs>
+          <w:tab w:val="num" w:pos="1440"/>
+        </w:tabs>
+        <w:ind w:left="1440" w:hanging="360"/>
+      </w:pPr>
+      <w:rPr>
+        <w:rFonts w:ascii="Symbol" w:hAnsi="Symbol" w:hint="default"/>
+        <w:sz w:val="20"/>
+      </w:rPr>
+    </w:lvl>
+    <w:lvl w:ilvl="2" w:tentative="1">
+      <w:start w:val="1"/>
+      <w:numFmt w:val="decimal"/>
+      <w:lvlText w:val="%3."/>
+      <w:lvlJc w:val="left"/>
+      <w:pPr>
+        <w:tabs>
+          <w:tab w:val="num" w:pos="2160"/>
+        </w:tabs>
+        <w:ind w:left="2160" w:hanging="360"/>
+      </w:pPr>
+    </w:lvl>
+    <w:lvl w:ilvl="3" w:tentative="1">
+      <w:start w:val="1"/>
+      <w:numFmt w:val="decimal"/>
+      <w:lvlText w:val="%4."/>
+      <w:lvlJc w:val="left"/>
+      <w:pPr>
+        <w:tabs>
+          <w:tab w:val="num" w:pos="2880"/>
+        </w:tabs>
+        <w:ind w:left="2880" w:hanging="360"/>
+      </w:pPr>
+    </w:lvl>
+    <w:lvl w:ilvl="4" w:tentative="1">
+      <w:start w:val="1"/>
+      <w:numFmt w:val="decimal"/>
+      <w:lvlText w:val="%5."/>
+      <w:lvlJc w:val="left"/>
+      <w:pPr>
+        <w:tabs>
+          <w:tab w:val="num" w:pos="3600"/>
+        </w:tabs>
+        <w:ind w:left="3600" w:hanging="360"/>
+      </w:pPr>
+    </w:lvl>
+    <w:lvl w:ilvl="5" w:tentative="1">
+      <w:start w:val="1"/>
+      <w:numFmt w:val="decimal"/>
+      <w:lvlText w:val="%6."/>
+      <w:lvlJc w:val="left"/>
+      <w:pPr>
+        <w:tabs>
+          <w:tab w:val="num" w:pos="4320"/>
+        </w:tabs>
+        <w:ind w:left="4320" w:hanging="360"/>
+      </w:pPr>
+    </w:lvl>
+    <w:lvl w:ilvl="6" w:tentative="1">
+      <w:start w:val="1"/>
+      <w:numFmt w:val="decimal"/>
+      <w:lvlText w:val="%7."/>
+      <w:lvlJc w:val="left"/>
+      <w:pPr>
+        <w:tabs>
+          <w:tab w:val="num" w:pos="5040"/>
+        </w:tabs>
+        <w:ind w:left="5040" w:hanging="360"/>
+      </w:pPr>
+    </w:lvl>
+    <w:lvl w:ilvl="7" w:tentative="1">
+      <w:start w:val="1"/>
+      <w:numFmt w:val="decimal"/>
+      <w:lvlText w:val="%8."/>
+      <w:lvlJc w:val="left"/>
+      <w:pPr>
+        <w:tabs>
+          <w:tab w:val="num" w:pos="5760"/>
+        </w:tabs>
+        <w:ind w:left="5760" w:hanging="360"/>
+      </w:pPr>
+    </w:lvl>
+    <w:lvl w:ilvl="8" w:tentative="1">
+      <w:start w:val="1"/>
+      <w:numFmt w:val="decimal"/>
+      <w:lvlText w:val="%9."/>
+      <w:lvlJc w:val="left"/>
+      <w:pPr>
+        <w:tabs>
+          <w:tab w:val="num" w:pos="6480"/>
+        </w:tabs>
+        <w:ind w:left="6480" w:hanging="360"/>
+      </w:pPr>
+    </w:lvl>
+  </w:abstractNum>
+  <w:abstractNum w:abstractNumId="16" w15:restartNumberingAfterBreak="0">
     <w:nsid w:val="36AB793B"/>
     <w:multiLevelType w:val="multilevel"/>
     <w:tmpl w:val="58BA525C"/>
@@ -15717,7 +17598,7 @@
       </w:pPr>
     </w:lvl>
   </w:abstractNum>
-  <w:abstractNum w:abstractNumId="16" w15:restartNumberingAfterBreak="0">
+  <w:abstractNum w:abstractNumId="17" w15:restartNumberingAfterBreak="0">
     <w:nsid w:val="3E174719"/>
     <w:multiLevelType w:val="multilevel"/>
     <w:tmpl w:val="8B6ACB7C"/>
@@ -15866,7 +17747,120 @@
       </w:rPr>
     </w:lvl>
   </w:abstractNum>
-  <w:abstractNum w:abstractNumId="17" w15:restartNumberingAfterBreak="0">
+  <w:abstractNum w:abstractNumId="18" w15:restartNumberingAfterBreak="0">
+    <w:nsid w:val="3FBF4554"/>
+    <w:multiLevelType w:val="multilevel"/>
+    <w:tmpl w:val="CB421628"/>
+    <w:lvl w:ilvl="0">
+      <w:start w:val="1"/>
+      <w:numFmt w:val="decimal"/>
+      <w:lvlText w:val="%1."/>
+      <w:lvlJc w:val="left"/>
+      <w:pPr>
+        <w:tabs>
+          <w:tab w:val="num" w:pos="720"/>
+        </w:tabs>
+        <w:ind w:left="720" w:hanging="360"/>
+      </w:pPr>
+    </w:lvl>
+    <w:lvl w:ilvl="1" w:tentative="1">
+      <w:start w:val="1"/>
+      <w:numFmt w:val="decimal"/>
+      <w:lvlText w:val="%2."/>
+      <w:lvlJc w:val="left"/>
+      <w:pPr>
+        <w:tabs>
+          <w:tab w:val="num" w:pos="1440"/>
+        </w:tabs>
+        <w:ind w:left="1440" w:hanging="360"/>
+      </w:pPr>
+    </w:lvl>
+    <w:lvl w:ilvl="2" w:tentative="1">
+      <w:start w:val="1"/>
+      <w:numFmt w:val="decimal"/>
+      <w:lvlText w:val="%3."/>
+      <w:lvlJc w:val="left"/>
+      <w:pPr>
+        <w:tabs>
+          <w:tab w:val="num" w:pos="2160"/>
+        </w:tabs>
+        <w:ind w:left="2160" w:hanging="360"/>
+      </w:pPr>
+    </w:lvl>
+    <w:lvl w:ilvl="3" w:tentative="1">
+      <w:start w:val="1"/>
+      <w:numFmt w:val="decimal"/>
+      <w:lvlText w:val="%4."/>
+      <w:lvlJc w:val="left"/>
+      <w:pPr>
+        <w:tabs>
+          <w:tab w:val="num" w:pos="2880"/>
+        </w:tabs>
+        <w:ind w:left="2880" w:hanging="360"/>
+      </w:pPr>
+    </w:lvl>
+    <w:lvl w:ilvl="4" w:tentative="1">
+      <w:start w:val="1"/>
+      <w:numFmt w:val="decimal"/>
+      <w:lvlText w:val="%5."/>
+      <w:lvlJc w:val="left"/>
+      <w:pPr>
+        <w:tabs>
+          <w:tab w:val="num" w:pos="3600"/>
+        </w:tabs>
+        <w:ind w:left="3600" w:hanging="360"/>
+      </w:pPr>
+    </w:lvl>
+    <w:lvl w:ilvl="5" w:tentative="1">
+      <w:start w:val="1"/>
+      <w:numFmt w:val="decimal"/>
+      <w:lvlText w:val="%6."/>
+      <w:lvlJc w:val="left"/>
+      <w:pPr>
+        <w:tabs>
+          <w:tab w:val="num" w:pos="4320"/>
+        </w:tabs>
+        <w:ind w:left="4320" w:hanging="360"/>
+      </w:pPr>
+    </w:lvl>
+    <w:lvl w:ilvl="6" w:tentative="1">
+      <w:start w:val="1"/>
+      <w:numFmt w:val="decimal"/>
+      <w:lvlText w:val="%7."/>
+      <w:lvlJc w:val="left"/>
+      <w:pPr>
+        <w:tabs>
+          <w:tab w:val="num" w:pos="5040"/>
+        </w:tabs>
+        <w:ind w:left="5040" w:hanging="360"/>
+      </w:pPr>
+    </w:lvl>
+    <w:lvl w:ilvl="7" w:tentative="1">
+      <w:start w:val="1"/>
+      <w:numFmt w:val="decimal"/>
+      <w:lvlText w:val="%8."/>
+      <w:lvlJc w:val="left"/>
+      <w:pPr>
+        <w:tabs>
+          <w:tab w:val="num" w:pos="5760"/>
+        </w:tabs>
+        <w:ind w:left="5760" w:hanging="360"/>
+      </w:pPr>
+    </w:lvl>
+    <w:lvl w:ilvl="8" w:tentative="1">
+      <w:start w:val="1"/>
+      <w:numFmt w:val="decimal"/>
+      <w:lvlText w:val="%9."/>
+      <w:lvlJc w:val="left"/>
+      <w:pPr>
+        <w:tabs>
+          <w:tab w:val="num" w:pos="6480"/>
+        </w:tabs>
+        <w:ind w:left="6480" w:hanging="360"/>
+      </w:pPr>
+    </w:lvl>
+  </w:abstractNum>
+  <w:abstractNum w:abstractNumId="19" w15:restartNumberingAfterBreak="0">
     <w:nsid w:val="41255EDF"/>
     <w:multiLevelType w:val="multilevel"/>
     <w:tmpl w:val="D51633B0"/>
@@ -16015,7 +18009,7 @@
       </w:rPr>
     </w:lvl>
   </w:abstractNum>
-  <w:abstractNum w:abstractNumId="18" w15:restartNumberingAfterBreak="0">
+  <w:abstractNum w:abstractNumId="20" w15:restartNumberingAfterBreak="0">
     <w:nsid w:val="50592E68"/>
     <w:multiLevelType w:val="multilevel"/>
     <w:tmpl w:val="FC96CB4C"/>
@@ -16128,7 +18122,7 @@
       </w:pPr>
     </w:lvl>
   </w:abstractNum>
-  <w:abstractNum w:abstractNumId="19" w15:restartNumberingAfterBreak="0">
+  <w:abstractNum w:abstractNumId="21" w15:restartNumberingAfterBreak="0">
     <w:nsid w:val="56F716FF"/>
     <w:multiLevelType w:val="multilevel"/>
     <w:tmpl w:val="C4FE0146"/>
@@ -16277,7 +18271,7 @@
       </w:rPr>
     </w:lvl>
   </w:abstractNum>
-  <w:abstractNum w:abstractNumId="20" w15:restartNumberingAfterBreak="0">
+  <w:abstractNum w:abstractNumId="22" w15:restartNumberingAfterBreak="0">
     <w:nsid w:val="58A74BAC"/>
     <w:multiLevelType w:val="multilevel"/>
     <w:tmpl w:val="A0E02532"/>
@@ -16390,7 +18384,7 @@
       </w:pPr>
     </w:lvl>
   </w:abstractNum>
-  <w:abstractNum w:abstractNumId="21" w15:restartNumberingAfterBreak="0">
+  <w:abstractNum w:abstractNumId="23" w15:restartNumberingAfterBreak="0">
     <w:nsid w:val="58C07C39"/>
     <w:multiLevelType w:val="multilevel"/>
     <w:tmpl w:val="F0302736"/>
@@ -16539,7 +18533,7 @@
       </w:rPr>
     </w:lvl>
   </w:abstractNum>
-  <w:abstractNum w:abstractNumId="22" w15:restartNumberingAfterBreak="0">
+  <w:abstractNum w:abstractNumId="24" w15:restartNumberingAfterBreak="0">
     <w:nsid w:val="61292230"/>
     <w:multiLevelType w:val="multilevel"/>
     <w:tmpl w:val="6AD610F0"/>
@@ -16656,7 +18650,7 @@
       </w:pPr>
     </w:lvl>
   </w:abstractNum>
-  <w:abstractNum w:abstractNumId="23" w15:restartNumberingAfterBreak="0">
+  <w:abstractNum w:abstractNumId="25" w15:restartNumberingAfterBreak="0">
     <w:nsid w:val="62A76490"/>
     <w:multiLevelType w:val="multilevel"/>
     <w:tmpl w:val="4F1C5316"/>
@@ -16773,7 +18767,7 @@
       </w:pPr>
     </w:lvl>
   </w:abstractNum>
-  <w:abstractNum w:abstractNumId="24" w15:restartNumberingAfterBreak="0">
+  <w:abstractNum w:abstractNumId="26" w15:restartNumberingAfterBreak="0">
     <w:nsid w:val="63573F96"/>
     <w:multiLevelType w:val="multilevel"/>
     <w:tmpl w:val="2CB21D70"/>
@@ -16922,7 +18916,7 @@
       </w:rPr>
     </w:lvl>
   </w:abstractNum>
-  <w:abstractNum w:abstractNumId="25" w15:restartNumberingAfterBreak="0">
+  <w:abstractNum w:abstractNumId="27" w15:restartNumberingAfterBreak="0">
     <w:nsid w:val="63C26785"/>
     <w:multiLevelType w:val="multilevel"/>
     <w:tmpl w:val="6818FAC8"/>
@@ -17035,7 +19029,7 @@
       </w:pPr>
     </w:lvl>
   </w:abstractNum>
-  <w:abstractNum w:abstractNumId="26" w15:restartNumberingAfterBreak="0">
+  <w:abstractNum w:abstractNumId="28" w15:restartNumberingAfterBreak="0">
     <w:nsid w:val="6BB13E57"/>
     <w:multiLevelType w:val="multilevel"/>
     <w:tmpl w:val="947E31F6"/>
@@ -17184,7 +19178,7 @@
       </w:rPr>
     </w:lvl>
   </w:abstractNum>
-  <w:abstractNum w:abstractNumId="27" w15:restartNumberingAfterBreak="0">
+  <w:abstractNum w:abstractNumId="29" w15:restartNumberingAfterBreak="0">
     <w:nsid w:val="6D64703A"/>
     <w:multiLevelType w:val="multilevel"/>
     <w:tmpl w:val="4A8A1276"/>
@@ -17297,7 +19291,7 @@
       </w:pPr>
     </w:lvl>
   </w:abstractNum>
-  <w:abstractNum w:abstractNumId="28" w15:restartNumberingAfterBreak="0">
+  <w:abstractNum w:abstractNumId="30" w15:restartNumberingAfterBreak="0">
     <w:nsid w:val="6D906C01"/>
     <w:multiLevelType w:val="multilevel"/>
     <w:tmpl w:val="4DF63D4A"/>
@@ -17446,7 +19440,7 @@
       </w:rPr>
     </w:lvl>
   </w:abstractNum>
-  <w:abstractNum w:abstractNumId="29" w15:restartNumberingAfterBreak="0">
+  <w:abstractNum w:abstractNumId="31" w15:restartNumberingAfterBreak="0">
     <w:nsid w:val="71E65246"/>
     <w:multiLevelType w:val="multilevel"/>
     <w:tmpl w:val="F9944F54"/>
@@ -17595,7 +19589,7 @@
       </w:rPr>
     </w:lvl>
   </w:abstractNum>
-  <w:abstractNum w:abstractNumId="30" w15:restartNumberingAfterBreak="0">
+  <w:abstractNum w:abstractNumId="32" w15:restartNumberingAfterBreak="0">
     <w:nsid w:val="75FC1139"/>
     <w:multiLevelType w:val="multilevel"/>
     <w:tmpl w:val="CC5A3DA6"/>
@@ -17745,28 +19739,28 @@
     </w:lvl>
   </w:abstractNum>
   <w:num w:numId="1">
-    <w:abstractNumId w:val="20"/>
+    <w:abstractNumId w:val="22"/>
   </w:num>
   <w:num w:numId="2">
-    <w:abstractNumId w:val="15"/>
+    <w:abstractNumId w:val="16"/>
   </w:num>
   <w:num w:numId="3">
-    <w:abstractNumId w:val="29"/>
+    <w:abstractNumId w:val="31"/>
   </w:num>
   <w:num w:numId="4">
-    <w:abstractNumId w:val="22"/>
+    <w:abstractNumId w:val="24"/>
   </w:num>
   <w:num w:numId="5">
     <w:abstractNumId w:val="11"/>
   </w:num>
   <w:num w:numId="6">
-    <w:abstractNumId w:val="23"/>
+    <w:abstractNumId w:val="25"/>
   </w:num>
   <w:num w:numId="7">
-    <w:abstractNumId w:val="24"/>
+    <w:abstractNumId w:val="26"/>
   </w:num>
   <w:num w:numId="8">
-    <w:abstractNumId w:val="27"/>
+    <w:abstractNumId w:val="29"/>
   </w:num>
   <w:num w:numId="9">
     <w:abstractNumId w:val="6"/>
@@ -17775,19 +19769,19 @@
     <w:abstractNumId w:val="7"/>
   </w:num>
   <w:num w:numId="11">
-    <w:abstractNumId w:val="21"/>
+    <w:abstractNumId w:val="23"/>
   </w:num>
   <w:num w:numId="12">
-    <w:abstractNumId w:val="25"/>
+    <w:abstractNumId w:val="27"/>
   </w:num>
   <w:num w:numId="13">
-    <w:abstractNumId w:val="17"/>
+    <w:abstractNumId w:val="19"/>
   </w:num>
   <w:num w:numId="14">
     <w:abstractNumId w:val="13"/>
   </w:num>
   <w:num w:numId="15">
-    <w:abstractNumId w:val="30"/>
+    <w:abstractNumId w:val="32"/>
   </w:num>
   <w:num w:numId="16">
     <w:abstractNumId w:val="14"/>
@@ -17796,7 +19790,7 @@
     <w:abstractNumId w:val="3"/>
   </w:num>
   <w:num w:numId="18">
-    <w:abstractNumId w:val="19"/>
+    <w:abstractNumId w:val="21"/>
   </w:num>
   <w:num w:numId="19">
     <w:abstractNumId w:val="2"/>
@@ -17811,7 +19805,7 @@
     <w:abstractNumId w:val="4"/>
   </w:num>
   <w:num w:numId="23">
-    <w:abstractNumId w:val="28"/>
+    <w:abstractNumId w:val="30"/>
   </w:num>
   <w:num w:numId="24">
     <w:abstractNumId w:val="5"/>
@@ -17820,7 +19814,7 @@
     <w:abstractNumId w:val="10"/>
   </w:num>
   <w:num w:numId="26">
-    <w:abstractNumId w:val="16"/>
+    <w:abstractNumId w:val="17"/>
   </w:num>
   <w:num w:numId="27">
     <w:abstractNumId w:val="0"/>
@@ -17832,10 +19826,16 @@
     <w:abstractNumId w:val="12"/>
   </w:num>
   <w:num w:numId="30">
-    <w:abstractNumId w:val="26"/>
+    <w:abstractNumId w:val="28"/>
   </w:num>
   <w:num w:numId="31">
+    <w:abstractNumId w:val="20"/>
+  </w:num>
+  <w:num w:numId="32">
     <w:abstractNumId w:val="18"/>
+  </w:num>
+  <w:num w:numId="33">
+    <w:abstractNumId w:val="15"/>
   </w:num>
 </w:numbering>
 </file>
@@ -18758,7 +20758,7 @@
 </file>
 
 <file path=customXml/itemProps1.xml><?xml version="1.0" encoding="utf-8"?>
-<ds:datastoreItem xmlns:ds="http://schemas.openxmlformats.org/officeDocument/2006/customXml" ds:itemID="{455FD12C-5756-485F-ABBB-41BF2E4DF435}">
+<ds:datastoreItem xmlns:ds="http://schemas.openxmlformats.org/officeDocument/2006/customXml" ds:itemID="{3BDC78A0-92E0-4BFB-B7A1-2488311666B2}">
   <ds:schemaRefs>
     <ds:schemaRef ds:uri="http://schemas.openxmlformats.org/officeDocument/2006/bibliography"/>
   </ds:schemaRefs>

</xml_diff>

<commit_message>
feat: Bouton Nouvelle Demande dans Espace Client
</commit_message>
<xml_diff>
--- a/Application de Réservation de Techniciens à Domicile.docx
+++ b/Application de Réservation de Techniciens à Domicile.docx
@@ -15084,7 +15084,6 @@
           <w:lang w:eastAsia="fr-FR"/>
         </w:rPr>
       </w:pPr>
-      <w:bookmarkStart w:id="0" w:name="_GoBack"/>
     </w:p>
     <w:p>
       <w:pPr>
@@ -15463,7 +15462,6 @@
         <w:t>L'application est super solide maintenant. Est-ce que tout vous semble bon ou voulez-vous qu'on</w:t>
       </w:r>
     </w:p>
-    <w:bookmarkEnd w:id="0"/>
     <w:p>
       <w:pPr>
         <w:rPr>
@@ -15472,6 +15470,26 @@
           <w:szCs w:val="24"/>
         </w:rPr>
       </w:pPr>
+    </w:p>
+    <w:p>
+      <w:pPr>
+        <w:rPr>
+          <w:rFonts w:asciiTheme="majorBidi" w:hAnsiTheme="majorBidi" w:cstheme="majorBidi"/>
+          <w:sz w:val="24"/>
+          <w:szCs w:val="24"/>
+        </w:rPr>
+      </w:pPr>
+    </w:p>
+    <w:p>
+      <w:pPr>
+        <w:rPr>
+          <w:rFonts w:asciiTheme="majorBidi" w:hAnsiTheme="majorBidi" w:cstheme="majorBidi"/>
+          <w:sz w:val="24"/>
+          <w:szCs w:val="24"/>
+        </w:rPr>
+      </w:pPr>
+      <w:bookmarkStart w:id="0" w:name="_GoBack"/>
+      <w:bookmarkEnd w:id="0"/>
     </w:p>
     <w:sectPr>
       <w:pgSz w:w="11906" w:h="16838" w:code="9"/>
@@ -18534,6 +18552,119 @@
     </w:lvl>
   </w:abstractNum>
   <w:abstractNum w:abstractNumId="24" w15:restartNumberingAfterBreak="0">
+    <w:nsid w:val="5A6644F2"/>
+    <w:multiLevelType w:val="multilevel"/>
+    <w:tmpl w:val="747AD70C"/>
+    <w:lvl w:ilvl="0">
+      <w:start w:val="1"/>
+      <w:numFmt w:val="decimal"/>
+      <w:lvlText w:val="%1."/>
+      <w:lvlJc w:val="left"/>
+      <w:pPr>
+        <w:tabs>
+          <w:tab w:val="num" w:pos="720"/>
+        </w:tabs>
+        <w:ind w:left="720" w:hanging="360"/>
+      </w:pPr>
+    </w:lvl>
+    <w:lvl w:ilvl="1" w:tentative="1">
+      <w:start w:val="1"/>
+      <w:numFmt w:val="decimal"/>
+      <w:lvlText w:val="%2."/>
+      <w:lvlJc w:val="left"/>
+      <w:pPr>
+        <w:tabs>
+          <w:tab w:val="num" w:pos="1440"/>
+        </w:tabs>
+        <w:ind w:left="1440" w:hanging="360"/>
+      </w:pPr>
+    </w:lvl>
+    <w:lvl w:ilvl="2" w:tentative="1">
+      <w:start w:val="1"/>
+      <w:numFmt w:val="decimal"/>
+      <w:lvlText w:val="%3."/>
+      <w:lvlJc w:val="left"/>
+      <w:pPr>
+        <w:tabs>
+          <w:tab w:val="num" w:pos="2160"/>
+        </w:tabs>
+        <w:ind w:left="2160" w:hanging="360"/>
+      </w:pPr>
+    </w:lvl>
+    <w:lvl w:ilvl="3" w:tentative="1">
+      <w:start w:val="1"/>
+      <w:numFmt w:val="decimal"/>
+      <w:lvlText w:val="%4."/>
+      <w:lvlJc w:val="left"/>
+      <w:pPr>
+        <w:tabs>
+          <w:tab w:val="num" w:pos="2880"/>
+        </w:tabs>
+        <w:ind w:left="2880" w:hanging="360"/>
+      </w:pPr>
+    </w:lvl>
+    <w:lvl w:ilvl="4" w:tentative="1">
+      <w:start w:val="1"/>
+      <w:numFmt w:val="decimal"/>
+      <w:lvlText w:val="%5."/>
+      <w:lvlJc w:val="left"/>
+      <w:pPr>
+        <w:tabs>
+          <w:tab w:val="num" w:pos="3600"/>
+        </w:tabs>
+        <w:ind w:left="3600" w:hanging="360"/>
+      </w:pPr>
+    </w:lvl>
+    <w:lvl w:ilvl="5" w:tentative="1">
+      <w:start w:val="1"/>
+      <w:numFmt w:val="decimal"/>
+      <w:lvlText w:val="%6."/>
+      <w:lvlJc w:val="left"/>
+      <w:pPr>
+        <w:tabs>
+          <w:tab w:val="num" w:pos="4320"/>
+        </w:tabs>
+        <w:ind w:left="4320" w:hanging="360"/>
+      </w:pPr>
+    </w:lvl>
+    <w:lvl w:ilvl="6" w:tentative="1">
+      <w:start w:val="1"/>
+      <w:numFmt w:val="decimal"/>
+      <w:lvlText w:val="%7."/>
+      <w:lvlJc w:val="left"/>
+      <w:pPr>
+        <w:tabs>
+          <w:tab w:val="num" w:pos="5040"/>
+        </w:tabs>
+        <w:ind w:left="5040" w:hanging="360"/>
+      </w:pPr>
+    </w:lvl>
+    <w:lvl w:ilvl="7" w:tentative="1">
+      <w:start w:val="1"/>
+      <w:numFmt w:val="decimal"/>
+      <w:lvlText w:val="%8."/>
+      <w:lvlJc w:val="left"/>
+      <w:pPr>
+        <w:tabs>
+          <w:tab w:val="num" w:pos="5760"/>
+        </w:tabs>
+        <w:ind w:left="5760" w:hanging="360"/>
+      </w:pPr>
+    </w:lvl>
+    <w:lvl w:ilvl="8" w:tentative="1">
+      <w:start w:val="1"/>
+      <w:numFmt w:val="decimal"/>
+      <w:lvlText w:val="%9."/>
+      <w:lvlJc w:val="left"/>
+      <w:pPr>
+        <w:tabs>
+          <w:tab w:val="num" w:pos="6480"/>
+        </w:tabs>
+        <w:ind w:left="6480" w:hanging="360"/>
+      </w:pPr>
+    </w:lvl>
+  </w:abstractNum>
+  <w:abstractNum w:abstractNumId="25" w15:restartNumberingAfterBreak="0">
     <w:nsid w:val="61292230"/>
     <w:multiLevelType w:val="multilevel"/>
     <w:tmpl w:val="6AD610F0"/>
@@ -18650,7 +18781,7 @@
       </w:pPr>
     </w:lvl>
   </w:abstractNum>
-  <w:abstractNum w:abstractNumId="25" w15:restartNumberingAfterBreak="0">
+  <w:abstractNum w:abstractNumId="26" w15:restartNumberingAfterBreak="0">
     <w:nsid w:val="62A76490"/>
     <w:multiLevelType w:val="multilevel"/>
     <w:tmpl w:val="4F1C5316"/>
@@ -18767,7 +18898,7 @@
       </w:pPr>
     </w:lvl>
   </w:abstractNum>
-  <w:abstractNum w:abstractNumId="26" w15:restartNumberingAfterBreak="0">
+  <w:abstractNum w:abstractNumId="27" w15:restartNumberingAfterBreak="0">
     <w:nsid w:val="63573F96"/>
     <w:multiLevelType w:val="multilevel"/>
     <w:tmpl w:val="2CB21D70"/>
@@ -18916,7 +19047,7 @@
       </w:rPr>
     </w:lvl>
   </w:abstractNum>
-  <w:abstractNum w:abstractNumId="27" w15:restartNumberingAfterBreak="0">
+  <w:abstractNum w:abstractNumId="28" w15:restartNumberingAfterBreak="0">
     <w:nsid w:val="63C26785"/>
     <w:multiLevelType w:val="multilevel"/>
     <w:tmpl w:val="6818FAC8"/>
@@ -19029,7 +19160,7 @@
       </w:pPr>
     </w:lvl>
   </w:abstractNum>
-  <w:abstractNum w:abstractNumId="28" w15:restartNumberingAfterBreak="0">
+  <w:abstractNum w:abstractNumId="29" w15:restartNumberingAfterBreak="0">
     <w:nsid w:val="6BB13E57"/>
     <w:multiLevelType w:val="multilevel"/>
     <w:tmpl w:val="947E31F6"/>
@@ -19178,7 +19309,7 @@
       </w:rPr>
     </w:lvl>
   </w:abstractNum>
-  <w:abstractNum w:abstractNumId="29" w15:restartNumberingAfterBreak="0">
+  <w:abstractNum w:abstractNumId="30" w15:restartNumberingAfterBreak="0">
     <w:nsid w:val="6D64703A"/>
     <w:multiLevelType w:val="multilevel"/>
     <w:tmpl w:val="4A8A1276"/>
@@ -19291,7 +19422,7 @@
       </w:pPr>
     </w:lvl>
   </w:abstractNum>
-  <w:abstractNum w:abstractNumId="30" w15:restartNumberingAfterBreak="0">
+  <w:abstractNum w:abstractNumId="31" w15:restartNumberingAfterBreak="0">
     <w:nsid w:val="6D906C01"/>
     <w:multiLevelType w:val="multilevel"/>
     <w:tmpl w:val="4DF63D4A"/>
@@ -19440,7 +19571,7 @@
       </w:rPr>
     </w:lvl>
   </w:abstractNum>
-  <w:abstractNum w:abstractNumId="31" w15:restartNumberingAfterBreak="0">
+  <w:abstractNum w:abstractNumId="32" w15:restartNumberingAfterBreak="0">
     <w:nsid w:val="71E65246"/>
     <w:multiLevelType w:val="multilevel"/>
     <w:tmpl w:val="F9944F54"/>
@@ -19589,7 +19720,7 @@
       </w:rPr>
     </w:lvl>
   </w:abstractNum>
-  <w:abstractNum w:abstractNumId="32" w15:restartNumberingAfterBreak="0">
+  <w:abstractNum w:abstractNumId="33" w15:restartNumberingAfterBreak="0">
     <w:nsid w:val="75FC1139"/>
     <w:multiLevelType w:val="multilevel"/>
     <w:tmpl w:val="CC5A3DA6"/>
@@ -19745,22 +19876,22 @@
     <w:abstractNumId w:val="16"/>
   </w:num>
   <w:num w:numId="3">
-    <w:abstractNumId w:val="31"/>
+    <w:abstractNumId w:val="32"/>
   </w:num>
   <w:num w:numId="4">
-    <w:abstractNumId w:val="24"/>
+    <w:abstractNumId w:val="25"/>
   </w:num>
   <w:num w:numId="5">
     <w:abstractNumId w:val="11"/>
   </w:num>
   <w:num w:numId="6">
-    <w:abstractNumId w:val="25"/>
+    <w:abstractNumId w:val="26"/>
   </w:num>
   <w:num w:numId="7">
-    <w:abstractNumId w:val="26"/>
+    <w:abstractNumId w:val="27"/>
   </w:num>
   <w:num w:numId="8">
-    <w:abstractNumId w:val="29"/>
+    <w:abstractNumId w:val="30"/>
   </w:num>
   <w:num w:numId="9">
     <w:abstractNumId w:val="6"/>
@@ -19772,7 +19903,7 @@
     <w:abstractNumId w:val="23"/>
   </w:num>
   <w:num w:numId="12">
-    <w:abstractNumId w:val="27"/>
+    <w:abstractNumId w:val="28"/>
   </w:num>
   <w:num w:numId="13">
     <w:abstractNumId w:val="19"/>
@@ -19781,7 +19912,7 @@
     <w:abstractNumId w:val="13"/>
   </w:num>
   <w:num w:numId="15">
-    <w:abstractNumId w:val="32"/>
+    <w:abstractNumId w:val="33"/>
   </w:num>
   <w:num w:numId="16">
     <w:abstractNumId w:val="14"/>
@@ -19805,7 +19936,7 @@
     <w:abstractNumId w:val="4"/>
   </w:num>
   <w:num w:numId="23">
-    <w:abstractNumId w:val="30"/>
+    <w:abstractNumId w:val="31"/>
   </w:num>
   <w:num w:numId="24">
     <w:abstractNumId w:val="5"/>
@@ -19826,7 +19957,7 @@
     <w:abstractNumId w:val="12"/>
   </w:num>
   <w:num w:numId="30">
-    <w:abstractNumId w:val="28"/>
+    <w:abstractNumId w:val="29"/>
   </w:num>
   <w:num w:numId="31">
     <w:abstractNumId w:val="20"/>
@@ -19836,6 +19967,9 @@
   </w:num>
   <w:num w:numId="33">
     <w:abstractNumId w:val="15"/>
+  </w:num>
+  <w:num w:numId="34">
+    <w:abstractNumId w:val="24"/>
   </w:num>
 </w:numbering>
 </file>
@@ -20758,7 +20892,7 @@
 </file>
 
 <file path=customXml/itemProps1.xml><?xml version="1.0" encoding="utf-8"?>
-<ds:datastoreItem xmlns:ds="http://schemas.openxmlformats.org/officeDocument/2006/customXml" ds:itemID="{3BDC78A0-92E0-4BFB-B7A1-2488311666B2}">
+<ds:datastoreItem xmlns:ds="http://schemas.openxmlformats.org/officeDocument/2006/customXml" ds:itemID="{C024B694-AEEA-4E4C-8337-6EA264894AB1}">
   <ds:schemaRefs>
     <ds:schemaRef ds:uri="http://schemas.openxmlformats.org/officeDocument/2006/bibliography"/>
   </ds:schemaRefs>

</xml_diff>

<commit_message>
fix: Configuration requise du PWA Manifest pour Chrome
</commit_message>
<xml_diff>
--- a/Application de Réservation de Techniciens à Domicile.docx
+++ b/Application de Réservation de Techniciens à Domicile.docx
@@ -15488,8 +15488,413 @@
           <w:szCs w:val="24"/>
         </w:rPr>
       </w:pPr>
+    </w:p>
+    <w:p>
+      <w:pPr>
+        <w:shd w:val="clear" w:color="auto" w:fill="F9F9F9"/>
+        <w:spacing w:after="0" w:line="240" w:lineRule="auto"/>
+        <w:rPr>
+          <w:rFonts w:ascii="Segoe UI" w:eastAsia="Times New Roman" w:hAnsi="Segoe UI" w:cs="Segoe UI"/>
+          <w:color w:val="101010"/>
+          <w:sz w:val="21"/>
+          <w:szCs w:val="21"/>
+          <w:lang w:eastAsia="fr-FR"/>
+        </w:rPr>
+      </w:pPr>
+      <w:r>
+        <w:rPr>
+          <w:rFonts w:ascii="Segoe UI" w:eastAsia="Times New Roman" w:hAnsi="Segoe UI" w:cs="Segoe UI"/>
+          <w:color w:val="101010"/>
+          <w:sz w:val="21"/>
+          <w:szCs w:val="21"/>
+          <w:lang w:eastAsia="fr-FR"/>
+        </w:rPr>
+        <w:lastRenderedPageBreak/>
+        <w:t xml:space="preserve">Excellents choix ! </w:t>
+      </w:r>
+      <w:r>
+        <w:rPr>
+          <w:rFonts w:ascii="Segoe UI Symbol" w:eastAsia="Times New Roman" w:hAnsi="Segoe UI Symbol" w:cs="Segoe UI Symbol"/>
+          <w:color w:val="101010"/>
+          <w:sz w:val="21"/>
+          <w:szCs w:val="21"/>
+          <w:lang w:eastAsia="fr-FR"/>
+        </w:rPr>
+        <w:t>🚀</w:t>
+      </w:r>
+      <w:r>
+        <w:rPr>
+          <w:rFonts w:ascii="Segoe UI" w:eastAsia="Times New Roman" w:hAnsi="Segoe UI" w:cs="Segoe UI"/>
+          <w:color w:val="101010"/>
+          <w:sz w:val="21"/>
+          <w:szCs w:val="21"/>
+          <w:lang w:eastAsia="fr-FR"/>
+        </w:rPr>
+        <w:t xml:space="preserve"> Je viens tout juste de terminer le développement et d'envoyer la mise à jour sur </w:t>
+      </w:r>
+      <w:proofErr w:type="spellStart"/>
+      <w:r>
+        <w:rPr>
+          <w:rFonts w:ascii="Segoe UI" w:eastAsia="Times New Roman" w:hAnsi="Segoe UI" w:cs="Segoe UI"/>
+          <w:color w:val="101010"/>
+          <w:sz w:val="21"/>
+          <w:szCs w:val="21"/>
+          <w:lang w:eastAsia="fr-FR"/>
+        </w:rPr>
+        <w:t>Render</w:t>
+      </w:r>
+      <w:proofErr w:type="spellEnd"/>
+      <w:r>
+        <w:rPr>
+          <w:rFonts w:ascii="Segoe UI" w:eastAsia="Times New Roman" w:hAnsi="Segoe UI" w:cs="Segoe UI"/>
+          <w:color w:val="101010"/>
+          <w:sz w:val="21"/>
+          <w:szCs w:val="21"/>
+          <w:lang w:eastAsia="fr-FR"/>
+        </w:rPr>
+        <w:t>.</w:t>
+      </w:r>
+    </w:p>
+    <w:p>
+      <w:pPr>
+        <w:shd w:val="clear" w:color="auto" w:fill="F9F9F9"/>
+        <w:spacing w:after="0" w:line="240" w:lineRule="auto"/>
+        <w:rPr>
+          <w:rFonts w:ascii="Segoe UI" w:eastAsia="Times New Roman" w:hAnsi="Segoe UI" w:cs="Segoe UI"/>
+          <w:color w:val="101010"/>
+          <w:sz w:val="21"/>
+          <w:szCs w:val="21"/>
+          <w:lang w:eastAsia="fr-FR"/>
+        </w:rPr>
+      </w:pPr>
+      <w:r>
+        <w:rPr>
+          <w:rFonts w:ascii="Segoe UI" w:eastAsia="Times New Roman" w:hAnsi="Segoe UI" w:cs="Segoe UI"/>
+          <w:color w:val="101010"/>
+          <w:sz w:val="21"/>
+          <w:szCs w:val="21"/>
+          <w:lang w:eastAsia="fr-FR"/>
+        </w:rPr>
+        <w:t>Voici ce qui vous attend d'ici environ une minute :</w:t>
+      </w:r>
+    </w:p>
+    <w:p>
+      <w:pPr>
+        <w:shd w:val="clear" w:color="auto" w:fill="F9F9F9"/>
+        <w:spacing w:after="0" w:line="240" w:lineRule="auto"/>
+        <w:rPr>
+          <w:rFonts w:ascii="Segoe UI" w:eastAsia="Times New Roman" w:hAnsi="Segoe UI" w:cs="Segoe UI"/>
+          <w:color w:val="101010"/>
+          <w:sz w:val="21"/>
+          <w:szCs w:val="21"/>
+          <w:lang w:eastAsia="fr-FR"/>
+        </w:rPr>
+      </w:pPr>
+      <w:r>
+        <w:rPr>
+          <w:rFonts w:ascii="Segoe UI Symbol" w:eastAsia="Times New Roman" w:hAnsi="Segoe UI Symbol" w:cs="Segoe UI Symbol"/>
+          <w:b/>
+          <w:bCs/>
+          <w:color w:val="101010"/>
+          <w:sz w:val="21"/>
+          <w:szCs w:val="21"/>
+          <w:lang w:eastAsia="fr-FR"/>
+        </w:rPr>
+        <w:t>📱</w:t>
+      </w:r>
+      <w:r>
+        <w:rPr>
+          <w:rFonts w:ascii="Segoe UI" w:eastAsia="Times New Roman" w:hAnsi="Segoe UI" w:cs="Segoe UI"/>
+          <w:b/>
+          <w:bCs/>
+          <w:color w:val="101010"/>
+          <w:sz w:val="21"/>
+          <w:szCs w:val="21"/>
+          <w:lang w:eastAsia="fr-FR"/>
+        </w:rPr>
+        <w:t xml:space="preserve"> 1. Bouton d'Installation (Sur la page d'accueil)</w:t>
+      </w:r>
+      <w:r>
+        <w:rPr>
+          <w:rFonts w:ascii="Segoe UI" w:eastAsia="Times New Roman" w:hAnsi="Segoe UI" w:cs="Segoe UI"/>
+          <w:color w:val="101010"/>
+          <w:sz w:val="21"/>
+          <w:szCs w:val="21"/>
+          <w:lang w:eastAsia="fr-FR"/>
+        </w:rPr>
+        <w:t> Juste en dessous de la petite bannière "Cadeau de bienvenue", le client verra un grand bouton bleu </w:t>
+      </w:r>
+      <w:r>
+        <w:rPr>
+          <w:rFonts w:ascii="Segoe UI" w:eastAsia="Times New Roman" w:hAnsi="Segoe UI" w:cs="Segoe UI"/>
+          <w:b/>
+          <w:bCs/>
+          <w:color w:val="101010"/>
+          <w:sz w:val="21"/>
+          <w:szCs w:val="21"/>
+          <w:lang w:eastAsia="fr-FR"/>
+        </w:rPr>
+        <w:t>"Installer l'application"</w:t>
+      </w:r>
+      <w:r>
+        <w:rPr>
+          <w:rFonts w:ascii="Segoe UI" w:eastAsia="Times New Roman" w:hAnsi="Segoe UI" w:cs="Segoe UI"/>
+          <w:color w:val="101010"/>
+          <w:sz w:val="21"/>
+          <w:szCs w:val="21"/>
+          <w:lang w:eastAsia="fr-FR"/>
+        </w:rPr>
+        <w:t>. S'il clique dessus (sur Android ou Chrome), le téléphone lui proposera d'ajouter SERVICE-GO directement sur son écran d'accueil avec votre logo ! </w:t>
+      </w:r>
+      <w:r>
+        <w:rPr>
+          <w:rFonts w:ascii="Segoe UI" w:eastAsia="Times New Roman" w:hAnsi="Segoe UI" w:cs="Segoe UI"/>
+          <w:i/>
+          <w:iCs/>
+          <w:color w:val="101010"/>
+          <w:sz w:val="21"/>
+          <w:szCs w:val="21"/>
+          <w:lang w:eastAsia="fr-FR"/>
+        </w:rPr>
+        <w:t>(</w:t>
+      </w:r>
+      <w:proofErr w:type="gramStart"/>
+      <w:r>
+        <w:rPr>
+          <w:rFonts w:ascii="Segoe UI" w:eastAsia="Times New Roman" w:hAnsi="Segoe UI" w:cs="Segoe UI"/>
+          <w:i/>
+          <w:iCs/>
+          <w:color w:val="101010"/>
+          <w:sz w:val="21"/>
+          <w:szCs w:val="21"/>
+          <w:lang w:eastAsia="fr-FR"/>
+        </w:rPr>
+        <w:t>Note:</w:t>
+      </w:r>
+      <w:proofErr w:type="gramEnd"/>
+      <w:r>
+        <w:rPr>
+          <w:rFonts w:ascii="Segoe UI" w:eastAsia="Times New Roman" w:hAnsi="Segoe UI" w:cs="Segoe UI"/>
+          <w:i/>
+          <w:iCs/>
+          <w:color w:val="101010"/>
+          <w:sz w:val="21"/>
+          <w:szCs w:val="21"/>
+          <w:lang w:eastAsia="fr-FR"/>
+        </w:rPr>
+        <w:t xml:space="preserve"> l'apparition de ce bouton dépend du navigateur du client, il s'affiche automatiquement si le téléphone est compatible).</w:t>
+      </w:r>
+    </w:p>
+    <w:p>
+      <w:pPr>
+        <w:shd w:val="clear" w:color="auto" w:fill="F9F9F9"/>
+        <w:spacing w:after="0" w:line="240" w:lineRule="auto"/>
+        <w:rPr>
+          <w:rFonts w:ascii="Segoe UI" w:eastAsia="Times New Roman" w:hAnsi="Segoe UI" w:cs="Segoe UI"/>
+          <w:color w:val="101010"/>
+          <w:sz w:val="21"/>
+          <w:szCs w:val="21"/>
+          <w:lang w:eastAsia="fr-FR"/>
+        </w:rPr>
+      </w:pPr>
+      <w:r>
+        <w:rPr>
+          <w:rFonts w:ascii="Segoe UI" w:eastAsia="Times New Roman" w:hAnsi="Segoe UI" w:cs="Segoe UI"/>
+          <w:b/>
+          <w:bCs/>
+          <w:color w:val="101010"/>
+          <w:sz w:val="21"/>
+          <w:szCs w:val="21"/>
+          <w:lang w:eastAsia="fr-FR"/>
+        </w:rPr>
+        <w:t>🧾 2. Les Factures PDF (Dans l'Admin ET l'Espace Client)</w:t>
+      </w:r>
+      <w:r>
+        <w:rPr>
+          <w:rFonts w:ascii="Segoe UI" w:eastAsia="Times New Roman" w:hAnsi="Segoe UI" w:cs="Segoe UI"/>
+          <w:color w:val="101010"/>
+          <w:sz w:val="21"/>
+          <w:szCs w:val="21"/>
+          <w:lang w:eastAsia="fr-FR"/>
+        </w:rPr>
+        <w:t> J'ai ajouté la génération de factures aux deux endroits pour gagner un temps fou :</w:t>
+      </w:r>
+    </w:p>
+    <w:p>
+      <w:pPr>
+        <w:numPr>
+          <w:ilvl w:val="0"/>
+          <w:numId w:val="35"/>
+        </w:numPr>
+        <w:shd w:val="clear" w:color="auto" w:fill="F9F9F9"/>
+        <w:spacing w:after="0" w:line="240" w:lineRule="auto"/>
+        <w:ind w:left="0"/>
+        <w:rPr>
+          <w:rFonts w:ascii="Segoe UI" w:eastAsia="Times New Roman" w:hAnsi="Segoe UI" w:cs="Segoe UI"/>
+          <w:color w:val="101010"/>
+          <w:sz w:val="21"/>
+          <w:szCs w:val="21"/>
+          <w:lang w:eastAsia="fr-FR"/>
+        </w:rPr>
+      </w:pPr>
+      <w:r>
+        <w:rPr>
+          <w:rFonts w:ascii="Segoe UI" w:eastAsia="Times New Roman" w:hAnsi="Segoe UI" w:cs="Segoe UI"/>
+          <w:b/>
+          <w:bCs/>
+          <w:color w:val="101010"/>
+          <w:sz w:val="21"/>
+          <w:szCs w:val="21"/>
+          <w:lang w:eastAsia="fr-FR"/>
+        </w:rPr>
+        <w:t>Côté Admin :</w:t>
+      </w:r>
+      <w:r>
+        <w:rPr>
+          <w:rFonts w:ascii="Segoe UI" w:eastAsia="Times New Roman" w:hAnsi="Segoe UI" w:cs="Segoe UI"/>
+          <w:color w:val="101010"/>
+          <w:sz w:val="21"/>
+          <w:szCs w:val="21"/>
+          <w:lang w:eastAsia="fr-FR"/>
+        </w:rPr>
+        <w:t> Quand vous passez une réservation en "Terminée", un bouton bleu </w:t>
+      </w:r>
+      <w:r>
+        <w:rPr>
+          <w:rFonts w:ascii="Segoe UI" w:eastAsia="Times New Roman" w:hAnsi="Segoe UI" w:cs="Segoe UI"/>
+          <w:b/>
+          <w:bCs/>
+          <w:color w:val="101010"/>
+          <w:sz w:val="21"/>
+          <w:szCs w:val="21"/>
+          <w:lang w:eastAsia="fr-FR"/>
+        </w:rPr>
+        <w:t>"Facture"</w:t>
+      </w:r>
+      <w:r>
+        <w:rPr>
+          <w:rFonts w:ascii="Segoe UI" w:eastAsia="Times New Roman" w:hAnsi="Segoe UI" w:cs="Segoe UI"/>
+          <w:color w:val="101010"/>
+          <w:sz w:val="21"/>
+          <w:szCs w:val="21"/>
+          <w:lang w:eastAsia="fr-FR"/>
+        </w:rPr>
+        <w:t> apparaît à côté du bouton "Supprimer". Vous pouvez la télécharger pour l'envoyer vous-même.</w:t>
+      </w:r>
+    </w:p>
+    <w:p>
+      <w:pPr>
+        <w:numPr>
+          <w:ilvl w:val="0"/>
+          <w:numId w:val="35"/>
+        </w:numPr>
+        <w:shd w:val="clear" w:color="auto" w:fill="F9F9F9"/>
+        <w:spacing w:after="0" w:line="240" w:lineRule="auto"/>
+        <w:ind w:left="0"/>
+        <w:rPr>
+          <w:rFonts w:ascii="Segoe UI" w:eastAsia="Times New Roman" w:hAnsi="Segoe UI" w:cs="Segoe UI"/>
+          <w:color w:val="101010"/>
+          <w:sz w:val="21"/>
+          <w:szCs w:val="21"/>
+          <w:lang w:eastAsia="fr-FR"/>
+        </w:rPr>
+      </w:pPr>
+      <w:r>
+        <w:rPr>
+          <w:rFonts w:ascii="Segoe UI" w:eastAsia="Times New Roman" w:hAnsi="Segoe UI" w:cs="Segoe UI"/>
+          <w:b/>
+          <w:bCs/>
+          <w:color w:val="101010"/>
+          <w:sz w:val="21"/>
+          <w:szCs w:val="21"/>
+          <w:lang w:eastAsia="fr-FR"/>
+        </w:rPr>
+        <w:t>Côté Client :</w:t>
+      </w:r>
+      <w:r>
+        <w:rPr>
+          <w:rFonts w:ascii="Segoe UI" w:eastAsia="Times New Roman" w:hAnsi="Segoe UI" w:cs="Segoe UI"/>
+          <w:color w:val="101010"/>
+          <w:sz w:val="21"/>
+          <w:szCs w:val="21"/>
+          <w:lang w:eastAsia="fr-FR"/>
+        </w:rPr>
+        <w:t> Dans son historique, si l'intervention est marquée comme "Terminée", le client aura un beau bouton bleu </w:t>
+      </w:r>
+      <w:r>
+        <w:rPr>
+          <w:rFonts w:ascii="Segoe UI" w:eastAsia="Times New Roman" w:hAnsi="Segoe UI" w:cs="Segoe UI"/>
+          <w:b/>
+          <w:bCs/>
+          <w:color w:val="101010"/>
+          <w:sz w:val="21"/>
+          <w:szCs w:val="21"/>
+          <w:lang w:eastAsia="fr-FR"/>
+        </w:rPr>
+        <w:t>"Télécharger la Facture"</w:t>
+      </w:r>
+      <w:r>
+        <w:rPr>
+          <w:rFonts w:ascii="Segoe UI" w:eastAsia="Times New Roman" w:hAnsi="Segoe UI" w:cs="Segoe UI"/>
+          <w:color w:val="101010"/>
+          <w:sz w:val="21"/>
+          <w:szCs w:val="21"/>
+          <w:lang w:eastAsia="fr-FR"/>
+        </w:rPr>
+        <w:t> juste au-dessus du bouton pour laisser un avis.</w:t>
+      </w:r>
+    </w:p>
+    <w:p>
+      <w:pPr>
+        <w:shd w:val="clear" w:color="auto" w:fill="F9F9F9"/>
+        <w:spacing w:after="0" w:line="240" w:lineRule="auto"/>
+        <w:rPr>
+          <w:rFonts w:ascii="Segoe UI" w:eastAsia="Times New Roman" w:hAnsi="Segoe UI" w:cs="Segoe UI"/>
+          <w:color w:val="101010"/>
+          <w:sz w:val="21"/>
+          <w:szCs w:val="21"/>
+          <w:lang w:eastAsia="fr-FR"/>
+        </w:rPr>
+      </w:pPr>
+      <w:r>
+        <w:rPr>
+          <w:rFonts w:ascii="Segoe UI" w:eastAsia="Times New Roman" w:hAnsi="Segoe UI" w:cs="Segoe UI"/>
+          <w:color w:val="101010"/>
+          <w:sz w:val="21"/>
+          <w:szCs w:val="21"/>
+          <w:lang w:eastAsia="fr-FR"/>
+        </w:rPr>
+        <w:t>La facture est générée instantanément avec un joli design (Date, Nom du client, Prix, Service, et Numéro de facture unique).</w:t>
+      </w:r>
+    </w:p>
+    <w:p>
+      <w:pPr>
+        <w:rPr>
+          <w:rFonts w:asciiTheme="majorBidi" w:hAnsiTheme="majorBidi" w:cstheme="majorBidi"/>
+          <w:sz w:val="24"/>
+          <w:szCs w:val="24"/>
+        </w:rPr>
+      </w:pPr>
       <w:bookmarkStart w:id="0" w:name="_GoBack"/>
       <w:bookmarkEnd w:id="0"/>
+    </w:p>
+    <w:p>
+      <w:pPr>
+        <w:rPr>
+          <w:rFonts w:asciiTheme="majorBidi" w:hAnsiTheme="majorBidi" w:cstheme="majorBidi"/>
+          <w:sz w:val="24"/>
+          <w:szCs w:val="24"/>
+        </w:rPr>
+      </w:pPr>
+    </w:p>
+    <w:p>
+      <w:pPr>
+        <w:rPr>
+          <w:rFonts w:asciiTheme="majorBidi" w:hAnsiTheme="majorBidi" w:cstheme="majorBidi"/>
+          <w:sz w:val="24"/>
+          <w:szCs w:val="24"/>
+        </w:rPr>
+      </w:pPr>
     </w:p>
     <w:sectPr>
       <w:pgSz w:w="11906" w:h="16838" w:code="9"/>
@@ -17617,6 +18022,155 @@
     </w:lvl>
   </w:abstractNum>
   <w:abstractNum w:abstractNumId="17" w15:restartNumberingAfterBreak="0">
+    <w:nsid w:val="37876C1B"/>
+    <w:multiLevelType w:val="multilevel"/>
+    <w:tmpl w:val="155A88A4"/>
+    <w:lvl w:ilvl="0">
+      <w:start w:val="1"/>
+      <w:numFmt w:val="bullet"/>
+      <w:lvlText w:val=""/>
+      <w:lvlJc w:val="left"/>
+      <w:pPr>
+        <w:tabs>
+          <w:tab w:val="num" w:pos="720"/>
+        </w:tabs>
+        <w:ind w:left="720" w:hanging="360"/>
+      </w:pPr>
+      <w:rPr>
+        <w:rFonts w:ascii="Symbol" w:hAnsi="Symbol" w:hint="default"/>
+        <w:sz w:val="20"/>
+      </w:rPr>
+    </w:lvl>
+    <w:lvl w:ilvl="1" w:tentative="1">
+      <w:start w:val="1"/>
+      <w:numFmt w:val="bullet"/>
+      <w:lvlText w:val=""/>
+      <w:lvlJc w:val="left"/>
+      <w:pPr>
+        <w:tabs>
+          <w:tab w:val="num" w:pos="1440"/>
+        </w:tabs>
+        <w:ind w:left="1440" w:hanging="360"/>
+      </w:pPr>
+      <w:rPr>
+        <w:rFonts w:ascii="Symbol" w:hAnsi="Symbol" w:hint="default"/>
+        <w:sz w:val="20"/>
+      </w:rPr>
+    </w:lvl>
+    <w:lvl w:ilvl="2" w:tentative="1">
+      <w:start w:val="1"/>
+      <w:numFmt w:val="bullet"/>
+      <w:lvlText w:val=""/>
+      <w:lvlJc w:val="left"/>
+      <w:pPr>
+        <w:tabs>
+          <w:tab w:val="num" w:pos="2160"/>
+        </w:tabs>
+        <w:ind w:left="2160" w:hanging="360"/>
+      </w:pPr>
+      <w:rPr>
+        <w:rFonts w:ascii="Symbol" w:hAnsi="Symbol" w:hint="default"/>
+        <w:sz w:val="20"/>
+      </w:rPr>
+    </w:lvl>
+    <w:lvl w:ilvl="3" w:tentative="1">
+      <w:start w:val="1"/>
+      <w:numFmt w:val="bullet"/>
+      <w:lvlText w:val=""/>
+      <w:lvlJc w:val="left"/>
+      <w:pPr>
+        <w:tabs>
+          <w:tab w:val="num" w:pos="2880"/>
+        </w:tabs>
+        <w:ind w:left="2880" w:hanging="360"/>
+      </w:pPr>
+      <w:rPr>
+        <w:rFonts w:ascii="Symbol" w:hAnsi="Symbol" w:hint="default"/>
+        <w:sz w:val="20"/>
+      </w:rPr>
+    </w:lvl>
+    <w:lvl w:ilvl="4" w:tentative="1">
+      <w:start w:val="1"/>
+      <w:numFmt w:val="bullet"/>
+      <w:lvlText w:val=""/>
+      <w:lvlJc w:val="left"/>
+      <w:pPr>
+        <w:tabs>
+          <w:tab w:val="num" w:pos="3600"/>
+        </w:tabs>
+        <w:ind w:left="3600" w:hanging="360"/>
+      </w:pPr>
+      <w:rPr>
+        <w:rFonts w:ascii="Symbol" w:hAnsi="Symbol" w:hint="default"/>
+        <w:sz w:val="20"/>
+      </w:rPr>
+    </w:lvl>
+    <w:lvl w:ilvl="5" w:tentative="1">
+      <w:start w:val="1"/>
+      <w:numFmt w:val="bullet"/>
+      <w:lvlText w:val=""/>
+      <w:lvlJc w:val="left"/>
+      <w:pPr>
+        <w:tabs>
+          <w:tab w:val="num" w:pos="4320"/>
+        </w:tabs>
+        <w:ind w:left="4320" w:hanging="360"/>
+      </w:pPr>
+      <w:rPr>
+        <w:rFonts w:ascii="Symbol" w:hAnsi="Symbol" w:hint="default"/>
+        <w:sz w:val="20"/>
+      </w:rPr>
+    </w:lvl>
+    <w:lvl w:ilvl="6" w:tentative="1">
+      <w:start w:val="1"/>
+      <w:numFmt w:val="bullet"/>
+      <w:lvlText w:val=""/>
+      <w:lvlJc w:val="left"/>
+      <w:pPr>
+        <w:tabs>
+          <w:tab w:val="num" w:pos="5040"/>
+        </w:tabs>
+        <w:ind w:left="5040" w:hanging="360"/>
+      </w:pPr>
+      <w:rPr>
+        <w:rFonts w:ascii="Symbol" w:hAnsi="Symbol" w:hint="default"/>
+        <w:sz w:val="20"/>
+      </w:rPr>
+    </w:lvl>
+    <w:lvl w:ilvl="7" w:tentative="1">
+      <w:start w:val="1"/>
+      <w:numFmt w:val="bullet"/>
+      <w:lvlText w:val=""/>
+      <w:lvlJc w:val="left"/>
+      <w:pPr>
+        <w:tabs>
+          <w:tab w:val="num" w:pos="5760"/>
+        </w:tabs>
+        <w:ind w:left="5760" w:hanging="360"/>
+      </w:pPr>
+      <w:rPr>
+        <w:rFonts w:ascii="Symbol" w:hAnsi="Symbol" w:hint="default"/>
+        <w:sz w:val="20"/>
+      </w:rPr>
+    </w:lvl>
+    <w:lvl w:ilvl="8" w:tentative="1">
+      <w:start w:val="1"/>
+      <w:numFmt w:val="bullet"/>
+      <w:lvlText w:val=""/>
+      <w:lvlJc w:val="left"/>
+      <w:pPr>
+        <w:tabs>
+          <w:tab w:val="num" w:pos="6480"/>
+        </w:tabs>
+        <w:ind w:left="6480" w:hanging="360"/>
+      </w:pPr>
+      <w:rPr>
+        <w:rFonts w:ascii="Symbol" w:hAnsi="Symbol" w:hint="default"/>
+        <w:sz w:val="20"/>
+      </w:rPr>
+    </w:lvl>
+  </w:abstractNum>
+  <w:abstractNum w:abstractNumId="18" w15:restartNumberingAfterBreak="0">
     <w:nsid w:val="3E174719"/>
     <w:multiLevelType w:val="multilevel"/>
     <w:tmpl w:val="8B6ACB7C"/>
@@ -17765,7 +18319,7 @@
       </w:rPr>
     </w:lvl>
   </w:abstractNum>
-  <w:abstractNum w:abstractNumId="18" w15:restartNumberingAfterBreak="0">
+  <w:abstractNum w:abstractNumId="19" w15:restartNumberingAfterBreak="0">
     <w:nsid w:val="3FBF4554"/>
     <w:multiLevelType w:val="multilevel"/>
     <w:tmpl w:val="CB421628"/>
@@ -17878,7 +18432,7 @@
       </w:pPr>
     </w:lvl>
   </w:abstractNum>
-  <w:abstractNum w:abstractNumId="19" w15:restartNumberingAfterBreak="0">
+  <w:abstractNum w:abstractNumId="20" w15:restartNumberingAfterBreak="0">
     <w:nsid w:val="41255EDF"/>
     <w:multiLevelType w:val="multilevel"/>
     <w:tmpl w:val="D51633B0"/>
@@ -18027,7 +18581,7 @@
       </w:rPr>
     </w:lvl>
   </w:abstractNum>
-  <w:abstractNum w:abstractNumId="20" w15:restartNumberingAfterBreak="0">
+  <w:abstractNum w:abstractNumId="21" w15:restartNumberingAfterBreak="0">
     <w:nsid w:val="50592E68"/>
     <w:multiLevelType w:val="multilevel"/>
     <w:tmpl w:val="FC96CB4C"/>
@@ -18140,7 +18694,7 @@
       </w:pPr>
     </w:lvl>
   </w:abstractNum>
-  <w:abstractNum w:abstractNumId="21" w15:restartNumberingAfterBreak="0">
+  <w:abstractNum w:abstractNumId="22" w15:restartNumberingAfterBreak="0">
     <w:nsid w:val="56F716FF"/>
     <w:multiLevelType w:val="multilevel"/>
     <w:tmpl w:val="C4FE0146"/>
@@ -18289,7 +18843,7 @@
       </w:rPr>
     </w:lvl>
   </w:abstractNum>
-  <w:abstractNum w:abstractNumId="22" w15:restartNumberingAfterBreak="0">
+  <w:abstractNum w:abstractNumId="23" w15:restartNumberingAfterBreak="0">
     <w:nsid w:val="58A74BAC"/>
     <w:multiLevelType w:val="multilevel"/>
     <w:tmpl w:val="A0E02532"/>
@@ -18402,7 +18956,7 @@
       </w:pPr>
     </w:lvl>
   </w:abstractNum>
-  <w:abstractNum w:abstractNumId="23" w15:restartNumberingAfterBreak="0">
+  <w:abstractNum w:abstractNumId="24" w15:restartNumberingAfterBreak="0">
     <w:nsid w:val="58C07C39"/>
     <w:multiLevelType w:val="multilevel"/>
     <w:tmpl w:val="F0302736"/>
@@ -18551,7 +19105,7 @@
       </w:rPr>
     </w:lvl>
   </w:abstractNum>
-  <w:abstractNum w:abstractNumId="24" w15:restartNumberingAfterBreak="0">
+  <w:abstractNum w:abstractNumId="25" w15:restartNumberingAfterBreak="0">
     <w:nsid w:val="5A6644F2"/>
     <w:multiLevelType w:val="multilevel"/>
     <w:tmpl w:val="747AD70C"/>
@@ -18664,7 +19218,7 @@
       </w:pPr>
     </w:lvl>
   </w:abstractNum>
-  <w:abstractNum w:abstractNumId="25" w15:restartNumberingAfterBreak="0">
+  <w:abstractNum w:abstractNumId="26" w15:restartNumberingAfterBreak="0">
     <w:nsid w:val="61292230"/>
     <w:multiLevelType w:val="multilevel"/>
     <w:tmpl w:val="6AD610F0"/>
@@ -18781,7 +19335,7 @@
       </w:pPr>
     </w:lvl>
   </w:abstractNum>
-  <w:abstractNum w:abstractNumId="26" w15:restartNumberingAfterBreak="0">
+  <w:abstractNum w:abstractNumId="27" w15:restartNumberingAfterBreak="0">
     <w:nsid w:val="62A76490"/>
     <w:multiLevelType w:val="multilevel"/>
     <w:tmpl w:val="4F1C5316"/>
@@ -18898,7 +19452,7 @@
       </w:pPr>
     </w:lvl>
   </w:abstractNum>
-  <w:abstractNum w:abstractNumId="27" w15:restartNumberingAfterBreak="0">
+  <w:abstractNum w:abstractNumId="28" w15:restartNumberingAfterBreak="0">
     <w:nsid w:val="63573F96"/>
     <w:multiLevelType w:val="multilevel"/>
     <w:tmpl w:val="2CB21D70"/>
@@ -19047,7 +19601,7 @@
       </w:rPr>
     </w:lvl>
   </w:abstractNum>
-  <w:abstractNum w:abstractNumId="28" w15:restartNumberingAfterBreak="0">
+  <w:abstractNum w:abstractNumId="29" w15:restartNumberingAfterBreak="0">
     <w:nsid w:val="63C26785"/>
     <w:multiLevelType w:val="multilevel"/>
     <w:tmpl w:val="6818FAC8"/>
@@ -19160,7 +19714,7 @@
       </w:pPr>
     </w:lvl>
   </w:abstractNum>
-  <w:abstractNum w:abstractNumId="29" w15:restartNumberingAfterBreak="0">
+  <w:abstractNum w:abstractNumId="30" w15:restartNumberingAfterBreak="0">
     <w:nsid w:val="6BB13E57"/>
     <w:multiLevelType w:val="multilevel"/>
     <w:tmpl w:val="947E31F6"/>
@@ -19309,7 +19863,7 @@
       </w:rPr>
     </w:lvl>
   </w:abstractNum>
-  <w:abstractNum w:abstractNumId="30" w15:restartNumberingAfterBreak="0">
+  <w:abstractNum w:abstractNumId="31" w15:restartNumberingAfterBreak="0">
     <w:nsid w:val="6D64703A"/>
     <w:multiLevelType w:val="multilevel"/>
     <w:tmpl w:val="4A8A1276"/>
@@ -19422,7 +19976,7 @@
       </w:pPr>
     </w:lvl>
   </w:abstractNum>
-  <w:abstractNum w:abstractNumId="31" w15:restartNumberingAfterBreak="0">
+  <w:abstractNum w:abstractNumId="32" w15:restartNumberingAfterBreak="0">
     <w:nsid w:val="6D906C01"/>
     <w:multiLevelType w:val="multilevel"/>
     <w:tmpl w:val="4DF63D4A"/>
@@ -19571,7 +20125,7 @@
       </w:rPr>
     </w:lvl>
   </w:abstractNum>
-  <w:abstractNum w:abstractNumId="32" w15:restartNumberingAfterBreak="0">
+  <w:abstractNum w:abstractNumId="33" w15:restartNumberingAfterBreak="0">
     <w:nsid w:val="71E65246"/>
     <w:multiLevelType w:val="multilevel"/>
     <w:tmpl w:val="F9944F54"/>
@@ -19720,7 +20274,7 @@
       </w:rPr>
     </w:lvl>
   </w:abstractNum>
-  <w:abstractNum w:abstractNumId="33" w15:restartNumberingAfterBreak="0">
+  <w:abstractNum w:abstractNumId="34" w15:restartNumberingAfterBreak="0">
     <w:nsid w:val="75FC1139"/>
     <w:multiLevelType w:val="multilevel"/>
     <w:tmpl w:val="CC5A3DA6"/>
@@ -19870,28 +20424,28 @@
     </w:lvl>
   </w:abstractNum>
   <w:num w:numId="1">
-    <w:abstractNumId w:val="22"/>
+    <w:abstractNumId w:val="23"/>
   </w:num>
   <w:num w:numId="2">
     <w:abstractNumId w:val="16"/>
   </w:num>
   <w:num w:numId="3">
-    <w:abstractNumId w:val="32"/>
+    <w:abstractNumId w:val="33"/>
   </w:num>
   <w:num w:numId="4">
-    <w:abstractNumId w:val="25"/>
+    <w:abstractNumId w:val="26"/>
   </w:num>
   <w:num w:numId="5">
     <w:abstractNumId w:val="11"/>
   </w:num>
   <w:num w:numId="6">
-    <w:abstractNumId w:val="26"/>
+    <w:abstractNumId w:val="27"/>
   </w:num>
   <w:num w:numId="7">
-    <w:abstractNumId w:val="27"/>
+    <w:abstractNumId w:val="28"/>
   </w:num>
   <w:num w:numId="8">
-    <w:abstractNumId w:val="30"/>
+    <w:abstractNumId w:val="31"/>
   </w:num>
   <w:num w:numId="9">
     <w:abstractNumId w:val="6"/>
@@ -19900,19 +20454,19 @@
     <w:abstractNumId w:val="7"/>
   </w:num>
   <w:num w:numId="11">
-    <w:abstractNumId w:val="23"/>
+    <w:abstractNumId w:val="24"/>
   </w:num>
   <w:num w:numId="12">
-    <w:abstractNumId w:val="28"/>
+    <w:abstractNumId w:val="29"/>
   </w:num>
   <w:num w:numId="13">
-    <w:abstractNumId w:val="19"/>
+    <w:abstractNumId w:val="20"/>
   </w:num>
   <w:num w:numId="14">
     <w:abstractNumId w:val="13"/>
   </w:num>
   <w:num w:numId="15">
-    <w:abstractNumId w:val="33"/>
+    <w:abstractNumId w:val="34"/>
   </w:num>
   <w:num w:numId="16">
     <w:abstractNumId w:val="14"/>
@@ -19921,7 +20475,7 @@
     <w:abstractNumId w:val="3"/>
   </w:num>
   <w:num w:numId="18">
-    <w:abstractNumId w:val="21"/>
+    <w:abstractNumId w:val="22"/>
   </w:num>
   <w:num w:numId="19">
     <w:abstractNumId w:val="2"/>
@@ -19936,7 +20490,7 @@
     <w:abstractNumId w:val="4"/>
   </w:num>
   <w:num w:numId="23">
-    <w:abstractNumId w:val="31"/>
+    <w:abstractNumId w:val="32"/>
   </w:num>
   <w:num w:numId="24">
     <w:abstractNumId w:val="5"/>
@@ -19945,7 +20499,7 @@
     <w:abstractNumId w:val="10"/>
   </w:num>
   <w:num w:numId="26">
-    <w:abstractNumId w:val="17"/>
+    <w:abstractNumId w:val="18"/>
   </w:num>
   <w:num w:numId="27">
     <w:abstractNumId w:val="0"/>
@@ -19957,19 +20511,22 @@
     <w:abstractNumId w:val="12"/>
   </w:num>
   <w:num w:numId="30">
-    <w:abstractNumId w:val="29"/>
+    <w:abstractNumId w:val="30"/>
   </w:num>
   <w:num w:numId="31">
-    <w:abstractNumId w:val="20"/>
+    <w:abstractNumId w:val="21"/>
   </w:num>
   <w:num w:numId="32">
-    <w:abstractNumId w:val="18"/>
+    <w:abstractNumId w:val="19"/>
   </w:num>
   <w:num w:numId="33">
     <w:abstractNumId w:val="15"/>
   </w:num>
   <w:num w:numId="34">
-    <w:abstractNumId w:val="24"/>
+    <w:abstractNumId w:val="25"/>
+  </w:num>
+  <w:num w:numId="35">
+    <w:abstractNumId w:val="17"/>
   </w:num>
 </w:numbering>
 </file>
@@ -20892,7 +21449,7 @@
 </file>
 
 <file path=customXml/itemProps1.xml><?xml version="1.0" encoding="utf-8"?>
-<ds:datastoreItem xmlns:ds="http://schemas.openxmlformats.org/officeDocument/2006/customXml" ds:itemID="{C024B694-AEEA-4E4C-8337-6EA264894AB1}">
+<ds:datastoreItem xmlns:ds="http://schemas.openxmlformats.org/officeDocument/2006/customXml" ds:itemID="{836A7E85-755C-40F3-8586-99D191E0D149}">
   <ds:schemaRefs>
     <ds:schemaRef ds:uri="http://schemas.openxmlformats.org/officeDocument/2006/bibliography"/>
   </ds:schemaRefs>

</xml_diff>